<commit_message>
Bổ sung tác động của Threads và sự cố mới nhất năm 2026 vào đề cương
Dự thảo 2 của đề cương tham luận Bộ trưởng Bộ VHTTDL:

- Phần I: thêm mục 6 phân tích tác động của Threads (quy mô, đặc điểm,
  6 tác động tới phòng ngừa, xử lý khủng hoảng); bổ sung nhóm nguy cơ
  dự án đầu tư lớn và thủ đoạn kích động “cách mạng Gen Z”
- Phần II: thêm bảng 5 sự cố mới nhất năm 2026 (gián đoạn nền tảng
  Meta, dự án Làng Vân, tin giả mùa mưa bão, đề xuất dự án Safari Ba
  Vì, kích động “cách mạng Gen Z”); thêm 2 hạn chế, 2 bài học
- Phần III: thêm bảng điểm nhấn ứng phó trên Threads; bổ sung yêu cầu
  công khai thông tin dự án lớn, kịch bản tình huống mới
- Phần IV, kết luận: thêm kiến nghị thứ 7 và cam kết thứ 6
- Phụ lục 4, 5: thêm nguồn tham khảo và danh mục cần xác minh
- Bảng biểu: giữ nguyên hàng, không tách sang trang sau

Co-Authored-By: Claude Opus 5.5 <noreply@anthropic.com>
Claude-Session: https://claude.ai/code/session_01NzZ78rAanjcMCsGwt7jxAb
</commit_message>
<xml_diff>
--- a/tham-luan-khung-hoang-truyen-thong/de-cuong-tham-luan-bvhttdl.docx
+++ b/tham-luan-khung-hoang-truyen-thong/de-cuong-tham-luan-bvhttdl.docx
@@ -258,7 +258,7 @@
         <w:pStyle w:val="ThongTinChung"/>
       </w:pPr>
       <w:r>
-        <w:t xml:space="preserve">Dự thảo 1, ngày 27/10/2026. Tài liệu làm việc phục vụ tổ biên tập.</w:t>
+        <w:t xml:space="preserve">Dự thảo 2, ngày 28/10/2026. Tài liệu làm việc phục vụ tổ biên tập.</w:t>
       </w:r>
     </w:p>
     <w:bookmarkStart w:id="20" w:name="tóm-tắt"/>
@@ -285,7 +285,25 @@
         <w:t xml:space="preserve"> </w:t>
       </w:r>
       <w:r>
-        <w:t xml:space="preserve">Tham luận phục vụ 3 mục tiêu: (1) nhận diện đúng bản chất, quy luật của khủng hoảng truyền thông trong môi trường số và phương thức đối tượng phản động lợi dụng; (2) đánh giá thẳng thắn kết quả, hạn chế, nguyên nhân; (3) đề xuất 7 nhóm giải pháp, trong đó có 3 giải pháp đột phá, cùng 6 kiến nghị cụ thể với Chính phủ, Thủ tướng Chính phủ.</w:t>
+        <w:t xml:space="preserve">Tham luận phục vụ 3 mục tiêu: (1) nhận diện đúng bản chất, quy luật của khủng hoảng truyền thông trong môi trường số và phương thức đối tượng phản động lợi dụng; (2) đánh giá thẳng thắn kết quả, hạn chế, nguyên nhân; (3) đề xuất 7 nhóm giải pháp, trong đó có 3 giải pháp đột phá, cùng 7 kiến nghị cụ thể với Chính phủ, Thủ tướng Chính phủ.</w:t>
+      </w:r>
+    </w:p>
+    <w:p>
+      <w:pPr>
+        <w:pStyle w:val="BodyText"/>
+      </w:pPr>
+      <w:r>
+        <w:rPr>
+          <w:b/>
+          <w:bCs/>
+        </w:rPr>
+        <w:t xml:space="preserve">Điểm mới của dự thảo 2.</w:t>
+      </w:r>
+      <w:r>
+        <w:t xml:space="preserve"> </w:t>
+      </w:r>
+      <w:r>
+        <w:t xml:space="preserve">Bổ sung phân tích tác động của Threads, nền tảng khởi phát nhiều làn sóng dư luận năm 2026 (Phần I, mục 6); 5 sự cố mới nhất năm 2026 làm dẫn chứng (Phần II, mục 2); nhóm việc cụ thể ứng phó trên Threads (Phần III); kiến nghị về công khai thông tin dự án đầu tư lớn (Phần IV).</w:t>
       </w:r>
     </w:p>
     <w:p>
@@ -502,6 +520,7 @@
       <w:tr>
         <w:trPr>
           <w:tblHeader w:val="true"/>
+          <w:cantSplit w:val="true"/>
           <w:tblHeader w:val="true"/>
         </w:trPr>
         <w:tc>
@@ -542,6 +561,9 @@
         </w:tc>
       </w:tr>
       <w:tr>
+        <w:trPr>
+          <w:cantSplit w:val="true"/>
+        </w:trPr>
         <w:tc>
           <w:tcPr/>
           <w:p>
@@ -574,6 +596,9 @@
         </w:tc>
       </w:tr>
       <w:tr>
+        <w:trPr>
+          <w:cantSplit w:val="true"/>
+        </w:trPr>
         <w:tc>
           <w:tcPr/>
           <w:p>
@@ -606,6 +631,9 @@
         </w:tc>
       </w:tr>
       <w:tr>
+        <w:trPr>
+          <w:cantSplit w:val="true"/>
+        </w:trPr>
         <w:tc>
           <w:tcPr/>
           <w:p>
@@ -638,6 +666,9 @@
         </w:tc>
       </w:tr>
       <w:tr>
+        <w:trPr>
+          <w:cantSplit w:val="true"/>
+        </w:trPr>
         <w:tc>
           <w:tcPr/>
           <w:p>
@@ -670,6 +701,9 @@
         </w:tc>
       </w:tr>
       <w:tr>
+        <w:trPr>
+          <w:cantSplit w:val="true"/>
+        </w:trPr>
         <w:tc>
           <w:tcPr/>
           <w:p>
@@ -736,6 +770,7 @@
       <w:tr>
         <w:trPr>
           <w:tblHeader w:val="true"/>
+          <w:cantSplit w:val="true"/>
           <w:tblHeader w:val="true"/>
         </w:trPr>
         <w:tc>
@@ -812,6 +847,9 @@
         </w:tc>
       </w:tr>
       <w:tr>
+        <w:trPr>
+          <w:cantSplit w:val="true"/>
+        </w:trPr>
         <w:tc>
           <w:tcPr/>
           <w:p>
@@ -874,6 +912,9 @@
         </w:tc>
       </w:tr>
       <w:tr>
+        <w:trPr>
+          <w:cantSplit w:val="true"/>
+        </w:trPr>
         <w:tc>
           <w:tcPr/>
           <w:p>
@@ -900,7 +941,7 @@
               <w:rPr>
                 <w:sz w:val="23"/>
               </w:rPr>
-              <w:t xml:space="preserve">Nhận diện khủng hoảng truyền thông và phương thức lợi dụng của đối tượng phản động</w:t>
+              <w:t xml:space="preserve">Nhận diện khủng hoảng truyền thông, phương thức lợi dụng của đối tượng phản động, tác động của Threads</w:t>
             </w:r>
           </w:p>
         </w:tc>
@@ -936,6 +977,9 @@
         </w:tc>
       </w:tr>
       <w:tr>
+        <w:trPr>
+          <w:cantSplit w:val="true"/>
+        </w:trPr>
         <w:tc>
           <w:tcPr/>
           <w:p>
@@ -962,7 +1006,7 @@
               <w:rPr>
                 <w:sz w:val="23"/>
               </w:rPr>
-              <w:t xml:space="preserve">Kết quả, hạn chế, nguyên nhân, bài học kinh nghiệm</w:t>
+              <w:t xml:space="preserve">Kết quả, sự cố mới nhất năm 2026, hạn chế, nguyên nhân, bài học kinh nghiệm</w:t>
             </w:r>
           </w:p>
         </w:tc>
@@ -998,6 +1042,9 @@
         </w:tc>
       </w:tr>
       <w:tr>
+        <w:trPr>
+          <w:cantSplit w:val="true"/>
+        </w:trPr>
         <w:tc>
           <w:tcPr/>
           <w:p>
@@ -1060,6 +1107,9 @@
         </w:tc>
       </w:tr>
       <w:tr>
+        <w:trPr>
+          <w:cantSplit w:val="true"/>
+        </w:trPr>
         <w:tc>
           <w:tcPr/>
           <w:p>
@@ -1122,6 +1172,9 @@
         </w:tc>
       </w:tr>
       <w:tr>
+        <w:trPr>
+          <w:cantSplit w:val="true"/>
+        </w:trPr>
         <w:tc>
           <w:tcPr/>
           <w:p>
@@ -1262,6 +1315,18 @@
     </w:p>
     <w:p>
       <w:pPr>
+        <w:pStyle w:val="Compact"/>
+        <w:numPr>
+          <w:ilvl w:val="0"/>
+          <w:numId w:val="1003"/>
+        </w:numPr>
+      </w:pPr>
+      <w:r>
+        <w:t xml:space="preserve">Threads nổi lên thành điểm khởi phát mới của dư luận, nhất là trong giới trẻ: năm 2026, nhiều làn sóng tranh luận về dự án đầu tư, môi trường, cảnh quan bắt đầu trên Threads rồi mới lan sang Facebook, TikTok và báo chí.</w:t>
+      </w:r>
+    </w:p>
+    <w:p>
+      <w:pPr>
         <w:pStyle w:val="FirstParagraph"/>
       </w:pPr>
       <w:r>
@@ -1317,7 +1382,7 @@
       </w:r>
     </w:p>
     <w:bookmarkEnd w:id="22"/>
-    <w:bookmarkStart w:id="28" w:name="X1a1acdf65848e2110cc8fafdd4f8066daf6352c"/>
+    <w:bookmarkStart w:id="29" w:name="X1a1acdf65848e2110cc8fafdd4f8066daf6352c"/>
     <w:p>
       <w:pPr>
         <w:pStyle w:val="Heading1"/>
@@ -1472,7 +1537,7 @@
         <w:t xml:space="preserve"> </w:t>
       </w:r>
       <w:r>
-        <w:t xml:space="preserve">Phân tán, ẩn danh, xuyên biên giới; phần lớn lưu lượng nằm trên nền tảng nước ngoài (Facebook, YouTube, TikTok).</w:t>
+        <w:t xml:space="preserve">Phân tán, ẩn danh, xuyên biên giới; phần lớn lưu lượng nằm trên nền tảng nước ngoài (Facebook, YouTube, TikTok và gần đây là Threads).</w:t>
       </w:r>
     </w:p>
     <w:p>
@@ -1614,6 +1679,7 @@
       <w:tr>
         <w:trPr>
           <w:tblHeader w:val="true"/>
+          <w:cantSplit w:val="true"/>
           <w:tblHeader w:val="true"/>
         </w:trPr>
         <w:tc>
@@ -1672,6 +1738,9 @@
         </w:tc>
       </w:tr>
       <w:tr>
+        <w:trPr>
+          <w:cantSplit w:val="true"/>
+        </w:trPr>
         <w:tc>
           <w:tcPr/>
           <w:p>
@@ -1719,6 +1788,9 @@
         </w:tc>
       </w:tr>
       <w:tr>
+        <w:trPr>
+          <w:cantSplit w:val="true"/>
+        </w:trPr>
         <w:tc>
           <w:tcPr/>
           <w:p>
@@ -1766,48 +1838,51 @@
         </w:tc>
       </w:tr>
       <w:tr>
-        <w:tc>
-          <w:tcPr/>
-          <w:p>
-            <w:pPr>
-              <w:pStyle w:val="Compact"/>
-              <w:jc w:val="left"/>
-            </w:pPr>
-            <w:r>
-              <w:rPr>
-                <w:sz w:val="23"/>
-              </w:rPr>
-              <w:t xml:space="preserve">Vi phạm, tiêu cực của cán bộ, doanh nghiệp, người nổi tiếng</w:t>
-            </w:r>
-          </w:p>
-        </w:tc>
-        <w:tc>
-          <w:tcPr/>
-          <w:p>
-            <w:pPr>
-              <w:pStyle w:val="Compact"/>
-              <w:jc w:val="left"/>
-            </w:pPr>
-            <w:r>
-              <w:rPr>
-                <w:sz w:val="23"/>
-              </w:rPr>
-              <w:t xml:space="preserve">Quảng cáo sai sự thật của người có ảnh hưởng (vụ kẹo rau củ Kera năm 2025); an toàn thực phẩm</w:t>
-            </w:r>
-          </w:p>
-        </w:tc>
-        <w:tc>
-          <w:tcPr/>
-          <w:p>
-            <w:pPr>
-              <w:pStyle w:val="Compact"/>
-              <w:jc w:val="left"/>
-            </w:pPr>
-            <w:r>
-              <w:rPr>
-                <w:sz w:val="23"/>
-              </w:rPr>
-              <w:t xml:space="preserve">Trung bình đến cao: quy chụp</w:t>
+        <w:trPr>
+          <w:cantSplit w:val="true"/>
+        </w:trPr>
+        <w:tc>
+          <w:tcPr/>
+          <w:p>
+            <w:pPr>
+              <w:pStyle w:val="Compact"/>
+              <w:jc w:val="left"/>
+            </w:pPr>
+            <w:r>
+              <w:rPr>
+                <w:sz w:val="23"/>
+              </w:rPr>
+              <w:t xml:space="preserve">Dự án đầu tư lớn tác động môi trường, cảnh quan, di sản</w:t>
+            </w:r>
+          </w:p>
+        </w:tc>
+        <w:tc>
+          <w:tcPr/>
+          <w:p>
+            <w:pPr>
+              <w:pStyle w:val="Compact"/>
+              <w:jc w:val="left"/>
+            </w:pPr>
+            <w:r>
+              <w:rPr>
+                <w:sz w:val="23"/>
+              </w:rPr>
+              <w:t xml:space="preserve">Dự án Làng Vân dưới chân đèo Hải Vân (Đà Nẵng), đề xuất dự án Safari Ba Vì (Hà Nội) năm 2026</w:t>
+            </w:r>
+          </w:p>
+        </w:tc>
+        <w:tc>
+          <w:tcPr/>
+          <w:p>
+            <w:pPr>
+              <w:pStyle w:val="Compact"/>
+              <w:jc w:val="left"/>
+            </w:pPr>
+            <w:r>
+              <w:rPr>
+                <w:sz w:val="23"/>
+              </w:rPr>
+              <w:t xml:space="preserve">Cao: đối tượng xấu bám vào lo ngại chính đáng về môi trường, minh bạch để quy chụp</w:t>
             </w:r>
             <w:r>
               <w:rPr>
@@ -1825,45 +1900,69 @@
               <w:rPr>
                 <w:sz w:val="23"/>
               </w:rPr>
-              <w:t xml:space="preserve">bản chất chế độ</w:t>
+              <w:t xml:space="preserve">lợi ích nhóm</w:t>
             </w:r>
             <w:r>
               <w:rPr>
                 <w:sz w:val="23"/>
               </w:rPr>
               <w:t xml:space="preserve">”</w:t>
+            </w:r>
+            <w:r>
+              <w:rPr>
+                <w:sz w:val="23"/>
+              </w:rPr>
+              <w:t xml:space="preserve">, kích động chống đối</w:t>
             </w:r>
           </w:p>
         </w:tc>
       </w:tr>
       <w:tr>
-        <w:tc>
-          <w:tcPr/>
-          <w:p>
-            <w:pPr>
-              <w:pStyle w:val="Compact"/>
-              <w:jc w:val="left"/>
-            </w:pPr>
-            <w:r>
-              <w:rPr>
-                <w:sz w:val="23"/>
-              </w:rPr>
-              <w:t xml:space="preserve">Chủ quyền, lịch sử, dân tộc, tôn giáo</w:t>
-            </w:r>
-          </w:p>
-        </w:tc>
-        <w:tc>
-          <w:tcPr/>
-          <w:p>
-            <w:pPr>
-              <w:pStyle w:val="Compact"/>
-              <w:jc w:val="left"/>
-            </w:pPr>
-            <w:r>
-              <w:rPr>
-                <w:sz w:val="23"/>
-              </w:rPr>
-              <w:t xml:space="preserve">Sản phẩm văn hóa nước ngoài chứa hình ảnh</w:t>
+        <w:trPr>
+          <w:cantSplit w:val="true"/>
+        </w:trPr>
+        <w:tc>
+          <w:tcPr/>
+          <w:p>
+            <w:pPr>
+              <w:pStyle w:val="Compact"/>
+              <w:jc w:val="left"/>
+            </w:pPr>
+            <w:r>
+              <w:rPr>
+                <w:sz w:val="23"/>
+              </w:rPr>
+              <w:t xml:space="preserve">Vi phạm, tiêu cực của cán bộ, doanh nghiệp, người nổi tiếng</w:t>
+            </w:r>
+          </w:p>
+        </w:tc>
+        <w:tc>
+          <w:tcPr/>
+          <w:p>
+            <w:pPr>
+              <w:pStyle w:val="Compact"/>
+              <w:jc w:val="left"/>
+            </w:pPr>
+            <w:r>
+              <w:rPr>
+                <w:sz w:val="23"/>
+              </w:rPr>
+              <w:t xml:space="preserve">Quảng cáo sai sự thật của người có ảnh hưởng (vụ kẹo rau củ Kera năm 2025); an toàn thực phẩm</w:t>
+            </w:r>
+          </w:p>
+        </w:tc>
+        <w:tc>
+          <w:tcPr/>
+          <w:p>
+            <w:pPr>
+              <w:pStyle w:val="Compact"/>
+              <w:jc w:val="left"/>
+            </w:pPr>
+            <w:r>
+              <w:rPr>
+                <w:sz w:val="23"/>
+              </w:rPr>
+              <w:t xml:space="preserve">Trung bình đến cao: quy chụp</w:t>
             </w:r>
             <w:r>
               <w:rPr>
@@ -1881,92 +1980,157 @@
               <w:rPr>
                 <w:sz w:val="23"/>
               </w:rPr>
-              <w:t xml:space="preserve">đường lưỡi bò</w:t>
+              <w:t xml:space="preserve">bản chất chế độ</w:t>
             </w:r>
             <w:r>
               <w:rPr>
                 <w:sz w:val="23"/>
               </w:rPr>
               <w:t xml:space="preserve">”</w:t>
-            </w:r>
-            <w:r>
-              <w:rPr>
-                <w:sz w:val="23"/>
-              </w:rPr>
-              <w:t xml:space="preserve"> </w:t>
-            </w:r>
-            <w:r>
-              <w:rPr>
-                <w:sz w:val="23"/>
-              </w:rPr>
-              <w:t xml:space="preserve">phi pháp; tác phẩm đề tài lịch sử, chiến tranh</w:t>
-            </w:r>
-          </w:p>
-        </w:tc>
-        <w:tc>
-          <w:tcPr/>
-          <w:p>
-            <w:pPr>
-              <w:pStyle w:val="Compact"/>
-              <w:jc w:val="left"/>
-            </w:pPr>
-            <w:r>
-              <w:rPr>
-                <w:sz w:val="23"/>
-              </w:rPr>
-              <w:t xml:space="preserve">Rất cao: kích động tư tưởng cực đoan, xét lại lịch sử</w:t>
             </w:r>
           </w:p>
         </w:tc>
       </w:tr>
       <w:tr>
-        <w:tc>
-          <w:tcPr/>
-          <w:p>
-            <w:pPr>
-              <w:pStyle w:val="Compact"/>
-              <w:jc w:val="left"/>
-            </w:pPr>
-            <w:r>
-              <w:rPr>
-                <w:sz w:val="23"/>
-              </w:rPr>
-              <w:t xml:space="preserve">Sự kiện chính trị, đối ngoại lớn</w:t>
-            </w:r>
-          </w:p>
-        </w:tc>
-        <w:tc>
-          <w:tcPr/>
-          <w:p>
-            <w:pPr>
-              <w:pStyle w:val="Compact"/>
-              <w:jc w:val="left"/>
-            </w:pPr>
-            <w:r>
-              <w:rPr>
-                <w:sz w:val="23"/>
-              </w:rPr>
-              <w:t xml:space="preserve">Đại hội Đảng, bầu cử, ngày lễ lớn, chuyến thăm cấp cao</w:t>
-            </w:r>
-          </w:p>
-        </w:tc>
-        <w:tc>
-          <w:tcPr/>
-          <w:p>
-            <w:pPr>
-              <w:pStyle w:val="Compact"/>
-              <w:jc w:val="left"/>
-            </w:pPr>
-            <w:r>
-              <w:rPr>
-                <w:sz w:val="23"/>
-              </w:rPr>
-              <w:t xml:space="preserve">Rất cao: chiến dịch có tổ chức, chuẩn bị từ trước</w:t>
+        <w:trPr>
+          <w:cantSplit w:val="true"/>
+        </w:trPr>
+        <w:tc>
+          <w:tcPr/>
+          <w:p>
+            <w:pPr>
+              <w:pStyle w:val="Compact"/>
+              <w:jc w:val="left"/>
+            </w:pPr>
+            <w:r>
+              <w:rPr>
+                <w:sz w:val="23"/>
+              </w:rPr>
+              <w:t xml:space="preserve">Chủ quyền, lịch sử, dân tộc, tôn giáo</w:t>
+            </w:r>
+          </w:p>
+        </w:tc>
+        <w:tc>
+          <w:tcPr/>
+          <w:p>
+            <w:pPr>
+              <w:pStyle w:val="Compact"/>
+              <w:jc w:val="left"/>
+            </w:pPr>
+            <w:r>
+              <w:rPr>
+                <w:sz w:val="23"/>
+              </w:rPr>
+              <w:t xml:space="preserve">Sản phẩm văn hóa nước ngoài chứa hình ảnh</w:t>
+            </w:r>
+            <w:r>
+              <w:rPr>
+                <w:sz w:val="23"/>
+              </w:rPr>
+              <w:t xml:space="preserve"> </w:t>
+            </w:r>
+            <w:r>
+              <w:rPr>
+                <w:sz w:val="23"/>
+              </w:rPr>
+              <w:t xml:space="preserve">“</w:t>
+            </w:r>
+            <w:r>
+              <w:rPr>
+                <w:sz w:val="23"/>
+              </w:rPr>
+              <w:t xml:space="preserve">đường lưỡi bò</w:t>
+            </w:r>
+            <w:r>
+              <w:rPr>
+                <w:sz w:val="23"/>
+              </w:rPr>
+              <w:t xml:space="preserve">”</w:t>
+            </w:r>
+            <w:r>
+              <w:rPr>
+                <w:sz w:val="23"/>
+              </w:rPr>
+              <w:t xml:space="preserve"> </w:t>
+            </w:r>
+            <w:r>
+              <w:rPr>
+                <w:sz w:val="23"/>
+              </w:rPr>
+              <w:t xml:space="preserve">phi pháp; tác phẩm đề tài lịch sử, chiến tranh</w:t>
+            </w:r>
+          </w:p>
+        </w:tc>
+        <w:tc>
+          <w:tcPr/>
+          <w:p>
+            <w:pPr>
+              <w:pStyle w:val="Compact"/>
+              <w:jc w:val="left"/>
+            </w:pPr>
+            <w:r>
+              <w:rPr>
+                <w:sz w:val="23"/>
+              </w:rPr>
+              <w:t xml:space="preserve">Rất cao: kích động tư tưởng cực đoan, xét lại lịch sử</w:t>
             </w:r>
           </w:p>
         </w:tc>
       </w:tr>
       <w:tr>
+        <w:trPr>
+          <w:cantSplit w:val="true"/>
+        </w:trPr>
+        <w:tc>
+          <w:tcPr/>
+          <w:p>
+            <w:pPr>
+              <w:pStyle w:val="Compact"/>
+              <w:jc w:val="left"/>
+            </w:pPr>
+            <w:r>
+              <w:rPr>
+                <w:sz w:val="23"/>
+              </w:rPr>
+              <w:t xml:space="preserve">Sự kiện chính trị, đối ngoại lớn</w:t>
+            </w:r>
+          </w:p>
+        </w:tc>
+        <w:tc>
+          <w:tcPr/>
+          <w:p>
+            <w:pPr>
+              <w:pStyle w:val="Compact"/>
+              <w:jc w:val="left"/>
+            </w:pPr>
+            <w:r>
+              <w:rPr>
+                <w:sz w:val="23"/>
+              </w:rPr>
+              <w:t xml:space="preserve">Đại hội Đảng, bầu cử, ngày lễ lớn, chuyến thăm cấp cao</w:t>
+            </w:r>
+          </w:p>
+        </w:tc>
+        <w:tc>
+          <w:tcPr/>
+          <w:p>
+            <w:pPr>
+              <w:pStyle w:val="Compact"/>
+              <w:jc w:val="left"/>
+            </w:pPr>
+            <w:r>
+              <w:rPr>
+                <w:sz w:val="23"/>
+              </w:rPr>
+              <w:t xml:space="preserve">Rất cao: chiến dịch có tổ chức, chuẩn bị từ trước</w:t>
+            </w:r>
+          </w:p>
+        </w:tc>
+      </w:tr>
+      <w:tr>
+        <w:trPr>
+          <w:cantSplit w:val="true"/>
+        </w:trPr>
         <w:tc>
           <w:tcPr/>
           <w:p>
@@ -2197,7 +2361,40 @@
         <w:t xml:space="preserve"> </w:t>
       </w:r>
       <w:r>
-        <w:t xml:space="preserve">Kêu gọi tụ tập, gây rối, khiếu kiện đông người, tẩy chay; quyên góp, gây quỹ trái phép.</w:t>
+        <w:t xml:space="preserve">Kêu gọi tụ tập, gây rối, khiếu kiện đông người, tẩy chay; quyên góp, gây quỹ trái phép. Từ năm 2025, các trang của tổ chức khủng bố Việt Tân lợi dụng các cuộc biểu tình của giới trẻ ở Nepal, Indonesia để kêu gọi</w:t>
+      </w:r>
+      <w:r>
+        <w:t xml:space="preserve"> </w:t>
+      </w:r>
+      <w:r>
+        <w:t xml:space="preserve">“</w:t>
+      </w:r>
+      <w:r>
+        <w:t xml:space="preserve">cách mạng Gen Z</w:t>
+      </w:r>
+      <w:r>
+        <w:t xml:space="preserve">”</w:t>
+      </w:r>
+      <w:r>
+        <w:t xml:space="preserve"> </w:t>
+      </w:r>
+      <w:r>
+        <w:t xml:space="preserve">tại Việt Nam; một số tài khoản trên Threads kêu gọi</w:t>
+      </w:r>
+      <w:r>
+        <w:t xml:space="preserve"> </w:t>
+      </w:r>
+      <w:r>
+        <w:t xml:space="preserve">“</w:t>
+      </w:r>
+      <w:r>
+        <w:t xml:space="preserve">đứng dậy đấu tranh</w:t>
+      </w:r>
+      <w:r>
+        <w:t xml:space="preserve">”</w:t>
+      </w:r>
+      <w:r>
+        <w:t xml:space="preserve">.</w:t>
       </w:r>
     </w:p>
     <w:p>
@@ -2323,6 +2520,7 @@
       <w:tr>
         <w:trPr>
           <w:tblHeader w:val="true"/>
+          <w:cantSplit w:val="true"/>
           <w:tblHeader w:val="true"/>
         </w:trPr>
         <w:tc>
@@ -2399,6 +2597,9 @@
         </w:tc>
       </w:tr>
       <w:tr>
+        <w:trPr>
+          <w:cantSplit w:val="true"/>
+        </w:trPr>
         <w:tc>
           <w:tcPr/>
           <w:p>
@@ -2461,6 +2662,9 @@
         </w:tc>
       </w:tr>
       <w:tr>
+        <w:trPr>
+          <w:cantSplit w:val="true"/>
+        </w:trPr>
         <w:tc>
           <w:tcPr/>
           <w:p>
@@ -2523,6 +2727,9 @@
         </w:tc>
       </w:tr>
       <w:tr>
+        <w:trPr>
+          <w:cantSplit w:val="true"/>
+        </w:trPr>
         <w:tc>
           <w:tcPr/>
           <w:p>
@@ -2585,6 +2792,9 @@
         </w:tc>
       </w:tr>
       <w:tr>
+        <w:trPr>
+          <w:cantSplit w:val="true"/>
+        </w:trPr>
         <w:tc>
           <w:tcPr/>
           <w:p>
@@ -2647,6 +2857,9 @@
         </w:tc>
       </w:tr>
       <w:tr>
+        <w:trPr>
+          <w:cantSplit w:val="true"/>
+        </w:trPr>
         <w:tc>
           <w:tcPr/>
           <w:p>
@@ -2757,6 +2970,250 @@
         <w:t xml:space="preserve">Ghi chú: mốc thời gian mang tính ước lượng; đề nghị Cục Thông tin điện tử và Chuyển đổi số xác lập số liệu nền từ dữ liệu giám sát thực tế trước khi hoàn thiện tham luận.</w:t>
       </w:r>
     </w:p>
+    <w:bookmarkEnd w:id="27"/>
+    <w:bookmarkStart w:id="28" w:name="Xda08df5e4c7f9b5a00f103574e851ca999c26a9"/>
+    <w:p>
+      <w:pPr>
+        <w:pStyle w:val="Heading2"/>
+      </w:pPr>
+      <w:r>
+        <w:t xml:space="preserve">6. Tác động của Threads: điểm khởi phát mới của khủng hoảng truyền thông</w:t>
+      </w:r>
+    </w:p>
+    <w:p>
+      <w:pPr>
+        <w:pStyle w:val="FirstParagraph"/>
+      </w:pPr>
+      <w:r>
+        <w:rPr>
+          <w:b/>
+          <w:bCs/>
+        </w:rPr>
+        <w:t xml:space="preserve">a) Quy mô, đặc điểm.</w:t>
+      </w:r>
+    </w:p>
+    <w:p>
+      <w:pPr>
+        <w:pStyle w:val="Compact"/>
+        <w:numPr>
+          <w:ilvl w:val="0"/>
+          <w:numId w:val="1008"/>
+        </w:numPr>
+      </w:pPr>
+      <w:r>
+        <w:t xml:space="preserve">Threads (thuộc Meta) đạt khoảng 500 triệu người dùng hoạt động hằng tháng trên toàn cầu (Meta công bố tháng 6/2026). Tại Việt Nam, Meta chưa công bố số liệu chính thức; một số ước tính thị trường cho thấy khoảng 4 triệu người dùng, tập trung ở Gen Z, sinh viên, người trẻ đô thị.</w:t>
+      </w:r>
+    </w:p>
+    <w:p>
+      <w:pPr>
+        <w:pStyle w:val="Compact"/>
+        <w:numPr>
+          <w:ilvl w:val="0"/>
+          <w:numId w:val="1008"/>
+        </w:numPr>
+      </w:pPr>
+      <w:r>
+        <w:t xml:space="preserve">Threads thiên về văn bản và thảo luận công khai. Thuật toán đề xuất đưa bài viết của tài khoản nhỏ, của người lạ tới đông người dùng, nên 1 bài đăng không cần nhiều người theo dõi vẫn có thể lan rộng trong vài giờ.</w:t>
+      </w:r>
+    </w:p>
+    <w:p>
+      <w:pPr>
+        <w:pStyle w:val="Compact"/>
+        <w:numPr>
+          <w:ilvl w:val="0"/>
+          <w:numId w:val="1008"/>
+        </w:numPr>
+      </w:pPr>
+      <w:r>
+        <w:t xml:space="preserve">Cộng đồng Threads đề cao lối nói thẳng, châm biếm và hành động tập thể theo trào lưu (hashtag, khẩu hiệu</w:t>
+      </w:r>
+      <w:r>
+        <w:t xml:space="preserve"> </w:t>
+      </w:r>
+      <w:r>
+        <w:t xml:space="preserve">“</w:t>
+      </w:r>
+      <w:r>
+        <w:t xml:space="preserve">Stand with…</w:t>
+      </w:r>
+      <w:r>
+        <w:t xml:space="preserve">”</w:t>
+      </w:r>
+      <w:r>
+        <w:t xml:space="preserve">). Ảnh chụp màn hình từ Threads nhanh chóng lan sang Facebook, TikTok và báo chí.</w:t>
+      </w:r>
+    </w:p>
+    <w:p>
+      <w:pPr>
+        <w:pStyle w:val="FirstParagraph"/>
+      </w:pPr>
+      <w:r>
+        <w:rPr>
+          <w:b/>
+          <w:bCs/>
+        </w:rPr>
+        <w:t xml:space="preserve">b) Tác động tới công tác phòng ngừa, xử lý khủng hoảng.</w:t>
+      </w:r>
+    </w:p>
+    <w:p>
+      <w:pPr>
+        <w:pStyle w:val="Compact"/>
+        <w:numPr>
+          <w:ilvl w:val="0"/>
+          <w:numId w:val="1009"/>
+        </w:numPr>
+      </w:pPr>
+      <w:r>
+        <w:rPr>
+          <w:b/>
+          <w:bCs/>
+        </w:rPr>
+        <w:t xml:space="preserve">Điểm khởi phát mới, khó lường.</w:t>
+      </w:r>
+      <w:r>
+        <w:t xml:space="preserve"> </w:t>
+      </w:r>
+      <w:r>
+        <w:t xml:space="preserve">Nhiều làn sóng dư luận năm 2026 bắt đầu trên Threads (dự án Làng Vân ở Đà Nẵng từ giữa tháng 7/2026; đề xuất dự án Safari Ba Vì ở Hà Nội tháng 10/2026) trước khi hệ thống giám sát truyền thống ghi nhận.</w:t>
+      </w:r>
+    </w:p>
+    <w:p>
+      <w:pPr>
+        <w:pStyle w:val="Compact"/>
+        <w:numPr>
+          <w:ilvl w:val="0"/>
+          <w:numId w:val="1009"/>
+        </w:numPr>
+      </w:pPr>
+      <w:r>
+        <w:rPr>
+          <w:b/>
+          <w:bCs/>
+        </w:rPr>
+        <w:t xml:space="preserve">Khoảng trống hiện diện của thông tin chính thống.</w:t>
+      </w:r>
+      <w:r>
+        <w:t xml:space="preserve"> </w:t>
+      </w:r>
+      <w:r>
+        <w:t xml:space="preserve">Cơ quan nhà nước và báo chí chủ lực hiện diện mờ nhạt trên Threads; khi tranh luận bùng phát, người dùng thiếu nguồn tin chính thức để đối chiếu ngay tại chỗ.</w:t>
+      </w:r>
+    </w:p>
+    <w:p>
+      <w:pPr>
+        <w:pStyle w:val="Compact"/>
+        <w:numPr>
+          <w:ilvl w:val="0"/>
+          <w:numId w:val="1009"/>
+        </w:numPr>
+      </w:pPr>
+      <w:r>
+        <w:rPr>
+          <w:b/>
+          <w:bCs/>
+        </w:rPr>
+        <w:t xml:space="preserve">Vùng quản lý mới.</w:t>
+      </w:r>
+      <w:r>
+        <w:t xml:space="preserve"> </w:t>
+      </w:r>
+      <w:r>
+        <w:t xml:space="preserve">Năm 2026 là năm đầu tiên Meta xử lý yêu cầu chặn, gỡ nội dung vi phạm trên Threads theo yêu cầu của cơ quan quản lý Việt Nam (Cục Phát thanh, truyền hình và thông tin điện tử công bố ngày 24/6/2026). Cơ chế giám sát, phối hợp trên Threads mới ở bước đầu.</w:t>
+      </w:r>
+    </w:p>
+    <w:p>
+      <w:pPr>
+        <w:pStyle w:val="Compact"/>
+        <w:numPr>
+          <w:ilvl w:val="0"/>
+          <w:numId w:val="1009"/>
+        </w:numPr>
+      </w:pPr>
+      <w:r>
+        <w:rPr>
+          <w:b/>
+          <w:bCs/>
+        </w:rPr>
+        <w:t xml:space="preserve">Nguy cơ chính trị hóa tranh luận chính đáng.</w:t>
+      </w:r>
+      <w:r>
+        <w:t xml:space="preserve"> </w:t>
+      </w:r>
+      <w:r>
+        <w:t xml:space="preserve">Đối tượng phản động chen vào các cuộc thảo luận về môi trường, quy hoạch, quyền lợi người dân để chuyển hướng sang kêu gọi chống đối,</w:t>
+      </w:r>
+      <w:r>
+        <w:t xml:space="preserve"> </w:t>
+      </w:r>
+      <w:r>
+        <w:t xml:space="preserve">“</w:t>
+      </w:r>
+      <w:r>
+        <w:t xml:space="preserve">cách mạng Gen Z</w:t>
+      </w:r>
+      <w:r>
+        <w:t xml:space="preserve">”</w:t>
+      </w:r>
+      <w:r>
+        <w:t xml:space="preserve">.</w:t>
+      </w:r>
+    </w:p>
+    <w:p>
+      <w:pPr>
+        <w:pStyle w:val="Compact"/>
+        <w:numPr>
+          <w:ilvl w:val="0"/>
+          <w:numId w:val="1009"/>
+        </w:numPr>
+      </w:pPr>
+      <w:r>
+        <w:rPr>
+          <w:b/>
+          <w:bCs/>
+        </w:rPr>
+        <w:t xml:space="preserve">Nguy cơ hiệu ứng ngược khi chỉ chặn, gỡ.</w:t>
+      </w:r>
+      <w:r>
+        <w:t xml:space="preserve"> </w:t>
+      </w:r>
+      <w:r>
+        <w:t xml:space="preserve">Người dùng Threads thường chia sẻ lại thông báo nền tảng hạn chế hiển thị bài viết; nếu thiếu thông tin giải thích đi kèm, biện pháp kỹ thuật dễ làm vụ việc lan rộng hơn và giảm niềm tin.</w:t>
+      </w:r>
+    </w:p>
+    <w:p>
+      <w:pPr>
+        <w:pStyle w:val="Compact"/>
+        <w:numPr>
+          <w:ilvl w:val="0"/>
+          <w:numId w:val="1009"/>
+        </w:numPr>
+      </w:pPr>
+      <w:r>
+        <w:rPr>
+          <w:b/>
+          <w:bCs/>
+        </w:rPr>
+        <w:t xml:space="preserve">Rủi ro phụ thuộc nền tảng.</w:t>
+      </w:r>
+      <w:r>
+        <w:t xml:space="preserve"> </w:t>
+      </w:r>
+      <w:r>
+        <w:t xml:space="preserve">Sự cố gián đoạn đồng loạt Facebook, Messenger, Instagram, Threads tại Việt Nam ngày 12/6/2026 cho thấy yêu cầu duy trì kênh thông tin dự phòng: cổng thông tin điện tử, ứng dụng nhắn tin trong nước, hệ thống thông tin cơ sở.</w:t>
+      </w:r>
+    </w:p>
+    <w:p>
+      <w:pPr>
+        <w:pStyle w:val="FirstParagraph"/>
+      </w:pPr>
+      <w:r>
+        <w:rPr>
+          <w:i/>
+          <w:iCs/>
+        </w:rPr>
+        <w:t xml:space="preserve">Ghi chú: diễn biến trên Threads tổng hợp từ báo chí trong nước, phản ánh của người dùng và một số nguồn nước ngoài; đề nghị Cục Thông tin điện tử và Chuyển đổi số đối chiếu với dữ liệu giám sát.</w:t>
+      </w:r>
+    </w:p>
     <w:p>
       <w:pPr>
         <w:pStyle w:val="BlockText"/>
@@ -2777,9 +3234,9 @@
         <w:t xml:space="preserve">”</w:t>
       </w:r>
     </w:p>
-    <w:bookmarkEnd w:id="27"/>
     <w:bookmarkEnd w:id="28"/>
-    <w:bookmarkStart w:id="33" w:name="X512ab98d70e9353645295d7e361a7347f1968c9"/>
+    <w:bookmarkEnd w:id="29"/>
+    <w:bookmarkStart w:id="35" w:name="X512ab98d70e9353645295d7e361a7347f1968c9"/>
     <w:p>
       <w:pPr>
         <w:pStyle w:val="Heading1"/>
@@ -2788,7 +3245,7 @@
         <w:t xml:space="preserve">Phần II. Kết quả, hạn chế và bài học kinh nghiệm</w:t>
       </w:r>
     </w:p>
-    <w:bookmarkStart w:id="29" w:name="kết-quả-nổi-bật"/>
+    <w:bookmarkStart w:id="30" w:name="kết-quả-nổi-bật"/>
     <w:p>
       <w:pPr>
         <w:pStyle w:val="Heading2"/>
@@ -2814,7 +3271,7 @@
         <w:pStyle w:val="Compact"/>
         <w:numPr>
           <w:ilvl w:val="0"/>
-          <w:numId w:val="1008"/>
+          <w:numId w:val="1010"/>
         </w:numPr>
       </w:pPr>
       <w:r>
@@ -2826,7 +3283,7 @@
         <w:pStyle w:val="Compact"/>
         <w:numPr>
           <w:ilvl w:val="0"/>
-          <w:numId w:val="1008"/>
+          <w:numId w:val="1010"/>
         </w:numPr>
       </w:pPr>
       <w:r>
@@ -2838,7 +3295,7 @@
         <w:pStyle w:val="Compact"/>
         <w:numPr>
           <w:ilvl w:val="0"/>
-          <w:numId w:val="1008"/>
+          <w:numId w:val="1010"/>
         </w:numPr>
       </w:pPr>
       <w:r>
@@ -2850,7 +3307,7 @@
         <w:pStyle w:val="Compact"/>
         <w:numPr>
           <w:ilvl w:val="0"/>
-          <w:numId w:val="1008"/>
+          <w:numId w:val="1010"/>
         </w:numPr>
       </w:pPr>
       <w:r>
@@ -2862,7 +3319,7 @@
         <w:pStyle w:val="Compact"/>
         <w:numPr>
           <w:ilvl w:val="0"/>
-          <w:numId w:val="1008"/>
+          <w:numId w:val="1010"/>
         </w:numPr>
       </w:pPr>
       <w:r>
@@ -2874,7 +3331,7 @@
         <w:pStyle w:val="Compact"/>
         <w:numPr>
           <w:ilvl w:val="0"/>
-          <w:numId w:val="1008"/>
+          <w:numId w:val="1010"/>
         </w:numPr>
       </w:pPr>
       <w:r>
@@ -2886,7 +3343,7 @@
         <w:pStyle w:val="Compact"/>
         <w:numPr>
           <w:ilvl w:val="0"/>
-          <w:numId w:val="1008"/>
+          <w:numId w:val="1010"/>
         </w:numPr>
       </w:pPr>
       <w:r>
@@ -2898,7 +3355,7 @@
         <w:pStyle w:val="Compact"/>
         <w:numPr>
           <w:ilvl w:val="0"/>
-          <w:numId w:val="1008"/>
+          <w:numId w:val="1010"/>
         </w:numPr>
       </w:pPr>
       <w:r>
@@ -2910,7 +3367,7 @@
         <w:pStyle w:val="Compact"/>
         <w:numPr>
           <w:ilvl w:val="0"/>
-          <w:numId w:val="1008"/>
+          <w:numId w:val="1010"/>
         </w:numPr>
       </w:pPr>
       <w:r>
@@ -2922,7 +3379,7 @@
         <w:pStyle w:val="Compact"/>
         <w:numPr>
           <w:ilvl w:val="0"/>
-          <w:numId w:val="1008"/>
+          <w:numId w:val="1010"/>
         </w:numPr>
       </w:pPr>
       <w:r>
@@ -2949,7 +3406,7 @@
         <w:pStyle w:val="Compact"/>
         <w:numPr>
           <w:ilvl w:val="0"/>
-          <w:numId w:val="1008"/>
+          <w:numId w:val="1010"/>
         </w:numPr>
       </w:pPr>
       <w:r>
@@ -2973,7 +3430,7 @@
         <w:pStyle w:val="Compact"/>
         <w:numPr>
           <w:ilvl w:val="0"/>
-          <w:numId w:val="1009"/>
+          <w:numId w:val="1011"/>
         </w:numPr>
       </w:pPr>
       <w:r>
@@ -2985,7 +3442,7 @@
         <w:pStyle w:val="Compact"/>
         <w:numPr>
           <w:ilvl w:val="0"/>
-          <w:numId w:val="1009"/>
+          <w:numId w:val="1011"/>
         </w:numPr>
       </w:pPr>
       <w:r>
@@ -2997,11 +3454,23 @@
         <w:pStyle w:val="Compact"/>
         <w:numPr>
           <w:ilvl w:val="0"/>
-          <w:numId w:val="1009"/>
-        </w:numPr>
-      </w:pPr>
-      <w:r>
-        <w:t xml:space="preserve">6 tháng đầu năm 2026: TikTok chặn, gỡ khoảng 115.000 video; YouTube gần 13.000 video; Facebook hơn 2.100 nội dung vi phạm.</w:t>
+          <w:numId w:val="1011"/>
+        </w:numPr>
+      </w:pPr>
+      <w:r>
+        <w:t xml:space="preserve">6 tháng đầu năm 2026: TikTok chặn, gỡ khoảng 115.000 video; YouTube gần 13.000 video; các nền tảng của Meta (Facebook, Instagram, Messenger, Threads) chặn, gỡ 63 tài khoản, trang, nhóm và 2.147 nội dung vi phạm.</w:t>
+      </w:r>
+    </w:p>
+    <w:p>
+      <w:pPr>
+        <w:pStyle w:val="Compact"/>
+        <w:numPr>
+          <w:ilvl w:val="0"/>
+          <w:numId w:val="1011"/>
+        </w:numPr>
+      </w:pPr>
+      <w:r>
+        <w:t xml:space="preserve">Năm 2026 là năm đầu tiên Meta đáp ứng yêu cầu chặn, gỡ nội dung vi phạm trên Threads, đưa Threads vào cơ chế quản lý như các mạng xã hội xuyên biên giới khác.</w:t>
       </w:r>
     </w:p>
     <w:p>
@@ -3033,7 +3502,7 @@
         <w:pStyle w:val="Compact"/>
         <w:numPr>
           <w:ilvl w:val="0"/>
-          <w:numId w:val="1010"/>
+          <w:numId w:val="1012"/>
         </w:numPr>
       </w:pPr>
       <w:r>
@@ -3045,7 +3514,7 @@
         <w:pStyle w:val="Compact"/>
         <w:numPr>
           <w:ilvl w:val="0"/>
-          <w:numId w:val="1010"/>
+          <w:numId w:val="1012"/>
         </w:numPr>
       </w:pPr>
       <w:r>
@@ -3057,7 +3526,7 @@
         <w:pStyle w:val="Compact"/>
         <w:numPr>
           <w:ilvl w:val="0"/>
-          <w:numId w:val="1010"/>
+          <w:numId w:val="1012"/>
         </w:numPr>
       </w:pPr>
       <w:r>
@@ -3132,7 +3601,7 @@
         <w:pStyle w:val="Compact"/>
         <w:numPr>
           <w:ilvl w:val="0"/>
-          <w:numId w:val="1011"/>
+          <w:numId w:val="1013"/>
         </w:numPr>
       </w:pPr>
       <w:r>
@@ -3144,7 +3613,7 @@
         <w:pStyle w:val="Compact"/>
         <w:numPr>
           <w:ilvl w:val="0"/>
-          <w:numId w:val="1011"/>
+          <w:numId w:val="1013"/>
         </w:numPr>
       </w:pPr>
       <w:r>
@@ -3163,22 +3632,590 @@
         <w:t xml:space="preserve">Gợi ý: tổ biên tập bổ sung 1 đến 2 vụ việc năm 2026 thuộc lĩnh vực văn hóa, thể thao, du lịch, báo chí do Bộ VHTTDL trực tiếp xử lý thành công (Văn phòng Bộ, Cục Báo chí cung cấp).</w:t>
       </w:r>
     </w:p>
-    <w:bookmarkEnd w:id="29"/>
-    <w:bookmarkStart w:id="30" w:name="hạn-chế-bất-cập"/>
+    <w:bookmarkEnd w:id="30"/>
+    <w:bookmarkStart w:id="31" w:name="Xd73746cb9ee23f35aeefdb2c94377cdf81c0227"/>
     <w:p>
       <w:pPr>
         <w:pStyle w:val="Heading2"/>
       </w:pPr>
       <w:r>
-        <w:t xml:space="preserve">2. Hạn chế, bất cập</w:t>
-      </w:r>
-    </w:p>
-    <w:p>
-      <w:pPr>
-        <w:pStyle w:val="Compact"/>
-        <w:numPr>
-          <w:ilvl w:val="0"/>
-          <w:numId w:val="1012"/>
+        <w:t xml:space="preserve">2. Một số sự cố mới nhất năm 2026 và bài học</w:t>
+      </w:r>
+    </w:p>
+    <w:tbl>
+      <w:tblPr>
+        <w:tblStyle w:val="Table"/>
+        <w:tblW w:type="pct" w:w="5000"/>
+        <w:jc w:val="start"/>
+        <w:tblBorders>
+          <w:top w:val="single" w:sz="4" w:space="0" w:color="8A9BB0"/>
+          <w:left w:val="single" w:sz="4" w:space="0" w:color="8A9BB0"/>
+          <w:bottom w:val="single" w:sz="4" w:space="0" w:color="8A9BB0"/>
+          <w:right w:val="single" w:sz="4" w:space="0" w:color="8A9BB0"/>
+          <w:insideH w:val="single" w:sz="4" w:space="0" w:color="8A9BB0"/>
+          <w:insideV w:val="single" w:sz="4" w:space="0" w:color="8A9BB0"/>
+        </w:tblBorders>
+        <w:tblLook w:firstRow="1" w:lastRow="0" w:firstColumn="0" w:lastColumn="0" w:noHBand="0" w:noVBand="0" w:val="0020"/>
+      </w:tblPr>
+      <w:tblGrid>
+        <w:gridCol w:w="1230"/>
+        <w:gridCol w:w="1614"/>
+        <w:gridCol w:w="2998"/>
+        <w:gridCol w:w="2076"/>
+      </w:tblGrid>
+      <w:tr>
+        <w:trPr>
+          <w:tblHeader w:val="true"/>
+          <w:cantSplit w:val="true"/>
+          <w:tblHeader w:val="true"/>
+        </w:trPr>
+        <w:tc>
+          <w:tcPr>
+            <w:shd w:val="clear" w:color="auto" w:fill="DCE6F0"/>
+          </w:tcPr>
+          <w:p>
+            <w:pPr>
+              <w:pStyle w:val="Compact"/>
+              <w:jc w:val="left"/>
+            </w:pPr>
+            <w:r>
+              <w:rPr>
+                <w:b/>
+                <w:sz w:val="23"/>
+              </w:rPr>
+              <w:t xml:space="preserve">Thời gian</w:t>
+            </w:r>
+          </w:p>
+        </w:tc>
+        <w:tc>
+          <w:tcPr>
+            <w:shd w:val="clear" w:color="auto" w:fill="DCE6F0"/>
+          </w:tcPr>
+          <w:p>
+            <w:pPr>
+              <w:pStyle w:val="Compact"/>
+              <w:jc w:val="left"/>
+            </w:pPr>
+            <w:r>
+              <w:rPr>
+                <w:b/>
+                <w:sz w:val="23"/>
+              </w:rPr>
+              <w:t xml:space="preserve">Sự cố</w:t>
+            </w:r>
+          </w:p>
+        </w:tc>
+        <w:tc>
+          <w:tcPr>
+            <w:shd w:val="clear" w:color="auto" w:fill="DCE6F0"/>
+          </w:tcPr>
+          <w:p>
+            <w:pPr>
+              <w:pStyle w:val="Compact"/>
+              <w:jc w:val="left"/>
+            </w:pPr>
+            <w:r>
+              <w:rPr>
+                <w:b/>
+                <w:sz w:val="23"/>
+              </w:rPr>
+              <w:t xml:space="preserve">Diễn biến chính</w:t>
+            </w:r>
+          </w:p>
+        </w:tc>
+        <w:tc>
+          <w:tcPr>
+            <w:shd w:val="clear" w:color="auto" w:fill="DCE6F0"/>
+          </w:tcPr>
+          <w:p>
+            <w:pPr>
+              <w:pStyle w:val="Compact"/>
+              <w:jc w:val="left"/>
+            </w:pPr>
+            <w:r>
+              <w:rPr>
+                <w:b/>
+                <w:sz w:val="23"/>
+              </w:rPr>
+              <w:t xml:space="preserve">Bài học</w:t>
+            </w:r>
+          </w:p>
+        </w:tc>
+      </w:tr>
+      <w:tr>
+        <w:trPr>
+          <w:cantSplit w:val="true"/>
+        </w:trPr>
+        <w:tc>
+          <w:tcPr/>
+          <w:p>
+            <w:pPr>
+              <w:pStyle w:val="Compact"/>
+              <w:jc w:val="left"/>
+            </w:pPr>
+            <w:r>
+              <w:rPr>
+                <w:sz w:val="23"/>
+              </w:rPr>
+              <w:t xml:space="preserve">12/6/2026</w:t>
+            </w:r>
+          </w:p>
+        </w:tc>
+        <w:tc>
+          <w:tcPr/>
+          <w:p>
+            <w:pPr>
+              <w:pStyle w:val="Compact"/>
+              <w:jc w:val="left"/>
+            </w:pPr>
+            <w:r>
+              <w:rPr>
+                <w:sz w:val="23"/>
+              </w:rPr>
+              <w:t xml:space="preserve">Gián đoạn đồng loạt Facebook, Messenger, Instagram, Threads tại Việt Nam</w:t>
+            </w:r>
+          </w:p>
+        </w:tc>
+        <w:tc>
+          <w:tcPr/>
+          <w:p>
+            <w:pPr>
+              <w:pStyle w:val="Compact"/>
+              <w:jc w:val="left"/>
+            </w:pPr>
+            <w:r>
+              <w:rPr>
+                <w:sz w:val="23"/>
+              </w:rPr>
+              <w:t xml:space="preserve">Người dùng mất kênh liên lạc, tiếp nhận thông tin trong thời gian sự cố</w:t>
+            </w:r>
+          </w:p>
+        </w:tc>
+        <w:tc>
+          <w:tcPr/>
+          <w:p>
+            <w:pPr>
+              <w:pStyle w:val="Compact"/>
+              <w:jc w:val="left"/>
+            </w:pPr>
+            <w:r>
+              <w:rPr>
+                <w:sz w:val="23"/>
+              </w:rPr>
+              <w:t xml:space="preserve">Duy trì kênh thông tin dự phòng; không phụ thuộc hoàn toàn vào nền tảng nước ngoài</w:t>
+            </w:r>
+          </w:p>
+        </w:tc>
+      </w:tr>
+      <w:tr>
+        <w:trPr>
+          <w:cantSplit w:val="true"/>
+        </w:trPr>
+        <w:tc>
+          <w:tcPr/>
+          <w:p>
+            <w:pPr>
+              <w:pStyle w:val="Compact"/>
+              <w:jc w:val="left"/>
+            </w:pPr>
+            <w:r>
+              <w:rPr>
+                <w:sz w:val="23"/>
+              </w:rPr>
+              <w:t xml:space="preserve">Từ giữa tháng 7/2026</w:t>
+            </w:r>
+          </w:p>
+        </w:tc>
+        <w:tc>
+          <w:tcPr/>
+          <w:p>
+            <w:pPr>
+              <w:pStyle w:val="Compact"/>
+              <w:jc w:val="left"/>
+            </w:pPr>
+            <w:r>
+              <w:rPr>
+                <w:sz w:val="23"/>
+              </w:rPr>
+              <w:t xml:space="preserve">Dự án Làng Vân dưới chân đèo Hải Vân (Đà Nẵng)</w:t>
+            </w:r>
+          </w:p>
+        </w:tc>
+        <w:tc>
+          <w:tcPr/>
+          <w:p>
+            <w:pPr>
+              <w:pStyle w:val="Compact"/>
+              <w:jc w:val="left"/>
+            </w:pPr>
+            <w:r>
+              <w:rPr>
+                <w:sz w:val="23"/>
+              </w:rPr>
+              <w:t xml:space="preserve">Bài đăng trên Threads so sánh hình ảnh trước và sau san lấp mặt bằng dự án (khởi công tháng 6/2025, quy mô khoảng 512 ha, vốn gần 44.000 tỷ đồng) tạo làn sóng lo ngại về cảnh quan, sinh thái, giá trị lịch sử, văn hóa; một số cơ quan truyền thông nước ngoài khai thác, đưa tin dồn dập</w:t>
+            </w:r>
+          </w:p>
+        </w:tc>
+        <w:tc>
+          <w:tcPr/>
+          <w:p>
+            <w:pPr>
+              <w:pStyle w:val="Compact"/>
+              <w:jc w:val="left"/>
+            </w:pPr>
+            <w:r>
+              <w:rPr>
+                <w:sz w:val="23"/>
+              </w:rPr>
+              <w:t xml:space="preserve">Dự án lớn tác động môi trường, cảnh quan cần công khai quy hoạch, đánh giá tác động môi trường và đối thoại sớm; thông tin chính thức không thể đến sau tranh luận</w:t>
+            </w:r>
+          </w:p>
+        </w:tc>
+      </w:tr>
+      <w:tr>
+        <w:trPr>
+          <w:cantSplit w:val="true"/>
+        </w:trPr>
+        <w:tc>
+          <w:tcPr/>
+          <w:p>
+            <w:pPr>
+              <w:pStyle w:val="Compact"/>
+              <w:jc w:val="left"/>
+            </w:pPr>
+            <w:r>
+              <w:rPr>
+                <w:sz w:val="23"/>
+              </w:rPr>
+              <w:t xml:space="preserve">Tháng 8, 9/2026</w:t>
+            </w:r>
+          </w:p>
+        </w:tc>
+        <w:tc>
+          <w:tcPr/>
+          <w:p>
+            <w:pPr>
+              <w:pStyle w:val="Compact"/>
+              <w:jc w:val="left"/>
+            </w:pPr>
+            <w:r>
+              <w:rPr>
+                <w:sz w:val="23"/>
+              </w:rPr>
+              <w:t xml:space="preserve">Tin giả mùa mưa bão</w:t>
+            </w:r>
+          </w:p>
+        </w:tc>
+        <w:tc>
+          <w:tcPr/>
+          <w:p>
+            <w:pPr>
+              <w:pStyle w:val="Compact"/>
+              <w:jc w:val="left"/>
+            </w:pPr>
+            <w:r>
+              <w:rPr>
+                <w:sz w:val="23"/>
+              </w:rPr>
+              <w:t xml:space="preserve">Video cắt ghép, tin sai về vỡ đê, sạt lở, ngập lụt xuất hiện trong nhiều đợt mưa lũ, gây hoang mang và cản trở công tác cứu hộ</w:t>
+            </w:r>
+          </w:p>
+        </w:tc>
+        <w:tc>
+          <w:tcPr/>
+          <w:p>
+            <w:pPr>
+              <w:pStyle w:val="Compact"/>
+              <w:jc w:val="left"/>
+            </w:pPr>
+            <w:r>
+              <w:rPr>
+                <w:sz w:val="23"/>
+              </w:rPr>
+              <w:t xml:space="preserve">Phát hiện nhanh; cải chính ngay trên nền tảng phát tán; công khai kết quả xử lý để răn đe</w:t>
+            </w:r>
+          </w:p>
+        </w:tc>
+      </w:tr>
+      <w:tr>
+        <w:trPr>
+          <w:cantSplit w:val="true"/>
+        </w:trPr>
+        <w:tc>
+          <w:tcPr/>
+          <w:p>
+            <w:pPr>
+              <w:pStyle w:val="Compact"/>
+              <w:jc w:val="left"/>
+            </w:pPr>
+            <w:r>
+              <w:rPr>
+                <w:sz w:val="23"/>
+              </w:rPr>
+              <w:t xml:space="preserve">Tháng 9, 10/2026</w:t>
+            </w:r>
+          </w:p>
+        </w:tc>
+        <w:tc>
+          <w:tcPr/>
+          <w:p>
+            <w:pPr>
+              <w:pStyle w:val="Compact"/>
+              <w:jc w:val="left"/>
+            </w:pPr>
+            <w:r>
+              <w:rPr>
+                <w:sz w:val="23"/>
+              </w:rPr>
+              <w:t xml:space="preserve">Đề xuất dự án Safari Ba Vì (Hà Nội)</w:t>
+            </w:r>
+          </w:p>
+        </w:tc>
+        <w:tc>
+          <w:tcPr/>
+          <w:p>
+            <w:pPr>
+              <w:pStyle w:val="Compact"/>
+              <w:jc w:val="left"/>
+            </w:pPr>
+            <w:r>
+              <w:rPr>
+                <w:sz w:val="23"/>
+              </w:rPr>
+              <w:t xml:space="preserve">Thông tin ban đầu thiếu nhất quán: có bài báo nêu Hà Nội thống nhất chủ trương, khởi công dịp 10/10, trong khi ngày 5/10/2026 Sở Tài chính Hà Nội khẳng định dự án mới là đề xuất của nhà đầu tư, quy mô dự kiến giảm từ 580 ha xuống khoảng 300 ha, người dân sẽ có cơ hội góp ý. Ngày 17 và 18/10/2026, người dùng Threads phản ánh nhiều bài viết về dự án không hiển thị tại Việt Nam; trào lưu</w:t>
+            </w:r>
+            <w:r>
+              <w:rPr>
+                <w:sz w:val="23"/>
+              </w:rPr>
+              <w:t xml:space="preserve"> </w:t>
+            </w:r>
+            <w:r>
+              <w:rPr>
+                <w:sz w:val="23"/>
+              </w:rPr>
+              <w:t xml:space="preserve">“</w:t>
+            </w:r>
+            <w:r>
+              <w:rPr>
+                <w:sz w:val="23"/>
+              </w:rPr>
+              <w:t xml:space="preserve">Stand with Ba Vì</w:t>
+            </w:r>
+            <w:r>
+              <w:rPr>
+                <w:sz w:val="23"/>
+              </w:rPr>
+              <w:t xml:space="preserve">”</w:t>
+            </w:r>
+            <w:r>
+              <w:rPr>
+                <w:sz w:val="23"/>
+              </w:rPr>
+              <w:t xml:space="preserve"> </w:t>
+            </w:r>
+            <w:r>
+              <w:rPr>
+                <w:sz w:val="23"/>
+              </w:rPr>
+              <w:t xml:space="preserve">xuất hiện</w:t>
+            </w:r>
+          </w:p>
+        </w:tc>
+        <w:tc>
+          <w:tcPr/>
+          <w:p>
+            <w:pPr>
+              <w:pStyle w:val="Compact"/>
+              <w:jc w:val="left"/>
+            </w:pPr>
+            <w:r>
+              <w:rPr>
+                <w:sz w:val="23"/>
+              </w:rPr>
+              <w:t xml:space="preserve">“</w:t>
+            </w:r>
+            <w:r>
+              <w:rPr>
+                <w:sz w:val="23"/>
+              </w:rPr>
+              <w:t xml:space="preserve">1 đầu mối, 1 thông điệp</w:t>
+            </w:r>
+            <w:r>
+              <w:rPr>
+                <w:sz w:val="23"/>
+              </w:rPr>
+              <w:t xml:space="preserve">”</w:t>
+            </w:r>
+            <w:r>
+              <w:rPr>
+                <w:sz w:val="23"/>
+              </w:rPr>
+              <w:t xml:space="preserve"> </w:t>
+            </w:r>
+            <w:r>
+              <w:rPr>
+                <w:sz w:val="23"/>
+              </w:rPr>
+              <w:t xml:space="preserve">ngay từ đầu; công khai lộ trình lấy ý kiến; biện pháp hạn chế hiển thị cần kèm thông tin giải thích để tránh hiệu ứng ngược</w:t>
+            </w:r>
+          </w:p>
+        </w:tc>
+      </w:tr>
+      <w:tr>
+        <w:trPr>
+          <w:cantSplit w:val="true"/>
+        </w:trPr>
+        <w:tc>
+          <w:tcPr/>
+          <w:p>
+            <w:pPr>
+              <w:pStyle w:val="Compact"/>
+              <w:jc w:val="left"/>
+            </w:pPr>
+            <w:r>
+              <w:rPr>
+                <w:sz w:val="23"/>
+              </w:rPr>
+              <w:t xml:space="preserve">Năm 2025, 2026</w:t>
+            </w:r>
+          </w:p>
+        </w:tc>
+        <w:tc>
+          <w:tcPr/>
+          <w:p>
+            <w:pPr>
+              <w:pStyle w:val="Compact"/>
+              <w:jc w:val="left"/>
+            </w:pPr>
+            <w:r>
+              <w:rPr>
+                <w:sz w:val="23"/>
+              </w:rPr>
+              <w:t xml:space="preserve">Kích động</w:t>
+            </w:r>
+            <w:r>
+              <w:rPr>
+                <w:sz w:val="23"/>
+              </w:rPr>
+              <w:t xml:space="preserve"> </w:t>
+            </w:r>
+            <w:r>
+              <w:rPr>
+                <w:sz w:val="23"/>
+              </w:rPr>
+              <w:t xml:space="preserve">“</w:t>
+            </w:r>
+            <w:r>
+              <w:rPr>
+                <w:sz w:val="23"/>
+              </w:rPr>
+              <w:t xml:space="preserve">cách mạng Gen Z</w:t>
+            </w:r>
+            <w:r>
+              <w:rPr>
+                <w:sz w:val="23"/>
+              </w:rPr>
+              <w:t xml:space="preserve">”</w:t>
+            </w:r>
+          </w:p>
+        </w:tc>
+        <w:tc>
+          <w:tcPr/>
+          <w:p>
+            <w:pPr>
+              <w:pStyle w:val="Compact"/>
+              <w:jc w:val="left"/>
+            </w:pPr>
+            <w:r>
+              <w:rPr>
+                <w:sz w:val="23"/>
+              </w:rPr>
+              <w:t xml:space="preserve">Các trang của tổ chức khủng bố Việt Tân lợi dụng biểu tình của giới trẻ ở Nepal, Indonesia để kêu gọi giới trẻ Việt Nam xuống đường; một số tài khoản trên Threads kêu gọi</w:t>
+            </w:r>
+            <w:r>
+              <w:rPr>
+                <w:sz w:val="23"/>
+              </w:rPr>
+              <w:t xml:space="preserve"> </w:t>
+            </w:r>
+            <w:r>
+              <w:rPr>
+                <w:sz w:val="23"/>
+              </w:rPr>
+              <w:t xml:space="preserve">“</w:t>
+            </w:r>
+            <w:r>
+              <w:rPr>
+                <w:sz w:val="23"/>
+              </w:rPr>
+              <w:t xml:space="preserve">đứng dậy đấu tranh</w:t>
+            </w:r>
+            <w:r>
+              <w:rPr>
+                <w:sz w:val="23"/>
+              </w:rPr>
+              <w:t xml:space="preserve">”</w:t>
+            </w:r>
+          </w:p>
+        </w:tc>
+        <w:tc>
+          <w:tcPr/>
+          <w:p>
+            <w:pPr>
+              <w:pStyle w:val="Compact"/>
+              <w:jc w:val="left"/>
+            </w:pPr>
+            <w:r>
+              <w:rPr>
+                <w:sz w:val="23"/>
+              </w:rPr>
+              <w:t xml:space="preserve">Tách bạch đối tượng chống phá với người trẻ bày tỏ quan điểm; đối thoại bằng ngôn ngữ của giới trẻ trên chính nền tảng giới trẻ sử dụng</w:t>
+            </w:r>
+          </w:p>
+        </w:tc>
+      </w:tr>
+    </w:tbl>
+    <w:p>
+      <w:pPr>
+        <w:pStyle w:val="BodyText"/>
+      </w:pPr>
+      <w:r>
+        <w:rPr>
+          <w:i/>
+          <w:iCs/>
+        </w:rPr>
+        <w:t xml:space="preserve">Ghi chú: diễn biến trên Threads của vụ Làng Vân và vụ Safari Ba Vì chủ yếu dựa trên phản ánh của người dùng và một số nguồn nước ngoài; tổ biên tập đối chiếu với dữ liệu giám sát của Cục Thông tin điện tử và Chuyển đổi số, thông tin của Bộ Công an, UBND thành phố Đà Nẵng, UBND thành phố Hà Nội trước khi sử dụng (xem Phụ lục 5).</w:t>
+      </w:r>
+    </w:p>
+    <w:p>
+      <w:pPr>
+        <w:pStyle w:val="BodyText"/>
+      </w:pPr>
+      <w:r>
+        <w:rPr>
+          <w:i/>
+          <w:iCs/>
+        </w:rPr>
+        <w:t xml:space="preserve">Gợi ý khi trình bày: chọn 1 đến 2 sự cố để minh họa (đề xuất: tin giả mùa mưa bão và đề xuất dự án Safari Ba Vì); nêu bài học chung, không đi sâu vào trách nhiệm của từng cơ quan, doanh nghiệp; tổ biên tập cân nhắc mức độ nêu tên dự án, doanh nghiệp.</w:t>
+      </w:r>
+    </w:p>
+    <w:bookmarkEnd w:id="31"/>
+    <w:bookmarkStart w:id="32" w:name="hạn-chế-bất-cập"/>
+    <w:p>
+      <w:pPr>
+        <w:pStyle w:val="Heading2"/>
+      </w:pPr>
+      <w:r>
+        <w:t xml:space="preserve">3. Hạn chế, bất cập</w:t>
+      </w:r>
+    </w:p>
+    <w:p>
+      <w:pPr>
+        <w:pStyle w:val="Compact"/>
+        <w:numPr>
+          <w:ilvl w:val="0"/>
+          <w:numId w:val="1014"/>
         </w:numPr>
       </w:pPr>
       <w:r>
@@ -3200,7 +4237,7 @@
         <w:pStyle w:val="Compact"/>
         <w:numPr>
           <w:ilvl w:val="0"/>
-          <w:numId w:val="1012"/>
+          <w:numId w:val="1014"/>
         </w:numPr>
       </w:pPr>
       <w:r>
@@ -3237,7 +4274,7 @@
         <w:pStyle w:val="Compact"/>
         <w:numPr>
           <w:ilvl w:val="0"/>
-          <w:numId w:val="1012"/>
+          <w:numId w:val="1014"/>
         </w:numPr>
       </w:pPr>
       <w:r>
@@ -3259,7 +4296,7 @@
         <w:pStyle w:val="Compact"/>
         <w:numPr>
           <w:ilvl w:val="0"/>
-          <w:numId w:val="1012"/>
+          <w:numId w:val="1014"/>
         </w:numPr>
       </w:pPr>
       <w:r>
@@ -3281,7 +4318,7 @@
         <w:pStyle w:val="Compact"/>
         <w:numPr>
           <w:ilvl w:val="0"/>
-          <w:numId w:val="1012"/>
+          <w:numId w:val="1014"/>
         </w:numPr>
       </w:pPr>
       <w:r>
@@ -3303,7 +4340,7 @@
         <w:pStyle w:val="Compact"/>
         <w:numPr>
           <w:ilvl w:val="0"/>
-          <w:numId w:val="1012"/>
+          <w:numId w:val="1014"/>
         </w:numPr>
       </w:pPr>
       <w:r>
@@ -3366,22 +4403,66 @@
         <w:t xml:space="preserve">còn phổ biến.</w:t>
       </w:r>
     </w:p>
-    <w:bookmarkEnd w:id="30"/>
-    <w:bookmarkStart w:id="31" w:name="nguyên-nhân"/>
+    <w:p>
+      <w:pPr>
+        <w:pStyle w:val="Compact"/>
+        <w:numPr>
+          <w:ilvl w:val="0"/>
+          <w:numId w:val="1014"/>
+        </w:numPr>
+      </w:pPr>
+      <w:r>
+        <w:rPr>
+          <w:b/>
+          <w:bCs/>
+        </w:rPr>
+        <w:t xml:space="preserve">Hiện diện mờ nhạt trên nền tảng mới.</w:t>
+      </w:r>
+      <w:r>
+        <w:t xml:space="preserve"> </w:t>
+      </w:r>
+      <w:r>
+        <w:t xml:space="preserve">Cơ quan nhà nước, báo chí chủ lực chưa có cách tiếp cận riêng cho Threads và các nền tảng thảo luận mới; cơ chế phối hợp với Meta trên Threads mới hình thành từ năm 2026.</w:t>
+      </w:r>
+    </w:p>
+    <w:p>
+      <w:pPr>
+        <w:pStyle w:val="Compact"/>
+        <w:numPr>
+          <w:ilvl w:val="0"/>
+          <w:numId w:val="1014"/>
+        </w:numPr>
+      </w:pPr>
+      <w:r>
+        <w:rPr>
+          <w:b/>
+          <w:bCs/>
+        </w:rPr>
+        <w:t xml:space="preserve">Lúng túng khi phân biệt góp ý chính đáng với hoạt động chống phá.</w:t>
+      </w:r>
+      <w:r>
+        <w:t xml:space="preserve"> </w:t>
+      </w:r>
+      <w:r>
+        <w:t xml:space="preserve">Có nơi xử lý ý kiến phản biện về dự án, chính sách bằng biện pháp kỹ thuật thay vì đối thoại, cung cấp thông tin; ngược lại, có nơi chậm nhận diện khi đối tượng xấu chen vào.</w:t>
+      </w:r>
+    </w:p>
+    <w:bookmarkEnd w:id="32"/>
+    <w:bookmarkStart w:id="33" w:name="nguyên-nhân"/>
     <w:p>
       <w:pPr>
         <w:pStyle w:val="Heading2"/>
       </w:pPr>
       <w:r>
-        <w:t xml:space="preserve">3. Nguyên nhân</w:t>
-      </w:r>
-    </w:p>
-    <w:p>
-      <w:pPr>
-        <w:pStyle w:val="Compact"/>
-        <w:numPr>
-          <w:ilvl w:val="0"/>
-          <w:numId w:val="1013"/>
+        <w:t xml:space="preserve">4. Nguyên nhân</w:t>
+      </w:r>
+    </w:p>
+    <w:p>
+      <w:pPr>
+        <w:pStyle w:val="Compact"/>
+        <w:numPr>
+          <w:ilvl w:val="0"/>
+          <w:numId w:val="1015"/>
         </w:numPr>
       </w:pPr>
       <w:r>
@@ -3403,7 +4484,7 @@
         <w:pStyle w:val="Compact"/>
         <w:numPr>
           <w:ilvl w:val="0"/>
-          <w:numId w:val="1013"/>
+          <w:numId w:val="1015"/>
         </w:numPr>
       </w:pPr>
       <w:r>
@@ -3420,22 +4501,22 @@
         <w:t xml:space="preserve">Công nghệ thay đổi nhanh hơn thể chế; nền tảng nước ngoài chi phối hạ tầng phân phối thông tin; nhiều đối tượng phản động hoạt động từ nước ngoài, ngoài phạm vi tài phán.</w:t>
       </w:r>
     </w:p>
-    <w:bookmarkEnd w:id="31"/>
-    <w:bookmarkStart w:id="32" w:name="bài-học-kinh-nghiệm"/>
+    <w:bookmarkEnd w:id="33"/>
+    <w:bookmarkStart w:id="34" w:name="bài-học-kinh-nghiệm"/>
     <w:p>
       <w:pPr>
         <w:pStyle w:val="Heading2"/>
       </w:pPr>
       <w:r>
-        <w:t xml:space="preserve">4. Bài học kinh nghiệm</w:t>
-      </w:r>
-    </w:p>
-    <w:p>
-      <w:pPr>
-        <w:pStyle w:val="Compact"/>
-        <w:numPr>
-          <w:ilvl w:val="0"/>
-          <w:numId w:val="1014"/>
+        <w:t xml:space="preserve">5. Bài học kinh nghiệm</w:t>
+      </w:r>
+    </w:p>
+    <w:p>
+      <w:pPr>
+        <w:pStyle w:val="Compact"/>
+        <w:numPr>
+          <w:ilvl w:val="0"/>
+          <w:numId w:val="1016"/>
         </w:numPr>
       </w:pPr>
       <w:r>
@@ -3457,7 +4538,7 @@
         <w:pStyle w:val="Compact"/>
         <w:numPr>
           <w:ilvl w:val="0"/>
-          <w:numId w:val="1014"/>
+          <w:numId w:val="1016"/>
         </w:numPr>
       </w:pPr>
       <w:r>
@@ -3479,7 +4560,7 @@
         <w:pStyle w:val="Compact"/>
         <w:numPr>
           <w:ilvl w:val="0"/>
-          <w:numId w:val="1014"/>
+          <w:numId w:val="1016"/>
         </w:numPr>
       </w:pPr>
       <w:r>
@@ -3519,7 +4600,7 @@
         <w:pStyle w:val="Compact"/>
         <w:numPr>
           <w:ilvl w:val="0"/>
-          <w:numId w:val="1014"/>
+          <w:numId w:val="1016"/>
         </w:numPr>
       </w:pPr>
       <w:r>
@@ -3556,6 +4637,50 @@
     </w:p>
     <w:p>
       <w:pPr>
+        <w:pStyle w:val="Compact"/>
+        <w:numPr>
+          <w:ilvl w:val="0"/>
+          <w:numId w:val="1016"/>
+        </w:numPr>
+      </w:pPr>
+      <w:r>
+        <w:rPr>
+          <w:b/>
+          <w:bCs/>
+        </w:rPr>
+        <w:t xml:space="preserve">Phân loại đúng phản ứng của dư luận.</w:t>
+      </w:r>
+      <w:r>
+        <w:t xml:space="preserve"> </w:t>
+      </w:r>
+      <w:r>
+        <w:t xml:space="preserve">Góp ý, phản biện chính đáng cần đối thoại, công khai thông tin, tiếp thu; thông tin sai cần cải chính, gắn nhãn; chỉ hành vi vi phạm pháp luật, kích động chống phá mới cần biện pháp pháp lý, kỹ thuật, kèm thông tin giải thích.</w:t>
+      </w:r>
+    </w:p>
+    <w:p>
+      <w:pPr>
+        <w:pStyle w:val="Compact"/>
+        <w:numPr>
+          <w:ilvl w:val="0"/>
+          <w:numId w:val="1016"/>
+        </w:numPr>
+      </w:pPr>
+      <w:r>
+        <w:rPr>
+          <w:b/>
+          <w:bCs/>
+        </w:rPr>
+        <w:t xml:space="preserve">Có mặt ở nơi dư luận hình thành.</w:t>
+      </w:r>
+      <w:r>
+        <w:t xml:space="preserve"> </w:t>
+      </w:r>
+      <w:r>
+        <w:t xml:space="preserve">Thông tin chính thống phải xuất hiện trên chính nền tảng nơi tranh luận khởi phát, kể cả nền tảng mới như Threads.</w:t>
+      </w:r>
+    </w:p>
+    <w:p>
+      <w:pPr>
         <w:pStyle w:val="BlockText"/>
       </w:pPr>
       <w:r>
@@ -3574,9 +4699,9 @@
         <w:t xml:space="preserve">”</w:t>
       </w:r>
     </w:p>
-    <w:bookmarkEnd w:id="32"/>
-    <w:bookmarkEnd w:id="33"/>
-    <w:bookmarkStart w:id="41" w:name="phần-iii.-nhóm-giải-pháp-trọng-tâm"/>
+    <w:bookmarkEnd w:id="34"/>
+    <w:bookmarkEnd w:id="35"/>
+    <w:bookmarkStart w:id="44" w:name="phần-iii.-nhóm-giải-pháp-trọng-tâm"/>
     <w:p>
       <w:pPr>
         <w:pStyle w:val="Heading1"/>
@@ -3597,7 +4722,7 @@
         <w:t xml:space="preserve">Ký hiệu: [Đột phá] là giải pháp đề xuất nhấn mạnh khi trình bày. Mốc thời gian là đề xuất để Chính phủ xem xét.</w:t>
       </w:r>
     </w:p>
-    <w:bookmarkStart w:id="34" w:name="X3b606fac8e10e45c422060c65e4197064830ea5"/>
+    <w:bookmarkStart w:id="36" w:name="X3b606fac8e10e45c422060c65e4197064830ea5"/>
     <w:p>
       <w:pPr>
         <w:pStyle w:val="Heading2"/>
@@ -3611,7 +4736,7 @@
         <w:pStyle w:val="Compact"/>
         <w:numPr>
           <w:ilvl w:val="0"/>
-          <w:numId w:val="1015"/>
+          <w:numId w:val="1017"/>
         </w:numPr>
       </w:pPr>
       <w:r>
@@ -3623,7 +4748,7 @@
         <w:pStyle w:val="Compact"/>
         <w:numPr>
           <w:ilvl w:val="0"/>
-          <w:numId w:val="1015"/>
+          <w:numId w:val="1017"/>
         </w:numPr>
       </w:pPr>
       <w:r>
@@ -3635,7 +4760,7 @@
         <w:pStyle w:val="Compact"/>
         <w:numPr>
           <w:ilvl w:val="0"/>
-          <w:numId w:val="1015"/>
+          <w:numId w:val="1017"/>
         </w:numPr>
       </w:pPr>
       <w:r>
@@ -3665,7 +4790,7 @@
         <w:pStyle w:val="Compact"/>
         <w:numPr>
           <w:ilvl w:val="0"/>
-          <w:numId w:val="1015"/>
+          <w:numId w:val="1017"/>
         </w:numPr>
       </w:pPr>
       <w:r>
@@ -3677,7 +4802,34 @@
         <w:pStyle w:val="Compact"/>
         <w:numPr>
           <w:ilvl w:val="0"/>
-          <w:numId w:val="1015"/>
+          <w:numId w:val="1017"/>
+        </w:numPr>
+      </w:pPr>
+      <w:r>
+        <w:t xml:space="preserve">Với dự án đầu tư lớn tác động tới môi trường, cảnh quan, di sản văn hóa: công khai thông tin quy hoạch, đánh giá tác động môi trường, tổ chức lấy ý kiến cộng đồng và có kế hoạch truyền thông trước khi triển khai, theo tinh thần</w:t>
+      </w:r>
+      <w:r>
+        <w:t xml:space="preserve"> </w:t>
+      </w:r>
+      <w:r>
+        <w:t xml:space="preserve">“</w:t>
+      </w:r>
+      <w:r>
+        <w:t xml:space="preserve">dân biết, dân bàn, dân làm, dân kiểm tra, dân giám sát, dân thụ hưởng</w:t>
+      </w:r>
+      <w:r>
+        <w:t xml:space="preserve">”</w:t>
+      </w:r>
+      <w:r>
+        <w:t xml:space="preserve">.</w:t>
+      </w:r>
+    </w:p>
+    <w:p>
+      <w:pPr>
+        <w:pStyle w:val="Compact"/>
+        <w:numPr>
+          <w:ilvl w:val="0"/>
+          <w:numId w:val="1017"/>
         </w:numPr>
       </w:pPr>
       <w:r>
@@ -3710,8 +4862,8 @@
         <w:t xml:space="preserve">quý I/2027.</w:t>
       </w:r>
     </w:p>
-    <w:bookmarkEnd w:id="34"/>
-    <w:bookmarkStart w:id="35" w:name="Xd40e24c53a30f6e873348ad2d5131cd62c86d93"/>
+    <w:bookmarkEnd w:id="36"/>
+    <w:bookmarkStart w:id="37" w:name="Xd40e24c53a30f6e873348ad2d5131cd62c86d93"/>
     <w:p>
       <w:pPr>
         <w:pStyle w:val="Heading2"/>
@@ -3725,7 +4877,7 @@
         <w:pStyle w:val="Compact"/>
         <w:numPr>
           <w:ilvl w:val="0"/>
-          <w:numId w:val="1016"/>
+          <w:numId w:val="1018"/>
         </w:numPr>
       </w:pPr>
       <w:r>
@@ -3750,7 +4902,7 @@
         <w:pStyle w:val="Compact"/>
         <w:numPr>
           <w:ilvl w:val="1"/>
-          <w:numId w:val="1017"/>
+          <w:numId w:val="1019"/>
         </w:numPr>
       </w:pPr>
       <w:r>
@@ -3762,7 +4914,7 @@
         <w:pStyle w:val="Compact"/>
         <w:numPr>
           <w:ilvl w:val="1"/>
-          <w:numId w:val="1017"/>
+          <w:numId w:val="1019"/>
         </w:numPr>
       </w:pPr>
       <w:r>
@@ -3774,7 +4926,7 @@
         <w:pStyle w:val="Compact"/>
         <w:numPr>
           <w:ilvl w:val="1"/>
-          <w:numId w:val="1017"/>
+          <w:numId w:val="1019"/>
         </w:numPr>
       </w:pPr>
       <w:r>
@@ -3786,7 +4938,7 @@
         <w:pStyle w:val="Compact"/>
         <w:numPr>
           <w:ilvl w:val="1"/>
-          <w:numId w:val="1017"/>
+          <w:numId w:val="1019"/>
         </w:numPr>
       </w:pPr>
       <w:r>
@@ -3798,7 +4950,7 @@
         <w:pStyle w:val="Compact"/>
         <w:numPr>
           <w:ilvl w:val="1"/>
-          <w:numId w:val="1017"/>
+          <w:numId w:val="1019"/>
         </w:numPr>
       </w:pPr>
       <w:r>
@@ -3810,7 +4962,7 @@
         <w:pStyle w:val="Compact"/>
         <w:numPr>
           <w:ilvl w:val="0"/>
-          <w:numId w:val="1016"/>
+          <w:numId w:val="1018"/>
         </w:numPr>
       </w:pPr>
       <w:r>
@@ -3822,19 +4974,19 @@
         <w:pStyle w:val="Compact"/>
         <w:numPr>
           <w:ilvl w:val="0"/>
-          <w:numId w:val="1016"/>
-        </w:numPr>
-      </w:pPr>
-      <w:r>
-        <w:t xml:space="preserve">Ban hành bộ quy trình mẫu và kịch bản xử lý cho khoảng 8 đến 10 tình huống điển hình: thiên tai, thảm họa; tai nạn du lịch; sự cố lễ hội, sự kiện đông người; an toàn thực phẩm; sản phẩm văn hóa vi phạm chủ quyền; phát ngôn lệch chuẩn của người nổi tiếng; tin giả về chính sách; nội dung giả mạo do AI tạo ra.</w:t>
-      </w:r>
-    </w:p>
-    <w:p>
-      <w:pPr>
-        <w:pStyle w:val="Compact"/>
-        <w:numPr>
-          <w:ilvl w:val="0"/>
-          <w:numId w:val="1016"/>
+          <w:numId w:val="1018"/>
+        </w:numPr>
+      </w:pPr>
+      <w:r>
+        <w:t xml:space="preserve">Ban hành bộ quy trình mẫu và kịch bản xử lý cho khoảng 10 đến 12 tình huống điển hình: thiên tai, thảm họa; tai nạn du lịch; sự cố lễ hội, sự kiện đông người; an toàn thực phẩm; sản phẩm văn hóa vi phạm chủ quyền; phát ngôn lệch chuẩn của người nổi tiếng; tin giả về chính sách; nội dung giả mạo do AI tạo ra; dự án đầu tư gây tranh cãi về môi trường, cảnh quan; làn sóng dư luận khởi phát trên nền tảng thảo luận như Threads; gián đoạn nền tảng mạng xã hội diện rộng.</w:t>
+      </w:r>
+    </w:p>
+    <w:p>
+      <w:pPr>
+        <w:pStyle w:val="Compact"/>
+        <w:numPr>
+          <w:ilvl w:val="0"/>
+          <w:numId w:val="1018"/>
         </w:numPr>
       </w:pPr>
       <w:r>
@@ -3846,7 +4998,7 @@
         <w:pStyle w:val="Compact"/>
         <w:numPr>
           <w:ilvl w:val="0"/>
-          <w:numId w:val="1016"/>
+          <w:numId w:val="1018"/>
         </w:numPr>
       </w:pPr>
       <w:r>
@@ -3895,8 +5047,8 @@
         <w:t xml:space="preserve">trình Thủ tướng Chính phủ dự thảo Quy chế trong quý I/2027.</w:t>
       </w:r>
     </w:p>
-    <w:bookmarkEnd w:id="35"/>
-    <w:bookmarkStart w:id="36" w:name="X573b61a05b9068aa29593ddd26c525dbc69a874"/>
+    <w:bookmarkEnd w:id="37"/>
+    <w:bookmarkStart w:id="38" w:name="X573b61a05b9068aa29593ddd26c525dbc69a874"/>
     <w:p>
       <w:pPr>
         <w:pStyle w:val="Heading2"/>
@@ -3910,19 +5062,19 @@
         <w:pStyle w:val="Compact"/>
         <w:numPr>
           <w:ilvl w:val="0"/>
-          <w:numId w:val="1018"/>
-        </w:numPr>
-      </w:pPr>
-      <w:r>
-        <w:t xml:space="preserve">Hình thành hệ thống giám sát, phân tích thông tin trên không gian mạng dùng chung giữa Bộ VHTTDL, Bộ Công an, Bộ Quốc phòng, Văn phòng Chính phủ và các cơ quan của Đảng; ứng dụng AI, dữ liệu lớn; kết nối 34 tỉnh, thành phố.</w:t>
-      </w:r>
-    </w:p>
-    <w:p>
-      <w:pPr>
-        <w:pStyle w:val="Compact"/>
-        <w:numPr>
-          <w:ilvl w:val="0"/>
-          <w:numId w:val="1018"/>
+          <w:numId w:val="1020"/>
+        </w:numPr>
+      </w:pPr>
+      <w:r>
+        <w:t xml:space="preserve">Hình thành hệ thống giám sát, phân tích thông tin trên không gian mạng dùng chung giữa Bộ VHTTDL, Bộ Công an, Bộ Quốc phòng, Văn phòng Chính phủ và các cơ quan của Đảng; ứng dụng AI, dữ liệu lớn; kết nối 34 tỉnh, thành phố; bao quát cả nền tảng mới như Threads.</w:t>
+      </w:r>
+    </w:p>
+    <w:p>
+      <w:pPr>
+        <w:pStyle w:val="Compact"/>
+        <w:numPr>
+          <w:ilvl w:val="0"/>
+          <w:numId w:val="1020"/>
         </w:numPr>
       </w:pPr>
       <w:r>
@@ -3934,7 +5086,7 @@
         <w:pStyle w:val="Compact"/>
         <w:numPr>
           <w:ilvl w:val="0"/>
-          <w:numId w:val="1018"/>
+          <w:numId w:val="1020"/>
         </w:numPr>
       </w:pPr>
       <w:r>
@@ -3964,7 +5116,7 @@
         <w:pStyle w:val="Compact"/>
         <w:numPr>
           <w:ilvl w:val="0"/>
-          <w:numId w:val="1018"/>
+          <w:numId w:val="1020"/>
         </w:numPr>
       </w:pPr>
       <w:r>
@@ -3976,7 +5128,7 @@
         <w:pStyle w:val="Compact"/>
         <w:numPr>
           <w:ilvl w:val="0"/>
-          <w:numId w:val="1018"/>
+          <w:numId w:val="1020"/>
         </w:numPr>
       </w:pPr>
       <w:r>
@@ -3988,7 +5140,7 @@
         <w:pStyle w:val="Compact"/>
         <w:numPr>
           <w:ilvl w:val="0"/>
-          <w:numId w:val="1018"/>
+          <w:numId w:val="1020"/>
         </w:numPr>
       </w:pPr>
       <w:r>
@@ -4037,8 +5189,8 @@
         <w:t xml:space="preserve">vận hành thử trong năm 2027.</w:t>
       </w:r>
     </w:p>
-    <w:bookmarkEnd w:id="36"/>
-    <w:bookmarkStart w:id="37" w:name="X6cb76ae2c3072150bf61976bc3786a83d7c3c8e"/>
+    <w:bookmarkEnd w:id="38"/>
+    <w:bookmarkStart w:id="39" w:name="X6cb76ae2c3072150bf61976bc3786a83d7c3c8e"/>
     <w:p>
       <w:pPr>
         <w:pStyle w:val="Heading2"/>
@@ -4070,7 +5222,7 @@
         <w:pStyle w:val="Compact"/>
         <w:numPr>
           <w:ilvl w:val="0"/>
-          <w:numId w:val="1019"/>
+          <w:numId w:val="1021"/>
         </w:numPr>
       </w:pPr>
       <w:r>
@@ -4107,7 +5259,7 @@
         <w:pStyle w:val="Compact"/>
         <w:numPr>
           <w:ilvl w:val="0"/>
-          <w:numId w:val="1019"/>
+          <w:numId w:val="1021"/>
         </w:numPr>
       </w:pPr>
       <w:r>
@@ -4129,7 +5281,7 @@
         <w:pStyle w:val="Compact"/>
         <w:numPr>
           <w:ilvl w:val="0"/>
-          <w:numId w:val="1019"/>
+          <w:numId w:val="1021"/>
         </w:numPr>
       </w:pPr>
       <w:r>
@@ -4151,7 +5303,7 @@
         <w:pStyle w:val="Compact"/>
         <w:numPr>
           <w:ilvl w:val="0"/>
-          <w:numId w:val="1019"/>
+          <w:numId w:val="1021"/>
         </w:numPr>
       </w:pPr>
       <w:r>
@@ -4173,7 +5325,7 @@
         <w:pStyle w:val="Compact"/>
         <w:numPr>
           <w:ilvl w:val="0"/>
-          <w:numId w:val="1019"/>
+          <w:numId w:val="1021"/>
         </w:numPr>
       </w:pPr>
       <w:r>
@@ -4195,7 +5347,7 @@
         <w:pStyle w:val="Compact"/>
         <w:numPr>
           <w:ilvl w:val="0"/>
-          <w:numId w:val="1019"/>
+          <w:numId w:val="1021"/>
         </w:numPr>
       </w:pPr>
       <w:r>
@@ -4217,19 +5369,19 @@
         <w:pStyle w:val="Compact"/>
         <w:numPr>
           <w:ilvl w:val="0"/>
-          <w:numId w:val="1019"/>
-        </w:numPr>
-      </w:pPr>
-      <w:r>
-        <w:t xml:space="preserve">Song song, lực lượng chức năng xác minh, xử lý người tung tin; phối hợp nền tảng gỡ bỏ nội dung vi phạm. Nguyên tắc: gỡ bỏ không thay thế giải thích.</w:t>
-      </w:r>
-    </w:p>
-    <w:p>
-      <w:pPr>
-        <w:pStyle w:val="Compact"/>
-        <w:numPr>
-          <w:ilvl w:val="0"/>
-          <w:numId w:val="1019"/>
+          <w:numId w:val="1021"/>
+        </w:numPr>
+      </w:pPr>
+      <w:r>
+        <w:t xml:space="preserve">Song song, lực lượng chức năng xác minh, xử lý người tung tin; phối hợp nền tảng gỡ bỏ nội dung vi phạm. Nguyên tắc: gỡ bỏ không thay thế giải thích. Khi áp dụng biện pháp hạn chế hiển thị, cơ quan có thẩm quyền công bố căn cứ, lý do ở mức phù hợp để tránh hiệu ứng ngược.</w:t>
+      </w:r>
+    </w:p>
+    <w:p>
+      <w:pPr>
+        <w:pStyle w:val="Compact"/>
+        <w:numPr>
+          <w:ilvl w:val="0"/>
+          <w:numId w:val="1021"/>
         </w:numPr>
       </w:pPr>
       <w:r>
@@ -4262,8 +5414,8 @@
         <w:t xml:space="preserve">áp dụng ngay từ quý IV/2026.</w:t>
       </w:r>
     </w:p>
-    <w:bookmarkEnd w:id="37"/>
-    <w:bookmarkStart w:id="38" w:name="Xc783ff94e32f4abeda209aa105c4f3b4a869b3b"/>
+    <w:bookmarkEnd w:id="39"/>
+    <w:bookmarkStart w:id="40" w:name="Xc783ff94e32f4abeda209aa105c4f3b4a869b3b"/>
     <w:p>
       <w:pPr>
         <w:pStyle w:val="Heading2"/>
@@ -4277,7 +5429,7 @@
         <w:pStyle w:val="Compact"/>
         <w:numPr>
           <w:ilvl w:val="0"/>
-          <w:numId w:val="1020"/>
+          <w:numId w:val="1022"/>
         </w:numPr>
       </w:pPr>
       <w:r>
@@ -4289,7 +5441,7 @@
         <w:pStyle w:val="Compact"/>
         <w:numPr>
           <w:ilvl w:val="0"/>
-          <w:numId w:val="1020"/>
+          <w:numId w:val="1022"/>
         </w:numPr>
       </w:pPr>
       <w:r>
@@ -4301,7 +5453,7 @@
         <w:pStyle w:val="Compact"/>
         <w:numPr>
           <w:ilvl w:val="0"/>
-          <w:numId w:val="1020"/>
+          <w:numId w:val="1022"/>
         </w:numPr>
       </w:pPr>
       <w:r>
@@ -4313,7 +5465,7 @@
         <w:pStyle w:val="Compact"/>
         <w:numPr>
           <w:ilvl w:val="0"/>
-          <w:numId w:val="1020"/>
+          <w:numId w:val="1022"/>
         </w:numPr>
       </w:pPr>
       <w:r>
@@ -4325,7 +5477,7 @@
         <w:pStyle w:val="Compact"/>
         <w:numPr>
           <w:ilvl w:val="0"/>
-          <w:numId w:val="1020"/>
+          <w:numId w:val="1022"/>
         </w:numPr>
       </w:pPr>
       <w:r>
@@ -4337,7 +5489,7 @@
         <w:pStyle w:val="Compact"/>
         <w:numPr>
           <w:ilvl w:val="0"/>
-          <w:numId w:val="1020"/>
+          <w:numId w:val="1022"/>
         </w:numPr>
       </w:pPr>
       <w:r>
@@ -4349,7 +5501,7 @@
         <w:pStyle w:val="Compact"/>
         <w:numPr>
           <w:ilvl w:val="0"/>
-          <w:numId w:val="1020"/>
+          <w:numId w:val="1022"/>
         </w:numPr>
       </w:pPr>
       <w:r>
@@ -4398,8 +5550,8 @@
         <w:t xml:space="preserve">thường xuyên.</w:t>
       </w:r>
     </w:p>
-    <w:bookmarkEnd w:id="38"/>
-    <w:bookmarkStart w:id="39" w:name="Xe7df467628ac3f8836f2633eba9266256a07ad3"/>
+    <w:bookmarkEnd w:id="40"/>
+    <w:bookmarkStart w:id="41" w:name="Xe7df467628ac3f8836f2633eba9266256a07ad3"/>
     <w:p>
       <w:pPr>
         <w:pStyle w:val="Heading2"/>
@@ -4413,7 +5565,7 @@
         <w:pStyle w:val="Compact"/>
         <w:numPr>
           <w:ilvl w:val="0"/>
-          <w:numId w:val="1021"/>
+          <w:numId w:val="1023"/>
         </w:numPr>
       </w:pPr>
       <w:r>
@@ -4425,7 +5577,7 @@
         <w:pStyle w:val="Compact"/>
         <w:numPr>
           <w:ilvl w:val="0"/>
-          <w:numId w:val="1021"/>
+          <w:numId w:val="1023"/>
         </w:numPr>
       </w:pPr>
       <w:r>
@@ -4437,7 +5589,7 @@
         <w:pStyle w:val="Compact"/>
         <w:numPr>
           <w:ilvl w:val="0"/>
-          <w:numId w:val="1021"/>
+          <w:numId w:val="1023"/>
         </w:numPr>
       </w:pPr>
       <w:r>
@@ -4449,7 +5601,7 @@
         <w:pStyle w:val="Compact"/>
         <w:numPr>
           <w:ilvl w:val="0"/>
-          <w:numId w:val="1021"/>
+          <w:numId w:val="1023"/>
         </w:numPr>
       </w:pPr>
       <w:r>
@@ -4461,7 +5613,7 @@
         <w:pStyle w:val="Compact"/>
         <w:numPr>
           <w:ilvl w:val="0"/>
-          <w:numId w:val="1021"/>
+          <w:numId w:val="1023"/>
         </w:numPr>
       </w:pPr>
       <w:r>
@@ -4473,7 +5625,7 @@
         <w:pStyle w:val="Compact"/>
         <w:numPr>
           <w:ilvl w:val="0"/>
-          <w:numId w:val="1021"/>
+          <w:numId w:val="1023"/>
         </w:numPr>
       </w:pPr>
       <w:r>
@@ -4522,8 +5674,8 @@
         <w:t xml:space="preserve">thường xuyên.</w:t>
       </w:r>
     </w:p>
-    <w:bookmarkEnd w:id="39"/>
-    <w:bookmarkStart w:id="40" w:name="Xd92dbbe034725eacfbd6182eaf1f42bec5222d6"/>
+    <w:bookmarkEnd w:id="41"/>
+    <w:bookmarkStart w:id="42" w:name="Xd92dbbe034725eacfbd6182eaf1f42bec5222d6"/>
     <w:p>
       <w:pPr>
         <w:pStyle w:val="Heading2"/>
@@ -4555,7 +5707,7 @@
         <w:pStyle w:val="Compact"/>
         <w:numPr>
           <w:ilvl w:val="0"/>
-          <w:numId w:val="1022"/>
+          <w:numId w:val="1024"/>
         </w:numPr>
       </w:pPr>
       <w:r>
@@ -4567,7 +5719,7 @@
         <w:pStyle w:val="Compact"/>
         <w:numPr>
           <w:ilvl w:val="0"/>
-          <w:numId w:val="1022"/>
+          <w:numId w:val="1024"/>
         </w:numPr>
       </w:pPr>
       <w:r>
@@ -4579,7 +5731,7 @@
         <w:pStyle w:val="Compact"/>
         <w:numPr>
           <w:ilvl w:val="0"/>
-          <w:numId w:val="1022"/>
+          <w:numId w:val="1024"/>
         </w:numPr>
       </w:pPr>
       <w:r>
@@ -4591,7 +5743,7 @@
         <w:pStyle w:val="Compact"/>
         <w:numPr>
           <w:ilvl w:val="0"/>
-          <w:numId w:val="1022"/>
+          <w:numId w:val="1024"/>
         </w:numPr>
       </w:pPr>
       <w:r>
@@ -4603,7 +5755,7 @@
         <w:pStyle w:val="Compact"/>
         <w:numPr>
           <w:ilvl w:val="0"/>
-          <w:numId w:val="1022"/>
+          <w:numId w:val="1024"/>
         </w:numPr>
       </w:pPr>
       <w:r>
@@ -4615,7 +5767,7 @@
         <w:pStyle w:val="Compact"/>
         <w:numPr>
           <w:ilvl w:val="0"/>
-          <w:numId w:val="1022"/>
+          <w:numId w:val="1024"/>
         </w:numPr>
       </w:pPr>
       <w:r>
@@ -4664,6 +5816,454 @@
         <w:t xml:space="preserve">từ năm 2027, thường xuyên.</w:t>
       </w:r>
     </w:p>
+    <w:bookmarkEnd w:id="42"/>
+    <w:bookmarkStart w:id="43" w:name="X89b037bad4de178bf82ed1f64535a00b5b42e04"/>
+    <w:p>
+      <w:pPr>
+        <w:pStyle w:val="Heading2"/>
+      </w:pPr>
+      <w:r>
+        <w:t xml:space="preserve">Điểm nhấn: ứng phó trên Threads và nền tảng thảo luận mới</w:t>
+      </w:r>
+    </w:p>
+    <w:p>
+      <w:pPr>
+        <w:pStyle w:val="FirstParagraph"/>
+      </w:pPr>
+      <w:r>
+        <w:rPr>
+          <w:i/>
+          <w:iCs/>
+        </w:rPr>
+        <w:t xml:space="preserve">Các việc dưới đây cụ thể hóa nhóm 3, 4, 5, 6 đối với Threads; không phát sinh nhóm giải pháp mới.</w:t>
+      </w:r>
+    </w:p>
+    <w:tbl>
+      <w:tblPr>
+        <w:tblStyle w:val="Table"/>
+        <w:tblW w:type="pct" w:w="5000"/>
+        <w:jc w:val="start"/>
+        <w:tblBorders>
+          <w:top w:val="single" w:sz="4" w:space="0" w:color="8A9BB0"/>
+          <w:left w:val="single" w:sz="4" w:space="0" w:color="8A9BB0"/>
+          <w:bottom w:val="single" w:sz="4" w:space="0" w:color="8A9BB0"/>
+          <w:right w:val="single" w:sz="4" w:space="0" w:color="8A9BB0"/>
+          <w:insideH w:val="single" w:sz="4" w:space="0" w:color="8A9BB0"/>
+          <w:insideV w:val="single" w:sz="4" w:space="0" w:color="8A9BB0"/>
+        </w:tblBorders>
+        <w:tblLook w:firstRow="1" w:lastRow="0" w:firstColumn="0" w:lastColumn="0" w:noHBand="0" w:noVBand="0" w:val="0020"/>
+      </w:tblPr>
+      <w:tblGrid>
+        <w:gridCol w:w="1402"/>
+        <w:gridCol w:w="3712"/>
+        <w:gridCol w:w="1732"/>
+        <w:gridCol w:w="1072"/>
+      </w:tblGrid>
+      <w:tr>
+        <w:trPr>
+          <w:tblHeader w:val="true"/>
+          <w:cantSplit w:val="true"/>
+          <w:tblHeader w:val="true"/>
+        </w:trPr>
+        <w:tc>
+          <w:tcPr>
+            <w:shd w:val="clear" w:color="auto" w:fill="DCE6F0"/>
+          </w:tcPr>
+          <w:p>
+            <w:pPr>
+              <w:pStyle w:val="Compact"/>
+              <w:jc w:val="left"/>
+            </w:pPr>
+            <w:r>
+              <w:rPr>
+                <w:b/>
+                <w:sz w:val="23"/>
+              </w:rPr>
+              <w:t xml:space="preserve">Hướng</w:t>
+            </w:r>
+          </w:p>
+        </w:tc>
+        <w:tc>
+          <w:tcPr>
+            <w:shd w:val="clear" w:color="auto" w:fill="DCE6F0"/>
+          </w:tcPr>
+          <w:p>
+            <w:pPr>
+              <w:pStyle w:val="Compact"/>
+              <w:jc w:val="left"/>
+            </w:pPr>
+            <w:r>
+              <w:rPr>
+                <w:b/>
+                <w:sz w:val="23"/>
+              </w:rPr>
+              <w:t xml:space="preserve">Việc cụ thể</w:t>
+            </w:r>
+          </w:p>
+        </w:tc>
+        <w:tc>
+          <w:tcPr>
+            <w:shd w:val="clear" w:color="auto" w:fill="DCE6F0"/>
+          </w:tcPr>
+          <w:p>
+            <w:pPr>
+              <w:pStyle w:val="Compact"/>
+              <w:jc w:val="left"/>
+            </w:pPr>
+            <w:r>
+              <w:rPr>
+                <w:b/>
+                <w:sz w:val="23"/>
+              </w:rPr>
+              <w:t xml:space="preserve">Chủ trì</w:t>
+            </w:r>
+          </w:p>
+        </w:tc>
+        <w:tc>
+          <w:tcPr>
+            <w:shd w:val="clear" w:color="auto" w:fill="DCE6F0"/>
+          </w:tcPr>
+          <w:p>
+            <w:pPr>
+              <w:pStyle w:val="Compact"/>
+              <w:jc w:val="left"/>
+            </w:pPr>
+            <w:r>
+              <w:rPr>
+                <w:b/>
+                <w:sz w:val="23"/>
+              </w:rPr>
+              <w:t xml:space="preserve">Thời hạn</w:t>
+            </w:r>
+          </w:p>
+        </w:tc>
+      </w:tr>
+      <w:tr>
+        <w:trPr>
+          <w:cantSplit w:val="true"/>
+        </w:trPr>
+        <w:tc>
+          <w:tcPr/>
+          <w:p>
+            <w:pPr>
+              <w:pStyle w:val="Compact"/>
+              <w:jc w:val="left"/>
+            </w:pPr>
+            <w:r>
+              <w:rPr>
+                <w:sz w:val="23"/>
+              </w:rPr>
+              <w:t xml:space="preserve">1. Có mặt chủ động</w:t>
+            </w:r>
+          </w:p>
+        </w:tc>
+        <w:tc>
+          <w:tcPr/>
+          <w:p>
+            <w:pPr>
+              <w:pStyle w:val="Compact"/>
+              <w:jc w:val="left"/>
+            </w:pPr>
+            <w:r>
+              <w:rPr>
+                <w:sz w:val="23"/>
+              </w:rPr>
+              <w:t xml:space="preserve">Bộ VHTTDL, báo chí chủ lực, các bộ, ngành, địa phương thường phát sinh vấn đề nóng mở tài khoản chính thức đã xác thực trên Threads; nội dung ngắn, ngôn ngữ đối thoại; phản hồi trực tiếp tại chuỗi thảo luận</w:t>
+            </w:r>
+          </w:p>
+        </w:tc>
+        <w:tc>
+          <w:tcPr/>
+          <w:p>
+            <w:pPr>
+              <w:pStyle w:val="Compact"/>
+              <w:jc w:val="left"/>
+            </w:pPr>
+            <w:r>
+              <w:rPr>
+                <w:sz w:val="23"/>
+              </w:rPr>
+              <w:t xml:space="preserve">Bộ VHTTDL, các cơ quan báo chí</w:t>
+            </w:r>
+          </w:p>
+        </w:tc>
+        <w:tc>
+          <w:tcPr/>
+          <w:p>
+            <w:pPr>
+              <w:pStyle w:val="Compact"/>
+              <w:jc w:val="left"/>
+            </w:pPr>
+            <w:r>
+              <w:rPr>
+                <w:sz w:val="23"/>
+              </w:rPr>
+              <w:t xml:space="preserve">Quý I/2027</w:t>
+            </w:r>
+          </w:p>
+        </w:tc>
+      </w:tr>
+      <w:tr>
+        <w:trPr>
+          <w:cantSplit w:val="true"/>
+        </w:trPr>
+        <w:tc>
+          <w:tcPr/>
+          <w:p>
+            <w:pPr>
+              <w:pStyle w:val="Compact"/>
+              <w:jc w:val="left"/>
+            </w:pPr>
+            <w:r>
+              <w:rPr>
+                <w:sz w:val="23"/>
+              </w:rPr>
+              <w:t xml:space="preserve">2. Giám sát chuyên biệt</w:t>
+            </w:r>
+          </w:p>
+        </w:tc>
+        <w:tc>
+          <w:tcPr/>
+          <w:p>
+            <w:pPr>
+              <w:pStyle w:val="Compact"/>
+              <w:jc w:val="left"/>
+            </w:pPr>
+            <w:r>
+              <w:rPr>
+                <w:sz w:val="23"/>
+              </w:rPr>
+              <w:t xml:space="preserve">Đưa Threads vào hệ thống giám sát dùng chung; bổ sung chỉ số riêng cho nền tảng văn bản: tốc độ trích dẫn lại, mức độ ảnh chụp màn hình lan sang nền tảng khác, sự xuất hiện của khẩu hiệu tập thể</w:t>
+            </w:r>
+          </w:p>
+        </w:tc>
+        <w:tc>
+          <w:tcPr/>
+          <w:p>
+            <w:pPr>
+              <w:pStyle w:val="Compact"/>
+              <w:jc w:val="left"/>
+            </w:pPr>
+            <w:r>
+              <w:rPr>
+                <w:sz w:val="23"/>
+              </w:rPr>
+              <w:t xml:space="preserve">Cục Thông tin điện tử và Chuyển đổi số, Bộ Công an</w:t>
+            </w:r>
+          </w:p>
+        </w:tc>
+        <w:tc>
+          <w:tcPr/>
+          <w:p>
+            <w:pPr>
+              <w:pStyle w:val="Compact"/>
+              <w:jc w:val="left"/>
+            </w:pPr>
+            <w:r>
+              <w:rPr>
+                <w:sz w:val="23"/>
+              </w:rPr>
+              <w:t xml:space="preserve">Năm 2027</w:t>
+            </w:r>
+          </w:p>
+        </w:tc>
+      </w:tr>
+      <w:tr>
+        <w:trPr>
+          <w:cantSplit w:val="true"/>
+        </w:trPr>
+        <w:tc>
+          <w:tcPr/>
+          <w:p>
+            <w:pPr>
+              <w:pStyle w:val="Compact"/>
+              <w:jc w:val="left"/>
+            </w:pPr>
+            <w:r>
+              <w:rPr>
+                <w:sz w:val="23"/>
+              </w:rPr>
+              <w:t xml:space="preserve">3. Phối hợp với Meta</w:t>
+            </w:r>
+          </w:p>
+        </w:tc>
+        <w:tc>
+          <w:tcPr/>
+          <w:p>
+            <w:pPr>
+              <w:pStyle w:val="Compact"/>
+              <w:jc w:val="left"/>
+            </w:pPr>
+            <w:r>
+              <w:rPr>
+                <w:sz w:val="23"/>
+              </w:rPr>
+              <w:t xml:space="preserve">Kênh ưu tiên xử lý khủng hoảng trên Threads; áp dụng gắn nhãn tin giả theo Nghị định số 328/2026/NĐ-CP; số liệu xử lý riêng cho Threads trong báo cáo định kỳ</w:t>
+            </w:r>
+          </w:p>
+        </w:tc>
+        <w:tc>
+          <w:tcPr/>
+          <w:p>
+            <w:pPr>
+              <w:pStyle w:val="Compact"/>
+              <w:jc w:val="left"/>
+            </w:pPr>
+            <w:r>
+              <w:rPr>
+                <w:sz w:val="23"/>
+              </w:rPr>
+              <w:t xml:space="preserve">Bộ VHTTDL</w:t>
+            </w:r>
+          </w:p>
+        </w:tc>
+        <w:tc>
+          <w:tcPr/>
+          <w:p>
+            <w:pPr>
+              <w:pStyle w:val="Compact"/>
+              <w:jc w:val="left"/>
+            </w:pPr>
+            <w:r>
+              <w:rPr>
+                <w:sz w:val="23"/>
+              </w:rPr>
+              <w:t xml:space="preserve">Quý IV/2026</w:t>
+            </w:r>
+          </w:p>
+        </w:tc>
+      </w:tr>
+      <w:tr>
+        <w:trPr>
+          <w:cantSplit w:val="true"/>
+        </w:trPr>
+        <w:tc>
+          <w:tcPr/>
+          <w:p>
+            <w:pPr>
+              <w:pStyle w:val="Compact"/>
+              <w:jc w:val="left"/>
+            </w:pPr>
+            <w:r>
+              <w:rPr>
+                <w:sz w:val="23"/>
+              </w:rPr>
+              <w:t xml:space="preserve">4. Đối thoại với giới trẻ</w:t>
+            </w:r>
+          </w:p>
+        </w:tc>
+        <w:tc>
+          <w:tcPr/>
+          <w:p>
+            <w:pPr>
+              <w:pStyle w:val="Compact"/>
+              <w:jc w:val="left"/>
+            </w:pPr>
+            <w:r>
+              <w:rPr>
+                <w:sz w:val="23"/>
+              </w:rPr>
+              <w:t xml:space="preserve">Mạng lưới chuyên gia, người có ảnh hưởng trẻ, đoàn viên thanh niên tham gia thảo luận bằng thông tin xác thực; tọa đàm trực tuyến về dự án, chính sách giới trẻ quan tâm</w:t>
+            </w:r>
+          </w:p>
+        </w:tc>
+        <w:tc>
+          <w:tcPr/>
+          <w:p>
+            <w:pPr>
+              <w:pStyle w:val="Compact"/>
+              <w:jc w:val="left"/>
+            </w:pPr>
+            <w:r>
+              <w:rPr>
+                <w:sz w:val="23"/>
+              </w:rPr>
+              <w:t xml:space="preserve">Bộ VHTTDL, Đoàn Thanh niên Cộng sản Hồ Chí Minh</w:t>
+            </w:r>
+          </w:p>
+        </w:tc>
+        <w:tc>
+          <w:tcPr/>
+          <w:p>
+            <w:pPr>
+              <w:pStyle w:val="Compact"/>
+              <w:jc w:val="left"/>
+            </w:pPr>
+            <w:r>
+              <w:rPr>
+                <w:sz w:val="23"/>
+              </w:rPr>
+              <w:t xml:space="preserve">Thường xuyên</w:t>
+            </w:r>
+          </w:p>
+        </w:tc>
+      </w:tr>
+      <w:tr>
+        <w:trPr>
+          <w:cantSplit w:val="true"/>
+        </w:trPr>
+        <w:tc>
+          <w:tcPr/>
+          <w:p>
+            <w:pPr>
+              <w:pStyle w:val="Compact"/>
+              <w:jc w:val="left"/>
+            </w:pPr>
+            <w:r>
+              <w:rPr>
+                <w:sz w:val="23"/>
+              </w:rPr>
+              <w:t xml:space="preserve">5. Ứng xử với ý kiến phản biện</w:t>
+            </w:r>
+          </w:p>
+        </w:tc>
+        <w:tc>
+          <w:tcPr/>
+          <w:p>
+            <w:pPr>
+              <w:pStyle w:val="Compact"/>
+              <w:jc w:val="left"/>
+            </w:pPr>
+            <w:r>
+              <w:rPr>
+                <w:sz w:val="23"/>
+              </w:rPr>
+              <w:t xml:space="preserve">Áp dụng nguyên tắc phân loại phản ứng của dư luận (Phần II, mục 5); ưu tiên đối thoại, cung cấp thông tin; chỉ áp dụng biện pháp kỹ thuật với nội dung vi phạm pháp luật rõ ràng, kèm thông tin giải thích</w:t>
+            </w:r>
+          </w:p>
+        </w:tc>
+        <w:tc>
+          <w:tcPr/>
+          <w:p>
+            <w:pPr>
+              <w:pStyle w:val="Compact"/>
+              <w:jc w:val="left"/>
+            </w:pPr>
+            <w:r>
+              <w:rPr>
+                <w:sz w:val="23"/>
+              </w:rPr>
+              <w:t xml:space="preserve">Các bộ, ngành, địa phương</w:t>
+            </w:r>
+          </w:p>
+        </w:tc>
+        <w:tc>
+          <w:tcPr/>
+          <w:p>
+            <w:pPr>
+              <w:pStyle w:val="Compact"/>
+              <w:jc w:val="left"/>
+            </w:pPr>
+            <w:r>
+              <w:rPr>
+                <w:sz w:val="23"/>
+              </w:rPr>
+              <w:t xml:space="preserve">Áp dụng ngay</w:t>
+            </w:r>
+          </w:p>
+        </w:tc>
+      </w:tr>
+    </w:tbl>
     <w:p>
       <w:pPr>
         <w:pStyle w:val="BlockText"/>
@@ -4684,9 +6284,9 @@
         <w:t xml:space="preserve">”</w:t>
       </w:r>
     </w:p>
-    <w:bookmarkEnd w:id="40"/>
-    <w:bookmarkEnd w:id="41"/>
-    <w:bookmarkStart w:id="45" w:name="phần-iv.-kiến-nghị-đề-xuất"/>
+    <w:bookmarkEnd w:id="43"/>
+    <w:bookmarkEnd w:id="44"/>
+    <w:bookmarkStart w:id="48" w:name="phần-iv.-kiến-nghị-đề-xuất"/>
     <w:p>
       <w:pPr>
         <w:pStyle w:val="Heading1"/>
@@ -4695,7 +6295,7 @@
         <w:t xml:space="preserve">Phần IV. Kiến nghị, đề xuất</w:t>
       </w:r>
     </w:p>
-    <w:bookmarkStart w:id="42" w:name="với-chính-phủ-thủ-tướng-chính-phủ"/>
+    <w:bookmarkStart w:id="45" w:name="với-chính-phủ-thủ-tướng-chính-phủ"/>
     <w:p>
       <w:pPr>
         <w:pStyle w:val="Heading2"/>
@@ -4709,7 +6309,7 @@
         <w:pStyle w:val="Compact"/>
         <w:numPr>
           <w:ilvl w:val="0"/>
-          <w:numId w:val="1023"/>
+          <w:numId w:val="1025"/>
         </w:numPr>
       </w:pPr>
       <w:r>
@@ -4721,7 +6321,7 @@
         <w:pStyle w:val="Compact"/>
         <w:numPr>
           <w:ilvl w:val="0"/>
-          <w:numId w:val="1023"/>
+          <w:numId w:val="1025"/>
         </w:numPr>
       </w:pPr>
       <w:r>
@@ -4733,7 +6333,7 @@
         <w:pStyle w:val="Compact"/>
         <w:numPr>
           <w:ilvl w:val="0"/>
-          <w:numId w:val="1023"/>
+          <w:numId w:val="1025"/>
         </w:numPr>
       </w:pPr>
       <w:r>
@@ -4745,7 +6345,7 @@
         <w:pStyle w:val="Compact"/>
         <w:numPr>
           <w:ilvl w:val="0"/>
-          <w:numId w:val="1023"/>
+          <w:numId w:val="1025"/>
         </w:numPr>
       </w:pPr>
       <w:r>
@@ -4757,7 +6357,7 @@
         <w:pStyle w:val="Compact"/>
         <w:numPr>
           <w:ilvl w:val="0"/>
-          <w:numId w:val="1023"/>
+          <w:numId w:val="1025"/>
         </w:numPr>
       </w:pPr>
       <w:r>
@@ -4769,15 +6369,27 @@
         <w:pStyle w:val="Compact"/>
         <w:numPr>
           <w:ilvl w:val="0"/>
-          <w:numId w:val="1023"/>
+          <w:numId w:val="1025"/>
         </w:numPr>
       </w:pPr>
       <w:r>
         <w:t xml:space="preserve">Duy trì cơ chế họp báo Chính phủ thường kỳ; tổ chức họp báo đột xuất khi xảy ra khủng hoảng cấp độ 3.</w:t>
       </w:r>
     </w:p>
-    <w:bookmarkEnd w:id="42"/>
-    <w:bookmarkStart w:id="43" w:name="với-các-bộ-ngành-địa-phương"/>
+    <w:p>
+      <w:pPr>
+        <w:pStyle w:val="Compact"/>
+        <w:numPr>
+          <w:ilvl w:val="0"/>
+          <w:numId w:val="1025"/>
+        </w:numPr>
+      </w:pPr>
+      <w:r>
+        <w:t xml:space="preserve">Chỉ đạo các bộ, ngành, địa phương công khai thông tin, lấy ý kiến cộng đồng đối với dự án đầu tư lớn tác động tới môi trường, cảnh quan, di sản trước khi triển khai; người đứng đầu chịu trách nhiệm khi thông tin chính thức thiếu nhất quán.</w:t>
+      </w:r>
+    </w:p>
+    <w:bookmarkEnd w:id="45"/>
+    <w:bookmarkStart w:id="46" w:name="với-các-bộ-ngành-địa-phương"/>
     <w:p>
       <w:pPr>
         <w:pStyle w:val="Heading2"/>
@@ -4808,6 +6420,7 @@
       <w:tr>
         <w:trPr>
           <w:tblHeader w:val="true"/>
+          <w:cantSplit w:val="true"/>
           <w:tblHeader w:val="true"/>
         </w:trPr>
         <w:tc>
@@ -4848,6 +6461,9 @@
         </w:tc>
       </w:tr>
       <w:tr>
+        <w:trPr>
+          <w:cantSplit w:val="true"/>
+        </w:trPr>
         <w:tc>
           <w:tcPr/>
           <w:p>
@@ -4880,6 +6496,9 @@
         </w:tc>
       </w:tr>
       <w:tr>
+        <w:trPr>
+          <w:cantSplit w:val="true"/>
+        </w:trPr>
         <w:tc>
           <w:tcPr/>
           <w:p>
@@ -4912,6 +6531,9 @@
         </w:tc>
       </w:tr>
       <w:tr>
+        <w:trPr>
+          <w:cantSplit w:val="true"/>
+        </w:trPr>
         <w:tc>
           <w:tcPr/>
           <w:p>
@@ -4944,6 +6566,9 @@
         </w:tc>
       </w:tr>
       <w:tr>
+        <w:trPr>
+          <w:cantSplit w:val="true"/>
+        </w:trPr>
         <w:tc>
           <w:tcPr/>
           <w:p>
@@ -4976,6 +6601,9 @@
         </w:tc>
       </w:tr>
       <w:tr>
+        <w:trPr>
+          <w:cantSplit w:val="true"/>
+        </w:trPr>
         <w:tc>
           <w:tcPr/>
           <w:p>
@@ -5008,6 +6636,9 @@
         </w:tc>
       </w:tr>
       <w:tr>
+        <w:trPr>
+          <w:cantSplit w:val="true"/>
+        </w:trPr>
         <w:tc>
           <w:tcPr/>
           <w:p>
@@ -5040,6 +6671,9 @@
         </w:tc>
       </w:tr>
       <w:tr>
+        <w:trPr>
+          <w:cantSplit w:val="true"/>
+        </w:trPr>
         <w:tc>
           <w:tcPr/>
           <w:p>
@@ -5072,6 +6706,9 @@
         </w:tc>
       </w:tr>
       <w:tr>
+        <w:trPr>
+          <w:cantSplit w:val="true"/>
+        </w:trPr>
         <w:tc>
           <w:tcPr/>
           <w:p>
@@ -5098,14 +6735,14 @@
               <w:rPr>
                 <w:sz w:val="23"/>
               </w:rPr>
-              <w:t xml:space="preserve">Kiện toàn người phát ngôn, Tổ phản ứng nhanh; vận hành hệ thống thông tin cơ sở; chủ động xử lý khủng hoảng cấp độ 1 và 2 trên địa bàn</w:t>
+              <w:t xml:space="preserve">Kiện toàn người phát ngôn, Tổ phản ứng nhanh; vận hành hệ thống thông tin cơ sở; chủ động xử lý khủng hoảng cấp độ 1 và 2 trên địa bàn; hiện diện, đối thoại trên nền tảng nơi dư luận địa phương khởi phát, kể cả Threads</w:t>
             </w:r>
           </w:p>
         </w:tc>
       </w:tr>
     </w:tbl>
-    <w:bookmarkEnd w:id="43"/>
-    <w:bookmarkStart w:id="44" w:name="phối-hợp-với-các-cơ-quan-của-đảng"/>
+    <w:bookmarkEnd w:id="46"/>
+    <w:bookmarkStart w:id="47" w:name="phối-hợp-với-các-cơ-quan-của-đảng"/>
     <w:p>
       <w:pPr>
         <w:pStyle w:val="Heading2"/>
@@ -5119,12 +6756,12 @@
         <w:pStyle w:val="FirstParagraph"/>
       </w:pPr>
       <w:r>
-        <w:t xml:space="preserve">Đề nghị tiếp tục phối hợp chặt chẽ với Ban Tuyên giáo và Dân vận Trung ương, Ban Chỉ đạo 35 Trung ương trong định hướng thông tin, đấu tranh phản bác quan điểm sai trái, thù địch, thực hiện Nghị quyết số 35-NQ/TW ngày 22/10/2018 của Bộ Chính trị.</w:t>
-      </w:r>
-    </w:p>
-    <w:bookmarkEnd w:id="44"/>
-    <w:bookmarkEnd w:id="45"/>
-    <w:bookmarkStart w:id="46" w:name="kết-luận-cam-kết-hành-động-của-bộ-vhttdl"/>
+        <w:t xml:space="preserve">Đề nghị tiếp tục phối hợp chặt chẽ với Ban Tuyên giáo và Dân vận Trung ương, Ban Chỉ đạo 35 Trung ương trong định hướng thông tin, đấu tranh phản bác quan điểm sai trái, thù địch, thực hiện Nghị quyết số 35-NQ/TW ngày 22/10/2018 của Bộ Chính trị; phối hợp với Mặt trận Tổ quốc Việt Nam, Đoàn Thanh niên Cộng sản Hồ Chí Minh trong đối thoại với giới trẻ trên không gian mạng.</w:t>
+      </w:r>
+    </w:p>
+    <w:bookmarkEnd w:id="47"/>
+    <w:bookmarkEnd w:id="48"/>
+    <w:bookmarkStart w:id="49" w:name="kết-luận-cam-kết-hành-động-của-bộ-vhttdl"/>
     <w:p>
       <w:pPr>
         <w:pStyle w:val="Heading1"/>
@@ -5146,7 +6783,7 @@
         <w:pStyle w:val="Compact"/>
         <w:numPr>
           <w:ilvl w:val="0"/>
-          <w:numId w:val="1024"/>
+          <w:numId w:val="1026"/>
         </w:numPr>
       </w:pPr>
       <w:r>
@@ -5158,7 +6795,7 @@
         <w:pStyle w:val="Compact"/>
         <w:numPr>
           <w:ilvl w:val="0"/>
-          <w:numId w:val="1024"/>
+          <w:numId w:val="1026"/>
         </w:numPr>
       </w:pPr>
       <w:r>
@@ -5170,7 +6807,7 @@
         <w:pStyle w:val="Compact"/>
         <w:numPr>
           <w:ilvl w:val="0"/>
-          <w:numId w:val="1024"/>
+          <w:numId w:val="1026"/>
         </w:numPr>
       </w:pPr>
       <w:r>
@@ -5182,7 +6819,7 @@
         <w:pStyle w:val="Compact"/>
         <w:numPr>
           <w:ilvl w:val="0"/>
-          <w:numId w:val="1024"/>
+          <w:numId w:val="1026"/>
         </w:numPr>
       </w:pPr>
       <w:r>
@@ -5194,7 +6831,7 @@
         <w:pStyle w:val="Compact"/>
         <w:numPr>
           <w:ilvl w:val="0"/>
-          <w:numId w:val="1024"/>
+          <w:numId w:val="1026"/>
         </w:numPr>
       </w:pPr>
       <w:r>
@@ -5203,6 +6840,18 @@
     </w:p>
     <w:p>
       <w:pPr>
+        <w:pStyle w:val="Compact"/>
+        <w:numPr>
+          <w:ilvl w:val="0"/>
+          <w:numId w:val="1026"/>
+        </w:numPr>
+      </w:pPr>
+      <w:r>
+        <w:t xml:space="preserve">Mở tài khoản chính thức của Bộ trên Threads; thí điểm mô hình đối thoại trực tuyến với giới trẻ trong quý I/2027.</w:t>
+      </w:r>
+    </w:p>
+    <w:p>
+      <w:pPr>
         <w:pStyle w:val="BlockText"/>
       </w:pPr>
       <w:r>
@@ -5229,8 +6878,8 @@
         <w:t xml:space="preserve">Xin trân trọng cảm ơn đồng chí Thủ tướng Chính phủ và các đồng chí.</w:t>
       </w:r>
     </w:p>
-    <w:bookmarkEnd w:id="46"/>
-    <w:bookmarkStart w:id="47" w:name="Xaf021c48d344296cf1588fd171e571371fc33c0"/>
+    <w:bookmarkEnd w:id="49"/>
+    <w:bookmarkStart w:id="50" w:name="Xaf021c48d344296cf1588fd171e571371fc33c0"/>
     <w:p>
       <w:pPr>
         <w:pStyle w:val="Heading1"/>
@@ -5265,6 +6914,7 @@
       <w:tr>
         <w:trPr>
           <w:tblHeader w:val="true"/>
+          <w:cantSplit w:val="true"/>
           <w:tblHeader w:val="true"/>
         </w:trPr>
         <w:tc>
@@ -5359,6 +7009,9 @@
         </w:tc>
       </w:tr>
       <w:tr>
+        <w:trPr>
+          <w:cantSplit w:val="true"/>
+        </w:trPr>
         <w:tc>
           <w:tcPr/>
           <w:p>
@@ -5436,6 +7089,9 @@
         </w:tc>
       </w:tr>
       <w:tr>
+        <w:trPr>
+          <w:cantSplit w:val="true"/>
+        </w:trPr>
         <w:tc>
           <w:tcPr/>
           <w:p>
@@ -5513,6 +7169,9 @@
         </w:tc>
       </w:tr>
       <w:tr>
+        <w:trPr>
+          <w:cantSplit w:val="true"/>
+        </w:trPr>
         <w:tc>
           <w:tcPr/>
           <w:p>
@@ -5590,8 +7249,8 @@
         </w:tc>
       </w:tr>
     </w:tbl>
-    <w:bookmarkEnd w:id="47"/>
-    <w:bookmarkStart w:id="48" w:name="Xe828f39b55f5493ea3a374321b14311e1f7bc67"/>
+    <w:bookmarkEnd w:id="50"/>
+    <w:bookmarkStart w:id="51" w:name="Xe828f39b55f5493ea3a374321b14311e1f7bc67"/>
     <w:p>
       <w:pPr>
         <w:pStyle w:val="Heading1"/>
@@ -5624,6 +7283,7 @@
       <w:tr>
         <w:trPr>
           <w:tblHeader w:val="true"/>
+          <w:cantSplit w:val="true"/>
           <w:tblHeader w:val="true"/>
         </w:trPr>
         <w:tc>
@@ -5700,6 +7360,9 @@
         </w:tc>
       </w:tr>
       <w:tr>
+        <w:trPr>
+          <w:cantSplit w:val="true"/>
+        </w:trPr>
         <w:tc>
           <w:tcPr/>
           <w:p>
@@ -5762,6 +7425,9 @@
         </w:tc>
       </w:tr>
       <w:tr>
+        <w:trPr>
+          <w:cantSplit w:val="true"/>
+        </w:trPr>
         <w:tc>
           <w:tcPr/>
           <w:p>
@@ -5824,6 +7490,9 @@
         </w:tc>
       </w:tr>
       <w:tr>
+        <w:trPr>
+          <w:cantSplit w:val="true"/>
+        </w:trPr>
         <w:tc>
           <w:tcPr/>
           <w:p>
@@ -5886,6 +7555,9 @@
         </w:tc>
       </w:tr>
       <w:tr>
+        <w:trPr>
+          <w:cantSplit w:val="true"/>
+        </w:trPr>
         <w:tc>
           <w:tcPr/>
           <w:p>
@@ -5948,8 +7620,8 @@
         </w:tc>
       </w:tr>
     </w:tbl>
-    <w:bookmarkEnd w:id="48"/>
-    <w:bookmarkStart w:id="49" w:name="X4d8239fd0fce95ce6c8a4def7cc38ab6bfec427"/>
+    <w:bookmarkEnd w:id="51"/>
+    <w:bookmarkStart w:id="52" w:name="X4d8239fd0fce95ce6c8a4def7cc38ab6bfec427"/>
     <w:p>
       <w:pPr>
         <w:pStyle w:val="Heading1"/>
@@ -5982,6 +7654,7 @@
       <w:tr>
         <w:trPr>
           <w:tblHeader w:val="true"/>
+          <w:cantSplit w:val="true"/>
           <w:tblHeader w:val="true"/>
         </w:trPr>
         <w:tc>
@@ -6058,6 +7731,9 @@
         </w:tc>
       </w:tr>
       <w:tr>
+        <w:trPr>
+          <w:cantSplit w:val="true"/>
+        </w:trPr>
         <w:tc>
           <w:tcPr/>
           <w:p>
@@ -6120,6 +7796,9 @@
         </w:tc>
       </w:tr>
       <w:tr>
+        <w:trPr>
+          <w:cantSplit w:val="true"/>
+        </w:trPr>
         <w:tc>
           <w:tcPr/>
           <w:p>
@@ -6182,6 +7861,9 @@
         </w:tc>
       </w:tr>
       <w:tr>
+        <w:trPr>
+          <w:cantSplit w:val="true"/>
+        </w:trPr>
         <w:tc>
           <w:tcPr/>
           <w:p>
@@ -6244,6 +7926,9 @@
         </w:tc>
       </w:tr>
       <w:tr>
+        <w:trPr>
+          <w:cantSplit w:val="true"/>
+        </w:trPr>
         <w:tc>
           <w:tcPr/>
           <w:p>
@@ -6306,6 +7991,9 @@
         </w:tc>
       </w:tr>
       <w:tr>
+        <w:trPr>
+          <w:cantSplit w:val="true"/>
+        </w:trPr>
         <w:tc>
           <w:tcPr/>
           <w:p>
@@ -6368,6 +8056,9 @@
         </w:tc>
       </w:tr>
       <w:tr>
+        <w:trPr>
+          <w:cantSplit w:val="true"/>
+        </w:trPr>
         <w:tc>
           <w:tcPr/>
           <w:p>
@@ -6430,6 +8121,9 @@
         </w:tc>
       </w:tr>
       <w:tr>
+        <w:trPr>
+          <w:cantSplit w:val="true"/>
+        </w:trPr>
         <w:tc>
           <w:tcPr/>
           <w:p>
@@ -6492,6 +8186,9 @@
         </w:tc>
       </w:tr>
       <w:tr>
+        <w:trPr>
+          <w:cantSplit w:val="true"/>
+        </w:trPr>
         <w:tc>
           <w:tcPr/>
           <w:p>
@@ -6554,8 +8251,8 @@
         </w:tc>
       </w:tr>
     </w:tbl>
-    <w:bookmarkEnd w:id="49"/>
-    <w:bookmarkStart w:id="50" w:name="X439cb3448f705fe1947d0e45d1505ba5e26dee6"/>
+    <w:bookmarkEnd w:id="52"/>
+    <w:bookmarkStart w:id="53" w:name="X439cb3448f705fe1947d0e45d1505ba5e26dee6"/>
     <w:p>
       <w:pPr>
         <w:pStyle w:val="Heading1"/>
@@ -6581,7 +8278,7 @@
         <w:pStyle w:val="Compact"/>
         <w:numPr>
           <w:ilvl w:val="0"/>
-          <w:numId w:val="1025"/>
+          <w:numId w:val="1027"/>
         </w:numPr>
         <w:jc w:val="left"/>
       </w:pPr>
@@ -6594,7 +8291,7 @@
         <w:pStyle w:val="Compact"/>
         <w:numPr>
           <w:ilvl w:val="0"/>
-          <w:numId w:val="1025"/>
+          <w:numId w:val="1027"/>
         </w:numPr>
         <w:jc w:val="left"/>
       </w:pPr>
@@ -6619,7 +8316,7 @@
         <w:pStyle w:val="Compact"/>
         <w:numPr>
           <w:ilvl w:val="0"/>
-          <w:numId w:val="1026"/>
+          <w:numId w:val="1028"/>
         </w:numPr>
         <w:jc w:val="left"/>
       </w:pPr>
@@ -6632,7 +8329,7 @@
         <w:pStyle w:val="Compact"/>
         <w:numPr>
           <w:ilvl w:val="0"/>
-          <w:numId w:val="1026"/>
+          <w:numId w:val="1028"/>
         </w:numPr>
         <w:jc w:val="left"/>
       </w:pPr>
@@ -6645,7 +8342,7 @@
         <w:pStyle w:val="Compact"/>
         <w:numPr>
           <w:ilvl w:val="0"/>
-          <w:numId w:val="1026"/>
+          <w:numId w:val="1028"/>
         </w:numPr>
         <w:jc w:val="left"/>
       </w:pPr>
@@ -6658,7 +8355,7 @@
         <w:pStyle w:val="Compact"/>
         <w:numPr>
           <w:ilvl w:val="0"/>
-          <w:numId w:val="1026"/>
+          <w:numId w:val="1028"/>
         </w:numPr>
         <w:jc w:val="left"/>
       </w:pPr>
@@ -6683,7 +8380,7 @@
         <w:pStyle w:val="Compact"/>
         <w:numPr>
           <w:ilvl w:val="0"/>
-          <w:numId w:val="1027"/>
+          <w:numId w:val="1029"/>
         </w:numPr>
         <w:jc w:val="left"/>
       </w:pPr>
@@ -6696,7 +8393,7 @@
         <w:pStyle w:val="Compact"/>
         <w:numPr>
           <w:ilvl w:val="0"/>
-          <w:numId w:val="1027"/>
+          <w:numId w:val="1029"/>
         </w:numPr>
         <w:jc w:val="left"/>
       </w:pPr>
@@ -6709,7 +8406,7 @@
         <w:pStyle w:val="Compact"/>
         <w:numPr>
           <w:ilvl w:val="0"/>
-          <w:numId w:val="1027"/>
+          <w:numId w:val="1029"/>
         </w:numPr>
         <w:jc w:val="left"/>
       </w:pPr>
@@ -6722,7 +8419,7 @@
         <w:pStyle w:val="Compact"/>
         <w:numPr>
           <w:ilvl w:val="0"/>
-          <w:numId w:val="1027"/>
+          <w:numId w:val="1029"/>
         </w:numPr>
         <w:jc w:val="left"/>
       </w:pPr>
@@ -6735,7 +8432,7 @@
         <w:pStyle w:val="Compact"/>
         <w:numPr>
           <w:ilvl w:val="0"/>
-          <w:numId w:val="1027"/>
+          <w:numId w:val="1029"/>
         </w:numPr>
         <w:jc w:val="left"/>
       </w:pPr>
@@ -6748,7 +8445,7 @@
         <w:pStyle w:val="Compact"/>
         <w:numPr>
           <w:ilvl w:val="0"/>
-          <w:numId w:val="1027"/>
+          <w:numId w:val="1029"/>
         </w:numPr>
         <w:jc w:val="left"/>
       </w:pPr>
@@ -6761,7 +8458,7 @@
         <w:pStyle w:val="Compact"/>
         <w:numPr>
           <w:ilvl w:val="0"/>
-          <w:numId w:val="1027"/>
+          <w:numId w:val="1029"/>
         </w:numPr>
         <w:jc w:val="left"/>
       </w:pPr>
@@ -6774,7 +8471,7 @@
         <w:pStyle w:val="Compact"/>
         <w:numPr>
           <w:ilvl w:val="0"/>
-          <w:numId w:val="1027"/>
+          <w:numId w:val="1029"/>
         </w:numPr>
         <w:jc w:val="left"/>
       </w:pPr>
@@ -6802,7 +8499,7 @@
         <w:pStyle w:val="Compact"/>
         <w:numPr>
           <w:ilvl w:val="0"/>
-          <w:numId w:val="1027"/>
+          <w:numId w:val="1029"/>
         </w:numPr>
         <w:jc w:val="left"/>
       </w:pPr>
@@ -6815,7 +8512,7 @@
         <w:pStyle w:val="Compact"/>
         <w:numPr>
           <w:ilvl w:val="0"/>
-          <w:numId w:val="1027"/>
+          <w:numId w:val="1029"/>
         </w:numPr>
         <w:jc w:val="left"/>
       </w:pPr>
@@ -6840,7 +8537,7 @@
         <w:pStyle w:val="Compact"/>
         <w:numPr>
           <w:ilvl w:val="0"/>
-          <w:numId w:val="1028"/>
+          <w:numId w:val="1030"/>
         </w:numPr>
         <w:jc w:val="left"/>
       </w:pPr>
@@ -6853,7 +8550,7 @@
         <w:pStyle w:val="Compact"/>
         <w:numPr>
           <w:ilvl w:val="0"/>
-          <w:numId w:val="1028"/>
+          <w:numId w:val="1030"/>
         </w:numPr>
         <w:jc w:val="left"/>
       </w:pPr>
@@ -6866,7 +8563,7 @@
         <w:pStyle w:val="Compact"/>
         <w:numPr>
           <w:ilvl w:val="0"/>
-          <w:numId w:val="1028"/>
+          <w:numId w:val="1030"/>
         </w:numPr>
         <w:jc w:val="left"/>
       </w:pPr>
@@ -6879,7 +8576,7 @@
         <w:pStyle w:val="Compact"/>
         <w:numPr>
           <w:ilvl w:val="0"/>
-          <w:numId w:val="1028"/>
+          <w:numId w:val="1030"/>
         </w:numPr>
         <w:jc w:val="left"/>
       </w:pPr>
@@ -6892,7 +8589,7 @@
         <w:pStyle w:val="Compact"/>
         <w:numPr>
           <w:ilvl w:val="0"/>
-          <w:numId w:val="1028"/>
+          <w:numId w:val="1030"/>
         </w:numPr>
         <w:jc w:val="left"/>
       </w:pPr>
@@ -6905,7 +8602,7 @@
         <w:pStyle w:val="Compact"/>
         <w:numPr>
           <w:ilvl w:val="0"/>
-          <w:numId w:val="1028"/>
+          <w:numId w:val="1030"/>
         </w:numPr>
         <w:jc w:val="left"/>
       </w:pPr>
@@ -6918,7 +8615,7 @@
         <w:pStyle w:val="Compact"/>
         <w:numPr>
           <w:ilvl w:val="0"/>
-          <w:numId w:val="1028"/>
+          <w:numId w:val="1030"/>
         </w:numPr>
         <w:jc w:val="left"/>
       </w:pPr>
@@ -6944,8 +8641,194 @@
         <w:t xml:space="preserve">đạt doanh thu kỷ lục. https://baolaocai.vn/doanh-thu-gan-552-ty-dong-mua-do-chinh-thuc-tro-thanh-phim-an-khach-nhat-moi-thoi-dai-rap-chieu-viet-nam-post881538.html</w:t>
       </w:r>
     </w:p>
-    <w:bookmarkEnd w:id="50"/>
-    <w:bookmarkStart w:id="51" w:name="X3e3258e5ea66b8efb3382786701774f70aaea7a"/>
+    <w:p>
+      <w:pPr>
+        <w:pStyle w:val="FirstParagraph"/>
+      </w:pPr>
+      <w:r>
+        <w:rPr>
+          <w:b/>
+          <w:bCs/>
+        </w:rPr>
+        <w:t xml:space="preserve">Threads và các sự cố năm 2026</w:t>
+      </w:r>
+    </w:p>
+    <w:p>
+      <w:pPr>
+        <w:pStyle w:val="Compact"/>
+        <w:numPr>
+          <w:ilvl w:val="0"/>
+          <w:numId w:val="1031"/>
+        </w:numPr>
+        <w:jc w:val="left"/>
+      </w:pPr>
+      <w:r>
+        <w:t xml:space="preserve">Lần đầu tiên chặn, gỡ nội dung vi phạm trên mạng xã hội Threads (Tuổi Trẻ, 25/6/2026). https://tuoitre.vn/lan-dau-tien-chan-go-noi-dung-vi-pham-tren-mang-xa-hoi-threads-100260625131951823.htm</w:t>
+      </w:r>
+    </w:p>
+    <w:p>
+      <w:pPr>
+        <w:pStyle w:val="Compact"/>
+        <w:numPr>
+          <w:ilvl w:val="0"/>
+          <w:numId w:val="1031"/>
+        </w:numPr>
+        <w:jc w:val="left"/>
+      </w:pPr>
+      <w:r>
+        <w:t xml:space="preserve">Threads đạt mốc 500 triệu người dùng hằng tháng (VietnamPlus). https://www.vietnamplus.vn/mang-xa-hoi-threads-dat-moc-500-trieu-nguoi-dung-hang-thang-sau-gan-3-nam-post1117039.vnp</w:t>
+      </w:r>
+    </w:p>
+    <w:p>
+      <w:pPr>
+        <w:pStyle w:val="Compact"/>
+        <w:numPr>
+          <w:ilvl w:val="0"/>
+          <w:numId w:val="1031"/>
+        </w:numPr>
+        <w:jc w:val="left"/>
+      </w:pPr>
+      <w:r>
+        <w:t xml:space="preserve">Ước tính số người dùng Threads tại Việt Nam (nguồn thị trường, chưa chính thức). https://raccoon.vn/chi-tiet-tin-tuc/thong-ke-so-nguoi-viet-nam-su-dung-mang-xa-hoi-threads-hien-nay-352</w:t>
+      </w:r>
+    </w:p>
+    <w:p>
+      <w:pPr>
+        <w:pStyle w:val="Compact"/>
+        <w:numPr>
+          <w:ilvl w:val="0"/>
+          <w:numId w:val="1031"/>
+        </w:numPr>
+        <w:jc w:val="left"/>
+      </w:pPr>
+      <w:r>
+        <w:t xml:space="preserve">Facebook, Messenger, Instagram, Threads đồng loạt gián đoạn tại Việt Nam (Phụ nữ Việt Nam, 12/6/2026). https://phunuvietnam.vn/facebook-messenger-instagram-threads-dong-loat-sap-tai-viet-nam-238260612210826749.htm</w:t>
+      </w:r>
+    </w:p>
+    <w:p>
+      <w:pPr>
+        <w:pStyle w:val="Compact"/>
+        <w:numPr>
+          <w:ilvl w:val="0"/>
+          <w:numId w:val="1031"/>
+        </w:numPr>
+        <w:jc w:val="left"/>
+      </w:pPr>
+      <w:r>
+        <w:t xml:space="preserve">Khởi công dự án Làng Vân dưới chân đèo Hải Vân (Tuổi Trẻ, 22/6/2025). https://tuoitre.vn/vingroup-khoi-cong-du-an-44-000-ti-dong-duoi-chan-deo-hai-van-da-nang-20250622114340955.htm</w:t>
+      </w:r>
+    </w:p>
+    <w:p>
+      <w:pPr>
+        <w:pStyle w:val="Compact"/>
+        <w:numPr>
+          <w:ilvl w:val="0"/>
+          <w:numId w:val="1031"/>
+        </w:numPr>
+        <w:jc w:val="left"/>
+      </w:pPr>
+      <w:r>
+        <w:t xml:space="preserve">Sở Tài chính Hà Nội: dự án Safari Ba Vì mới là đề xuất của nhà đầu tư (Tuổi Trẻ, 5/10/2026). https://tuoitre.vn/so-tai-chinh-ha-noi-du-an-safari-ba-vi-moi-la-de-xuat-cua-nha-dau-tu-chua-phai-chu-truong-cua-ha-noi-100261005165353826.htm</w:t>
+      </w:r>
+    </w:p>
+    <w:p>
+      <w:pPr>
+        <w:pStyle w:val="Compact"/>
+        <w:numPr>
+          <w:ilvl w:val="0"/>
+          <w:numId w:val="1031"/>
+        </w:numPr>
+        <w:jc w:val="left"/>
+      </w:pPr>
+      <w:r>
+        <w:t xml:space="preserve">Dự án Safari Ba Vì giảm diện tích từ 580 ha xuống khoảng 300 ha (Dân trí, 5/10/2026). https://dantri.com.vn/thoi-su/du-an-safari-ba-vi-giam-gan-mot-nua-dien-tich-tu-580ha-xuong-khoang-300ha-20261005181057335.htm</w:t>
+      </w:r>
+    </w:p>
+    <w:p>
+      <w:pPr>
+        <w:pStyle w:val="Compact"/>
+        <w:numPr>
+          <w:ilvl w:val="0"/>
+          <w:numId w:val="1031"/>
+        </w:numPr>
+        <w:jc w:val="left"/>
+      </w:pPr>
+      <w:r>
+        <w:t xml:space="preserve">Bài báo nêu Hà Nội thống nhất chủ trương đầu tư Công viên Safari Ba Vì, khởi công dịp 10/10 (VOV). https://vov.vn/xa-hoi/ha-noi-thong-nhat-chu-truong-dau-tu-cong-vien-safari-ba-vi-khoi-cong-dip-1010-post1338883.vov</w:t>
+      </w:r>
+    </w:p>
+    <w:p>
+      <w:pPr>
+        <w:pStyle w:val="Compact"/>
+        <w:numPr>
+          <w:ilvl w:val="0"/>
+          <w:numId w:val="1031"/>
+        </w:numPr>
+        <w:jc w:val="left"/>
+      </w:pPr>
+      <w:r>
+        <w:t xml:space="preserve">Gen Z Việt Nam và Threads (Mekong Eye, 26/10/2026). https://www.mekongeye.com/2026/10/26/vietnam-genz-threads</w:t>
+      </w:r>
+    </w:p>
+    <w:p>
+      <w:pPr>
+        <w:pStyle w:val="Compact"/>
+        <w:numPr>
+          <w:ilvl w:val="0"/>
+          <w:numId w:val="1031"/>
+        </w:numPr>
+        <w:jc w:val="left"/>
+      </w:pPr>
+      <w:r>
+        <w:t xml:space="preserve">Cảnh giác âm mưu lợi dụng biểu tình, bạo loạn ở Indonesia, Nepal để kích động</w:t>
+      </w:r>
+      <w:r>
+        <w:t xml:space="preserve"> </w:t>
+      </w:r>
+      <w:r>
+        <w:t xml:space="preserve">“</w:t>
+      </w:r>
+      <w:r>
+        <w:t xml:space="preserve">cách mạng màu</w:t>
+      </w:r>
+      <w:r>
+        <w:t xml:space="preserve">”</w:t>
+      </w:r>
+      <w:r>
+        <w:t xml:space="preserve"> </w:t>
+      </w:r>
+      <w:r>
+        <w:t xml:space="preserve">(Báo Lào Cai). https://baolaocai.vn/canh-giac-am-muu-loi-dung-bieu-tinh-bao-loan-o-indonesia-nepal-de-kich-dong-cach-mang-mau-post882057.html</w:t>
+      </w:r>
+    </w:p>
+    <w:p>
+      <w:pPr>
+        <w:pStyle w:val="Compact"/>
+        <w:numPr>
+          <w:ilvl w:val="0"/>
+          <w:numId w:val="1031"/>
+        </w:numPr>
+        <w:jc w:val="left"/>
+      </w:pPr>
+      <w:r>
+        <w:t xml:space="preserve">Để Gen Z không bị cuốn vào dòng xoáy thông tin gây bất ổn xã hội (Báo Công an nhân dân). https://cand.vn/de-gen-z-khong-bi-cuon-vao-dong-xoay-thong-tin-gay-bat-on-xa-hoi-post820186.html</w:t>
+      </w:r>
+    </w:p>
+    <w:p>
+      <w:pPr>
+        <w:pStyle w:val="Compact"/>
+        <w:numPr>
+          <w:ilvl w:val="0"/>
+          <w:numId w:val="1031"/>
+        </w:numPr>
+        <w:jc w:val="left"/>
+      </w:pPr>
+      <w:r>
+        <w:t xml:space="preserve">Tin giả trong mùa mưa lũ đặc biệt nguy hiểm (Sức khỏe và Đời sống, 17/9/2026). https://suckhoedoisong.vn/tin-gia-trong-mua-mua-lu-dac-biet-nguy-hiem-co-the-gay-chet-nguoi-169260917101216227.htm</w:t>
+      </w:r>
+    </w:p>
+    <w:bookmarkEnd w:id="53"/>
+    <w:bookmarkStart w:id="54" w:name="X3e3258e5ea66b8efb3382786701774f70aaea7a"/>
     <w:p>
       <w:pPr>
         <w:pStyle w:val="Heading1"/>
@@ -6976,6 +8859,7 @@
       <w:tr>
         <w:trPr>
           <w:tblHeader w:val="true"/>
+          <w:cantSplit w:val="true"/>
           <w:tblHeader w:val="true"/>
         </w:trPr>
         <w:tc>
@@ -7016,6 +8900,9 @@
         </w:tc>
       </w:tr>
       <w:tr>
+        <w:trPr>
+          <w:cantSplit w:val="true"/>
+        </w:trPr>
         <w:tc>
           <w:tcPr/>
           <w:p>
@@ -7048,6 +8935,9 @@
         </w:tc>
       </w:tr>
       <w:tr>
+        <w:trPr>
+          <w:cantSplit w:val="true"/>
+        </w:trPr>
         <w:tc>
           <w:tcPr/>
           <w:p>
@@ -7080,6 +8970,9 @@
         </w:tc>
       </w:tr>
       <w:tr>
+        <w:trPr>
+          <w:cantSplit w:val="true"/>
+        </w:trPr>
         <w:tc>
           <w:tcPr/>
           <w:p>
@@ -7112,6 +9005,9 @@
         </w:tc>
       </w:tr>
       <w:tr>
+        <w:trPr>
+          <w:cantSplit w:val="true"/>
+        </w:trPr>
         <w:tc>
           <w:tcPr/>
           <w:p>
@@ -7144,6 +9040,9 @@
         </w:tc>
       </w:tr>
       <w:tr>
+        <w:trPr>
+          <w:cantSplit w:val="true"/>
+        </w:trPr>
         <w:tc>
           <w:tcPr/>
           <w:p>
@@ -7176,6 +9075,9 @@
         </w:tc>
       </w:tr>
       <w:tr>
+        <w:trPr>
+          <w:cantSplit w:val="true"/>
+        </w:trPr>
         <w:tc>
           <w:tcPr/>
           <w:p>
@@ -7208,6 +9110,9 @@
         </w:tc>
       </w:tr>
       <w:tr>
+        <w:trPr>
+          <w:cantSplit w:val="true"/>
+        </w:trPr>
         <w:tc>
           <w:tcPr/>
           <w:p>
@@ -7235,12 +9140,152 @@
                 <w:sz w:val="23"/>
               </w:rPr>
               <w:t xml:space="preserve">Vụ Pháp chế</w:t>
+            </w:r>
+          </w:p>
+        </w:tc>
+      </w:tr>
+      <w:tr>
+        <w:trPr>
+          <w:cantSplit w:val="true"/>
+        </w:trPr>
+        <w:tc>
+          <w:tcPr/>
+          <w:p>
+            <w:pPr>
+              <w:pStyle w:val="Compact"/>
+              <w:jc w:val="left"/>
+            </w:pPr>
+            <w:r>
+              <w:rPr>
+                <w:sz w:val="23"/>
+              </w:rPr>
+              <w:t xml:space="preserve">Số người dùng Threads tại Việt Nam; số yêu cầu chặn, gỡ và tỷ lệ đáp ứng riêng của Threads năm 2026</w:t>
+            </w:r>
+          </w:p>
+        </w:tc>
+        <w:tc>
+          <w:tcPr/>
+          <w:p>
+            <w:pPr>
+              <w:pStyle w:val="Compact"/>
+              <w:jc w:val="left"/>
+            </w:pPr>
+            <w:r>
+              <w:rPr>
+                <w:sz w:val="23"/>
+              </w:rPr>
+              <w:t xml:space="preserve">Cục Thông tin điện tử và Chuyển đổi số</w:t>
+            </w:r>
+          </w:p>
+        </w:tc>
+      </w:tr>
+      <w:tr>
+        <w:trPr>
+          <w:cantSplit w:val="true"/>
+        </w:trPr>
+        <w:tc>
+          <w:tcPr/>
+          <w:p>
+            <w:pPr>
+              <w:pStyle w:val="Compact"/>
+              <w:jc w:val="left"/>
+            </w:pPr>
+            <w:r>
+              <w:rPr>
+                <w:sz w:val="23"/>
+              </w:rPr>
+              <w:t xml:space="preserve">Diễn biến trên Threads của vụ Làng Vân (từ giữa tháng 7/2026) và vụ Safari Ba Vì (tháng 10/2026), trong đó có phản ánh của người dùng về việc bài viết không hiển thị tại Việt Nam ngày 17 và 18/10/2026 (thông tin hiện chỉ có từ người dùng và nguồn nước ngoài)</w:t>
+            </w:r>
+          </w:p>
+        </w:tc>
+        <w:tc>
+          <w:tcPr/>
+          <w:p>
+            <w:pPr>
+              <w:pStyle w:val="Compact"/>
+              <w:jc w:val="left"/>
+            </w:pPr>
+            <w:r>
+              <w:rPr>
+                <w:sz w:val="23"/>
+              </w:rPr>
+              <w:t xml:space="preserve">Cục Thông tin điện tử và Chuyển đổi số, phối hợp Bộ Công an</w:t>
+            </w:r>
+          </w:p>
+        </w:tc>
+      </w:tr>
+      <w:tr>
+        <w:trPr>
+          <w:cantSplit w:val="true"/>
+        </w:trPr>
+        <w:tc>
+          <w:tcPr/>
+          <w:p>
+            <w:pPr>
+              <w:pStyle w:val="Compact"/>
+              <w:jc w:val="left"/>
+            </w:pPr>
+            <w:r>
+              <w:rPr>
+                <w:sz w:val="23"/>
+              </w:rPr>
+              <w:t xml:space="preserve">Thông tin chính thức, phản hồi của chính quyền về dự án Làng Vân và đề xuất dự án Safari Ba Vì</w:t>
+            </w:r>
+          </w:p>
+        </w:tc>
+        <w:tc>
+          <w:tcPr/>
+          <w:p>
+            <w:pPr>
+              <w:pStyle w:val="Compact"/>
+              <w:jc w:val="left"/>
+            </w:pPr>
+            <w:r>
+              <w:rPr>
+                <w:sz w:val="23"/>
+              </w:rPr>
+              <w:t xml:space="preserve">UBND thành phố Đà Nẵng, UBND thành phố Hà Nội</w:t>
+            </w:r>
+          </w:p>
+        </w:tc>
+      </w:tr>
+      <w:tr>
+        <w:trPr>
+          <w:cantSplit w:val="true"/>
+        </w:trPr>
+        <w:tc>
+          <w:tcPr/>
+          <w:p>
+            <w:pPr>
+              <w:pStyle w:val="Compact"/>
+              <w:jc w:val="left"/>
+            </w:pPr>
+            <w:r>
+              <w:rPr>
+                <w:sz w:val="23"/>
+              </w:rPr>
+              <w:t xml:space="preserve">Số vụ xử lý tin giả mùa mưa bão năm 2026 có thể nêu làm dẫn chứng</w:t>
+            </w:r>
+          </w:p>
+        </w:tc>
+        <w:tc>
+          <w:tcPr/>
+          <w:p>
+            <w:pPr>
+              <w:pStyle w:val="Compact"/>
+              <w:jc w:val="left"/>
+            </w:pPr>
+            <w:r>
+              <w:rPr>
+                <w:sz w:val="23"/>
+              </w:rPr>
+              <w:t xml:space="preserve">Cục Thông tin điện tử và Chuyển đổi số, phối hợp Bộ Công an</w:t>
             </w:r>
           </w:p>
         </w:tc>
       </w:tr>
     </w:tbl>
-    <w:bookmarkEnd w:id="51"/>
+    <w:bookmarkEnd w:id="54"/>
     <w:sectPr>
       <w:footerReference w:type="default" r:id="rId9"/>
       <w:pgSz w:w="11906" w:h="16838"/>
@@ -7641,15 +9686,6 @@
     <w:abstractNumId w:val="991"/>
   </w:num>
   <w:num w:numId="1009">
-    <w:abstractNumId w:val="991"/>
-  </w:num>
-  <w:num w:numId="1010">
-    <w:abstractNumId w:val="991"/>
-  </w:num>
-  <w:num w:numId="1011">
-    <w:abstractNumId w:val="991"/>
-  </w:num>
-  <w:num w:numId="1012">
     <w:abstractNumId w:val="99411"/>
     <w:lvlOverride w:ilvl="0">
       <w:startOverride w:val="1"/>
@@ -7678,6 +9714,15 @@
     <w:lvlOverride w:ilvl="8">
       <w:startOverride w:val="1"/>
     </w:lvlOverride>
+  </w:num>
+  <w:num w:numId="1010">
+    <w:abstractNumId w:val="991"/>
+  </w:num>
+  <w:num w:numId="1011">
+    <w:abstractNumId w:val="991"/>
+  </w:num>
+  <w:num w:numId="1012">
+    <w:abstractNumId w:val="991"/>
   </w:num>
   <w:num w:numId="1013">
     <w:abstractNumId w:val="991"/>
@@ -7716,27 +9761,6 @@
     <w:abstractNumId w:val="991"/>
   </w:num>
   <w:num w:numId="1016">
-    <w:abstractNumId w:val="991"/>
-  </w:num>
-  <w:num w:numId="1017">
-    <w:abstractNumId w:val="991"/>
-  </w:num>
-  <w:num w:numId="1018">
-    <w:abstractNumId w:val="991"/>
-  </w:num>
-  <w:num w:numId="1019">
-    <w:abstractNumId w:val="991"/>
-  </w:num>
-  <w:num w:numId="1020">
-    <w:abstractNumId w:val="991"/>
-  </w:num>
-  <w:num w:numId="1021">
-    <w:abstractNumId w:val="991"/>
-  </w:num>
-  <w:num w:numId="1022">
-    <w:abstractNumId w:val="991"/>
-  </w:num>
-  <w:num w:numId="1023">
     <w:abstractNumId w:val="99411"/>
     <w:lvlOverride w:ilvl="0">
       <w:startOverride w:val="1"/>
@@ -7766,7 +9790,31 @@
       <w:startOverride w:val="1"/>
     </w:lvlOverride>
   </w:num>
+  <w:num w:numId="1017">
+    <w:abstractNumId w:val="991"/>
+  </w:num>
+  <w:num w:numId="1018">
+    <w:abstractNumId w:val="991"/>
+  </w:num>
+  <w:num w:numId="1019">
+    <w:abstractNumId w:val="991"/>
+  </w:num>
+  <w:num w:numId="1020">
+    <w:abstractNumId w:val="991"/>
+  </w:num>
+  <w:num w:numId="1021">
+    <w:abstractNumId w:val="991"/>
+  </w:num>
+  <w:num w:numId="1022">
+    <w:abstractNumId w:val="991"/>
+  </w:num>
+  <w:num w:numId="1023">
+    <w:abstractNumId w:val="991"/>
+  </w:num>
   <w:num w:numId="1024">
+    <w:abstractNumId w:val="991"/>
+  </w:num>
+  <w:num w:numId="1025">
     <w:abstractNumId w:val="99411"/>
     <w:lvlOverride w:ilvl="0">
       <w:startOverride w:val="1"/>
@@ -7796,16 +9844,49 @@
       <w:startOverride w:val="1"/>
     </w:lvlOverride>
   </w:num>
-  <w:num w:numId="1025">
-    <w:abstractNumId w:val="991"/>
-  </w:num>
   <w:num w:numId="1026">
-    <w:abstractNumId w:val="991"/>
+    <w:abstractNumId w:val="99411"/>
+    <w:lvlOverride w:ilvl="0">
+      <w:startOverride w:val="1"/>
+    </w:lvlOverride>
+    <w:lvlOverride w:ilvl="1">
+      <w:startOverride w:val="1"/>
+    </w:lvlOverride>
+    <w:lvlOverride w:ilvl="2">
+      <w:startOverride w:val="1"/>
+    </w:lvlOverride>
+    <w:lvlOverride w:ilvl="3">
+      <w:startOverride w:val="1"/>
+    </w:lvlOverride>
+    <w:lvlOverride w:ilvl="4">
+      <w:startOverride w:val="1"/>
+    </w:lvlOverride>
+    <w:lvlOverride w:ilvl="5">
+      <w:startOverride w:val="1"/>
+    </w:lvlOverride>
+    <w:lvlOverride w:ilvl="6">
+      <w:startOverride w:val="1"/>
+    </w:lvlOverride>
+    <w:lvlOverride w:ilvl="7">
+      <w:startOverride w:val="1"/>
+    </w:lvlOverride>
+    <w:lvlOverride w:ilvl="8">
+      <w:startOverride w:val="1"/>
+    </w:lvlOverride>
   </w:num>
   <w:num w:numId="1027">
     <w:abstractNumId w:val="991"/>
   </w:num>
   <w:num w:numId="1028">
+    <w:abstractNumId w:val="991"/>
+  </w:num>
+  <w:num w:numId="1029">
+    <w:abstractNumId w:val="991"/>
+  </w:num>
+  <w:num w:numId="1030">
+    <w:abstractNumId w:val="991"/>
+  </w:num>
+  <w:num w:numId="1031">
     <w:abstractNumId w:val="991"/>
   </w:num>
 </w:numbering>

</xml_diff>

<commit_message>
Cập nhật căn cứ pháp lý và số liệu mới cho đề cương (dự thảo 3, phần 1)
- Sửa căn cứ lạc hậu: Nghị định 09/2017/NĐ-CP đã được thay thế bằng
  Nghị định 244/2026/NĐ-CP (hiệu lực 1/7/2026); kiến nghị chuyển từ
  “sớm ban hành” sang “thực hiện nghiêm”, mốc “giờ vàng” đối chiếu với
  thời hạn tối đa 24 giờ tại Điều 7
- Bổ sung: Điều 31 Luật Báo chí 2025, thời hạn gỡ bỏ theo Luật An ninh
  mạng 2025, Luật Bảo vệ dữ liệu cá nhân, Nghị định 219/2026, Nghị định
  343/2026, Luật Tiếp cận thông tin, Luật Thực hiện dân chủ ở cơ sở
- Số liệu mới: Digital News Report 2026, lừa đảo trực tuyến và deepfake
  2025-2026, mốc so sánh chặn, gỡ quý III/2025
- Phụ lục 5: thêm việc đối chiếu toàn văn và số liệu quý III/2026

Co-Authored-By: Claude Opus 5.5 <noreply@anthropic.com>
Claude-Session: https://claude.ai/code/session_01NzZ78rAanjcMCsGwt7jxAb
</commit_message>
<xml_diff>
--- a/tham-luan-khung-hoang-truyen-thong/de-cuong-tham-luan-bvhttdl.docx
+++ b/tham-luan-khung-hoang-truyen-thong/de-cuong-tham-luan-bvhttdl.docx
@@ -258,7 +258,7 @@
         <w:pStyle w:val="ThongTinChung"/>
       </w:pPr>
       <w:r>
-        <w:t xml:space="preserve">Dự thảo 2, ngày 28/10/2026. Tài liệu làm việc phục vụ tổ biên tập.</w:t>
+        <w:t xml:space="preserve">Dự thảo 3, ngày 28/10/2026. Tài liệu làm việc phục vụ tổ biên tập.</w:t>
       </w:r>
     </w:p>
     <w:bookmarkStart w:id="20" w:name="tóm-tắt"/>
@@ -695,7 +695,7 @@
               <w:rPr>
                 <w:sz w:val="23"/>
               </w:rPr>
-              <w:t xml:space="preserve">Phụ lục 1 đến 5 phát tại hội nghị, không đọc trong bài nói</w:t>
+              <w:t xml:space="preserve">Phụ lục 1 đến 6 phát tại hội nghị, không đọc trong bài nói</w:t>
             </w:r>
           </w:p>
         </w:tc>
@@ -1298,7 +1298,19 @@
         </w:numPr>
       </w:pPr>
       <w:r>
-        <w:t xml:space="preserve">Năm 2026 là năm đầu triển khai Nghị quyết Đại hội XIV của Đảng; bộ máy sau sắp xếp và chính quyền địa phương 2 cấp đi vào vận hành; nhiều luật mới có hiệu lực (Luật Trí tuệ nhân tạo từ 1/3/2026, Luật Báo chí và Luật An ninh mạng từ 1/7/2026). Những thay đổi lớn luôn kéo theo nhu cầu thông tin lớn, đồng thời mở ra cơ hội để đối tượng xấu xuyên tạc, kích động.</w:t>
+        <w:t xml:space="preserve">Trên thế giới, mạng xã hội và nền tảng video lần đầu tiên vượt website, ứng dụng của cơ quan báo chí, trở thành kênh tiếp cận tin tức trực tuyến phổ biến nhất; 27% người tham gia khảo sát nhận tin từ người sáng tạo nội dung chuyên về tin tức; niềm tin vào tin tức giảm đáng kể ở 29/48 thị trường (Digital News Report 2026 của Viện Reuters, khảo sát gần 100.000 người tại 48 thị trường, chưa bao gồm Việt Nam).</w:t>
+      </w:r>
+    </w:p>
+    <w:p>
+      <w:pPr>
+        <w:pStyle w:val="Compact"/>
+        <w:numPr>
+          <w:ilvl w:val="0"/>
+          <w:numId w:val="1003"/>
+        </w:numPr>
+      </w:pPr>
+      <w:r>
+        <w:t xml:space="preserve">Năm 2026 là năm đầu triển khai Nghị quyết Đại hội XIV của Đảng; bộ máy sau sắp xếp và chính quyền địa phương 2 cấp đi vào vận hành; nhiều luật, nghị định mới có hiệu lực (Luật Bảo vệ dữ liệu cá nhân từ 1/1/2026; Luật Trí tuệ nhân tạo từ 1/3/2026; Luật Báo chí, Luật An ninh mạng và Nghị định số 244/2026/NĐ-CP về phát ngôn từ 1/7/2026; Nghị định số 328/2026/NĐ-CP về xử lý tin giả từ 5/10/2026). Những thay đổi lớn luôn kéo theo nhu cầu thông tin lớn, đồng thời mở ra cơ hội để đối tượng xấu xuyên tạc, kích động.</w:t>
       </w:r>
     </w:p>
     <w:p>
@@ -1559,7 +1571,7 @@
         <w:t xml:space="preserve"> </w:t>
       </w:r>
       <w:r>
-        <w:t xml:space="preserve">AI tạo sinh giúp làm giả hình ảnh, giọng nói lãnh đạo, mạo danh cơ quan báo chí, cơ quan nhà nước với chi phí rất thấp.</w:t>
+        <w:t xml:space="preserve">AI tạo sinh giúp làm giả hình ảnh, giọng nói lãnh đạo, mạo danh cơ quan báo chí, cơ quan nhà nước với chi phí rất thấp. Năm 2025, Bộ Công an phát hiện hơn 4.200 vụ lừa đảo trực tuyến, thiệt hại hơn 8.000 tỷ đồng; 9 tháng đầu năm 2026 ghi nhận thêm 1.800 vụ việc; nhiều vụ dùng video deepfake mạo danh cán bộ công an, kiểm sát viên.</w:t>
       </w:r>
     </w:p>
     <w:p>
@@ -3275,7 +3287,7 @@
         </w:numPr>
       </w:pPr>
       <w:r>
-        <w:t xml:space="preserve">Luật Báo chí số 126/2025/QH15 (hiệu lực từ 1/7/2026) bổ sung quy định về quyền yêu cầu cải chính, sử dụng AI trong hoạt động báo chí, mở rộng không gian phát triển báo chí.</w:t>
+        <w:t xml:space="preserve">Luật Báo chí số 126/2025/QH15 (hiệu lực từ 1/7/2026): Điều 31 quy định cơ quan, tổ chức, người có thẩm quyền vừa có quyền, vừa có nghĩa vụ cung cấp thông tin cho báo chí và chịu trách nhiệm về nội dung cung cấp; luật bổ sung quy định về quyền yêu cầu cải chính, sử dụng AI trong hoạt động báo chí.</w:t>
       </w:r>
     </w:p>
     <w:p>
@@ -3287,7 +3299,7 @@
         </w:numPr>
       </w:pPr>
       <w:r>
-        <w:t xml:space="preserve">Luật An ninh mạng số 116/2025/QH15 (hiệu lực từ 1/7/2026) quy định các hành vi nghiêm cấm, trong đó có bịa đặt, lan truyền thông tin sai sự thật.</w:t>
+        <w:t xml:space="preserve">Luật An ninh mạng số 116/2025/QH15 (hiệu lực từ 1/7/2026): nghiêm cấm bịa đặt, lan truyền thông tin sai sự thật; doanh nghiệp viễn thông, Internet, mạng xã hội xử lý thông tin vi phạm tối đa 24 giờ kể từ khi nhận yêu cầu hợp pháp, thời hạn ngắn hơn trong trường hợp khẩn cấp.</w:t>
       </w:r>
     </w:p>
     <w:p>
@@ -3311,6 +3323,18 @@
         </w:numPr>
       </w:pPr>
       <w:r>
+        <w:t xml:space="preserve">Luật Bảo vệ dữ liệu cá nhân số 91/2025/QH15 (hiệu lực từ 1/1/2026) và Nghị định số 356/2025/NĐ-CP: căn cứ xử lý hành vi phát tán trái phép dữ liệu cá nhân của nạn nhân, người liên quan trong các vụ việc gây chú ý.</w:t>
+      </w:r>
+    </w:p>
+    <w:p>
+      <w:pPr>
+        <w:pStyle w:val="Compact"/>
+        <w:numPr>
+          <w:ilvl w:val="0"/>
+          <w:numId w:val="1010"/>
+        </w:numPr>
+      </w:pPr>
+      <w:r>
         <w:t xml:space="preserve">Luật số 75/2025/QH15 sửa đổi, bổ sung Luật Quảng cáo (hiệu lực từ 1/1/2026) quy định nghĩa vụ của người chuyển tải sản phẩm quảng cáo, trong đó có người có ảnh hưởng.</w:t>
       </w:r>
     </w:p>
@@ -3323,6 +3347,18 @@
         </w:numPr>
       </w:pPr>
       <w:r>
+        <w:t xml:space="preserve">Nghị định số 244/2026/NĐ-CP ngày 26/6/2026 (hiệu lực từ 1/7/2026) về phát ngôn và cung cấp thông tin cho báo chí, thay thế Nghị định số 09/2017/NĐ-CP: với vụ việc đột xuất, bất thường hoặc khi dư luận có nhiều ý kiến trái chiều, người phát ngôn cung cấp thông tin ban đầu chậm nhất 24 giờ (Điều 7); vụ việc liên quan từ 2 bộ, ngành, địa phương trở lên có 1 đầu mối chủ trì thống nhất nội dung phát ngôn; cơ quan công khai thông tin người phát ngôn trên cổng thông tin điện tử trong 24 giờ; các cơ quan ban hành quy chế phát ngôn nội bộ trong 45 ngày.</w:t>
+      </w:r>
+    </w:p>
+    <w:p>
+      <w:pPr>
+        <w:pStyle w:val="Compact"/>
+        <w:numPr>
+          <w:ilvl w:val="0"/>
+          <w:numId w:val="1010"/>
+        </w:numPr>
+      </w:pPr>
+      <w:r>
         <w:t xml:space="preserve">Nghị định số 147/2024/NĐ-CP yêu cầu xác thực tài khoản mạng xã hội và gỡ bỏ thông tin vi phạm chậm nhất 24 giờ kể từ khi có yêu cầu.</w:t>
       </w:r>
     </w:p>
@@ -3347,6 +3383,18 @@
         </w:numPr>
       </w:pPr>
       <w:r>
+        <w:t xml:space="preserve">Nghị định số 219/2026/NĐ-CP (hiệu lực từ 8/8/2026) quy định xử phạt trong lĩnh vực khí tượng thủy văn, mức phạt cao nhất 40 triệu đồng đối với nhóm hành vi truyền tin sai lệch về dự báo, cảnh báo.</w:t>
+      </w:r>
+    </w:p>
+    <w:p>
+      <w:pPr>
+        <w:pStyle w:val="Compact"/>
+        <w:numPr>
+          <w:ilvl w:val="0"/>
+          <w:numId w:val="1010"/>
+        </w:numPr>
+      </w:pPr>
+      <w:r>
         <w:t xml:space="preserve">Nghị định số 327/2026/NĐ-CP ngày 19/8/2026 quy định chi tiết Điều 14 Luật An ninh mạng, bổ sung biện pháp yêu cầu xóa bỏ thông tin, ngăn chặn truy cập hệ thống thông tin ở nước ngoài vi phạm.</w:t>
       </w:r>
     </w:p>
@@ -3360,6 +3408,18 @@
       </w:pPr>
       <w:r>
         <w:t xml:space="preserve">Nghị định số 328/2026/NĐ-CP ngày 19/8/2026 (hiệu lực từ 5/10/2026) quy định quy trình phát hiện, kiểm chứng, xác minh, gắn nhãn, cảnh báo, ngăn chặn, gỡ bỏ và xử lý tin giả, tin sai sự thật; xác định trách nhiệm của các bộ, ngành, UBND các cấp.</w:t>
+      </w:r>
+    </w:p>
+    <w:p>
+      <w:pPr>
+        <w:pStyle w:val="Compact"/>
+        <w:numPr>
+          <w:ilvl w:val="0"/>
+          <w:numId w:val="1010"/>
+        </w:numPr>
+      </w:pPr>
+      <w:r>
+        <w:t xml:space="preserve">Nghị định số 343/2026/NĐ-CP ngày 3/9/2026 quy định việc tiếp nhận, xử lý xung đột thông tin trên không gian mạng thuộc phạm vi Bộ Quốc phòng; Bộ VHTTDL tham gia ngăn chặn, khắc phục xung đột thông tin trên báo chí, phát thanh, truyền hình, thông tin điện tử.</w:t>
       </w:r>
     </w:p>
     <w:p>
@@ -3447,6 +3507,18 @@
       </w:pPr>
       <w:r>
         <w:t xml:space="preserve">Thời gian nền tảng xử lý yêu cầu rút xuống còn 3 đến 12 giờ, thay vì khoảng 24 giờ như trước.</w:t>
+      </w:r>
+    </w:p>
+    <w:p>
+      <w:pPr>
+        <w:pStyle w:val="Compact"/>
+        <w:numPr>
+          <w:ilvl w:val="0"/>
+          <w:numId w:val="1011"/>
+        </w:numPr>
+      </w:pPr>
+      <w:r>
+        <w:t xml:space="preserve">Mốc so sánh quý III/2025: Bộ VHTTDL xử lý hơn 12.200 thông tin xấu độc; Facebook chặn, gỡ 10.713 bài viết (tỷ lệ 96%), YouTube 705 video (92%), TikTok 798 nội dung (97%).</w:t>
       </w:r>
     </w:p>
     <w:p>
@@ -4821,7 +4893,7 @@
         <w:t xml:space="preserve">”</w:t>
       </w:r>
       <w:r>
-        <w:t xml:space="preserve">.</w:t>
+        <w:t xml:space="preserve">, trên cơ sở Luật Tiếp cận thông tin năm 2016 và Luật Thực hiện dân chủ ở cơ sở năm 2022.</w:t>
       </w:r>
     </w:p>
     <w:p>
@@ -4966,7 +5038,7 @@
         </w:numPr>
       </w:pPr>
       <w:r>
-        <w:t xml:space="preserve">Sớm ban hành Nghị định quy định chi tiết việc phát ngôn và cung cấp thông tin cho báo chí của cơ quan hành chính nhà nước, thay thế Nghị định số 09/2017/NĐ-CP, theo Kế hoạch ban hành kèm Quyết định số 329/QĐ-TTg ngày 24/2/2026. Đề xuất bổ sung: thời hạn cung cấp thông tin ban đầu đối với sự việc nghiêm trọng; cơ chế ủy quyền phát ngôn; phát ngôn trên tài khoản chính thức của cơ quan nhà nước trên nền tảng số.</w:t>
+        <w:t xml:space="preserve">Triển khai nghiêm Nghị định số 244/2026/NĐ-CP về phát ngôn và cung cấp thông tin cho báo chí: kiểm tra việc ban hành quy chế phát ngôn nội bộ (thời hạn 45 ngày kể từ ngày 1/7/2026); hướng dẫn phát ngôn trên tài khoản chính thức của cơ quan nhà nước trên nền tảng số; trong Quy chế phối hợp, đặt mục tiêu thông tin ban đầu sớm hơn mốc tối đa 24 giờ tại Điều 7 đối với khủng hoảng cấp độ 2 và 3.</w:t>
       </w:r>
     </w:p>
     <w:p>
@@ -5251,7 +5323,7 @@
         <w:t xml:space="preserve">”</w:t>
       </w:r>
       <w:r>
-        <w:t xml:space="preserve">.</w:t>
+        <w:t xml:space="preserve">, phù hợp cơ chế 1 đầu mối chủ trì của Nghị định số 244/2026/NĐ-CP.</w:t>
       </w:r>
     </w:p>
     <w:p>
@@ -5317,7 +5389,7 @@
         <w:t xml:space="preserve"> </w:t>
       </w:r>
       <w:r>
-        <w:t xml:space="preserve">thông tin ban đầu trong 3 giờ đối với cấp độ 3, trong 6 giờ đối với cấp độ 2, trong 24 giờ đối với cấp độ 1; họp báo hoặc thông cáo đầy đủ trong 24 giờ đối với cấp độ 2 và 3.</w:t>
+        <w:t xml:space="preserve">thông tin ban đầu trong 3 giờ đối với cấp độ 3, trong 6 giờ đối với cấp độ 2, trong 24 giờ đối với cấp độ 1; họp báo hoặc thông cáo đầy đủ trong 24 giờ đối với cấp độ 2 và 3. Mốc 24 giờ là thời hạn tối đa theo Điều 7 Nghị định số 244/2026/NĐ-CP; mốc 3 giờ, 6 giờ là mục tiêu đề xuất, phù hợp tốc độ lan truyền trên mạng xã hội.</w:t>
       </w:r>
     </w:p>
     <w:p>
@@ -6337,7 +6409,7 @@
         </w:numPr>
       </w:pPr>
       <w:r>
-        <w:t xml:space="preserve">Sớm ban hành Nghị định về phát ngôn và cung cấp thông tin cho báo chí, thay thế Nghị định số 09/2017/NĐ-CP.</w:t>
+        <w:t xml:space="preserve">Chỉ đạo các bộ, ngành, địa phương thực hiện nghiêm Nghị định số 244/2026/NĐ-CP về phát ngôn và cung cấp thông tin cho báo chí, nhất là thời hạn thông tin ban đầu chậm nhất 24 giờ và cơ chế 1 đầu mối đối với vụ việc liên ngành, liên tỉnh; giao Bộ VHTTDL hướng dẫn phát ngôn trên nền tảng số.</w:t>
       </w:r>
     </w:p>
     <w:p>
@@ -7249,6 +7321,18 @@
         </w:tc>
       </w:tr>
     </w:tbl>
+    <w:p>
+      <w:pPr>
+        <w:pStyle w:val="BodyText"/>
+      </w:pPr>
+      <w:r>
+        <w:rPr>
+          <w:i/>
+          <w:iCs/>
+        </w:rPr>
+        <w:t xml:space="preserve">Ghi chú: mốc 24 giờ là thời hạn tối đa theo Điều 7 Nghị định số 244/2026/NĐ-CP; mốc 6 giờ, 3 giờ là mục tiêu đề xuất đưa vào Quy chế phối hợp.</w:t>
+      </w:r>
+    </w:p>
     <w:bookmarkEnd w:id="50"/>
     <w:bookmarkStart w:id="51" w:name="Xe828f39b55f5493ea3a374321b14311e1f7bc67"/>
     <w:p>
@@ -7875,7 +7959,7 @@
               <w:rPr>
                 <w:sz w:val="23"/>
               </w:rPr>
-              <w:t xml:space="preserve">Nghị định về phát ngôn, cung cấp thông tin cho báo chí</w:t>
+              <w:t xml:space="preserve">Hướng dẫn thực hiện Nghị định số 244/2026/NĐ-CP, phát ngôn trên nền tảng số; kiểm tra quy chế phát ngôn nội bộ</w:t>
             </w:r>
           </w:p>
         </w:tc>
@@ -7905,22 +7989,22 @@
               <w:rPr>
                 <w:sz w:val="23"/>
               </w:rPr>
-              <w:t xml:space="preserve">Bộ Tư pháp, Văn phòng Chính phủ</w:t>
-            </w:r>
-          </w:p>
-        </w:tc>
-        <w:tc>
-          <w:tcPr/>
-          <w:p>
-            <w:pPr>
-              <w:pStyle w:val="Compact"/>
-              <w:jc w:val="left"/>
-            </w:pPr>
-            <w:r>
-              <w:rPr>
-                <w:sz w:val="23"/>
-              </w:rPr>
-              <w:t xml:space="preserve">Theo Quyết định số 329/QĐ-TTg</w:t>
+              <w:t xml:space="preserve">Văn phòng Chính phủ, các bộ, ngành, địa phương</w:t>
+            </w:r>
+          </w:p>
+        </w:tc>
+        <w:tc>
+          <w:tcPr/>
+          <w:p>
+            <w:pPr>
+              <w:pStyle w:val="Compact"/>
+              <w:jc w:val="left"/>
+            </w:pPr>
+            <w:r>
+              <w:rPr>
+                <w:sz w:val="23"/>
+              </w:rPr>
+              <w:t xml:space="preserve">Quý IV/2026</w:t>
             </w:r>
           </w:p>
         </w:tc>
@@ -8365,6 +8449,57 @@
     </w:p>
     <w:p>
       <w:pPr>
+        <w:pStyle w:val="Compact"/>
+        <w:numPr>
+          <w:ilvl w:val="0"/>
+          <w:numId w:val="1028"/>
+        </w:numPr>
+        <w:jc w:val="left"/>
+      </w:pPr>
+      <w:r>
+        <w:t xml:space="preserve">Luật Bảo vệ dữ liệu cá nhân số 91/2025/QH15, hiệu lực từ 1/1/2026. https://hatinh.gov.vn/vi/bai-viet/luat-bao-ve-du-lieu-ca-nhan-chinh-thuc-co-hieu-luc-thi-hanh-tu-ngay-112026</w:t>
+      </w:r>
+    </w:p>
+    <w:p>
+      <w:pPr>
+        <w:pStyle w:val="Compact"/>
+        <w:numPr>
+          <w:ilvl w:val="0"/>
+          <w:numId w:val="1028"/>
+        </w:numPr>
+      </w:pPr>
+      <w:r>
+        <w:t xml:space="preserve">Luật Tiếp cận thông tin số 104/2016/QH13 và Luật Thực hiện dân chủ ở cơ sở số 10/2022/QH15 (tổ biên tập đối chiếu tại Cơ sở dữ liệu quốc gia về pháp luật).</w:t>
+      </w:r>
+    </w:p>
+    <w:p>
+      <w:pPr>
+        <w:pStyle w:val="Compact"/>
+        <w:numPr>
+          <w:ilvl w:val="0"/>
+          <w:numId w:val="1028"/>
+        </w:numPr>
+        <w:jc w:val="left"/>
+      </w:pPr>
+      <w:r>
+        <w:t xml:space="preserve">Điều 31 Luật Báo chí năm 2025 về cung cấp thông tin cho báo chí. https://pbgdpl.cantho.gov.vn/quy-dinh-ve-cung-cap-thong-tin-cho-bao-chi-theo-luat-bao-chi-nam-2025</w:t>
+      </w:r>
+    </w:p>
+    <w:p>
+      <w:pPr>
+        <w:pStyle w:val="Compact"/>
+        <w:numPr>
+          <w:ilvl w:val="0"/>
+          <w:numId w:val="1028"/>
+        </w:numPr>
+        <w:jc w:val="left"/>
+      </w:pPr>
+      <w:r>
+        <w:t xml:space="preserve">Thời hạn xử lý thông tin vi phạm theo Luật An ninh mạng năm 2025. https://luatvietnam.vn/tin-van-ban-moi/mang-xa-hoi-buoc-go-noi-dung-vi-pham-trong-3-6-gio-doi-voi-truong-hop-khan-cap-186-106179-article.html</w:t>
+      </w:r>
+    </w:p>
+    <w:p>
+      <w:pPr>
         <w:pStyle w:val="FirstParagraph"/>
       </w:pPr>
       <w:r>
@@ -8385,7 +8520,7 @@
         <w:jc w:val="left"/>
       </w:pPr>
       <w:r>
-        <w:t xml:space="preserve">Nghị định số 09/2017/NĐ-CP ngày 9/2/2017 quy định chi tiết việc phát ngôn và cung cấp thông tin cho báo chí của các cơ quan hành chính nhà nước. https://luatvietnam.vn/thong-tin/nghi-dinh-09-2017-nd-cp-chinh-phu-112267-d1.html</w:t>
+        <w:t xml:space="preserve">Nghị định số 244/2026/NĐ-CP ngày 26/6/2026 quy định chi tiết việc phát ngôn và cung cấp thông tin cho báo chí của các cơ quan hành chính nhà nước, hiệu lực từ 1/7/2026, thay thế Nghị định số 09/2017/NĐ-CP. https://luatvietnam.vn/hanh-chinh/nghi-dinh-244-2026-nd-cp-quy-dinh-phat-ngon-va-cung-cap-thong-tin-cho-bao-chi-438961-d1.html</w:t>
       </w:r>
     </w:p>
     <w:p>
@@ -8412,6 +8547,32 @@
       </w:pPr>
       <w:r>
         <w:t xml:space="preserve">Nghị định số 174/2026/NĐ-CP về xử phạt vi phạm hành chính trong lĩnh vực bưu chính, viễn thông, giao dịch điện tử và công nghệ thông tin, hiệu lực từ 1/7/2026. https://baovanhoa.vn/phap-luat/tu-17-cung-cap-chia-se-thong-tin-gia-mao-sai-su-that-tren-mang-xa-hoi-bi-phat-den-50-trieu-dong-230197.html</w:t>
+      </w:r>
+    </w:p>
+    <w:p>
+      <w:pPr>
+        <w:pStyle w:val="Compact"/>
+        <w:numPr>
+          <w:ilvl w:val="0"/>
+          <w:numId w:val="1029"/>
+        </w:numPr>
+        <w:jc w:val="left"/>
+      </w:pPr>
+      <w:r>
+        <w:t xml:space="preserve">Nghị định số 219/2026/NĐ-CP ngày 21/6/2026 quy định xử phạt trong lĩnh vực khí tượng thủy văn, hiệu lực từ 8/8/2026. https://vov.vn/xa-hoi/dua-tin-sai-lech-ve-du-bao-khi-tuong-thuy-van-co-the-bi-phat-den-40-trieu-dong-post1310071.vov</w:t>
+      </w:r>
+    </w:p>
+    <w:p>
+      <w:pPr>
+        <w:pStyle w:val="Compact"/>
+        <w:numPr>
+          <w:ilvl w:val="0"/>
+          <w:numId w:val="1029"/>
+        </w:numPr>
+        <w:jc w:val="left"/>
+      </w:pPr>
+      <w:r>
+        <w:t xml:space="preserve">Nghị định số 343/2026/NĐ-CP ngày 3/9/2026 quy định việc tiếp nhận và xử lý xung đột thông tin trên không gian mạng. https://www.vietnamplus.vn/quy-dinh-viec-tiep-nhan-va-xu-ly-xung-dot-thong-tin-tren-khong-gian-mang-post1134300.vnp</w:t>
       </w:r>
     </w:p>
     <w:p>
@@ -8582,6 +8743,58 @@
       </w:pPr>
       <w:r>
         <w:t xml:space="preserve">Tỷ lệ chặn, gỡ trên 92% giai đoạn 2021-2025. https://www.sggp.org.vn/go-bo-tren-92-thong-tin-xau-doc-tren-facebook-youtube-tiktok-post830682.html</w:t>
+      </w:r>
+    </w:p>
+    <w:p>
+      <w:pPr>
+        <w:pStyle w:val="Compact"/>
+        <w:numPr>
+          <w:ilvl w:val="0"/>
+          <w:numId w:val="1030"/>
+        </w:numPr>
+        <w:jc w:val="left"/>
+      </w:pPr>
+      <w:r>
+        <w:t xml:space="preserve">Hơn 12.200 thông tin xấu độc trên mạng bị gỡ bỏ trong quý III/2025 (Báo Điện tử Chính phủ). https://baochinhphu.vn/hon-12200-thong-tin-xau-doc-tren-mang-bi-go-bo-102251010182038234.htm</w:t>
+      </w:r>
+    </w:p>
+    <w:p>
+      <w:pPr>
+        <w:pStyle w:val="Compact"/>
+        <w:numPr>
+          <w:ilvl w:val="0"/>
+          <w:numId w:val="1030"/>
+        </w:numPr>
+        <w:jc w:val="left"/>
+      </w:pPr>
+      <w:r>
+        <w:t xml:space="preserve">1.800 vụ việc lừa đảo trực tuyến trong 9 tháng năm 2026 (Dân Việt). https://danviet.vn/1800-vu-viec-lua-dao-truc-tuyen-trong-9-thang-nam-2026-dai-ta-cong-an-neu-cac-giai-phap-chan-dong-tien-bat-hop-phap-d1467783.html</w:t>
+      </w:r>
+    </w:p>
+    <w:p>
+      <w:pPr>
+        <w:pStyle w:val="Compact"/>
+        <w:numPr>
+          <w:ilvl w:val="0"/>
+          <w:numId w:val="1030"/>
+        </w:numPr>
+        <w:jc w:val="left"/>
+      </w:pPr>
+      <w:r>
+        <w:t xml:space="preserve">Bộ Công an cảnh báo tình trạng dùng AI, deepfake để lừa đảo trên không gian mạng (Tuổi Trẻ, 3/6/2026). https://tuoitre.vn/bo-cong-an-canh-bao-tinh-trang-dung-ai-deepfake-de-lua-dao-tren-khong-gian-mang-2026060317353666.htm</w:t>
+      </w:r>
+    </w:p>
+    <w:p>
+      <w:pPr>
+        <w:pStyle w:val="Compact"/>
+        <w:numPr>
+          <w:ilvl w:val="0"/>
+          <w:numId w:val="1030"/>
+        </w:numPr>
+        <w:jc w:val="left"/>
+      </w:pPr>
+      <w:r>
+        <w:t xml:space="preserve">Reuters Institute, Digital News Report 2026 (tóm tắt). https://www.benton.org/headlines/reuters-institute-digital-news-report-2026</w:t>
       </w:r>
     </w:p>
     <w:p>
@@ -8914,22 +9127,22 @@
               <w:rPr>
                 <w:sz w:val="23"/>
               </w:rPr>
-              <w:t xml:space="preserve">Số liệu chính thức chặn, gỡ thông tin vi phạm 9 tháng năm 2026; số liệu nền về thời gian phát hiện, phản hồi</w:t>
-            </w:r>
-          </w:p>
-        </w:tc>
-        <w:tc>
-          <w:tcPr/>
-          <w:p>
-            <w:pPr>
-              <w:pStyle w:val="Compact"/>
-              <w:jc w:val="left"/>
-            </w:pPr>
-            <w:r>
-              <w:rPr>
-                <w:sz w:val="23"/>
-              </w:rPr>
-              <w:t xml:space="preserve">Cục Thông tin điện tử và Chuyển đổi số</w:t>
+              <w:t xml:space="preserve">Đối chiếu toàn văn các luật, nghị định tại Phần II, mục 1 và Phụ lục 4 (dự thảo này mới tổng hợp từ báo chí và trang pháp luật thứ cấp, chưa đọc toàn văn), nhất là Điều 7 Nghị định số 244/2026/NĐ-CP, thời hạn gỡ bỏ khẩn cấp theo Luật An ninh mạng năm 2025, phạm vi Nghị định số 219/2026/NĐ-CP và Nghị định số 343/2026/NĐ-CP</w:t>
+            </w:r>
+          </w:p>
+        </w:tc>
+        <w:tc>
+          <w:tcPr/>
+          <w:p>
+            <w:pPr>
+              <w:pStyle w:val="Compact"/>
+              <w:jc w:val="left"/>
+            </w:pPr>
+            <w:r>
+              <w:rPr>
+                <w:sz w:val="23"/>
+              </w:rPr>
+              <w:t xml:space="preserve">Vụ Pháp chế</w:t>
             </w:r>
           </w:p>
         </w:tc>
@@ -8949,22 +9162,22 @@
               <w:rPr>
                 <w:sz w:val="23"/>
               </w:rPr>
-              <w:t xml:space="preserve">1 đến 2 vụ việc năm 2026 thuộc lĩnh vực văn hóa, thể thao, du lịch, báo chí do Bộ VHTTDL trực tiếp xử lý</w:t>
-            </w:r>
-          </w:p>
-        </w:tc>
-        <w:tc>
-          <w:tcPr/>
-          <w:p>
-            <w:pPr>
-              <w:pStyle w:val="Compact"/>
-              <w:jc w:val="left"/>
-            </w:pPr>
-            <w:r>
-              <w:rPr>
-                <w:sz w:val="23"/>
-              </w:rPr>
-              <w:t xml:space="preserve">Văn phòng Bộ, Cục Báo chí</w:t>
+              <w:t xml:space="preserve">Số liệu chính thức chặn, gỡ thông tin vi phạm quý III và 9 tháng năm 2026 (chưa công bố công khai); số liệu nền về thời gian phát hiện, phản hồi</w:t>
+            </w:r>
+          </w:p>
+        </w:tc>
+        <w:tc>
+          <w:tcPr/>
+          <w:p>
+            <w:pPr>
+              <w:pStyle w:val="Compact"/>
+              <w:jc w:val="left"/>
+            </w:pPr>
+            <w:r>
+              <w:rPr>
+                <w:sz w:val="23"/>
+              </w:rPr>
+              <w:t xml:space="preserve">Cục Thông tin điện tử và Chuyển đổi số</w:t>
             </w:r>
           </w:p>
         </w:tc>
@@ -8984,22 +9197,22 @@
               <w:rPr>
                 <w:sz w:val="23"/>
               </w:rPr>
-              <w:t xml:space="preserve">Kết quả xử phạt theo Nghị định số 174/2026/NĐ-CP từ ngày 1/7/2026</w:t>
-            </w:r>
-          </w:p>
-        </w:tc>
-        <w:tc>
-          <w:tcPr/>
-          <w:p>
-            <w:pPr>
-              <w:pStyle w:val="Compact"/>
-              <w:jc w:val="left"/>
-            </w:pPr>
-            <w:r>
-              <w:rPr>
-                <w:sz w:val="23"/>
-              </w:rPr>
-              <w:t xml:space="preserve">Cơ quan có thẩm quyền xử phạt thuộc Bộ, phối hợp Bộ Công an</w:t>
+              <w:t xml:space="preserve">Tình hình ban hành quy chế phát ngôn nội bộ của các bộ, ngành, địa phương theo Nghị định số 244/2026/NĐ-CP</w:t>
+            </w:r>
+          </w:p>
+        </w:tc>
+        <w:tc>
+          <w:tcPr/>
+          <w:p>
+            <w:pPr>
+              <w:pStyle w:val="Compact"/>
+              <w:jc w:val="left"/>
+            </w:pPr>
+            <w:r>
+              <w:rPr>
+                <w:sz w:val="23"/>
+              </w:rPr>
+              <w:t xml:space="preserve">Văn phòng Bộ, phối hợp Văn phòng Chính phủ</w:t>
             </w:r>
           </w:p>
         </w:tc>
@@ -9019,22 +9232,22 @@
               <w:rPr>
                 <w:sz w:val="23"/>
               </w:rPr>
-              <w:t xml:space="preserve">Tiến độ xây dựng Nghị định về phát ngôn thay thế Nghị định số 09/2017/NĐ-CP; tiến độ sửa đổi Nghị định số 147/2024/NĐ-CP</w:t>
-            </w:r>
-          </w:p>
-        </w:tc>
-        <w:tc>
-          <w:tcPr/>
-          <w:p>
-            <w:pPr>
-              <w:pStyle w:val="Compact"/>
-              <w:jc w:val="left"/>
-            </w:pPr>
-            <w:r>
-              <w:rPr>
-                <w:sz w:val="23"/>
-              </w:rPr>
-              <w:t xml:space="preserve">Vụ Pháp chế</w:t>
+              <w:t xml:space="preserve">Số liệu lừa đảo trực tuyến, deepfake năm 2025 và 9 tháng năm 2026</w:t>
+            </w:r>
+          </w:p>
+        </w:tc>
+        <w:tc>
+          <w:tcPr/>
+          <w:p>
+            <w:pPr>
+              <w:pStyle w:val="Compact"/>
+              <w:jc w:val="left"/>
+            </w:pPr>
+            <w:r>
+              <w:rPr>
+                <w:sz w:val="23"/>
+              </w:rPr>
+              <w:t xml:space="preserve">Bộ Công an</w:t>
             </w:r>
           </w:p>
         </w:tc>
@@ -9054,22 +9267,22 @@
               <w:rPr>
                 <w:sz w:val="23"/>
               </w:rPr>
-              <w:t xml:space="preserve">Mô hình tổ chức, cơ quan chủ quản hiện hành của Trung tâm Xử lý tin giả Việt Nam sau sắp xếp</w:t>
-            </w:r>
-          </w:p>
-        </w:tc>
-        <w:tc>
-          <w:tcPr/>
-          <w:p>
-            <w:pPr>
-              <w:pStyle w:val="Compact"/>
-              <w:jc w:val="left"/>
-            </w:pPr>
-            <w:r>
-              <w:rPr>
-                <w:sz w:val="23"/>
-              </w:rPr>
-              <w:t xml:space="preserve">Cục Thông tin điện tử và Chuyển đổi số</w:t>
+              <w:t xml:space="preserve">1 đến 2 vụ việc năm 2026 thuộc lĩnh vực văn hóa, thể thao, du lịch, báo chí do Bộ VHTTDL trực tiếp xử lý</w:t>
+            </w:r>
+          </w:p>
+        </w:tc>
+        <w:tc>
+          <w:tcPr/>
+          <w:p>
+            <w:pPr>
+              <w:pStyle w:val="Compact"/>
+              <w:jc w:val="left"/>
+            </w:pPr>
+            <w:r>
+              <w:rPr>
+                <w:sz w:val="23"/>
+              </w:rPr>
+              <w:t xml:space="preserve">Văn phòng Bộ, Cục Báo chí</w:t>
             </w:r>
           </w:p>
         </w:tc>
@@ -9089,22 +9302,22 @@
               <w:rPr>
                 <w:sz w:val="23"/>
               </w:rPr>
-              <w:t xml:space="preserve">Thẩm quyền, cơ quan chủ trì từng bước trong quy trình xử lý tin giả theo Nghị định số 328/2026/NĐ-CP, làm cơ sở phân vai trong Quy chế phối hợp</w:t>
-            </w:r>
-          </w:p>
-        </w:tc>
-        <w:tc>
-          <w:tcPr/>
-          <w:p>
-            <w:pPr>
-              <w:pStyle w:val="Compact"/>
-              <w:jc w:val="left"/>
-            </w:pPr>
-            <w:r>
-              <w:rPr>
-                <w:sz w:val="23"/>
-              </w:rPr>
-              <w:t xml:space="preserve">Vụ Pháp chế, Cục Thông tin điện tử và Chuyển đổi số</w:t>
+              <w:t xml:space="preserve">Kết quả xử phạt theo Nghị định số 174/2026/NĐ-CP từ ngày 1/7/2026</w:t>
+            </w:r>
+          </w:p>
+        </w:tc>
+        <w:tc>
+          <w:tcPr/>
+          <w:p>
+            <w:pPr>
+              <w:pStyle w:val="Compact"/>
+              <w:jc w:val="left"/>
+            </w:pPr>
+            <w:r>
+              <w:rPr>
+                <w:sz w:val="23"/>
+              </w:rPr>
+              <w:t xml:space="preserve">Cơ quan có thẩm quyền xử phạt thuộc Bộ, phối hợp Bộ Công an</w:t>
             </w:r>
           </w:p>
         </w:tc>
@@ -9124,7 +9337,7 @@
               <w:rPr>
                 <w:sz w:val="23"/>
               </w:rPr>
-              <w:t xml:space="preserve">Đối chiếu toàn văn các văn bản tại Phụ lục 4 với Công báo, Cơ sở dữ liệu quốc gia về pháp luật</w:t>
+              <w:t xml:space="preserve">Tiến độ sửa đổi Nghị định số 147/2024/NĐ-CP; nghị định hướng dẫn Luật An ninh mạng năm 2025 về nghĩa vụ của doanh nghiệp</w:t>
             </w:r>
           </w:p>
         </w:tc>
@@ -9140,6 +9353,76 @@
                 <w:sz w:val="23"/>
               </w:rPr>
               <w:t xml:space="preserve">Vụ Pháp chế</w:t>
+            </w:r>
+          </w:p>
+        </w:tc>
+      </w:tr>
+      <w:tr>
+        <w:trPr>
+          <w:cantSplit w:val="true"/>
+        </w:trPr>
+        <w:tc>
+          <w:tcPr/>
+          <w:p>
+            <w:pPr>
+              <w:pStyle w:val="Compact"/>
+              <w:jc w:val="left"/>
+            </w:pPr>
+            <w:r>
+              <w:rPr>
+                <w:sz w:val="23"/>
+              </w:rPr>
+              <w:t xml:space="preserve">Mô hình tổ chức, cơ quan chủ quản hiện hành của Trung tâm Xử lý tin giả Việt Nam sau sắp xếp</w:t>
+            </w:r>
+          </w:p>
+        </w:tc>
+        <w:tc>
+          <w:tcPr/>
+          <w:p>
+            <w:pPr>
+              <w:pStyle w:val="Compact"/>
+              <w:jc w:val="left"/>
+            </w:pPr>
+            <w:r>
+              <w:rPr>
+                <w:sz w:val="23"/>
+              </w:rPr>
+              <w:t xml:space="preserve">Cục Thông tin điện tử và Chuyển đổi số</w:t>
+            </w:r>
+          </w:p>
+        </w:tc>
+      </w:tr>
+      <w:tr>
+        <w:trPr>
+          <w:cantSplit w:val="true"/>
+        </w:trPr>
+        <w:tc>
+          <w:tcPr/>
+          <w:p>
+            <w:pPr>
+              <w:pStyle w:val="Compact"/>
+              <w:jc w:val="left"/>
+            </w:pPr>
+            <w:r>
+              <w:rPr>
+                <w:sz w:val="23"/>
+              </w:rPr>
+              <w:t xml:space="preserve">Thẩm quyền, cơ quan chủ trì từng bước trong quy trình xử lý tin giả theo Nghị định số 328/2026/NĐ-CP, làm cơ sở phân vai trong Quy chế phối hợp</w:t>
+            </w:r>
+          </w:p>
+        </w:tc>
+        <w:tc>
+          <w:tcPr/>
+          <w:p>
+            <w:pPr>
+              <w:pStyle w:val="Compact"/>
+              <w:jc w:val="left"/>
+            </w:pPr>
+            <w:r>
+              <w:rPr>
+                <w:sz w:val="23"/>
+              </w:rPr>
+              <w:t xml:space="preserve">Vụ Pháp chế, Cục Thông tin điện tử và Chuyển đổi số</w:t>
             </w:r>
           </w:p>
         </w:tc>

</xml_diff>

<commit_message>
Bổ sung kinh nghiệm quốc tế vào đề cương (dự thảo 3, phần 2)
- Phần II, mục 6: 7 bài học quốc tế (Trung Quốc, Singapore, Anh, Liên
  minh châu Âu, Nepal, Pháp và Thụy Điển, Phần Lan và nghiên cứu “tiêm
  chủng thông tin”)
- Lồng ghép vào giải pháp: thông tin tối thiểu có thể công bố khi vụ
  việc đang điều tra (nhóm 2), báo cáo bằng chứng về chiến dịch thao
  túng (nhóm 3), cải chính đính kèm (nhóm 4), giao thức khủng hoảng
  của nền tảng và không chặn diện rộng (nhóm 6), “tiêm chủng thông
  tin” (nhóm 7)
- Phụ lục 6: bảng chi tiết cơ chế, số liệu, mức phù hợp và nguồn
- Tóm tắt: thêm điểm mới của dự thảo 3

Co-Authored-By: Claude Opus 5.5 <noreply@anthropic.com>
Claude-Session: https://claude.ai/code/session_01NzZ78rAanjcMCsGwt7jxAb
</commit_message>
<xml_diff>
--- a/tham-luan-khung-hoang-truyen-thong/de-cuong-tham-luan-bvhttdl.docx
+++ b/tham-luan-khung-hoang-truyen-thong/de-cuong-tham-luan-bvhttdl.docx
@@ -304,6 +304,24 @@
       </w:r>
       <w:r>
         <w:t xml:space="preserve">Bổ sung phân tích tác động của Threads, nền tảng khởi phát nhiều làn sóng dư luận năm 2026 (Phần I, mục 6); 5 sự cố mới nhất năm 2026 làm dẫn chứng (Phần II, mục 2); nhóm việc cụ thể ứng phó trên Threads (Phần III); kiến nghị về công khai thông tin dự án đầu tư lớn (Phần IV).</w:t>
+      </w:r>
+    </w:p>
+    <w:p>
+      <w:pPr>
+        <w:pStyle w:val="BodyText"/>
+      </w:pPr>
+      <w:r>
+        <w:rPr>
+          <w:b/>
+          <w:bCs/>
+        </w:rPr>
+        <w:t xml:space="preserve">Điểm mới của dự thảo 3.</w:t>
+      </w:r>
+      <w:r>
+        <w:t xml:space="preserve"> </w:t>
+      </w:r>
+      <w:r>
+        <w:t xml:space="preserve">Cập nhật căn cứ pháp lý: Nghị định số 244/2026/NĐ-CP thay thế Nghị định số 09/2017/NĐ-CP về phát ngôn, cùng 7 văn bản bổ sung (Phần II, mục 1); số liệu mới nhất về tiếp nhận tin tức và lừa đảo trực tuyến (Mở đầu, Phần I); kinh nghiệm quốc tế (Phần II, mục 6 và Phụ lục 6), lồng ghép vào nhóm giải pháp 2, 3, 4, 6, 7.</w:t>
       </w:r>
     </w:p>
     <w:p>
@@ -1006,7 +1024,7 @@
               <w:rPr>
                 <w:sz w:val="23"/>
               </w:rPr>
-              <w:t xml:space="preserve">Kết quả, sự cố mới nhất năm 2026, hạn chế, nguyên nhân, bài học kinh nghiệm</w:t>
+              <w:t xml:space="preserve">Kết quả, sự cố mới nhất năm 2026, hạn chế, nguyên nhân, bài học kinh nghiệm, kinh nghiệm quốc tế</w:t>
             </w:r>
           </w:p>
         </w:tc>
@@ -3248,7 +3266,7 @@
     </w:p>
     <w:bookmarkEnd w:id="28"/>
     <w:bookmarkEnd w:id="29"/>
-    <w:bookmarkStart w:id="35" w:name="X512ab98d70e9353645295d7e361a7347f1968c9"/>
+    <w:bookmarkStart w:id="36" w:name="X512ab98d70e9353645295d7e361a7347f1968c9"/>
     <w:p>
       <w:pPr>
         <w:pStyle w:val="Heading1"/>
@@ -4751,6 +4769,294 @@
         <w:t xml:space="preserve">Thông tin chính thống phải xuất hiện trên chính nền tảng nơi tranh luận khởi phát, kể cả nền tảng mới như Threads.</w:t>
       </w:r>
     </w:p>
+    <w:bookmarkEnd w:id="34"/>
+    <w:bookmarkStart w:id="35" w:name="kinh-nghiệm-quốc-tế"/>
+    <w:p>
+      <w:pPr>
+        <w:pStyle w:val="Heading2"/>
+      </w:pPr>
+      <w:r>
+        <w:t xml:space="preserve">6. Kinh nghiệm quốc tế</w:t>
+      </w:r>
+    </w:p>
+    <w:p>
+      <w:pPr>
+        <w:pStyle w:val="Compact"/>
+        <w:numPr>
+          <w:ilvl w:val="0"/>
+          <w:numId w:val="1017"/>
+        </w:numPr>
+      </w:pPr>
+      <w:r>
+        <w:rPr>
+          <w:b/>
+          <w:bCs/>
+        </w:rPr>
+        <w:t xml:space="preserve">Lượng hóa thời hạn phản hồi (Trung Quốc).</w:t>
+      </w:r>
+      <w:r>
+        <w:t xml:space="preserve"> </w:t>
+      </w:r>
+      <w:r>
+        <w:t xml:space="preserve">Từ năm 2016, quy định yêu cầu công bố thông tin chính thức chậm nhất 5 giờ, họp báo chậm nhất 24 giờ với sự kiện đột xuất nghiêm trọng, gắn trách nhiệm cơ quan chủ quản; nền tảng bác bỏ tin đồn dùng chung hoạt động từ năm 2018. Mốc 3, 6, 24 giờ đề xuất trong đề cương phù hợp xu hướng này.</w:t>
+      </w:r>
+    </w:p>
+    <w:p>
+      <w:pPr>
+        <w:pStyle w:val="Compact"/>
+        <w:numPr>
+          <w:ilvl w:val="0"/>
+          <w:numId w:val="1017"/>
+        </w:numPr>
+      </w:pPr>
+      <w:r>
+        <w:rPr>
+          <w:b/>
+          <w:bCs/>
+        </w:rPr>
+        <w:t xml:space="preserve">Cải chính đính kèm thay vì chỉ gỡ bỏ (Singapore).</w:t>
+      </w:r>
+      <w:r>
+        <w:t xml:space="preserve"> </w:t>
+      </w:r>
+      <w:r>
+        <w:t xml:space="preserve">Luật POFMA (2019) buộc người đăng gắn thông báo cải chính vào bài gốc, buộc nền tảng hiển thị cải chính cho người dùng đã xem tin sai; mỗi lệnh kèm bài giải thích công khai. Cách làm này ít gây phản ứng ngược hơn gỡ bài, với điều kiện có tiêu chí công khai, minh bạch.</w:t>
+      </w:r>
+    </w:p>
+    <w:p>
+      <w:pPr>
+        <w:pStyle w:val="Compact"/>
+        <w:numPr>
+          <w:ilvl w:val="0"/>
+          <w:numId w:val="1017"/>
+        </w:numPr>
+      </w:pPr>
+      <w:r>
+        <w:rPr>
+          <w:b/>
+          <w:bCs/>
+        </w:rPr>
+        <w:t xml:space="preserve">Không để khoảng trống thông tin (Anh).</w:t>
+      </w:r>
+      <w:r>
+        <w:t xml:space="preserve"> </w:t>
+      </w:r>
+      <w:r>
+        <w:t xml:space="preserve">Sau vụ tấn công ở Southport (29/7/2024), tin sai về danh tính nghi phạm lan nhanh khi cơ quan chức năng chưa thể công bố thông tin do hạn chế tố tụng, dẫn tới bạo loạn; cảnh sát bắt giữ hơn 1.700 người. Ủy ban Nội vụ Hạ viện Anh kết luận quy định hạn chế công bố đã tạo khoảng trống cho tin sai.</w:t>
+      </w:r>
+    </w:p>
+    <w:p>
+      <w:pPr>
+        <w:pStyle w:val="Compact"/>
+        <w:numPr>
+          <w:ilvl w:val="0"/>
+          <w:numId w:val="1017"/>
+        </w:numPr>
+      </w:pPr>
+      <w:r>
+        <w:rPr>
+          <w:b/>
+          <w:bCs/>
+        </w:rPr>
+        <w:t xml:space="preserve">Nghĩa vụ hệ thống của nền tảng (Liên minh châu Âu).</w:t>
+      </w:r>
+      <w:r>
+        <w:t xml:space="preserve"> </w:t>
+      </w:r>
+      <w:r>
+        <w:t xml:space="preserve">Đạo luật Dịch vụ số buộc nền tảng rất lớn đánh giá, giảm thiểu rủi ro hệ thống, có cơ chế ứng phó khủng hoảng, mức phạt tối đa 6% doanh thu toàn cầu; tháng 12/2025, Ủy ban châu Âu phạt X 120 triệu euro.</w:t>
+      </w:r>
+    </w:p>
+    <w:p>
+      <w:pPr>
+        <w:pStyle w:val="Compact"/>
+        <w:numPr>
+          <w:ilvl w:val="0"/>
+          <w:numId w:val="1017"/>
+        </w:numPr>
+      </w:pPr>
+      <w:r>
+        <w:rPr>
+          <w:b/>
+          <w:bCs/>
+        </w:rPr>
+        <w:t xml:space="preserve">Cảnh báo về chặn diện rộng (Nepal).</w:t>
+      </w:r>
+      <w:r>
+        <w:t xml:space="preserve"> </w:t>
+      </w:r>
+      <w:r>
+        <w:t xml:space="preserve">Lệnh chặn 26 nền tảng mạng xã hội ngày 4/9/2025 trở thành ngòi nổ cho làn sóng biểu tình của giới trẻ; chính quyền phải dỡ lệnh chặn sau 4 ngày, Thủ tướng từ chức ngày 9/9/2025.</w:t>
+      </w:r>
+    </w:p>
+    <w:p>
+      <w:pPr>
+        <w:pStyle w:val="Compact"/>
+        <w:numPr>
+          <w:ilvl w:val="0"/>
+          <w:numId w:val="1017"/>
+        </w:numPr>
+      </w:pPr>
+      <w:r>
+        <w:rPr>
+          <w:b/>
+          <w:bCs/>
+        </w:rPr>
+        <w:t xml:space="preserve">Cơ quan chuyên trách, bằng chứng công khai (Pháp, Thụy Điển).</w:t>
+      </w:r>
+      <w:r>
+        <w:t xml:space="preserve"> </w:t>
+      </w:r>
+      <w:r>
+        <w:t xml:space="preserve">Pháp lập cơ quan VIGINUM (2021), công bố báo cáo về 43 chiến dịch thao túng thông tin nhắm vào Thế vận hội Paris 2024; Thụy Điển lập Cơ quan Phòng vệ tâm lý (2022). Báo cáo bằng chứng công khai làm tăng tính chính danh của biện pháp xử lý.</w:t>
+      </w:r>
+    </w:p>
+    <w:p>
+      <w:pPr>
+        <w:pStyle w:val="Compact"/>
+        <w:numPr>
+          <w:ilvl w:val="0"/>
+          <w:numId w:val="1017"/>
+        </w:numPr>
+      </w:pPr>
+      <w:r>
+        <w:rPr>
+          <w:b/>
+          <w:bCs/>
+        </w:rPr>
+        <w:t xml:space="preserve">Đầu tư dài hạn cho</w:t>
+      </w:r>
+      <w:r>
+        <w:rPr>
+          <w:b/>
+          <w:bCs/>
+        </w:rPr>
+        <w:t xml:space="preserve"> </w:t>
+      </w:r>
+      <w:r>
+        <w:rPr>
+          <w:b/>
+          <w:bCs/>
+        </w:rPr>
+        <w:t xml:space="preserve">“</w:t>
+      </w:r>
+      <w:r>
+        <w:rPr>
+          <w:b/>
+          <w:bCs/>
+        </w:rPr>
+        <w:t xml:space="preserve">sức đề kháng</w:t>
+      </w:r>
+      <w:r>
+        <w:rPr>
+          <w:b/>
+          <w:bCs/>
+        </w:rPr>
+        <w:t xml:space="preserve">”</w:t>
+      </w:r>
+      <w:r>
+        <w:rPr>
+          <w:b/>
+          <w:bCs/>
+        </w:rPr>
+        <w:t xml:space="preserve"> </w:t>
+      </w:r>
+      <w:r>
+        <w:rPr>
+          <w:b/>
+          <w:bCs/>
+        </w:rPr>
+        <w:t xml:space="preserve">(Phần Lan, nghiên cứu</w:t>
+      </w:r>
+      <w:r>
+        <w:rPr>
+          <w:b/>
+          <w:bCs/>
+        </w:rPr>
+        <w:t xml:space="preserve"> </w:t>
+      </w:r>
+      <w:r>
+        <w:rPr>
+          <w:b/>
+          <w:bCs/>
+        </w:rPr>
+        <w:t xml:space="preserve">“</w:t>
+      </w:r>
+      <w:r>
+        <w:rPr>
+          <w:b/>
+          <w:bCs/>
+        </w:rPr>
+        <w:t xml:space="preserve">tiêm chủng thông tin</w:t>
+      </w:r>
+      <w:r>
+        <w:rPr>
+          <w:b/>
+          <w:bCs/>
+        </w:rPr>
+        <w:t xml:space="preserve">”</w:t>
+      </w:r>
+      <w:r>
+        <w:rPr>
+          <w:b/>
+          <w:bCs/>
+        </w:rPr>
+        <w:t xml:space="preserve">).</w:t>
+      </w:r>
+      <w:r>
+        <w:t xml:space="preserve"> </w:t>
+      </w:r>
+      <w:r>
+        <w:t xml:space="preserve">Phần Lan đưa giáo dục năng lực truyền thông vào chương trình từ mầm non; thử nghiệm trên YouTube với khoảng 1 triệu người cho thấy video 90 giây giới thiệu thủ đoạn thao túng giúp tăng khả năng nhận diện khoảng 5%, chi phí khoảng 0,05 USD mỗi lượt xem.</w:t>
+      </w:r>
+    </w:p>
+    <w:p>
+      <w:pPr>
+        <w:pStyle w:val="FirstParagraph"/>
+      </w:pPr>
+      <w:r>
+        <w:rPr>
+          <w:i/>
+          <w:iCs/>
+        </w:rPr>
+        <w:t xml:space="preserve">Chi tiết, số liệu, nguồn tại Phụ lục 6. Gợi ý khi trình bày: chỉ nêu 1 câu, ví dụ</w:t>
+      </w:r>
+      <w:r>
+        <w:rPr>
+          <w:i/>
+          <w:iCs/>
+        </w:rPr>
+        <w:t xml:space="preserve"> </w:t>
+      </w:r>
+      <w:r>
+        <w:rPr>
+          <w:i/>
+          <w:iCs/>
+        </w:rPr>
+        <w:t xml:space="preserve">“</w:t>
+      </w:r>
+      <w:r>
+        <w:rPr>
+          <w:i/>
+          <w:iCs/>
+        </w:rPr>
+        <w:t xml:space="preserve">Kinh nghiệm của Trung Quốc, Singapore, Anh cho thấy: cần lượng hóa thời hạn phản hồi, cải chính hiệu quả hơn chỉ gỡ bỏ, và im lặng vì thủ tục là rủi ro lớn nhất</w:t>
+      </w:r>
+      <w:r>
+        <w:rPr>
+          <w:i/>
+          <w:iCs/>
+        </w:rPr>
+        <w:t xml:space="preserve">”</w:t>
+      </w:r>
+      <w:r>
+        <w:rPr>
+          <w:i/>
+          <w:iCs/>
+        </w:rPr>
+        <w:t xml:space="preserve">.</w:t>
+      </w:r>
+    </w:p>
     <w:p>
       <w:pPr>
         <w:pStyle w:val="BlockText"/>
@@ -4771,9 +5077,9 @@
         <w:t xml:space="preserve">”</w:t>
       </w:r>
     </w:p>
-    <w:bookmarkEnd w:id="34"/>
     <w:bookmarkEnd w:id="35"/>
-    <w:bookmarkStart w:id="44" w:name="phần-iii.-nhóm-giải-pháp-trọng-tâm"/>
+    <w:bookmarkEnd w:id="36"/>
+    <w:bookmarkStart w:id="45" w:name="phần-iii.-nhóm-giải-pháp-trọng-tâm"/>
     <w:p>
       <w:pPr>
         <w:pStyle w:val="Heading1"/>
@@ -4794,7 +5100,7 @@
         <w:t xml:space="preserve">Ký hiệu: [Đột phá] là giải pháp đề xuất nhấn mạnh khi trình bày. Mốc thời gian là đề xuất để Chính phủ xem xét.</w:t>
       </w:r>
     </w:p>
-    <w:bookmarkStart w:id="36" w:name="X3b606fac8e10e45c422060c65e4197064830ea5"/>
+    <w:bookmarkStart w:id="37" w:name="X3b606fac8e10e45c422060c65e4197064830ea5"/>
     <w:p>
       <w:pPr>
         <w:pStyle w:val="Heading2"/>
@@ -4808,7 +5114,7 @@
         <w:pStyle w:val="Compact"/>
         <w:numPr>
           <w:ilvl w:val="0"/>
-          <w:numId w:val="1017"/>
+          <w:numId w:val="1018"/>
         </w:numPr>
       </w:pPr>
       <w:r>
@@ -4820,7 +5126,7 @@
         <w:pStyle w:val="Compact"/>
         <w:numPr>
           <w:ilvl w:val="0"/>
-          <w:numId w:val="1017"/>
+          <w:numId w:val="1018"/>
         </w:numPr>
       </w:pPr>
       <w:r>
@@ -4832,7 +5138,7 @@
         <w:pStyle w:val="Compact"/>
         <w:numPr>
           <w:ilvl w:val="0"/>
-          <w:numId w:val="1017"/>
+          <w:numId w:val="1018"/>
         </w:numPr>
       </w:pPr>
       <w:r>
@@ -4862,7 +5168,7 @@
         <w:pStyle w:val="Compact"/>
         <w:numPr>
           <w:ilvl w:val="0"/>
-          <w:numId w:val="1017"/>
+          <w:numId w:val="1018"/>
         </w:numPr>
       </w:pPr>
       <w:r>
@@ -4874,7 +5180,7 @@
         <w:pStyle w:val="Compact"/>
         <w:numPr>
           <w:ilvl w:val="0"/>
-          <w:numId w:val="1017"/>
+          <w:numId w:val="1018"/>
         </w:numPr>
       </w:pPr>
       <w:r>
@@ -4901,7 +5207,7 @@
         <w:pStyle w:val="Compact"/>
         <w:numPr>
           <w:ilvl w:val="0"/>
-          <w:numId w:val="1017"/>
+          <w:numId w:val="1018"/>
         </w:numPr>
       </w:pPr>
       <w:r>
@@ -4934,8 +5240,8 @@
         <w:t xml:space="preserve">quý I/2027.</w:t>
       </w:r>
     </w:p>
-    <w:bookmarkEnd w:id="36"/>
-    <w:bookmarkStart w:id="37" w:name="Xd40e24c53a30f6e873348ad2d5131cd62c86d93"/>
+    <w:bookmarkEnd w:id="37"/>
+    <w:bookmarkStart w:id="38" w:name="Xd40e24c53a30f6e873348ad2d5131cd62c86d93"/>
     <w:p>
       <w:pPr>
         <w:pStyle w:val="Heading2"/>
@@ -4949,7 +5255,7 @@
         <w:pStyle w:val="Compact"/>
         <w:numPr>
           <w:ilvl w:val="0"/>
-          <w:numId w:val="1018"/>
+          <w:numId w:val="1019"/>
         </w:numPr>
       </w:pPr>
       <w:r>
@@ -4974,103 +5280,133 @@
         <w:pStyle w:val="Compact"/>
         <w:numPr>
           <w:ilvl w:val="1"/>
+          <w:numId w:val="1020"/>
+        </w:numPr>
+      </w:pPr>
+      <w:r>
+        <w:t xml:space="preserve">Phân 3 cấp độ khủng hoảng (chi tiết tại Phụ lục 1).</w:t>
+      </w:r>
+    </w:p>
+    <w:p>
+      <w:pPr>
+        <w:pStyle w:val="Compact"/>
+        <w:numPr>
+          <w:ilvl w:val="1"/>
+          <w:numId w:val="1020"/>
+        </w:numPr>
+      </w:pPr>
+      <w:r>
+        <w:t xml:space="preserve">Xác định cơ quan chủ trì, cơ quan phối hợp theo từng cấp độ.</w:t>
+      </w:r>
+    </w:p>
+    <w:p>
+      <w:pPr>
+        <w:pStyle w:val="Compact"/>
+        <w:numPr>
+          <w:ilvl w:val="1"/>
+          <w:numId w:val="1020"/>
+        </w:numPr>
+      </w:pPr>
+      <w:r>
+        <w:t xml:space="preserve">Cơ chế huy động báo chí, nền tảng số, lực lượng chuyên trách.</w:t>
+      </w:r>
+    </w:p>
+    <w:p>
+      <w:pPr>
+        <w:pStyle w:val="Compact"/>
+        <w:numPr>
+          <w:ilvl w:val="1"/>
+          <w:numId w:val="1020"/>
+        </w:numPr>
+      </w:pPr>
+      <w:r>
+        <w:t xml:space="preserve">Chế độ thông tin, báo cáo, đánh giá sau khủng hoảng.</w:t>
+      </w:r>
+    </w:p>
+    <w:p>
+      <w:pPr>
+        <w:pStyle w:val="Compact"/>
+        <w:numPr>
+          <w:ilvl w:val="1"/>
+          <w:numId w:val="1020"/>
+        </w:numPr>
+      </w:pPr>
+      <w:r>
+        <w:t xml:space="preserve">Bảo đảm thống nhất với quy trình xử lý tin giả theo Nghị định số 328/2026/NĐ-CP và các biện pháp theo Nghị định số 327/2026/NĐ-CP.</w:t>
+      </w:r>
+    </w:p>
+    <w:p>
+      <w:pPr>
+        <w:pStyle w:val="Compact"/>
+        <w:numPr>
+          <w:ilvl w:val="1"/>
+          <w:numId w:val="1020"/>
+        </w:numPr>
+      </w:pPr>
+      <w:r>
+        <w:t xml:space="preserve">Quy định sẵn</w:t>
+      </w:r>
+      <w:r>
+        <w:t xml:space="preserve"> </w:t>
+      </w:r>
+      <w:r>
+        <w:t xml:space="preserve">“</w:t>
+      </w:r>
+      <w:r>
+        <w:t xml:space="preserve">thông tin tối thiểu có thể công bố</w:t>
+      </w:r>
+      <w:r>
+        <w:t xml:space="preserve">”</w:t>
+      </w:r>
+      <w:r>
+        <w:t xml:space="preserve"> </w:t>
+      </w:r>
+      <w:r>
+        <w:t xml:space="preserve">đối với vụ việc đang điều tra, xác minh, để không tạo khoảng trống thông tin (bài học từ vụ Southport của Anh năm 2024).</w:t>
+      </w:r>
+    </w:p>
+    <w:p>
+      <w:pPr>
+        <w:pStyle w:val="Compact"/>
+        <w:numPr>
+          <w:ilvl w:val="0"/>
           <w:numId w:val="1019"/>
         </w:numPr>
       </w:pPr>
       <w:r>
-        <w:t xml:space="preserve">Phân 3 cấp độ khủng hoảng (chi tiết tại Phụ lục 1).</w:t>
-      </w:r>
-    </w:p>
-    <w:p>
-      <w:pPr>
-        <w:pStyle w:val="Compact"/>
-        <w:numPr>
-          <w:ilvl w:val="1"/>
+        <w:t xml:space="preserve">Triển khai nghiêm Nghị định số 244/2026/NĐ-CP về phát ngôn và cung cấp thông tin cho báo chí: kiểm tra việc ban hành quy chế phát ngôn nội bộ (thời hạn 45 ngày kể từ ngày 1/7/2026); hướng dẫn phát ngôn trên tài khoản chính thức của cơ quan nhà nước trên nền tảng số; trong Quy chế phối hợp, đặt mục tiêu thông tin ban đầu sớm hơn mốc tối đa 24 giờ tại Điều 7 đối với khủng hoảng cấp độ 2 và 3.</w:t>
+      </w:r>
+    </w:p>
+    <w:p>
+      <w:pPr>
+        <w:pStyle w:val="Compact"/>
+        <w:numPr>
+          <w:ilvl w:val="0"/>
           <w:numId w:val="1019"/>
         </w:numPr>
       </w:pPr>
       <w:r>
-        <w:t xml:space="preserve">Xác định cơ quan chủ trì, cơ quan phối hợp theo từng cấp độ.</w:t>
-      </w:r>
-    </w:p>
-    <w:p>
-      <w:pPr>
-        <w:pStyle w:val="Compact"/>
-        <w:numPr>
-          <w:ilvl w:val="1"/>
+        <w:t xml:space="preserve">Ban hành bộ quy trình mẫu và kịch bản xử lý cho khoảng 10 đến 12 tình huống điển hình: thiên tai, thảm họa; tai nạn du lịch; sự cố lễ hội, sự kiện đông người; an toàn thực phẩm; sản phẩm văn hóa vi phạm chủ quyền; phát ngôn lệch chuẩn của người nổi tiếng; tin giả về chính sách; nội dung giả mạo do AI tạo ra; dự án đầu tư gây tranh cãi về môi trường, cảnh quan; làn sóng dư luận khởi phát trên nền tảng thảo luận như Threads; gián đoạn nền tảng mạng xã hội diện rộng.</w:t>
+      </w:r>
+    </w:p>
+    <w:p>
+      <w:pPr>
+        <w:pStyle w:val="Compact"/>
+        <w:numPr>
+          <w:ilvl w:val="0"/>
           <w:numId w:val="1019"/>
         </w:numPr>
       </w:pPr>
       <w:r>
-        <w:t xml:space="preserve">Cơ chế huy động báo chí, nền tảng số, lực lượng chuyên trách.</w:t>
-      </w:r>
-    </w:p>
-    <w:p>
-      <w:pPr>
-        <w:pStyle w:val="Compact"/>
-        <w:numPr>
-          <w:ilvl w:val="1"/>
+        <w:t xml:space="preserve">Hoàn thiện văn bản hướng dẫn Luật Báo chí 2025, Luật Trí tuệ nhân tạo (gắn nhãn nội dung AI); sửa đổi, bổ sung Nghị định số 147/2024/NĐ-CP theo hướng: nghĩa vụ nền tảng xử lý nhanh trong tình huống khẩn cấp; ưu tiên hiển thị thông tin chính thống khi xảy ra khủng hoảng; báo cáo minh bạch định kỳ.</w:t>
+      </w:r>
+    </w:p>
+    <w:p>
+      <w:pPr>
+        <w:pStyle w:val="Compact"/>
+        <w:numPr>
+          <w:ilvl w:val="0"/>
           <w:numId w:val="1019"/>
-        </w:numPr>
-      </w:pPr>
-      <w:r>
-        <w:t xml:space="preserve">Chế độ thông tin, báo cáo, đánh giá sau khủng hoảng.</w:t>
-      </w:r>
-    </w:p>
-    <w:p>
-      <w:pPr>
-        <w:pStyle w:val="Compact"/>
-        <w:numPr>
-          <w:ilvl w:val="1"/>
-          <w:numId w:val="1019"/>
-        </w:numPr>
-      </w:pPr>
-      <w:r>
-        <w:t xml:space="preserve">Bảo đảm thống nhất với quy trình xử lý tin giả theo Nghị định số 328/2026/NĐ-CP và các biện pháp theo Nghị định số 327/2026/NĐ-CP.</w:t>
-      </w:r>
-    </w:p>
-    <w:p>
-      <w:pPr>
-        <w:pStyle w:val="Compact"/>
-        <w:numPr>
-          <w:ilvl w:val="0"/>
-          <w:numId w:val="1018"/>
-        </w:numPr>
-      </w:pPr>
-      <w:r>
-        <w:t xml:space="preserve">Triển khai nghiêm Nghị định số 244/2026/NĐ-CP về phát ngôn và cung cấp thông tin cho báo chí: kiểm tra việc ban hành quy chế phát ngôn nội bộ (thời hạn 45 ngày kể từ ngày 1/7/2026); hướng dẫn phát ngôn trên tài khoản chính thức của cơ quan nhà nước trên nền tảng số; trong Quy chế phối hợp, đặt mục tiêu thông tin ban đầu sớm hơn mốc tối đa 24 giờ tại Điều 7 đối với khủng hoảng cấp độ 2 và 3.</w:t>
-      </w:r>
-    </w:p>
-    <w:p>
-      <w:pPr>
-        <w:pStyle w:val="Compact"/>
-        <w:numPr>
-          <w:ilvl w:val="0"/>
-          <w:numId w:val="1018"/>
-        </w:numPr>
-      </w:pPr>
-      <w:r>
-        <w:t xml:space="preserve">Ban hành bộ quy trình mẫu và kịch bản xử lý cho khoảng 10 đến 12 tình huống điển hình: thiên tai, thảm họa; tai nạn du lịch; sự cố lễ hội, sự kiện đông người; an toàn thực phẩm; sản phẩm văn hóa vi phạm chủ quyền; phát ngôn lệch chuẩn của người nổi tiếng; tin giả về chính sách; nội dung giả mạo do AI tạo ra; dự án đầu tư gây tranh cãi về môi trường, cảnh quan; làn sóng dư luận khởi phát trên nền tảng thảo luận như Threads; gián đoạn nền tảng mạng xã hội diện rộng.</w:t>
-      </w:r>
-    </w:p>
-    <w:p>
-      <w:pPr>
-        <w:pStyle w:val="Compact"/>
-        <w:numPr>
-          <w:ilvl w:val="0"/>
-          <w:numId w:val="1018"/>
-        </w:numPr>
-      </w:pPr>
-      <w:r>
-        <w:t xml:space="preserve">Hoàn thiện văn bản hướng dẫn Luật Báo chí 2025, Luật Trí tuệ nhân tạo (gắn nhãn nội dung AI); sửa đổi, bổ sung Nghị định số 147/2024/NĐ-CP theo hướng: nghĩa vụ nền tảng xử lý nhanh trong tình huống khẩn cấp; ưu tiên hiển thị thông tin chính thống khi xảy ra khủng hoảng; báo cáo minh bạch định kỳ.</w:t>
-      </w:r>
-    </w:p>
-    <w:p>
-      <w:pPr>
-        <w:pStyle w:val="Compact"/>
-        <w:numPr>
-          <w:ilvl w:val="0"/>
-          <w:numId w:val="1018"/>
         </w:numPr>
       </w:pPr>
       <w:r>
@@ -5119,8 +5455,8 @@
         <w:t xml:space="preserve">trình Thủ tướng Chính phủ dự thảo Quy chế trong quý I/2027.</w:t>
       </w:r>
     </w:p>
-    <w:bookmarkEnd w:id="37"/>
-    <w:bookmarkStart w:id="38" w:name="X573b61a05b9068aa29593ddd26c525dbc69a874"/>
+    <w:bookmarkEnd w:id="38"/>
+    <w:bookmarkStart w:id="39" w:name="X573b61a05b9068aa29593ddd26c525dbc69a874"/>
     <w:p>
       <w:pPr>
         <w:pStyle w:val="Heading2"/>
@@ -5134,7 +5470,7 @@
         <w:pStyle w:val="Compact"/>
         <w:numPr>
           <w:ilvl w:val="0"/>
-          <w:numId w:val="1020"/>
+          <w:numId w:val="1021"/>
         </w:numPr>
       </w:pPr>
       <w:r>
@@ -5146,7 +5482,7 @@
         <w:pStyle w:val="Compact"/>
         <w:numPr>
           <w:ilvl w:val="0"/>
-          <w:numId w:val="1020"/>
+          <w:numId w:val="1021"/>
         </w:numPr>
       </w:pPr>
       <w:r>
@@ -5158,7 +5494,7 @@
         <w:pStyle w:val="Compact"/>
         <w:numPr>
           <w:ilvl w:val="0"/>
-          <w:numId w:val="1020"/>
+          <w:numId w:val="1021"/>
         </w:numPr>
       </w:pPr>
       <w:r>
@@ -5188,7 +5524,7 @@
         <w:pStyle w:val="Compact"/>
         <w:numPr>
           <w:ilvl w:val="0"/>
-          <w:numId w:val="1020"/>
+          <w:numId w:val="1021"/>
         </w:numPr>
       </w:pPr>
       <w:r>
@@ -5200,7 +5536,7 @@
         <w:pStyle w:val="Compact"/>
         <w:numPr>
           <w:ilvl w:val="0"/>
-          <w:numId w:val="1020"/>
+          <w:numId w:val="1021"/>
         </w:numPr>
       </w:pPr>
       <w:r>
@@ -5212,7 +5548,19 @@
         <w:pStyle w:val="Compact"/>
         <w:numPr>
           <w:ilvl w:val="0"/>
-          <w:numId w:val="1020"/>
+          <w:numId w:val="1021"/>
+        </w:numPr>
+      </w:pPr>
+      <w:r>
+        <w:t xml:space="preserve">Định kỳ công bố báo cáo bằng chứng về các chiến dịch thao túng thông tin có tổ chức từ nước ngoài, tăng tính chính danh của biện pháp xử lý (tham khảo cơ quan VIGINUM của Pháp).</w:t>
+      </w:r>
+    </w:p>
+    <w:p>
+      <w:pPr>
+        <w:pStyle w:val="Compact"/>
+        <w:numPr>
+          <w:ilvl w:val="0"/>
+          <w:numId w:val="1021"/>
         </w:numPr>
       </w:pPr>
       <w:r>
@@ -5261,8 +5609,8 @@
         <w:t xml:space="preserve">vận hành thử trong năm 2027.</w:t>
       </w:r>
     </w:p>
-    <w:bookmarkEnd w:id="38"/>
-    <w:bookmarkStart w:id="39" w:name="X6cb76ae2c3072150bf61976bc3786a83d7c3c8e"/>
+    <w:bookmarkEnd w:id="39"/>
+    <w:bookmarkStart w:id="40" w:name="X6cb76ae2c3072150bf61976bc3786a83d7c3c8e"/>
     <w:p>
       <w:pPr>
         <w:pStyle w:val="Heading2"/>
@@ -5294,7 +5642,7 @@
         <w:pStyle w:val="Compact"/>
         <w:numPr>
           <w:ilvl w:val="0"/>
-          <w:numId w:val="1021"/>
+          <w:numId w:val="1022"/>
         </w:numPr>
       </w:pPr>
       <w:r>
@@ -5331,7 +5679,7 @@
         <w:pStyle w:val="Compact"/>
         <w:numPr>
           <w:ilvl w:val="0"/>
-          <w:numId w:val="1021"/>
+          <w:numId w:val="1022"/>
         </w:numPr>
       </w:pPr>
       <w:r>
@@ -5353,7 +5701,7 @@
         <w:pStyle w:val="Compact"/>
         <w:numPr>
           <w:ilvl w:val="0"/>
-          <w:numId w:val="1021"/>
+          <w:numId w:val="1022"/>
         </w:numPr>
       </w:pPr>
       <w:r>
@@ -5375,7 +5723,7 @@
         <w:pStyle w:val="Compact"/>
         <w:numPr>
           <w:ilvl w:val="0"/>
-          <w:numId w:val="1021"/>
+          <w:numId w:val="1022"/>
         </w:numPr>
       </w:pPr>
       <w:r>
@@ -5397,7 +5745,7 @@
         <w:pStyle w:val="Compact"/>
         <w:numPr>
           <w:ilvl w:val="0"/>
-          <w:numId w:val="1021"/>
+          <w:numId w:val="1022"/>
         </w:numPr>
       </w:pPr>
       <w:r>
@@ -5419,7 +5767,7 @@
         <w:pStyle w:val="Compact"/>
         <w:numPr>
           <w:ilvl w:val="0"/>
-          <w:numId w:val="1021"/>
+          <w:numId w:val="1022"/>
         </w:numPr>
       </w:pPr>
       <w:r>
@@ -5441,7 +5789,7 @@
         <w:pStyle w:val="Compact"/>
         <w:numPr>
           <w:ilvl w:val="0"/>
-          <w:numId w:val="1021"/>
+          <w:numId w:val="1022"/>
         </w:numPr>
       </w:pPr>
       <w:r>
@@ -5453,7 +5801,29 @@
         <w:pStyle w:val="Compact"/>
         <w:numPr>
           <w:ilvl w:val="0"/>
-          <w:numId w:val="1021"/>
+          <w:numId w:val="1022"/>
+        </w:numPr>
+      </w:pPr>
+      <w:r>
+        <w:rPr>
+          <w:b/>
+          <w:bCs/>
+        </w:rPr>
+        <w:t xml:space="preserve">Cải chính đính kèm:</w:t>
+      </w:r>
+      <w:r>
+        <w:t xml:space="preserve"> </w:t>
+      </w:r>
+      <w:r>
+        <w:t xml:space="preserve">kết hợp gắn nhãn tin giả theo Nghị định số 328/2026/NĐ-CP với thông báo cải chính gắn vào bài gốc, dẫn tới thông tin chính thức và hiển thị cho người dùng đã xem tin sai (tham khảo Luật POFMA của Singapore); chỉ gỡ bỏ đối với nội dung vi phạm nghiêm trọng.</w:t>
+      </w:r>
+    </w:p>
+    <w:p>
+      <w:pPr>
+        <w:pStyle w:val="Compact"/>
+        <w:numPr>
+          <w:ilvl w:val="0"/>
+          <w:numId w:val="1022"/>
         </w:numPr>
       </w:pPr>
       <w:r>
@@ -5486,8 +5856,8 @@
         <w:t xml:space="preserve">áp dụng ngay từ quý IV/2026.</w:t>
       </w:r>
     </w:p>
-    <w:bookmarkEnd w:id="39"/>
-    <w:bookmarkStart w:id="40" w:name="Xc783ff94e32f4abeda209aa105c4f3b4a869b3b"/>
+    <w:bookmarkEnd w:id="40"/>
+    <w:bookmarkStart w:id="41" w:name="Xc783ff94e32f4abeda209aa105c4f3b4a869b3b"/>
     <w:p>
       <w:pPr>
         <w:pStyle w:val="Heading2"/>
@@ -5501,7 +5871,7 @@
         <w:pStyle w:val="Compact"/>
         <w:numPr>
           <w:ilvl w:val="0"/>
-          <w:numId w:val="1022"/>
+          <w:numId w:val="1023"/>
         </w:numPr>
       </w:pPr>
       <w:r>
@@ -5513,7 +5883,7 @@
         <w:pStyle w:val="Compact"/>
         <w:numPr>
           <w:ilvl w:val="0"/>
-          <w:numId w:val="1022"/>
+          <w:numId w:val="1023"/>
         </w:numPr>
       </w:pPr>
       <w:r>
@@ -5525,7 +5895,7 @@
         <w:pStyle w:val="Compact"/>
         <w:numPr>
           <w:ilvl w:val="0"/>
-          <w:numId w:val="1022"/>
+          <w:numId w:val="1023"/>
         </w:numPr>
       </w:pPr>
       <w:r>
@@ -5537,7 +5907,7 @@
         <w:pStyle w:val="Compact"/>
         <w:numPr>
           <w:ilvl w:val="0"/>
-          <w:numId w:val="1022"/>
+          <w:numId w:val="1023"/>
         </w:numPr>
       </w:pPr>
       <w:r>
@@ -5549,7 +5919,7 @@
         <w:pStyle w:val="Compact"/>
         <w:numPr>
           <w:ilvl w:val="0"/>
-          <w:numId w:val="1022"/>
+          <w:numId w:val="1023"/>
         </w:numPr>
       </w:pPr>
       <w:r>
@@ -5561,7 +5931,7 @@
         <w:pStyle w:val="Compact"/>
         <w:numPr>
           <w:ilvl w:val="0"/>
-          <w:numId w:val="1022"/>
+          <w:numId w:val="1023"/>
         </w:numPr>
       </w:pPr>
       <w:r>
@@ -5573,7 +5943,7 @@
         <w:pStyle w:val="Compact"/>
         <w:numPr>
           <w:ilvl w:val="0"/>
-          <w:numId w:val="1022"/>
+          <w:numId w:val="1023"/>
         </w:numPr>
       </w:pPr>
       <w:r>
@@ -5622,8 +5992,8 @@
         <w:t xml:space="preserve">thường xuyên.</w:t>
       </w:r>
     </w:p>
-    <w:bookmarkEnd w:id="40"/>
-    <w:bookmarkStart w:id="41" w:name="Xe7df467628ac3f8836f2633eba9266256a07ad3"/>
+    <w:bookmarkEnd w:id="41"/>
+    <w:bookmarkStart w:id="42" w:name="Xe7df467628ac3f8836f2633eba9266256a07ad3"/>
     <w:p>
       <w:pPr>
         <w:pStyle w:val="Heading2"/>
@@ -5637,19 +6007,31 @@
         <w:pStyle w:val="Compact"/>
         <w:numPr>
           <w:ilvl w:val="0"/>
-          <w:numId w:val="1023"/>
-        </w:numPr>
-      </w:pPr>
-      <w:r>
-        <w:t xml:space="preserve">Yêu cầu nền tảng xuyên biên giới thực hiện nghiêm nghĩa vụ: xác thực tài khoản; gỡ bỏ trong thời hạn quy định; cung cấp dữ liệu phục vụ điều tra; thiết lập kênh ưu tiên xử lý trong khủng hoảng; báo cáo minh bạch định kỳ.</w:t>
-      </w:r>
-    </w:p>
-    <w:p>
-      <w:pPr>
-        <w:pStyle w:val="Compact"/>
-        <w:numPr>
-          <w:ilvl w:val="0"/>
-          <w:numId w:val="1023"/>
+          <w:numId w:val="1024"/>
+        </w:numPr>
+      </w:pPr>
+      <w:r>
+        <w:t xml:space="preserve">Yêu cầu nền tảng xuyên biên giới thực hiện nghiêm nghĩa vụ: xác thực tài khoản; gỡ bỏ trong thời hạn quy định; cung cấp dữ liệu phục vụ điều tra; thiết lập kênh ưu tiên và giao thức ứng phó khủng hoảng (tham khảo Đạo luật Dịch vụ số của Liên minh châu Âu); báo cáo minh bạch định kỳ.</w:t>
+      </w:r>
+    </w:p>
+    <w:p>
+      <w:pPr>
+        <w:pStyle w:val="Compact"/>
+        <w:numPr>
+          <w:ilvl w:val="0"/>
+          <w:numId w:val="1024"/>
+        </w:numPr>
+      </w:pPr>
+      <w:r>
+        <w:t xml:space="preserve">Không áp dụng biện pháp chặn nền tảng diện rộng; biện pháp kỹ thuật nhắm đúng nội dung, đúng tài khoản vi phạm (bài học từ Nepal năm 2025).</w:t>
+      </w:r>
+    </w:p>
+    <w:p>
+      <w:pPr>
+        <w:pStyle w:val="Compact"/>
+        <w:numPr>
+          <w:ilvl w:val="0"/>
+          <w:numId w:val="1024"/>
         </w:numPr>
       </w:pPr>
       <w:r>
@@ -5661,7 +6043,7 @@
         <w:pStyle w:val="Compact"/>
         <w:numPr>
           <w:ilvl w:val="0"/>
-          <w:numId w:val="1023"/>
+          <w:numId w:val="1024"/>
         </w:numPr>
       </w:pPr>
       <w:r>
@@ -5673,7 +6055,7 @@
         <w:pStyle w:val="Compact"/>
         <w:numPr>
           <w:ilvl w:val="0"/>
-          <w:numId w:val="1023"/>
+          <w:numId w:val="1024"/>
         </w:numPr>
       </w:pPr>
       <w:r>
@@ -5685,7 +6067,7 @@
         <w:pStyle w:val="Compact"/>
         <w:numPr>
           <w:ilvl w:val="0"/>
-          <w:numId w:val="1023"/>
+          <w:numId w:val="1024"/>
         </w:numPr>
       </w:pPr>
       <w:r>
@@ -5697,7 +6079,7 @@
         <w:pStyle w:val="Compact"/>
         <w:numPr>
           <w:ilvl w:val="0"/>
-          <w:numId w:val="1023"/>
+          <w:numId w:val="1024"/>
         </w:numPr>
       </w:pPr>
       <w:r>
@@ -5746,8 +6128,8 @@
         <w:t xml:space="preserve">thường xuyên.</w:t>
       </w:r>
     </w:p>
-    <w:bookmarkEnd w:id="41"/>
-    <w:bookmarkStart w:id="42" w:name="Xd92dbbe034725eacfbd6182eaf1f42bec5222d6"/>
+    <w:bookmarkEnd w:id="42"/>
+    <w:bookmarkStart w:id="43" w:name="Xd92dbbe034725eacfbd6182eaf1f42bec5222d6"/>
     <w:p>
       <w:pPr>
         <w:pStyle w:val="Heading2"/>
@@ -5779,7 +6161,7 @@
         <w:pStyle w:val="Compact"/>
         <w:numPr>
           <w:ilvl w:val="0"/>
-          <w:numId w:val="1024"/>
+          <w:numId w:val="1025"/>
         </w:numPr>
       </w:pPr>
       <w:r>
@@ -5791,7 +6173,7 @@
         <w:pStyle w:val="Compact"/>
         <w:numPr>
           <w:ilvl w:val="0"/>
-          <w:numId w:val="1024"/>
+          <w:numId w:val="1025"/>
         </w:numPr>
       </w:pPr>
       <w:r>
@@ -5803,7 +6185,7 @@
         <w:pStyle w:val="Compact"/>
         <w:numPr>
           <w:ilvl w:val="0"/>
-          <w:numId w:val="1024"/>
+          <w:numId w:val="1025"/>
         </w:numPr>
       </w:pPr>
       <w:r>
@@ -5815,19 +6197,49 @@
         <w:pStyle w:val="Compact"/>
         <w:numPr>
           <w:ilvl w:val="0"/>
-          <w:numId w:val="1024"/>
-        </w:numPr>
-      </w:pPr>
-      <w:r>
-        <w:t xml:space="preserve">Phối hợp Bộ Giáo dục và Đào tạo đưa kỹ năng số, năng lực thông tin vào chương trình giáo dục; triển khai Đề án theo Quyết định số 1125/QĐ-TTg.</w:t>
-      </w:r>
-    </w:p>
-    <w:p>
-      <w:pPr>
-        <w:pStyle w:val="Compact"/>
-        <w:numPr>
-          <w:ilvl w:val="0"/>
-          <w:numId w:val="1024"/>
+          <w:numId w:val="1025"/>
+        </w:numPr>
+      </w:pPr>
+      <w:r>
+        <w:t xml:space="preserve">Phối hợp Bộ Giáo dục và Đào tạo đưa kỹ năng số, năng lực thông tin vào chương trình giáo dục từ bậc mầm non (tham khảo Phần Lan); triển khai Đề án theo Quyết định số 1125/QĐ-TTg.</w:t>
+      </w:r>
+    </w:p>
+    <w:p>
+      <w:pPr>
+        <w:pStyle w:val="Compact"/>
+        <w:numPr>
+          <w:ilvl w:val="0"/>
+          <w:numId w:val="1025"/>
+        </w:numPr>
+      </w:pPr>
+      <w:r>
+        <w:t xml:space="preserve">Triển khai chiến dịch</w:t>
+      </w:r>
+      <w:r>
+        <w:t xml:space="preserve"> </w:t>
+      </w:r>
+      <w:r>
+        <w:t xml:space="preserve">“</w:t>
+      </w:r>
+      <w:r>
+        <w:t xml:space="preserve">tiêm chủng thông tin</w:t>
+      </w:r>
+      <w:r>
+        <w:t xml:space="preserve">”</w:t>
+      </w:r>
+      <w:r>
+        <w:t xml:space="preserve"> </w:t>
+      </w:r>
+      <w:r>
+        <w:t xml:space="preserve">bằng video ngắn giới thiệu thủ đoạn thao túng, phát trước các sự kiện nhạy cảm đã có trong lịch rủi ro truyền thông.</w:t>
+      </w:r>
+    </w:p>
+    <w:p>
+      <w:pPr>
+        <w:pStyle w:val="Compact"/>
+        <w:numPr>
+          <w:ilvl w:val="0"/>
+          <w:numId w:val="1025"/>
         </w:numPr>
       </w:pPr>
       <w:r>
@@ -5839,7 +6251,7 @@
         <w:pStyle w:val="Compact"/>
         <w:numPr>
           <w:ilvl w:val="0"/>
-          <w:numId w:val="1024"/>
+          <w:numId w:val="1025"/>
         </w:numPr>
       </w:pPr>
       <w:r>
@@ -5888,8 +6300,8 @@
         <w:t xml:space="preserve">từ năm 2027, thường xuyên.</w:t>
       </w:r>
     </w:p>
-    <w:bookmarkEnd w:id="42"/>
-    <w:bookmarkStart w:id="43" w:name="X89b037bad4de178bf82ed1f64535a00b5b42e04"/>
+    <w:bookmarkEnd w:id="43"/>
+    <w:bookmarkStart w:id="44" w:name="X89b037bad4de178bf82ed1f64535a00b5b42e04"/>
     <w:p>
       <w:pPr>
         <w:pStyle w:val="Heading2"/>
@@ -6356,9 +6768,9 @@
         <w:t xml:space="preserve">”</w:t>
       </w:r>
     </w:p>
-    <w:bookmarkEnd w:id="43"/>
     <w:bookmarkEnd w:id="44"/>
-    <w:bookmarkStart w:id="48" w:name="phần-iv.-kiến-nghị-đề-xuất"/>
+    <w:bookmarkEnd w:id="45"/>
+    <w:bookmarkStart w:id="49" w:name="phần-iv.-kiến-nghị-đề-xuất"/>
     <w:p>
       <w:pPr>
         <w:pStyle w:val="Heading1"/>
@@ -6367,7 +6779,7 @@
         <w:t xml:space="preserve">Phần IV. Kiến nghị, đề xuất</w:t>
       </w:r>
     </w:p>
-    <w:bookmarkStart w:id="45" w:name="với-chính-phủ-thủ-tướng-chính-phủ"/>
+    <w:bookmarkStart w:id="46" w:name="với-chính-phủ-thủ-tướng-chính-phủ"/>
     <w:p>
       <w:pPr>
         <w:pStyle w:val="Heading2"/>
@@ -6381,7 +6793,7 @@
         <w:pStyle w:val="Compact"/>
         <w:numPr>
           <w:ilvl w:val="0"/>
-          <w:numId w:val="1025"/>
+          <w:numId w:val="1026"/>
         </w:numPr>
       </w:pPr>
       <w:r>
@@ -6393,7 +6805,7 @@
         <w:pStyle w:val="Compact"/>
         <w:numPr>
           <w:ilvl w:val="0"/>
-          <w:numId w:val="1025"/>
+          <w:numId w:val="1026"/>
         </w:numPr>
       </w:pPr>
       <w:r>
@@ -6405,7 +6817,7 @@
         <w:pStyle w:val="Compact"/>
         <w:numPr>
           <w:ilvl w:val="0"/>
-          <w:numId w:val="1025"/>
+          <w:numId w:val="1026"/>
         </w:numPr>
       </w:pPr>
       <w:r>
@@ -6417,7 +6829,7 @@
         <w:pStyle w:val="Compact"/>
         <w:numPr>
           <w:ilvl w:val="0"/>
-          <w:numId w:val="1025"/>
+          <w:numId w:val="1026"/>
         </w:numPr>
       </w:pPr>
       <w:r>
@@ -6429,7 +6841,7 @@
         <w:pStyle w:val="Compact"/>
         <w:numPr>
           <w:ilvl w:val="0"/>
-          <w:numId w:val="1025"/>
+          <w:numId w:val="1026"/>
         </w:numPr>
       </w:pPr>
       <w:r>
@@ -6441,7 +6853,7 @@
         <w:pStyle w:val="Compact"/>
         <w:numPr>
           <w:ilvl w:val="0"/>
-          <w:numId w:val="1025"/>
+          <w:numId w:val="1026"/>
         </w:numPr>
       </w:pPr>
       <w:r>
@@ -6453,15 +6865,15 @@
         <w:pStyle w:val="Compact"/>
         <w:numPr>
           <w:ilvl w:val="0"/>
-          <w:numId w:val="1025"/>
+          <w:numId w:val="1026"/>
         </w:numPr>
       </w:pPr>
       <w:r>
         <w:t xml:space="preserve">Chỉ đạo các bộ, ngành, địa phương công khai thông tin, lấy ý kiến cộng đồng đối với dự án đầu tư lớn tác động tới môi trường, cảnh quan, di sản trước khi triển khai; người đứng đầu chịu trách nhiệm khi thông tin chính thức thiếu nhất quán.</w:t>
       </w:r>
     </w:p>
-    <w:bookmarkEnd w:id="45"/>
-    <w:bookmarkStart w:id="46" w:name="với-các-bộ-ngành-địa-phương"/>
+    <w:bookmarkEnd w:id="46"/>
+    <w:bookmarkStart w:id="47" w:name="với-các-bộ-ngành-địa-phương"/>
     <w:p>
       <w:pPr>
         <w:pStyle w:val="Heading2"/>
@@ -6813,8 +7225,8 @@
         </w:tc>
       </w:tr>
     </w:tbl>
-    <w:bookmarkEnd w:id="46"/>
-    <w:bookmarkStart w:id="47" w:name="phối-hợp-với-các-cơ-quan-của-đảng"/>
+    <w:bookmarkEnd w:id="47"/>
+    <w:bookmarkStart w:id="48" w:name="phối-hợp-với-các-cơ-quan-của-đảng"/>
     <w:p>
       <w:pPr>
         <w:pStyle w:val="Heading2"/>
@@ -6831,9 +7243,9 @@
         <w:t xml:space="preserve">Đề nghị tiếp tục phối hợp chặt chẽ với Ban Tuyên giáo và Dân vận Trung ương, Ban Chỉ đạo 35 Trung ương trong định hướng thông tin, đấu tranh phản bác quan điểm sai trái, thù địch, thực hiện Nghị quyết số 35-NQ/TW ngày 22/10/2018 của Bộ Chính trị; phối hợp với Mặt trận Tổ quốc Việt Nam, Đoàn Thanh niên Cộng sản Hồ Chí Minh trong đối thoại với giới trẻ trên không gian mạng.</w:t>
       </w:r>
     </w:p>
-    <w:bookmarkEnd w:id="47"/>
     <w:bookmarkEnd w:id="48"/>
-    <w:bookmarkStart w:id="49" w:name="kết-luận-cam-kết-hành-động-của-bộ-vhttdl"/>
+    <w:bookmarkEnd w:id="49"/>
+    <w:bookmarkStart w:id="50" w:name="kết-luận-cam-kết-hành-động-của-bộ-vhttdl"/>
     <w:p>
       <w:pPr>
         <w:pStyle w:val="Heading1"/>
@@ -6855,7 +7267,7 @@
         <w:pStyle w:val="Compact"/>
         <w:numPr>
           <w:ilvl w:val="0"/>
-          <w:numId w:val="1026"/>
+          <w:numId w:val="1027"/>
         </w:numPr>
       </w:pPr>
       <w:r>
@@ -6867,7 +7279,7 @@
         <w:pStyle w:val="Compact"/>
         <w:numPr>
           <w:ilvl w:val="0"/>
-          <w:numId w:val="1026"/>
+          <w:numId w:val="1027"/>
         </w:numPr>
       </w:pPr>
       <w:r>
@@ -6879,7 +7291,7 @@
         <w:pStyle w:val="Compact"/>
         <w:numPr>
           <w:ilvl w:val="0"/>
-          <w:numId w:val="1026"/>
+          <w:numId w:val="1027"/>
         </w:numPr>
       </w:pPr>
       <w:r>
@@ -6891,7 +7303,7 @@
         <w:pStyle w:val="Compact"/>
         <w:numPr>
           <w:ilvl w:val="0"/>
-          <w:numId w:val="1026"/>
+          <w:numId w:val="1027"/>
         </w:numPr>
       </w:pPr>
       <w:r>
@@ -6903,7 +7315,7 @@
         <w:pStyle w:val="Compact"/>
         <w:numPr>
           <w:ilvl w:val="0"/>
-          <w:numId w:val="1026"/>
+          <w:numId w:val="1027"/>
         </w:numPr>
       </w:pPr>
       <w:r>
@@ -6915,7 +7327,7 @@
         <w:pStyle w:val="Compact"/>
         <w:numPr>
           <w:ilvl w:val="0"/>
-          <w:numId w:val="1026"/>
+          <w:numId w:val="1027"/>
         </w:numPr>
       </w:pPr>
       <w:r>
@@ -6950,8 +7362,8 @@
         <w:t xml:space="preserve">Xin trân trọng cảm ơn đồng chí Thủ tướng Chính phủ và các đồng chí.</w:t>
       </w:r>
     </w:p>
-    <w:bookmarkEnd w:id="49"/>
-    <w:bookmarkStart w:id="50" w:name="Xaf021c48d344296cf1588fd171e571371fc33c0"/>
+    <w:bookmarkEnd w:id="50"/>
+    <w:bookmarkStart w:id="51" w:name="Xaf021c48d344296cf1588fd171e571371fc33c0"/>
     <w:p>
       <w:pPr>
         <w:pStyle w:val="Heading1"/>
@@ -7333,8 +7745,8 @@
         <w:t xml:space="preserve">Ghi chú: mốc 24 giờ là thời hạn tối đa theo Điều 7 Nghị định số 244/2026/NĐ-CP; mốc 6 giờ, 3 giờ là mục tiêu đề xuất đưa vào Quy chế phối hợp.</w:t>
       </w:r>
     </w:p>
-    <w:bookmarkEnd w:id="50"/>
-    <w:bookmarkStart w:id="51" w:name="Xe828f39b55f5493ea3a374321b14311e1f7bc67"/>
+    <w:bookmarkEnd w:id="51"/>
+    <w:bookmarkStart w:id="52" w:name="Xe828f39b55f5493ea3a374321b14311e1f7bc67"/>
     <w:p>
       <w:pPr>
         <w:pStyle w:val="Heading1"/>
@@ -7704,8 +8116,8 @@
         </w:tc>
       </w:tr>
     </w:tbl>
-    <w:bookmarkEnd w:id="51"/>
-    <w:bookmarkStart w:id="52" w:name="X4d8239fd0fce95ce6c8a4def7cc38ab6bfec427"/>
+    <w:bookmarkEnd w:id="52"/>
+    <w:bookmarkStart w:id="53" w:name="X4d8239fd0fce95ce6c8a4def7cc38ab6bfec427"/>
     <w:p>
       <w:pPr>
         <w:pStyle w:val="Heading1"/>
@@ -8335,8 +8747,8 @@
         </w:tc>
       </w:tr>
     </w:tbl>
-    <w:bookmarkEnd w:id="52"/>
-    <w:bookmarkStart w:id="53" w:name="X439cb3448f705fe1947d0e45d1505ba5e26dee6"/>
+    <w:bookmarkEnd w:id="53"/>
+    <w:bookmarkStart w:id="54" w:name="X439cb3448f705fe1947d0e45d1505ba5e26dee6"/>
     <w:p>
       <w:pPr>
         <w:pStyle w:val="Heading1"/>
@@ -8362,7 +8774,7 @@
         <w:pStyle w:val="Compact"/>
         <w:numPr>
           <w:ilvl w:val="0"/>
-          <w:numId w:val="1027"/>
+          <w:numId w:val="1028"/>
         </w:numPr>
         <w:jc w:val="left"/>
       </w:pPr>
@@ -8375,7 +8787,7 @@
         <w:pStyle w:val="Compact"/>
         <w:numPr>
           <w:ilvl w:val="0"/>
-          <w:numId w:val="1027"/>
+          <w:numId w:val="1028"/>
         </w:numPr>
         <w:jc w:val="left"/>
       </w:pPr>
@@ -8400,7 +8812,7 @@
         <w:pStyle w:val="Compact"/>
         <w:numPr>
           <w:ilvl w:val="0"/>
-          <w:numId w:val="1028"/>
+          <w:numId w:val="1029"/>
         </w:numPr>
         <w:jc w:val="left"/>
       </w:pPr>
@@ -8413,7 +8825,7 @@
         <w:pStyle w:val="Compact"/>
         <w:numPr>
           <w:ilvl w:val="0"/>
-          <w:numId w:val="1028"/>
+          <w:numId w:val="1029"/>
         </w:numPr>
         <w:jc w:val="left"/>
       </w:pPr>
@@ -8426,7 +8838,7 @@
         <w:pStyle w:val="Compact"/>
         <w:numPr>
           <w:ilvl w:val="0"/>
-          <w:numId w:val="1028"/>
+          <w:numId w:val="1029"/>
         </w:numPr>
         <w:jc w:val="left"/>
       </w:pPr>
@@ -8439,7 +8851,7 @@
         <w:pStyle w:val="Compact"/>
         <w:numPr>
           <w:ilvl w:val="0"/>
-          <w:numId w:val="1028"/>
+          <w:numId w:val="1029"/>
         </w:numPr>
         <w:jc w:val="left"/>
       </w:pPr>
@@ -8452,7 +8864,7 @@
         <w:pStyle w:val="Compact"/>
         <w:numPr>
           <w:ilvl w:val="0"/>
-          <w:numId w:val="1028"/>
+          <w:numId w:val="1029"/>
         </w:numPr>
         <w:jc w:val="left"/>
       </w:pPr>
@@ -8465,7 +8877,7 @@
         <w:pStyle w:val="Compact"/>
         <w:numPr>
           <w:ilvl w:val="0"/>
-          <w:numId w:val="1028"/>
+          <w:numId w:val="1029"/>
         </w:numPr>
       </w:pPr>
       <w:r>
@@ -8477,7 +8889,7 @@
         <w:pStyle w:val="Compact"/>
         <w:numPr>
           <w:ilvl w:val="0"/>
-          <w:numId w:val="1028"/>
+          <w:numId w:val="1029"/>
         </w:numPr>
         <w:jc w:val="left"/>
       </w:pPr>
@@ -8490,7 +8902,7 @@
         <w:pStyle w:val="Compact"/>
         <w:numPr>
           <w:ilvl w:val="0"/>
-          <w:numId w:val="1028"/>
+          <w:numId w:val="1029"/>
         </w:numPr>
         <w:jc w:val="left"/>
       </w:pPr>
@@ -8515,7 +8927,7 @@
         <w:pStyle w:val="Compact"/>
         <w:numPr>
           <w:ilvl w:val="0"/>
-          <w:numId w:val="1029"/>
+          <w:numId w:val="1030"/>
         </w:numPr>
         <w:jc w:val="left"/>
       </w:pPr>
@@ -8528,7 +8940,7 @@
         <w:pStyle w:val="Compact"/>
         <w:numPr>
           <w:ilvl w:val="0"/>
-          <w:numId w:val="1029"/>
+          <w:numId w:val="1030"/>
         </w:numPr>
         <w:jc w:val="left"/>
       </w:pPr>
@@ -8541,7 +8953,7 @@
         <w:pStyle w:val="Compact"/>
         <w:numPr>
           <w:ilvl w:val="0"/>
-          <w:numId w:val="1029"/>
+          <w:numId w:val="1030"/>
         </w:numPr>
         <w:jc w:val="left"/>
       </w:pPr>
@@ -8554,7 +8966,7 @@
         <w:pStyle w:val="Compact"/>
         <w:numPr>
           <w:ilvl w:val="0"/>
-          <w:numId w:val="1029"/>
+          <w:numId w:val="1030"/>
         </w:numPr>
         <w:jc w:val="left"/>
       </w:pPr>
@@ -8567,7 +8979,7 @@
         <w:pStyle w:val="Compact"/>
         <w:numPr>
           <w:ilvl w:val="0"/>
-          <w:numId w:val="1029"/>
+          <w:numId w:val="1030"/>
         </w:numPr>
         <w:jc w:val="left"/>
       </w:pPr>
@@ -8580,7 +8992,7 @@
         <w:pStyle w:val="Compact"/>
         <w:numPr>
           <w:ilvl w:val="0"/>
-          <w:numId w:val="1029"/>
+          <w:numId w:val="1030"/>
         </w:numPr>
         <w:jc w:val="left"/>
       </w:pPr>
@@ -8593,7 +9005,7 @@
         <w:pStyle w:val="Compact"/>
         <w:numPr>
           <w:ilvl w:val="0"/>
-          <w:numId w:val="1029"/>
+          <w:numId w:val="1030"/>
         </w:numPr>
         <w:jc w:val="left"/>
       </w:pPr>
@@ -8606,7 +9018,7 @@
         <w:pStyle w:val="Compact"/>
         <w:numPr>
           <w:ilvl w:val="0"/>
-          <w:numId w:val="1029"/>
+          <w:numId w:val="1030"/>
         </w:numPr>
         <w:jc w:val="left"/>
       </w:pPr>
@@ -8619,7 +9031,7 @@
         <w:pStyle w:val="Compact"/>
         <w:numPr>
           <w:ilvl w:val="0"/>
-          <w:numId w:val="1029"/>
+          <w:numId w:val="1030"/>
         </w:numPr>
         <w:jc w:val="left"/>
       </w:pPr>
@@ -8632,7 +9044,7 @@
         <w:pStyle w:val="Compact"/>
         <w:numPr>
           <w:ilvl w:val="0"/>
-          <w:numId w:val="1029"/>
+          <w:numId w:val="1030"/>
         </w:numPr>
         <w:jc w:val="left"/>
       </w:pPr>
@@ -8660,7 +9072,7 @@
         <w:pStyle w:val="Compact"/>
         <w:numPr>
           <w:ilvl w:val="0"/>
-          <w:numId w:val="1029"/>
+          <w:numId w:val="1030"/>
         </w:numPr>
         <w:jc w:val="left"/>
       </w:pPr>
@@ -8673,7 +9085,7 @@
         <w:pStyle w:val="Compact"/>
         <w:numPr>
           <w:ilvl w:val="0"/>
-          <w:numId w:val="1029"/>
+          <w:numId w:val="1030"/>
         </w:numPr>
         <w:jc w:val="left"/>
       </w:pPr>
@@ -8698,7 +9110,7 @@
         <w:pStyle w:val="Compact"/>
         <w:numPr>
           <w:ilvl w:val="0"/>
-          <w:numId w:val="1030"/>
+          <w:numId w:val="1031"/>
         </w:numPr>
         <w:jc w:val="left"/>
       </w:pPr>
@@ -8711,7 +9123,7 @@
         <w:pStyle w:val="Compact"/>
         <w:numPr>
           <w:ilvl w:val="0"/>
-          <w:numId w:val="1030"/>
+          <w:numId w:val="1031"/>
         </w:numPr>
         <w:jc w:val="left"/>
       </w:pPr>
@@ -8724,7 +9136,7 @@
         <w:pStyle w:val="Compact"/>
         <w:numPr>
           <w:ilvl w:val="0"/>
-          <w:numId w:val="1030"/>
+          <w:numId w:val="1031"/>
         </w:numPr>
         <w:jc w:val="left"/>
       </w:pPr>
@@ -8737,7 +9149,7 @@
         <w:pStyle w:val="Compact"/>
         <w:numPr>
           <w:ilvl w:val="0"/>
-          <w:numId w:val="1030"/>
+          <w:numId w:val="1031"/>
         </w:numPr>
         <w:jc w:val="left"/>
       </w:pPr>
@@ -8750,7 +9162,7 @@
         <w:pStyle w:val="Compact"/>
         <w:numPr>
           <w:ilvl w:val="0"/>
-          <w:numId w:val="1030"/>
+          <w:numId w:val="1031"/>
         </w:numPr>
         <w:jc w:val="left"/>
       </w:pPr>
@@ -8763,7 +9175,7 @@
         <w:pStyle w:val="Compact"/>
         <w:numPr>
           <w:ilvl w:val="0"/>
-          <w:numId w:val="1030"/>
+          <w:numId w:val="1031"/>
         </w:numPr>
         <w:jc w:val="left"/>
       </w:pPr>
@@ -8776,7 +9188,7 @@
         <w:pStyle w:val="Compact"/>
         <w:numPr>
           <w:ilvl w:val="0"/>
-          <w:numId w:val="1030"/>
+          <w:numId w:val="1031"/>
         </w:numPr>
         <w:jc w:val="left"/>
       </w:pPr>
@@ -8789,7 +9201,7 @@
         <w:pStyle w:val="Compact"/>
         <w:numPr>
           <w:ilvl w:val="0"/>
-          <w:numId w:val="1030"/>
+          <w:numId w:val="1031"/>
         </w:numPr>
         <w:jc w:val="left"/>
       </w:pPr>
@@ -8802,7 +9214,7 @@
         <w:pStyle w:val="Compact"/>
         <w:numPr>
           <w:ilvl w:val="0"/>
-          <w:numId w:val="1030"/>
+          <w:numId w:val="1031"/>
         </w:numPr>
         <w:jc w:val="left"/>
       </w:pPr>
@@ -8815,7 +9227,7 @@
         <w:pStyle w:val="Compact"/>
         <w:numPr>
           <w:ilvl w:val="0"/>
-          <w:numId w:val="1030"/>
+          <w:numId w:val="1031"/>
         </w:numPr>
         <w:jc w:val="left"/>
       </w:pPr>
@@ -8828,7 +9240,7 @@
         <w:pStyle w:val="Compact"/>
         <w:numPr>
           <w:ilvl w:val="0"/>
-          <w:numId w:val="1030"/>
+          <w:numId w:val="1031"/>
         </w:numPr>
         <w:jc w:val="left"/>
       </w:pPr>
@@ -8871,7 +9283,7 @@
         <w:pStyle w:val="Compact"/>
         <w:numPr>
           <w:ilvl w:val="0"/>
-          <w:numId w:val="1031"/>
+          <w:numId w:val="1032"/>
         </w:numPr>
         <w:jc w:val="left"/>
       </w:pPr>
@@ -8884,7 +9296,7 @@
         <w:pStyle w:val="Compact"/>
         <w:numPr>
           <w:ilvl w:val="0"/>
-          <w:numId w:val="1031"/>
+          <w:numId w:val="1032"/>
         </w:numPr>
         <w:jc w:val="left"/>
       </w:pPr>
@@ -8897,7 +9309,7 @@
         <w:pStyle w:val="Compact"/>
         <w:numPr>
           <w:ilvl w:val="0"/>
-          <w:numId w:val="1031"/>
+          <w:numId w:val="1032"/>
         </w:numPr>
         <w:jc w:val="left"/>
       </w:pPr>
@@ -8910,7 +9322,7 @@
         <w:pStyle w:val="Compact"/>
         <w:numPr>
           <w:ilvl w:val="0"/>
-          <w:numId w:val="1031"/>
+          <w:numId w:val="1032"/>
         </w:numPr>
         <w:jc w:val="left"/>
       </w:pPr>
@@ -8923,7 +9335,7 @@
         <w:pStyle w:val="Compact"/>
         <w:numPr>
           <w:ilvl w:val="0"/>
-          <w:numId w:val="1031"/>
+          <w:numId w:val="1032"/>
         </w:numPr>
         <w:jc w:val="left"/>
       </w:pPr>
@@ -8936,7 +9348,7 @@
         <w:pStyle w:val="Compact"/>
         <w:numPr>
           <w:ilvl w:val="0"/>
-          <w:numId w:val="1031"/>
+          <w:numId w:val="1032"/>
         </w:numPr>
         <w:jc w:val="left"/>
       </w:pPr>
@@ -8949,7 +9361,7 @@
         <w:pStyle w:val="Compact"/>
         <w:numPr>
           <w:ilvl w:val="0"/>
-          <w:numId w:val="1031"/>
+          <w:numId w:val="1032"/>
         </w:numPr>
         <w:jc w:val="left"/>
       </w:pPr>
@@ -8962,7 +9374,7 @@
         <w:pStyle w:val="Compact"/>
         <w:numPr>
           <w:ilvl w:val="0"/>
-          <w:numId w:val="1031"/>
+          <w:numId w:val="1032"/>
         </w:numPr>
         <w:jc w:val="left"/>
       </w:pPr>
@@ -8975,7 +9387,7 @@
         <w:pStyle w:val="Compact"/>
         <w:numPr>
           <w:ilvl w:val="0"/>
-          <w:numId w:val="1031"/>
+          <w:numId w:val="1032"/>
         </w:numPr>
         <w:jc w:val="left"/>
       </w:pPr>
@@ -8988,7 +9400,7 @@
         <w:pStyle w:val="Compact"/>
         <w:numPr>
           <w:ilvl w:val="0"/>
-          <w:numId w:val="1031"/>
+          <w:numId w:val="1032"/>
         </w:numPr>
         <w:jc w:val="left"/>
       </w:pPr>
@@ -9019,7 +9431,7 @@
         <w:pStyle w:val="Compact"/>
         <w:numPr>
           <w:ilvl w:val="0"/>
-          <w:numId w:val="1031"/>
+          <w:numId w:val="1032"/>
         </w:numPr>
         <w:jc w:val="left"/>
       </w:pPr>
@@ -9032,7 +9444,7 @@
         <w:pStyle w:val="Compact"/>
         <w:numPr>
           <w:ilvl w:val="0"/>
-          <w:numId w:val="1031"/>
+          <w:numId w:val="1032"/>
         </w:numPr>
         <w:jc w:val="left"/>
       </w:pPr>
@@ -9040,8 +9452,8 @@
         <w:t xml:space="preserve">Tin giả trong mùa mưa lũ đặc biệt nguy hiểm (Sức khỏe và Đời sống, 17/9/2026). https://suckhoedoisong.vn/tin-gia-trong-mua-mua-lu-dac-biet-nguy-hiem-co-the-gay-chet-nguoi-169260917101216227.htm</w:t>
       </w:r>
     </w:p>
-    <w:bookmarkEnd w:id="53"/>
-    <w:bookmarkStart w:id="54" w:name="X3e3258e5ea66b8efb3382786701774f70aaea7a"/>
+    <w:bookmarkEnd w:id="54"/>
+    <w:bookmarkStart w:id="55" w:name="X3e3258e5ea66b8efb3382786701774f70aaea7a"/>
     <w:p>
       <w:pPr>
         <w:pStyle w:val="Heading1"/>
@@ -9567,8 +9979,886 @@
           </w:p>
         </w:tc>
       </w:tr>
+      <w:tr>
+        <w:trPr>
+          <w:cantSplit w:val="true"/>
+        </w:trPr>
+        <w:tc>
+          <w:tcPr/>
+          <w:p>
+            <w:pPr>
+              <w:pStyle w:val="Compact"/>
+              <w:jc w:val="left"/>
+            </w:pPr>
+            <w:r>
+              <w:rPr>
+                <w:sz w:val="23"/>
+              </w:rPr>
+              <w:t xml:space="preserve">Đối chiếu số liệu, nguồn kinh nghiệm quốc tế tại Phụ lục 6 (hiện tổng hợp qua tìm kiếm, chưa đọc trực tiếp văn bản gốc)</w:t>
+            </w:r>
+          </w:p>
+        </w:tc>
+        <w:tc>
+          <w:tcPr/>
+          <w:p>
+            <w:pPr>
+              <w:pStyle w:val="Compact"/>
+              <w:jc w:val="left"/>
+            </w:pPr>
+            <w:r>
+              <w:rPr>
+                <w:sz w:val="23"/>
+              </w:rPr>
+              <w:t xml:space="preserve">Cục Hợp tác quốc tế, phối hợp Bộ Ngoại giao</w:t>
+            </w:r>
+          </w:p>
+        </w:tc>
+      </w:tr>
     </w:tbl>
-    <w:bookmarkEnd w:id="54"/>
+    <w:bookmarkEnd w:id="55"/>
+    <w:bookmarkStart w:id="56" w:name="phụ-lục-6.-kinh-nghiệm-quốc-tế"/>
+    <w:p>
+      <w:pPr>
+        <w:pStyle w:val="Heading1"/>
+      </w:pPr>
+      <w:r>
+        <w:t xml:space="preserve">Phụ lục 6. Kinh nghiệm quốc tế</w:t>
+      </w:r>
+    </w:p>
+    <w:tbl>
+      <w:tblPr>
+        <w:tblStyle w:val="Table"/>
+        <w:tblW w:type="pct" w:w="5000"/>
+        <w:jc w:val="start"/>
+        <w:tblBorders>
+          <w:top w:val="single" w:sz="4" w:space="0" w:color="8A9BB0"/>
+          <w:left w:val="single" w:sz="4" w:space="0" w:color="8A9BB0"/>
+          <w:bottom w:val="single" w:sz="4" w:space="0" w:color="8A9BB0"/>
+          <w:right w:val="single" w:sz="4" w:space="0" w:color="8A9BB0"/>
+          <w:insideH w:val="single" w:sz="4" w:space="0" w:color="8A9BB0"/>
+          <w:insideV w:val="single" w:sz="4" w:space="0" w:color="8A9BB0"/>
+        </w:tblBorders>
+        <w:tblLook w:firstRow="1" w:lastRow="0" w:firstColumn="0" w:lastColumn="0" w:noHBand="0" w:noVBand="0" w:val="0020"/>
+      </w:tblPr>
+      <w:tblGrid>
+        <w:gridCol w:w="1320"/>
+        <w:gridCol w:w="2562"/>
+        <w:gridCol w:w="2562"/>
+        <w:gridCol w:w="1475"/>
+      </w:tblGrid>
+      <w:tr>
+        <w:trPr>
+          <w:tblHeader w:val="true"/>
+          <w:cantSplit w:val="true"/>
+          <w:tblHeader w:val="true"/>
+        </w:trPr>
+        <w:tc>
+          <w:tcPr>
+            <w:shd w:val="clear" w:color="auto" w:fill="DCE6F0"/>
+          </w:tcPr>
+          <w:p>
+            <w:pPr>
+              <w:pStyle w:val="Compact"/>
+              <w:jc w:val="left"/>
+            </w:pPr>
+            <w:r>
+              <w:rPr>
+                <w:b/>
+                <w:sz w:val="23"/>
+              </w:rPr>
+              <w:t xml:space="preserve">Quốc gia, khu vực</w:t>
+            </w:r>
+          </w:p>
+        </w:tc>
+        <w:tc>
+          <w:tcPr>
+            <w:shd w:val="clear" w:color="auto" w:fill="DCE6F0"/>
+          </w:tcPr>
+          <w:p>
+            <w:pPr>
+              <w:pStyle w:val="Compact"/>
+              <w:jc w:val="left"/>
+            </w:pPr>
+            <w:r>
+              <w:rPr>
+                <w:b/>
+                <w:sz w:val="23"/>
+              </w:rPr>
+              <w:t xml:space="preserve">Cơ chế, công cụ</w:t>
+            </w:r>
+          </w:p>
+        </w:tc>
+        <w:tc>
+          <w:tcPr>
+            <w:shd w:val="clear" w:color="auto" w:fill="DCE6F0"/>
+          </w:tcPr>
+          <w:p>
+            <w:pPr>
+              <w:pStyle w:val="Compact"/>
+              <w:jc w:val="left"/>
+            </w:pPr>
+            <w:r>
+              <w:rPr>
+                <w:b/>
+                <w:sz w:val="23"/>
+              </w:rPr>
+              <w:t xml:space="preserve">Kết quả, số liệu</w:t>
+            </w:r>
+          </w:p>
+        </w:tc>
+        <w:tc>
+          <w:tcPr>
+            <w:shd w:val="clear" w:color="auto" w:fill="DCE6F0"/>
+          </w:tcPr>
+          <w:p>
+            <w:pPr>
+              <w:pStyle w:val="Compact"/>
+              <w:jc w:val="left"/>
+            </w:pPr>
+            <w:r>
+              <w:rPr>
+                <w:b/>
+                <w:sz w:val="23"/>
+              </w:rPr>
+              <w:t xml:space="preserve">Mức phù hợp với Việt Nam</w:t>
+            </w:r>
+          </w:p>
+        </w:tc>
+      </w:tr>
+      <w:tr>
+        <w:trPr>
+          <w:cantSplit w:val="true"/>
+        </w:trPr>
+        <w:tc>
+          <w:tcPr/>
+          <w:p>
+            <w:pPr>
+              <w:pStyle w:val="Compact"/>
+              <w:jc w:val="left"/>
+            </w:pPr>
+            <w:r>
+              <w:rPr>
+                <w:sz w:val="23"/>
+              </w:rPr>
+              <w:t xml:space="preserve">Trung Quốc</w:t>
+            </w:r>
+          </w:p>
+        </w:tc>
+        <w:tc>
+          <w:tcPr/>
+          <w:p>
+            <w:pPr>
+              <w:pStyle w:val="Compact"/>
+              <w:jc w:val="left"/>
+            </w:pPr>
+            <w:r>
+              <w:rPr>
+                <w:sz w:val="23"/>
+              </w:rPr>
+              <w:t xml:space="preserve">Văn bản của Văn phòng Quốc vụ viện tháng 8/2016: họp báo chậm nhất 24 giờ với sự kiện đột xuất nghiêm trọng, phản hồi dư luận khác trong 48 giờ; văn bản tháng 11/2016: công bố thông tin chính thức chậm nhất 5 giờ, họp báo trong 24 giờ; nền tảng bác bỏ tin đồn Internet liên hợp (từ 8/2018), tích hợp hơn 40 nền tảng địa phương</w:t>
+            </w:r>
+          </w:p>
+        </w:tc>
+        <w:tc>
+          <w:tcPr/>
+          <w:p>
+            <w:pPr>
+              <w:pStyle w:val="Compact"/>
+              <w:jc w:val="left"/>
+            </w:pPr>
+            <w:r>
+              <w:rPr>
+                <w:sz w:val="23"/>
+              </w:rPr>
+              <w:t xml:space="preserve">Sau 2 năm, nền tảng tiếp nhận hơn 30.000 manh mối, đăng hơn 9.000 bài bác bỏ (8/2020)</w:t>
+            </w:r>
+          </w:p>
+        </w:tc>
+        <w:tc>
+          <w:tcPr/>
+          <w:p>
+            <w:pPr>
+              <w:pStyle w:val="Compact"/>
+              <w:jc w:val="left"/>
+            </w:pPr>
+            <w:r>
+              <w:rPr>
+                <w:sz w:val="23"/>
+              </w:rPr>
+              <w:t xml:space="preserve">Cao: thể chế tương đồng; đề xuất 3, 6, 24 giờ của đề cương chặt hơn chuẩn 5 và 24 giờ</w:t>
+            </w:r>
+          </w:p>
+        </w:tc>
+      </w:tr>
+      <w:tr>
+        <w:trPr>
+          <w:cantSplit w:val="true"/>
+        </w:trPr>
+        <w:tc>
+          <w:tcPr/>
+          <w:p>
+            <w:pPr>
+              <w:pStyle w:val="Compact"/>
+              <w:jc w:val="left"/>
+            </w:pPr>
+            <w:r>
+              <w:rPr>
+                <w:sz w:val="23"/>
+              </w:rPr>
+              <w:t xml:space="preserve">Singapore</w:t>
+            </w:r>
+          </w:p>
+        </w:tc>
+        <w:tc>
+          <w:tcPr/>
+          <w:p>
+            <w:pPr>
+              <w:pStyle w:val="Compact"/>
+              <w:jc w:val="left"/>
+            </w:pPr>
+            <w:r>
+              <w:rPr>
+                <w:sz w:val="23"/>
+              </w:rPr>
+              <w:t xml:space="preserve">Luật POFMA (10/2019): lệnh cải chính đính kèm bài gốc, lệnh cải chính nhắm mục tiêu qua nền tảng, trang giải thích Factually; kênh WhatsApp Gov.sg; Ủy ban An toàn trực tuyến hoạt động từ 29/6/2026</w:t>
+            </w:r>
+          </w:p>
+        </w:tc>
+        <w:tc>
+          <w:tcPr/>
+          <w:p>
+            <w:pPr>
+              <w:pStyle w:val="Compact"/>
+              <w:jc w:val="left"/>
+            </w:pPr>
+            <w:r>
+              <w:rPr>
+                <w:sz w:val="23"/>
+              </w:rPr>
+              <w:t xml:space="preserve">Đến 30/9/2025: 88 vụ, 142 lệnh cải chính, 36 lệnh cải chính nhắm mục tiêu, 4 lệnh chặn truy cập; kênh WhatsApp Gov.sg tăng từ khoảng 7.000 lên hơn 900.000 thuê bao trong 10 tuần đầu dịch COVID-19</w:t>
+            </w:r>
+          </w:p>
+        </w:tc>
+        <w:tc>
+          <w:tcPr/>
+          <w:p>
+            <w:pPr>
+              <w:pStyle w:val="Compact"/>
+              <w:jc w:val="left"/>
+            </w:pPr>
+            <w:r>
+              <w:rPr>
+                <w:sz w:val="23"/>
+              </w:rPr>
+              <w:t xml:space="preserve">Cao: chi phí thấp, ít phản ứng ngược; cần tiêu chí công khai</w:t>
+            </w:r>
+          </w:p>
+        </w:tc>
+      </w:tr>
+      <w:tr>
+        <w:trPr>
+          <w:cantSplit w:val="true"/>
+        </w:trPr>
+        <w:tc>
+          <w:tcPr/>
+          <w:p>
+            <w:pPr>
+              <w:pStyle w:val="Compact"/>
+              <w:jc w:val="left"/>
+            </w:pPr>
+            <w:r>
+              <w:rPr>
+                <w:sz w:val="23"/>
+              </w:rPr>
+              <w:t xml:space="preserve">Liên minh châu Âu</w:t>
+            </w:r>
+          </w:p>
+        </w:tc>
+        <w:tc>
+          <w:tcPr/>
+          <w:p>
+            <w:pPr>
+              <w:pStyle w:val="Compact"/>
+              <w:jc w:val="left"/>
+            </w:pPr>
+            <w:r>
+              <w:rPr>
+                <w:sz w:val="23"/>
+              </w:rPr>
+              <w:t xml:space="preserve">Đạo luật Dịch vụ số: nghĩa vụ đánh giá rủi ro hệ thống của nền tảng rất lớn, cơ chế ứng phó khủng hoảng (Điều 36), phạt tối đa 6% doanh thu toàn cầu; Lá chắn Dân chủ châu Âu (11/2025)</w:t>
+            </w:r>
+          </w:p>
+        </w:tc>
+        <w:tc>
+          <w:tcPr/>
+          <w:p>
+            <w:pPr>
+              <w:pStyle w:val="Compact"/>
+              <w:jc w:val="left"/>
+            </w:pPr>
+            <w:r>
+              <w:rPr>
+                <w:sz w:val="23"/>
+              </w:rPr>
+              <w:t xml:space="preserve">Phạt X 120 triệu euro (5/12/2025), quyết định xử phạt đầu tiên theo Đạo luật; chưa ghi nhận lần kích hoạt Điều 36</w:t>
+            </w:r>
+          </w:p>
+        </w:tc>
+        <w:tc>
+          <w:tcPr/>
+          <w:p>
+            <w:pPr>
+              <w:pStyle w:val="Compact"/>
+              <w:jc w:val="left"/>
+            </w:pPr>
+            <w:r>
+              <w:rPr>
+                <w:sz w:val="23"/>
+              </w:rPr>
+              <w:t xml:space="preserve">Trung bình: hướng đúng nhưng khó tái lập sức mặc cả của thị trường 27 nước</w:t>
+            </w:r>
+          </w:p>
+        </w:tc>
+      </w:tr>
+      <w:tr>
+        <w:trPr>
+          <w:cantSplit w:val="true"/>
+        </w:trPr>
+        <w:tc>
+          <w:tcPr/>
+          <w:p>
+            <w:pPr>
+              <w:pStyle w:val="Compact"/>
+              <w:jc w:val="left"/>
+            </w:pPr>
+            <w:r>
+              <w:rPr>
+                <w:sz w:val="23"/>
+              </w:rPr>
+              <w:t xml:space="preserve">Anh</w:t>
+            </w:r>
+          </w:p>
+        </w:tc>
+        <w:tc>
+          <w:tcPr/>
+          <w:p>
+            <w:pPr>
+              <w:pStyle w:val="Compact"/>
+              <w:jc w:val="left"/>
+            </w:pPr>
+            <w:r>
+              <w:rPr>
+                <w:sz w:val="23"/>
+              </w:rPr>
+              <w:t xml:space="preserve">Bộ công cụ RESIST 2 (6 bước: nhận diện, cảnh báo sớm, nắm tình hình, đánh giá tác động, truyền thông chiến lược, theo dõi hiệu quả); Online Safety Act 2023</w:t>
+            </w:r>
+          </w:p>
+        </w:tc>
+        <w:tc>
+          <w:tcPr/>
+          <w:p>
+            <w:pPr>
+              <w:pStyle w:val="Compact"/>
+              <w:jc w:val="left"/>
+            </w:pPr>
+            <w:r>
+              <w:rPr>
+                <w:sz w:val="23"/>
+              </w:rPr>
+              <w:t xml:space="preserve">Vụ Southport (29/7/2024): tin sai về danh tính nghi phạm xuất hiện ngay trong ngày, bạo loạn từ 30/7; cảnh sát bắt giữ hơn 1.700 người (đến 12/2024); có bị cáo nhận án tù chỉ 1 ngày sau bài đăng kích động; Ủy ban Nội vụ Hạ viện (4/2025) kết luận hạn chế công bố đã tạo khoảng trống thông tin</w:t>
+            </w:r>
+          </w:p>
+        </w:tc>
+        <w:tc>
+          <w:tcPr/>
+          <w:p>
+            <w:pPr>
+              <w:pStyle w:val="Compact"/>
+              <w:jc w:val="left"/>
+            </w:pPr>
+            <w:r>
+              <w:rPr>
+                <w:sz w:val="23"/>
+              </w:rPr>
+              <w:t xml:space="preserve">Cao: khớp quy trình</w:t>
+            </w:r>
+            <w:r>
+              <w:rPr>
+                <w:sz w:val="23"/>
+              </w:rPr>
+              <w:t xml:space="preserve"> </w:t>
+            </w:r>
+            <w:r>
+              <w:rPr>
+                <w:sz w:val="23"/>
+              </w:rPr>
+              <w:t xml:space="preserve">“</w:t>
+            </w:r>
+            <w:r>
+              <w:rPr>
+                <w:sz w:val="23"/>
+              </w:rPr>
+              <w:t xml:space="preserve">giờ vàng</w:t>
+            </w:r>
+            <w:r>
+              <w:rPr>
+                <w:sz w:val="23"/>
+              </w:rPr>
+              <w:t xml:space="preserve">”</w:t>
+            </w:r>
+          </w:p>
+        </w:tc>
+      </w:tr>
+      <w:tr>
+        <w:trPr>
+          <w:cantSplit w:val="true"/>
+        </w:trPr>
+        <w:tc>
+          <w:tcPr/>
+          <w:p>
+            <w:pPr>
+              <w:pStyle w:val="Compact"/>
+              <w:jc w:val="left"/>
+            </w:pPr>
+            <w:r>
+              <w:rPr>
+                <w:sz w:val="23"/>
+              </w:rPr>
+              <w:t xml:space="preserve">Nepal</w:t>
+            </w:r>
+          </w:p>
+        </w:tc>
+        <w:tc>
+          <w:tcPr/>
+          <w:p>
+            <w:pPr>
+              <w:pStyle w:val="Compact"/>
+              <w:jc w:val="left"/>
+            </w:pPr>
+            <w:r>
+              <w:rPr>
+                <w:sz w:val="23"/>
+              </w:rPr>
+              <w:t xml:space="preserve">Chặn 26 nền tảng mạng xã hội chưa đăng ký (4/9/2025)</w:t>
+            </w:r>
+          </w:p>
+        </w:tc>
+        <w:tc>
+          <w:tcPr/>
+          <w:p>
+            <w:pPr>
+              <w:pStyle w:val="Compact"/>
+              <w:jc w:val="left"/>
+            </w:pPr>
+            <w:r>
+              <w:rPr>
+                <w:sz w:val="23"/>
+              </w:rPr>
+              <w:t xml:space="preserve">Biểu tình của giới trẻ ngày 8/9/2025, khoảng 19 người chết ngày đầu; chính quyền dỡ lệnh chặn trong đêm; Thủ tướng từ chức ngày 9/9; tổng số người chết khoảng 76</w:t>
+            </w:r>
+          </w:p>
+        </w:tc>
+        <w:tc>
+          <w:tcPr/>
+          <w:p>
+            <w:pPr>
+              <w:pStyle w:val="Compact"/>
+              <w:jc w:val="left"/>
+            </w:pPr>
+            <w:r>
+              <w:rPr>
+                <w:sz w:val="23"/>
+              </w:rPr>
+              <w:t xml:space="preserve">Cao, dưới dạng bài học cảnh báo</w:t>
+            </w:r>
+          </w:p>
+        </w:tc>
+      </w:tr>
+      <w:tr>
+        <w:trPr>
+          <w:cantSplit w:val="true"/>
+        </w:trPr>
+        <w:tc>
+          <w:tcPr/>
+          <w:p>
+            <w:pPr>
+              <w:pStyle w:val="Compact"/>
+              <w:jc w:val="left"/>
+            </w:pPr>
+            <w:r>
+              <w:rPr>
+                <w:sz w:val="23"/>
+              </w:rPr>
+              <w:t xml:space="preserve">Pháp, Thụy Điển, Phần Lan</w:t>
+            </w:r>
+          </w:p>
+        </w:tc>
+        <w:tc>
+          <w:tcPr/>
+          <w:p>
+            <w:pPr>
+              <w:pStyle w:val="Compact"/>
+              <w:jc w:val="left"/>
+            </w:pPr>
+            <w:r>
+              <w:rPr>
+                <w:sz w:val="23"/>
+              </w:rPr>
+              <w:t xml:space="preserve">Cơ quan VIGINUM (2021) phát hiện can thiệp số từ nước ngoài; Cơ quan Phòng vệ tâm lý Thụy Điển (2022); Phần Lan lồng ghép giáo dục năng lực truyền thông từ mầm non đến trung học</w:t>
+            </w:r>
+          </w:p>
+        </w:tc>
+        <w:tc>
+          <w:tcPr/>
+          <w:p>
+            <w:pPr>
+              <w:pStyle w:val="Compact"/>
+              <w:jc w:val="left"/>
+            </w:pPr>
+            <w:r>
+              <w:rPr>
+                <w:sz w:val="23"/>
+              </w:rPr>
+              <w:t xml:space="preserve">VIGINUM phát hiện 43 chiến dịch nhắm vào Thế vận hội Paris 2024; Phần Lan đứng đầu Chỉ số năng lực truyền thông châu Âu năm 2023 (74/100 điểm, lần thứ 6 liên tiếp)</w:t>
+            </w:r>
+          </w:p>
+        </w:tc>
+        <w:tc>
+          <w:tcPr/>
+          <w:p>
+            <w:pPr>
+              <w:pStyle w:val="Compact"/>
+              <w:jc w:val="left"/>
+            </w:pPr>
+            <w:r>
+              <w:rPr>
+                <w:sz w:val="23"/>
+              </w:rPr>
+              <w:t xml:space="preserve">Trung bình: cần nhiều chuyên gia; hiệu quả dài hạn</w:t>
+            </w:r>
+          </w:p>
+        </w:tc>
+      </w:tr>
+      <w:tr>
+        <w:trPr>
+          <w:cantSplit w:val="true"/>
+        </w:trPr>
+        <w:tc>
+          <w:tcPr/>
+          <w:p>
+            <w:pPr>
+              <w:pStyle w:val="Compact"/>
+              <w:jc w:val="left"/>
+            </w:pPr>
+            <w:r>
+              <w:rPr>
+                <w:sz w:val="23"/>
+              </w:rPr>
+              <w:t xml:space="preserve">Nghiên cứu</w:t>
+            </w:r>
+            <w:r>
+              <w:rPr>
+                <w:sz w:val="23"/>
+              </w:rPr>
+              <w:t xml:space="preserve"> </w:t>
+            </w:r>
+            <w:r>
+              <w:rPr>
+                <w:sz w:val="23"/>
+              </w:rPr>
+              <w:t xml:space="preserve">“</w:t>
+            </w:r>
+            <w:r>
+              <w:rPr>
+                <w:sz w:val="23"/>
+              </w:rPr>
+              <w:t xml:space="preserve">tiêm chủng thông tin</w:t>
+            </w:r>
+            <w:r>
+              <w:rPr>
+                <w:sz w:val="23"/>
+              </w:rPr>
+              <w:t xml:space="preserve">”</w:t>
+            </w:r>
+            <w:r>
+              <w:rPr>
+                <w:sz w:val="23"/>
+              </w:rPr>
+              <w:t xml:space="preserve">, WHO</w:t>
+            </w:r>
+          </w:p>
+        </w:tc>
+        <w:tc>
+          <w:tcPr/>
+          <w:p>
+            <w:pPr>
+              <w:pStyle w:val="Compact"/>
+              <w:jc w:val="left"/>
+            </w:pPr>
+            <w:r>
+              <w:rPr>
+                <w:sz w:val="23"/>
+              </w:rPr>
+              <w:t xml:space="preserve">Video 90 giây giới thiệu thủ đoạn thao túng; khung năng lực quản lý</w:t>
+            </w:r>
+            <w:r>
+              <w:rPr>
+                <w:sz w:val="23"/>
+              </w:rPr>
+              <w:t xml:space="preserve"> </w:t>
+            </w:r>
+            <w:r>
+              <w:rPr>
+                <w:sz w:val="23"/>
+              </w:rPr>
+              <w:t xml:space="preserve">“</w:t>
+            </w:r>
+            <w:r>
+              <w:rPr>
+                <w:sz w:val="23"/>
+              </w:rPr>
+              <w:t xml:space="preserve">đại dịch thông tin</w:t>
+            </w:r>
+            <w:r>
+              <w:rPr>
+                <w:sz w:val="23"/>
+              </w:rPr>
+              <w:t xml:space="preserve">”</w:t>
+            </w:r>
+            <w:r>
+              <w:rPr>
+                <w:sz w:val="23"/>
+              </w:rPr>
+              <w:t xml:space="preserve"> </w:t>
+            </w:r>
+            <w:r>
+              <w:rPr>
+                <w:sz w:val="23"/>
+              </w:rPr>
+              <w:t xml:space="preserve">của WHO (2021)</w:t>
+            </w:r>
+          </w:p>
+        </w:tc>
+        <w:tc>
+          <w:tcPr/>
+          <w:p>
+            <w:pPr>
+              <w:pStyle w:val="Compact"/>
+              <w:jc w:val="left"/>
+            </w:pPr>
+            <w:r>
+              <w:rPr>
+                <w:sz w:val="23"/>
+              </w:rPr>
+              <w:t xml:space="preserve">Thử nghiệm trên YouTube với khoảng 1 triệu người: khả năng nhận diện tăng khoảng 5%, chi phí khoảng 0,05 USD mỗi lượt xem (Science Advances, 2022)</w:t>
+            </w:r>
+          </w:p>
+        </w:tc>
+        <w:tc>
+          <w:tcPr/>
+          <w:p>
+            <w:pPr>
+              <w:pStyle w:val="Compact"/>
+              <w:jc w:val="left"/>
+            </w:pPr>
+            <w:r>
+              <w:rPr>
+                <w:sz w:val="23"/>
+              </w:rPr>
+              <w:t xml:space="preserve">Cao: rẻ, không cần gỡ bài; hiệu ứng khiêm tốn nên cần lặp lại</w:t>
+            </w:r>
+          </w:p>
+        </w:tc>
+      </w:tr>
+    </w:tbl>
+    <w:p>
+      <w:pPr>
+        <w:pStyle w:val="BodyText"/>
+      </w:pPr>
+      <w:r>
+        <w:rPr>
+          <w:i/>
+          <w:iCs/>
+        </w:rPr>
+        <w:t xml:space="preserve">Ghi chú: số liệu tổng hợp qua tìm kiếm, chưa đọc trực tiếp văn bản gốc; tổ biên tập mở từng nguồn để đối chiếu trước khi sử dụng. Không có tài liệu quốc tế riêng về ứng phó trên Threads.</w:t>
+      </w:r>
+    </w:p>
+    <w:p>
+      <w:pPr>
+        <w:pStyle w:val="BodyText"/>
+      </w:pPr>
+      <w:r>
+        <w:rPr>
+          <w:b/>
+          <w:bCs/>
+        </w:rPr>
+        <w:t xml:space="preserve">Nguồn tham khảo</w:t>
+      </w:r>
+    </w:p>
+    <w:p>
+      <w:pPr>
+        <w:pStyle w:val="Compact"/>
+        <w:numPr>
+          <w:ilvl w:val="0"/>
+          <w:numId w:val="1033"/>
+        </w:numPr>
+        <w:jc w:val="left"/>
+      </w:pPr>
+      <w:r>
+        <w:t xml:space="preserve">Trung Quốc, văn bản tháng 11/2016 (mốc 5 giờ, 24 giờ). https://www.gov.cn/zhengce/content/2016-11/15/content_5132852.htm</w:t>
+      </w:r>
+    </w:p>
+    <w:p>
+      <w:pPr>
+        <w:pStyle w:val="Compact"/>
+        <w:numPr>
+          <w:ilvl w:val="0"/>
+          <w:numId w:val="1033"/>
+        </w:numPr>
+        <w:jc w:val="left"/>
+      </w:pPr>
+      <w:r>
+        <w:t xml:space="preserve">Trung Quốc, văn bản tháng 8/2016 về phản hồi dư luận. https://www.gov.cn/zhengce/content/2016-08/12/content_5099138.htm</w:t>
+      </w:r>
+    </w:p>
+    <w:p>
+      <w:pPr>
+        <w:pStyle w:val="Compact"/>
+        <w:numPr>
+          <w:ilvl w:val="0"/>
+          <w:numId w:val="1033"/>
+        </w:numPr>
+        <w:jc w:val="left"/>
+      </w:pPr>
+      <w:r>
+        <w:t xml:space="preserve">Singapore, thống kê các vụ áp dụng Luật POFMA. https://www.pofmaoffice.gov.sg/files/tabulation_of_pofma_cases_and_actions.pdf</w:t>
+      </w:r>
+    </w:p>
+    <w:p>
+      <w:pPr>
+        <w:pStyle w:val="Compact"/>
+        <w:numPr>
+          <w:ilvl w:val="0"/>
+          <w:numId w:val="1033"/>
+        </w:numPr>
+        <w:jc w:val="left"/>
+      </w:pPr>
+      <w:r>
+        <w:t xml:space="preserve">Singapore, Ủy ban An toàn trực tuyến. https://www.mlaw.gov.sg/online-safety-commission-and-online-safety-relief-and-accountability-act-2025-to-start-on-29-june-2026/</w:t>
+      </w:r>
+    </w:p>
+    <w:p>
+      <w:pPr>
+        <w:pStyle w:val="Compact"/>
+        <w:numPr>
+          <w:ilvl w:val="0"/>
+          <w:numId w:val="1033"/>
+        </w:numPr>
+        <w:jc w:val="left"/>
+      </w:pPr>
+      <w:r>
+        <w:t xml:space="preserve">Ủy ban châu Âu phạt X theo Đạo luật Dịch vụ số. https://digital-strategy.ec.europa.eu/en/news/commission-fines-x-eu120-million-under-digital-services-act</w:t>
+      </w:r>
+    </w:p>
+    <w:p>
+      <w:pPr>
+        <w:pStyle w:val="Compact"/>
+        <w:numPr>
+          <w:ilvl w:val="0"/>
+          <w:numId w:val="1033"/>
+        </w:numPr>
+        <w:jc w:val="left"/>
+      </w:pPr>
+      <w:r>
+        <w:t xml:space="preserve">Ủy ban Nội vụ Hạ viện Anh về bạo loạn năm 2024. https://committees.parliament.uk/committee/83/home-affairs-committee/news/206380/</w:t>
+      </w:r>
+    </w:p>
+    <w:p>
+      <w:pPr>
+        <w:pStyle w:val="Compact"/>
+        <w:numPr>
+          <w:ilvl w:val="0"/>
+          <w:numId w:val="1033"/>
+        </w:numPr>
+        <w:jc w:val="left"/>
+      </w:pPr>
+      <w:r>
+        <w:t xml:space="preserve">Bộ công cụ RESIST 2 của Anh. https://gcs.civilservice.gov.uk/wp-content/uploads/2021/11/RESIST-2-counter-disinformation-toolkit.pdf</w:t>
+      </w:r>
+    </w:p>
+    <w:p>
+      <w:pPr>
+        <w:pStyle w:val="Compact"/>
+        <w:numPr>
+          <w:ilvl w:val="0"/>
+          <w:numId w:val="1033"/>
+        </w:numPr>
+        <w:jc w:val="left"/>
+      </w:pPr>
+      <w:r>
+        <w:t xml:space="preserve">Biểu tình của giới trẻ ở Nepal năm 2025. https://restofworld.org/2025/nepal-gen-z-protest/</w:t>
+      </w:r>
+    </w:p>
+    <w:p>
+      <w:pPr>
+        <w:pStyle w:val="Compact"/>
+        <w:numPr>
+          <w:ilvl w:val="0"/>
+          <w:numId w:val="1033"/>
+        </w:numPr>
+        <w:jc w:val="left"/>
+      </w:pPr>
+      <w:r>
+        <w:t xml:space="preserve">Nghiên cứu</w:t>
+      </w:r>
+      <w:r>
+        <w:t xml:space="preserve"> </w:t>
+      </w:r>
+      <w:r>
+        <w:t xml:space="preserve">“</w:t>
+      </w:r>
+      <w:r>
+        <w:t xml:space="preserve">tiêm chủng tâm lý</w:t>
+      </w:r>
+      <w:r>
+        <w:t xml:space="preserve">”</w:t>
+      </w:r>
+      <w:r>
+        <w:t xml:space="preserve"> </w:t>
+      </w:r>
+      <w:r>
+        <w:t xml:space="preserve">trên YouTube (Science Advances, 2022). https://pmc.ncbi.nlm.nih.gov/articles/PMC9401631</w:t>
+      </w:r>
+    </w:p>
+    <w:p>
+      <w:pPr>
+        <w:pStyle w:val="Compact"/>
+        <w:numPr>
+          <w:ilvl w:val="0"/>
+          <w:numId w:val="1033"/>
+        </w:numPr>
+        <w:jc w:val="left"/>
+      </w:pPr>
+      <w:r>
+        <w:t xml:space="preserve">WHO, khung năng lực quản lý</w:t>
+      </w:r>
+      <w:r>
+        <w:t xml:space="preserve"> </w:t>
+      </w:r>
+      <w:r>
+        <w:t xml:space="preserve">“</w:t>
+      </w:r>
+      <w:r>
+        <w:t xml:space="preserve">đại dịch thông tin</w:t>
+      </w:r>
+      <w:r>
+        <w:t xml:space="preserve">”</w:t>
+      </w:r>
+      <w:r>
+        <w:t xml:space="preserve">. https://www.who.int/news/item/20-09-2021-who-releases-competency-framework-for-workforce-response-to-infodemic-management</w:t>
+      </w:r>
+    </w:p>
+    <w:bookmarkEnd w:id="56"/>
     <w:sectPr>
       <w:footerReference w:type="default" r:id="rId9"/>
       <w:pgSz w:w="11906" w:h="16838"/>
@@ -10074,30 +11364,6 @@
     </w:lvlOverride>
   </w:num>
   <w:num w:numId="1017">
-    <w:abstractNumId w:val="991"/>
-  </w:num>
-  <w:num w:numId="1018">
-    <w:abstractNumId w:val="991"/>
-  </w:num>
-  <w:num w:numId="1019">
-    <w:abstractNumId w:val="991"/>
-  </w:num>
-  <w:num w:numId="1020">
-    <w:abstractNumId w:val="991"/>
-  </w:num>
-  <w:num w:numId="1021">
-    <w:abstractNumId w:val="991"/>
-  </w:num>
-  <w:num w:numId="1022">
-    <w:abstractNumId w:val="991"/>
-  </w:num>
-  <w:num w:numId="1023">
-    <w:abstractNumId w:val="991"/>
-  </w:num>
-  <w:num w:numId="1024">
-    <w:abstractNumId w:val="991"/>
-  </w:num>
-  <w:num w:numId="1025">
     <w:abstractNumId w:val="99411"/>
     <w:lvlOverride w:ilvl="0">
       <w:startOverride w:val="1"/>
@@ -10126,6 +11392,30 @@
     <w:lvlOverride w:ilvl="8">
       <w:startOverride w:val="1"/>
     </w:lvlOverride>
+  </w:num>
+  <w:num w:numId="1018">
+    <w:abstractNumId w:val="991"/>
+  </w:num>
+  <w:num w:numId="1019">
+    <w:abstractNumId w:val="991"/>
+  </w:num>
+  <w:num w:numId="1020">
+    <w:abstractNumId w:val="991"/>
+  </w:num>
+  <w:num w:numId="1021">
+    <w:abstractNumId w:val="991"/>
+  </w:num>
+  <w:num w:numId="1022">
+    <w:abstractNumId w:val="991"/>
+  </w:num>
+  <w:num w:numId="1023">
+    <w:abstractNumId w:val="991"/>
+  </w:num>
+  <w:num w:numId="1024">
+    <w:abstractNumId w:val="991"/>
+  </w:num>
+  <w:num w:numId="1025">
+    <w:abstractNumId w:val="991"/>
   </w:num>
   <w:num w:numId="1026">
     <w:abstractNumId w:val="99411"/>
@@ -10158,7 +11448,34 @@
     </w:lvlOverride>
   </w:num>
   <w:num w:numId="1027">
-    <w:abstractNumId w:val="991"/>
+    <w:abstractNumId w:val="99411"/>
+    <w:lvlOverride w:ilvl="0">
+      <w:startOverride w:val="1"/>
+    </w:lvlOverride>
+    <w:lvlOverride w:ilvl="1">
+      <w:startOverride w:val="1"/>
+    </w:lvlOverride>
+    <w:lvlOverride w:ilvl="2">
+      <w:startOverride w:val="1"/>
+    </w:lvlOverride>
+    <w:lvlOverride w:ilvl="3">
+      <w:startOverride w:val="1"/>
+    </w:lvlOverride>
+    <w:lvlOverride w:ilvl="4">
+      <w:startOverride w:val="1"/>
+    </w:lvlOverride>
+    <w:lvlOverride w:ilvl="5">
+      <w:startOverride w:val="1"/>
+    </w:lvlOverride>
+    <w:lvlOverride w:ilvl="6">
+      <w:startOverride w:val="1"/>
+    </w:lvlOverride>
+    <w:lvlOverride w:ilvl="7">
+      <w:startOverride w:val="1"/>
+    </w:lvlOverride>
+    <w:lvlOverride w:ilvl="8">
+      <w:startOverride w:val="1"/>
+    </w:lvlOverride>
   </w:num>
   <w:num w:numId="1028">
     <w:abstractNumId w:val="991"/>
@@ -10170,6 +11487,12 @@
     <w:abstractNumId w:val="991"/>
   </w:num>
   <w:num w:numId="1031">
+    <w:abstractNumId w:val="991"/>
+  </w:num>
+  <w:num w:numId="1032">
+    <w:abstractNumId w:val="991"/>
+  </w:num>
+  <w:num w:numId="1033">
     <w:abstractNumId w:val="991"/>
   </w:num>
 </w:numbering>

</xml_diff>

<commit_message>
Cập nhật nguồn gốc và sửa số liệu phần kinh nghiệm quốc tế
- Phụ lục 6: thay danh mục nguồn bằng đường dẫn tới văn bản gốc và
  file PDF (văn bản Trung Quốc năm 2016, Luật POFMA, Đạo luật Dịch vụ
  số trên EUR-Lex, RESIST 2, giao thức của Ofcom, báo cáo VIGINUM,
  Chỉ số năng lực truyền thông 2023, WHO)
- Sửa số liệu nghiên cứu “tiêm chủng thông tin”: 6.464 người trong
  thí nghiệm có đối chứng và 22.632 người trong thử nghiệm trên
  YouTube, bỏ con số “khoảng 1 triệu người” và chi phí chưa xác minh
- Cập nhật thống kê POFMA đến 1/7/2026; ghi nhận ngày Nepal ban hành
  lệnh chặn chưa thống nhất giữa các nguồn

Co-Authored-By: Claude Opus 5.5 <noreply@anthropic.com>
Claude-Session: https://claude.ai/code/session_01NzZ78rAanjcMCsGwt7jxAb
</commit_message>
<xml_diff>
--- a/tham-luan-khung-hoang-truyen-thong/de-cuong-tham-luan-bvhttdl.docx
+++ b/tham-luan-khung-hoang-truyen-thong/de-cuong-tham-luan-bvhttdl.docx
@@ -4886,7 +4886,7 @@
         <w:t xml:space="preserve"> </w:t>
       </w:r>
       <w:r>
-        <w:t xml:space="preserve">Lệnh chặn 26 nền tảng mạng xã hội ngày 4/9/2025 trở thành ngòi nổ cho làn sóng biểu tình của giới trẻ; chính quyền phải dỡ lệnh chặn sau 4 ngày, Thủ tướng từ chức ngày 9/9/2025.</w:t>
+        <w:t xml:space="preserve">Lệnh chặn 26 nền tảng mạng xã hội đầu tháng 9/2025 trở thành ngòi nổ cho làn sóng biểu tình của giới trẻ; chính quyền phải dỡ lệnh chặn chỉ vài ngày sau, Thủ tướng từ chức ngày 9/9/2025.</w:t>
       </w:r>
     </w:p>
     <w:p>
@@ -5007,7 +5007,7 @@
         <w:t xml:space="preserve"> </w:t>
       </w:r>
       <w:r>
-        <w:t xml:space="preserve">Phần Lan đưa giáo dục năng lực truyền thông vào chương trình từ mầm non; thử nghiệm trên YouTube với khoảng 1 triệu người cho thấy video 90 giây giới thiệu thủ đoạn thao túng giúp tăng khả năng nhận diện khoảng 5%, chi phí khoảng 0,05 USD mỗi lượt xem.</w:t>
+        <w:t xml:space="preserve">Phần Lan đưa giáo dục năng lực truyền thông vào chương trình từ mầm non; nghiên cứu đăng trên Science Advances (2022), gồm 6 thí nghiệm có đối chứng với 6.464 người và 1 thử nghiệm thực địa trên YouTube với 22.632 người, cho thấy video ngắn giới thiệu thủ đoạn thao túng giúp người xem nhận diện thủ đoạn và phân biệt nội dung đáng tin tốt hơn, với chi phí thấp.</w:t>
       </w:r>
     </w:p>
     <w:p>
@@ -10235,7 +10235,7 @@
               <w:rPr>
                 <w:sz w:val="23"/>
               </w:rPr>
-              <w:t xml:space="preserve">Đến 30/9/2025: 88 vụ, 142 lệnh cải chính, 36 lệnh cải chính nhắm mục tiêu, 4 lệnh chặn truy cập; kênh WhatsApp Gov.sg tăng từ khoảng 7.000 lên hơn 900.000 thuê bao trong 10 tuần đầu dịch COVID-19</w:t>
+              <w:t xml:space="preserve">Đến 1/7/2026: 92 vụ, 146 lệnh cải chính, 39 lệnh cải chính nhắm mục tiêu, 5 lệnh chặn truy cập; kênh WhatsApp Gov.sg tăng từ khoảng 7.000 lên hơn 900.000 thuê bao trong 10 tuần đầu dịch COVID-19</w:t>
             </w:r>
           </w:p>
         </w:tc>
@@ -10439,22 +10439,22 @@
               <w:rPr>
                 <w:sz w:val="23"/>
               </w:rPr>
-              <w:t xml:space="preserve">Chặn 26 nền tảng mạng xã hội chưa đăng ký (4/9/2025)</w:t>
-            </w:r>
-          </w:p>
-        </w:tc>
-        <w:tc>
-          <w:tcPr/>
-          <w:p>
-            <w:pPr>
-              <w:pStyle w:val="Compact"/>
-              <w:jc w:val="left"/>
-            </w:pPr>
-            <w:r>
-              <w:rPr>
-                <w:sz w:val="23"/>
-              </w:rPr>
-              <w:t xml:space="preserve">Biểu tình của giới trẻ ngày 8/9/2025, khoảng 19 người chết ngày đầu; chính quyền dỡ lệnh chặn trong đêm; Thủ tướng từ chức ngày 9/9; tổng số người chết khoảng 76</w:t>
+              <w:t xml:space="preserve">Chặn 26 nền tảng mạng xã hội chưa đăng ký (đầu tháng 9/2025; các nguồn ghi ngày 4 hoặc 5/9)</w:t>
+            </w:r>
+          </w:p>
+        </w:tc>
+        <w:tc>
+          <w:tcPr/>
+          <w:p>
+            <w:pPr>
+              <w:pStyle w:val="Compact"/>
+              <w:jc w:val="left"/>
+            </w:pPr>
+            <w:r>
+              <w:rPr>
+                <w:sz w:val="23"/>
+              </w:rPr>
+              <w:t xml:space="preserve">Biểu tình của giới trẻ ngày 8/9/2025, 19 người chết ngay trong ngày; chính quyền dỡ lệnh chặn; Thủ tướng từ chức ngày 9/9</w:t>
             </w:r>
           </w:p>
         </w:tc>
@@ -10650,7 +10650,7 @@
               <w:rPr>
                 <w:sz w:val="23"/>
               </w:rPr>
-              <w:t xml:space="preserve">Thử nghiệm trên YouTube với khoảng 1 triệu người: khả năng nhận diện tăng khoảng 5%, chi phí khoảng 0,05 USD mỗi lượt xem (Science Advances, 2022)</w:t>
+              <w:t xml:space="preserve">Science Advances (2022): 6 thí nghiệm có đối chứng (6.464 người) và 1 thử nghiệm thực địa trên YouTube (22.632 người); người xem nhận diện thủ đoạn thao túng và phân biệt nội dung đáng tin tốt hơn</w:t>
             </w:r>
           </w:p>
         </w:tc>
@@ -10692,7 +10692,19 @@
           <w:b/>
           <w:bCs/>
         </w:rPr>
-        <w:t xml:space="preserve">Nguồn tham khảo</w:t>
+        <w:t xml:space="preserve">Nguồn tham khảo (ưu tiên văn bản gốc, file PDF)</w:t>
+      </w:r>
+    </w:p>
+    <w:p>
+      <w:pPr>
+        <w:pStyle w:val="BodyText"/>
+      </w:pPr>
+      <w:r>
+        <w:rPr>
+          <w:i/>
+          <w:iCs/>
+        </w:rPr>
+        <w:t xml:space="preserve">Trung Quốc</w:t>
       </w:r>
     </w:p>
     <w:p>
@@ -10705,7 +10717,7 @@
         <w:jc w:val="left"/>
       </w:pPr>
       <w:r>
-        <w:t xml:space="preserve">Trung Quốc, văn bản tháng 11/2016 (mốc 5 giờ, 24 giờ). https://www.gov.cn/zhengce/content/2016-11/15/content_5132852.htm</w:t>
+        <w:t xml:space="preserve">Thông báo của Văn phòng Quốc vụ viện về phản hồi dư luận chính vụ, số 61 năm 2016 (bản gốc tiếng Trung). https://www.gov.cn/zhengce/content/2016-08/12/content_5099138.htm</w:t>
       </w:r>
     </w:p>
     <w:p>
@@ -10718,7 +10730,7 @@
         <w:jc w:val="left"/>
       </w:pPr>
       <w:r>
-        <w:t xml:space="preserve">Trung Quốc, văn bản tháng 8/2016 về phản hồi dư luận. https://www.gov.cn/zhengce/content/2016-08/12/content_5099138.htm</w:t>
+        <w:t xml:space="preserve">Bản dịch tiếng Anh của Thông báo số 61 năm 2016. https://www.chinalawtranslate.com/state-council-notice-on-responses-to-public-opinion-on-government-affairs/</w:t>
       </w:r>
     </w:p>
     <w:p>
@@ -10731,7 +10743,7 @@
         <w:jc w:val="left"/>
       </w:pPr>
       <w:r>
-        <w:t xml:space="preserve">Singapore, thống kê các vụ áp dụng Luật POFMA. https://www.pofmaoffice.gov.sg/files/tabulation_of_pofma_cases_and_actions.pdf</w:t>
+        <w:t xml:space="preserve">Chi tiết thực hiện công khai chính vụ, số 80 năm 2016 (mốc 5 giờ, 24 giờ; trang gốc ghi văn bản đã hết hiệu lực). https://www.gov.cn/zhengce/content/2016-11/15/content_5132852.htm</w:t>
       </w:r>
     </w:p>
     <w:p>
@@ -10744,102 +10756,321 @@
         <w:jc w:val="left"/>
       </w:pPr>
       <w:r>
-        <w:t xml:space="preserve">Singapore, Ủy ban An toàn trực tuyến. https://www.mlaw.gov.sg/online-safety-commission-and-online-safety-relief-and-accountability-act-2025-to-start-on-29-june-2026/</w:t>
-      </w:r>
-    </w:p>
-    <w:p>
-      <w:pPr>
-        <w:pStyle w:val="Compact"/>
-        <w:numPr>
-          <w:ilvl w:val="0"/>
-          <w:numId w:val="1033"/>
+        <w:t xml:space="preserve">Nền tảng bác bỏ tin đồn Internet liên hợp. https://www.piyao.org.cn/</w:t>
+      </w:r>
+    </w:p>
+    <w:p>
+      <w:pPr>
+        <w:pStyle w:val="FirstParagraph"/>
+      </w:pPr>
+      <w:r>
+        <w:rPr>
+          <w:i/>
+          <w:iCs/>
+        </w:rPr>
+        <w:t xml:space="preserve">Singapore</w:t>
+      </w:r>
+    </w:p>
+    <w:p>
+      <w:pPr>
+        <w:pStyle w:val="Compact"/>
+        <w:numPr>
+          <w:ilvl w:val="0"/>
+          <w:numId w:val="1034"/>
         </w:numPr>
         <w:jc w:val="left"/>
       </w:pPr>
       <w:r>
-        <w:t xml:space="preserve">Ủy ban châu Âu phạt X theo Đạo luật Dịch vụ số. https://digital-strategy.ec.europa.eu/en/news/commission-fines-x-eu120-million-under-digital-services-act</w:t>
-      </w:r>
-    </w:p>
-    <w:p>
-      <w:pPr>
-        <w:pStyle w:val="Compact"/>
-        <w:numPr>
-          <w:ilvl w:val="0"/>
-          <w:numId w:val="1033"/>
+        <w:t xml:space="preserve">Văn bản Luật POFMA 2019 (Singapore Statutes Online). https://sso.agc.gov.sg/Act/POFMA2019</w:t>
+      </w:r>
+    </w:p>
+    <w:p>
+      <w:pPr>
+        <w:pStyle w:val="Compact"/>
+        <w:numPr>
+          <w:ilvl w:val="0"/>
+          <w:numId w:val="1034"/>
         </w:numPr>
         <w:jc w:val="left"/>
       </w:pPr>
       <w:r>
+        <w:t xml:space="preserve">Bảng thống kê vụ việc POFMA, cập nhật đến 1/7/2026 (PDF). https://isomer-user-content.by.gov.sg/501/80bbf192-e278-4ab9-93cc-8da479af0819/tabulation_of_pofma_cases_and_actions.pdf</w:t>
+      </w:r>
+    </w:p>
+    <w:p>
+      <w:pPr>
+        <w:pStyle w:val="Compact"/>
+        <w:numPr>
+          <w:ilvl w:val="0"/>
+          <w:numId w:val="1034"/>
+        </w:numPr>
+        <w:jc w:val="left"/>
+      </w:pPr>
+      <w:r>
+        <w:t xml:space="preserve">Thông cáo về Ủy ban An toàn trực tuyến và Đạo luật năm 2025. https://www.mlaw.gov.sg/online-safety-commission-and-online-safety-relief-and-accountability-act-2025-to-start-on-29-june-2026/</w:t>
+      </w:r>
+    </w:p>
+    <w:p>
+      <w:pPr>
+        <w:pStyle w:val="FirstParagraph"/>
+      </w:pPr>
+      <w:r>
+        <w:rPr>
+          <w:i/>
+          <w:iCs/>
+        </w:rPr>
+        <w:t xml:space="preserve">Liên minh châu Âu</w:t>
+      </w:r>
+    </w:p>
+    <w:p>
+      <w:pPr>
+        <w:pStyle w:val="Compact"/>
+        <w:numPr>
+          <w:ilvl w:val="0"/>
+          <w:numId w:val="1035"/>
+        </w:numPr>
+        <w:jc w:val="left"/>
+      </w:pPr>
+      <w:r>
+        <w:t xml:space="preserve">Văn bản Đạo luật Dịch vụ số, Quy định (EU) 2022/2065 (EUR-Lex). https://eur-lex.europa.eu/eli/reg/2022/2065/oj</w:t>
+      </w:r>
+    </w:p>
+    <w:p>
+      <w:pPr>
+        <w:pStyle w:val="Compact"/>
+        <w:numPr>
+          <w:ilvl w:val="0"/>
+          <w:numId w:val="1035"/>
+        </w:numPr>
+        <w:jc w:val="left"/>
+      </w:pPr>
+      <w:r>
+        <w:t xml:space="preserve">Thông cáo của Ủy ban châu Âu về khoản phạt 120 triệu euro đối với X. https://digital-strategy.ec.europa.eu/en/news/commission-fines-x-eu120-million-under-digital-services-act</w:t>
+      </w:r>
+    </w:p>
+    <w:p>
+      <w:pPr>
+        <w:pStyle w:val="Compact"/>
+        <w:numPr>
+          <w:ilvl w:val="0"/>
+          <w:numId w:val="1035"/>
+        </w:numPr>
+        <w:jc w:val="left"/>
+      </w:pPr>
+      <w:r>
+        <w:t xml:space="preserve">Phân tích cơ chế ứng phó khủng hoảng của Đạo luật Dịch vụ số. https://dsa-observatory.eu/2023/02/21/the-dsas-crisis-approach-crisis-response-mechanism-and-crisis-protocols/</w:t>
+      </w:r>
+    </w:p>
+    <w:p>
+      <w:pPr>
+        <w:pStyle w:val="FirstParagraph"/>
+      </w:pPr>
+      <w:r>
+        <w:rPr>
+          <w:i/>
+          <w:iCs/>
+        </w:rPr>
+        <w:t xml:space="preserve">Anh</w:t>
+      </w:r>
+    </w:p>
+    <w:p>
+      <w:pPr>
+        <w:pStyle w:val="Compact"/>
+        <w:numPr>
+          <w:ilvl w:val="0"/>
+          <w:numId w:val="1036"/>
+        </w:numPr>
+        <w:jc w:val="left"/>
+      </w:pPr>
+      <w:r>
+        <w:t xml:space="preserve">Bộ công cụ RESIST 2 (PDF). https://gcs.civilservice.gov.uk/wp-content/uploads/2021/11/RESIST-2-counter-disinformation-toolkit.pdf</w:t>
+      </w:r>
+    </w:p>
+    <w:p>
+      <w:pPr>
+        <w:pStyle w:val="Compact"/>
+        <w:numPr>
+          <w:ilvl w:val="0"/>
+          <w:numId w:val="1036"/>
+        </w:numPr>
+        <w:jc w:val="left"/>
+      </w:pPr>
+      <w:r>
+        <w:t xml:space="preserve">Giao thức ứng phó khủng hoảng của Ofcom, 9/6/2026 (trang văn bản và PDF). https://www.ofcom.org.uk/online-safety/illegal-and-harmful-content/statement-crisis-response-protocol ; https://www.ofcom.org.uk/siteassets/resources/documents/online-safety/protecting-children/illegal-harms/crisis-response-protocol-online-safety-additional-safety-measures.pdf</w:t>
+      </w:r>
+    </w:p>
+    <w:p>
+      <w:pPr>
+        <w:pStyle w:val="Compact"/>
+        <w:numPr>
+          <w:ilvl w:val="0"/>
+          <w:numId w:val="1036"/>
+        </w:numPr>
+        <w:jc w:val="left"/>
+      </w:pPr>
+      <w:r>
         <w:t xml:space="preserve">Ủy ban Nội vụ Hạ viện Anh về bạo loạn năm 2024. https://committees.parliament.uk/committee/83/home-affairs-committee/news/206380/</w:t>
       </w:r>
     </w:p>
     <w:p>
       <w:pPr>
-        <w:pStyle w:val="Compact"/>
-        <w:numPr>
-          <w:ilvl w:val="0"/>
-          <w:numId w:val="1033"/>
+        <w:pStyle w:val="FirstParagraph"/>
+      </w:pPr>
+      <w:r>
+        <w:rPr>
+          <w:i/>
+          <w:iCs/>
+        </w:rPr>
+        <w:t xml:space="preserve">Nepal</w:t>
+      </w:r>
+    </w:p>
+    <w:p>
+      <w:pPr>
+        <w:pStyle w:val="Compact"/>
+        <w:numPr>
+          <w:ilvl w:val="0"/>
+          <w:numId w:val="1037"/>
         </w:numPr>
         <w:jc w:val="left"/>
       </w:pPr>
       <w:r>
-        <w:t xml:space="preserve">Bộ công cụ RESIST 2 của Anh. https://gcs.civilservice.gov.uk/wp-content/uploads/2021/11/RESIST-2-counter-disinformation-toolkit.pdf</w:t>
-      </w:r>
-    </w:p>
-    <w:p>
-      <w:pPr>
-        <w:pStyle w:val="Compact"/>
-        <w:numPr>
-          <w:ilvl w:val="0"/>
-          <w:numId w:val="1033"/>
+        <w:t xml:space="preserve">Diễn biến biểu tình của giới trẻ năm 2025. https://restofworld.org/2025/nepal-gen-z-protest/ ; https://www.cbsnews.com/news/nepal-protests-social-media-ban-prime-minister-oli-resigns/</w:t>
+      </w:r>
+    </w:p>
+    <w:p>
+      <w:pPr>
+        <w:pStyle w:val="FirstParagraph"/>
+      </w:pPr>
+      <w:r>
+        <w:rPr>
+          <w:i/>
+          <w:iCs/>
+        </w:rPr>
+        <w:t xml:space="preserve">Pháp, Thụy Điển, Phần Lan</w:t>
+      </w:r>
+    </w:p>
+    <w:p>
+      <w:pPr>
+        <w:pStyle w:val="Compact"/>
+        <w:numPr>
+          <w:ilvl w:val="0"/>
+          <w:numId w:val="1038"/>
         </w:numPr>
         <w:jc w:val="left"/>
       </w:pPr>
       <w:r>
-        <w:t xml:space="preserve">Biểu tình của giới trẻ ở Nepal năm 2025. https://restofworld.org/2025/nepal-gen-z-protest/</w:t>
-      </w:r>
-    </w:p>
-    <w:p>
-      <w:pPr>
-        <w:pStyle w:val="Compact"/>
-        <w:numPr>
-          <w:ilvl w:val="0"/>
-          <w:numId w:val="1033"/>
+        <w:t xml:space="preserve">Báo cáo của VIGINUM về Thế vận hội Paris 2024 (PDF). https://www.vie-publique.fr/files/rapport/pdf/295411.pdf</w:t>
+      </w:r>
+    </w:p>
+    <w:p>
+      <w:pPr>
+        <w:pStyle w:val="Compact"/>
+        <w:numPr>
+          <w:ilvl w:val="0"/>
+          <w:numId w:val="1038"/>
         </w:numPr>
         <w:jc w:val="left"/>
       </w:pPr>
       <w:r>
+        <w:t xml:space="preserve">Tóm tắt của Bộ Ngoại giao Pháp về báo cáo VIGINUM. https://diplomatie.gouv.fr/en/french-foreign-policy/sports-diplomacy/news/article/paris-2024-olympic-and-paralympic-games-report-on-attempted-foreign-digital</w:t>
+      </w:r>
+    </w:p>
+    <w:p>
+      <w:pPr>
+        <w:pStyle w:val="Compact"/>
+        <w:numPr>
+          <w:ilvl w:val="0"/>
+          <w:numId w:val="1038"/>
+        </w:numPr>
+        <w:jc w:val="left"/>
+      </w:pPr>
+      <w:r>
+        <w:t xml:space="preserve">Cơ quan Phòng vệ tâm lý Thụy Điển. https://www.mpf.se/</w:t>
+      </w:r>
+    </w:p>
+    <w:p>
+      <w:pPr>
+        <w:pStyle w:val="Compact"/>
+        <w:numPr>
+          <w:ilvl w:val="0"/>
+          <w:numId w:val="1038"/>
+        </w:numPr>
+        <w:jc w:val="left"/>
+      </w:pPr>
+      <w:r>
+        <w:t xml:space="preserve">Chỉ số năng lực truyền thông châu Âu năm 2023 (PDF). https://osis.bg/wp-content/uploads/2023/06/MLI-report-in-English-22.06.pdf</w:t>
+      </w:r>
+    </w:p>
+    <w:p>
+      <w:pPr>
+        <w:pStyle w:val="FirstParagraph"/>
+      </w:pPr>
+      <w:r>
+        <w:rPr>
+          <w:i/>
+          <w:iCs/>
+        </w:rPr>
         <w:t xml:space="preserve">Nghiên cứu</w:t>
       </w:r>
       <w:r>
-        <w:t xml:space="preserve"> </w:t>
-      </w:r>
-      <w:r>
+        <w:rPr>
+          <w:i/>
+          <w:iCs/>
+        </w:rPr>
+        <w:t xml:space="preserve"> </w:t>
+      </w:r>
+      <w:r>
+        <w:rPr>
+          <w:i/>
+          <w:iCs/>
+        </w:rPr>
         <w:t xml:space="preserve">“</w:t>
       </w:r>
       <w:r>
-        <w:t xml:space="preserve">tiêm chủng tâm lý</w:t>
-      </w:r>
-      <w:r>
+        <w:rPr>
+          <w:i/>
+          <w:iCs/>
+        </w:rPr>
+        <w:t xml:space="preserve">tiêm chủng thông tin</w:t>
+      </w:r>
+      <w:r>
+        <w:rPr>
+          <w:i/>
+          <w:iCs/>
+        </w:rPr>
         <w:t xml:space="preserve">”</w:t>
       </w:r>
       <w:r>
-        <w:t xml:space="preserve"> </w:t>
-      </w:r>
-      <w:r>
-        <w:t xml:space="preserve">trên YouTube (Science Advances, 2022). https://pmc.ncbi.nlm.nih.gov/articles/PMC9401631</w:t>
-      </w:r>
-    </w:p>
-    <w:p>
-      <w:pPr>
-        <w:pStyle w:val="Compact"/>
-        <w:numPr>
-          <w:ilvl w:val="0"/>
-          <w:numId w:val="1033"/>
+        <w:rPr>
+          <w:i/>
+          <w:iCs/>
+        </w:rPr>
+        <w:t xml:space="preserve">, WHO</w:t>
+      </w:r>
+    </w:p>
+    <w:p>
+      <w:pPr>
+        <w:pStyle w:val="Compact"/>
+        <w:numPr>
+          <w:ilvl w:val="0"/>
+          <w:numId w:val="1039"/>
         </w:numPr>
         <w:jc w:val="left"/>
       </w:pPr>
       <w:r>
+        <w:t xml:space="preserve">Roozenbeek và cộng sự, Science Advances, 2022 (bản toàn văn miễn phí). https://pmc.ncbi.nlm.nih.gov/articles/PMC9401631 ; https://doi.org/10.1126/sciadv.abo6254</w:t>
+      </w:r>
+    </w:p>
+    <w:p>
+      <w:pPr>
+        <w:pStyle w:val="Compact"/>
+        <w:numPr>
+          <w:ilvl w:val="0"/>
+          <w:numId w:val="1039"/>
+        </w:numPr>
+        <w:jc w:val="left"/>
+      </w:pPr>
+      <w:r>
         <w:t xml:space="preserve">WHO, khung năng lực quản lý</w:t>
       </w:r>
       <w:r>
@@ -10855,7 +11086,10 @@
         <w:t xml:space="preserve">”</w:t>
       </w:r>
       <w:r>
-        <w:t xml:space="preserve">. https://www.who.int/news/item/20-09-2021-who-releases-competency-framework-for-workforce-response-to-infodemic-management</w:t>
+        <w:t xml:space="preserve"> </w:t>
+      </w:r>
+      <w:r>
+        <w:t xml:space="preserve">(2021). https://www.who.int/publications/i/item/9789240035287</w:t>
       </w:r>
     </w:p>
     <w:bookmarkEnd w:id="56"/>
@@ -11493,6 +11727,24 @@
     <w:abstractNumId w:val="991"/>
   </w:num>
   <w:num w:numId="1033">
+    <w:abstractNumId w:val="991"/>
+  </w:num>
+  <w:num w:numId="1034">
+    <w:abstractNumId w:val="991"/>
+  </w:num>
+  <w:num w:numId="1035">
+    <w:abstractNumId w:val="991"/>
+  </w:num>
+  <w:num w:numId="1036">
+    <w:abstractNumId w:val="991"/>
+  </w:num>
+  <w:num w:numId="1037">
+    <w:abstractNumId w:val="991"/>
+  </w:num>
+  <w:num w:numId="1038">
+    <w:abstractNumId w:val="991"/>
+  </w:num>
+  <w:num w:numId="1039">
     <w:abstractNumId w:val="991"/>
   </w:num>
 </w:numbering>

</xml_diff>

<commit_message>
Đối chiếu văn bản gốc: mốc 5 giờ của Trung Quốc, số liệu nghiên cứu “tiêm chủng thông tin”
- Văn bản số 80 năm 2016 của Văn phòng Quốc vụ viện (gov.cn): xác nhận
  mốc 5 giờ công bố thông tin, 24 giờ họp báo; ghi chú văn bản nay đã
  hết hiệu lực
- Toàn văn Science Advances 2022 (Europe PMC): video hiển thị cho khoảng
  5,4 triệu người trong 15 ngày, 22.632 người trả lời câu hỏi kiểm tra,
  khả năng nhận diện tăng trung bình khoảng 5%, chi phí khoảng 0,05 USD
  mỗi lượt xem; khôi phục 2 số liệu đã bỏ nhầm ở commit trước

Co-Authored-By: Claude Opus 5.5 <noreply@anthropic.com>
Claude-Session: https://claude.ai/code/session_01NzZ78rAanjcMCsGwt7jxAb
</commit_message>
<xml_diff>
--- a/tham-luan-khung-hoang-truyen-thong/de-cuong-tham-luan-bvhttdl.docx
+++ b/tham-luan-khung-hoang-truyen-thong/de-cuong-tham-luan-bvhttdl.docx
@@ -4798,7 +4798,7 @@
         <w:t xml:space="preserve"> </w:t>
       </w:r>
       <w:r>
-        <w:t xml:space="preserve">Từ năm 2016, quy định yêu cầu công bố thông tin chính thức chậm nhất 5 giờ, họp báo chậm nhất 24 giờ với sự kiện đột xuất nghiêm trọng, gắn trách nhiệm cơ quan chủ quản; nền tảng bác bỏ tin đồn dùng chung hoạt động từ năm 2018. Mốc 3, 6, 24 giờ đề xuất trong đề cương phù hợp xu hướng này.</w:t>
+        <w:t xml:space="preserve">Năm 2016, văn bản của Văn phòng Quốc vụ viện yêu cầu công bố thông tin chính thức chậm nhất 5 giờ, họp báo chậm nhất 24 giờ với sự kiện đột xuất đặc biệt nghiêm trọng, nghiêm trọng, gắn trách nhiệm cơ quan chủ quản (văn bản này nay đã hết hiệu lực); nền tảng bác bỏ tin đồn dùng chung hoạt động từ năm 2018. Mốc 3, 6, 24 giờ đề xuất trong đề cương phù hợp xu hướng này.</w:t>
       </w:r>
     </w:p>
     <w:p>
@@ -5007,7 +5007,7 @@
         <w:t xml:space="preserve"> </w:t>
       </w:r>
       <w:r>
-        <w:t xml:space="preserve">Phần Lan đưa giáo dục năng lực truyền thông vào chương trình từ mầm non; nghiên cứu đăng trên Science Advances (2022), gồm 6 thí nghiệm có đối chứng với 6.464 người và 1 thử nghiệm thực địa trên YouTube với 22.632 người, cho thấy video ngắn giới thiệu thủ đoạn thao túng giúp người xem nhận diện thủ đoạn và phân biệt nội dung đáng tin tốt hơn, với chi phí thấp.</w:t>
+        <w:t xml:space="preserve">Phần Lan đưa giáo dục năng lực truyền thông vào chương trình từ mầm non; nghiên cứu đăng trên Science Advances (2022), gồm 6 thí nghiệm có đối chứng với 6.464 người và 1 thử nghiệm thực địa trên YouTube, cho thấy video ngắn giới thiệu thủ đoạn thao túng giúp người xem nhận diện thủ đoạn và phân biệt nội dung đáng tin tốt hơn. Trong thử nghiệm thực địa, video quảng cáo hiển thị cho khoảng 5,4 triệu người dùng trong 15 ngày; trong số 22.632 người trả lời câu hỏi kiểm tra, khả năng nhận diện thủ đoạn tăng trung bình khoảng 5%; chi phí trung bình khoảng 0,05 USD mỗi lượt xem.</w:t>
       </w:r>
     </w:p>
     <w:p>
@@ -10155,7 +10155,7 @@
               <w:rPr>
                 <w:sz w:val="23"/>
               </w:rPr>
-              <w:t xml:space="preserve">Văn bản của Văn phòng Quốc vụ viện tháng 8/2016: họp báo chậm nhất 24 giờ với sự kiện đột xuất nghiêm trọng, phản hồi dư luận khác trong 48 giờ; văn bản tháng 11/2016: công bố thông tin chính thức chậm nhất 5 giờ, họp báo trong 24 giờ; nền tảng bác bỏ tin đồn Internet liên hợp (từ 8/2018), tích hợp hơn 40 nền tảng địa phương</w:t>
+              <w:t xml:space="preserve">Văn bản của Văn phòng Quốc vụ viện tháng 8/2016: họp báo chậm nhất 24 giờ với sự kiện đột xuất nghiêm trọng, phản hồi dư luận khác trong 48 giờ; văn bản tháng 11/2016 (nay đã hết hiệu lực): công bố thông tin chính thức chậm nhất 5 giờ, họp báo trong 24 giờ (đã đối chiếu văn bản gốc); nền tảng bác bỏ tin đồn Internet liên hợp (từ 8/2018), tích hợp hơn 40 nền tảng địa phương</w:t>
             </w:r>
           </w:p>
         </w:tc>
@@ -10650,7 +10650,7 @@
               <w:rPr>
                 <w:sz w:val="23"/>
               </w:rPr>
-              <w:t xml:space="preserve">Science Advances (2022): 6 thí nghiệm có đối chứng (6.464 người) và 1 thử nghiệm thực địa trên YouTube (22.632 người); người xem nhận diện thủ đoạn thao túng và phân biệt nội dung đáng tin tốt hơn</w:t>
+              <w:t xml:space="preserve">Science Advances (2022): 6 thí nghiệm có đối chứng (6.464 người); thử nghiệm thực địa trên YouTube hiển thị video cho khoảng 5,4 triệu người trong 15 ngày, 22.632 người trả lời câu hỏi kiểm tra; khả năng nhận diện thủ đoạn tăng trung bình khoảng 5%, chi phí trung bình khoảng 0,05 USD mỗi lượt xem (đã đối chiếu toàn văn)</w:t>
             </w:r>
           </w:p>
         </w:tc>
@@ -10680,7 +10680,7 @@
           <w:i/>
           <w:iCs/>
         </w:rPr>
-        <w:t xml:space="preserve">Ghi chú: số liệu tổng hợp qua tìm kiếm, chưa đọc trực tiếp văn bản gốc; tổ biên tập mở từng nguồn để đối chiếu trước khi sử dụng. Không có tài liệu quốc tế riêng về ứng phó trên Threads.</w:t>
+        <w:t xml:space="preserve">Ghi chú: đã đối chiếu văn bản gốc đối với mốc 5 giờ, 24 giờ của Trung Quốc và số liệu nghiên cứu trên Science Advances; các số liệu còn lại tổng hợp qua tìm kiếm, tổ biên tập mở từng nguồn để đối chiếu trước khi sử dụng. Không có tài liệu quốc tế riêng về ứng phó trên Threads.</w:t>
       </w:r>
     </w:p>
     <w:p>

</xml_diff>

<commit_message>
Bổ sung kinh nghiệm quốc tế liên quan Threads; thay RESIST 2 bằng RESIST 3
- Phần II, mục 6: thêm mục 8 về kinh nghiệm liên quan Threads (Úc,
  Malaysia, Meta)
- Phụ lục 6: bảng 6 kinh nghiệm liên quan Threads kèm nhãn mức kiểm
  chứng (Úc, Meta 1/2025 và 2/2024, Malaysia, quy trình hạn chế nội
  dung theo luật sở tại của Meta, Thổ Nhĩ Kỳ) và nguồn tham khảo
- Phần “Điểm nhấn: ứng phó trên Threads”: theo dõi chính sách kiểm
  chứng của Meta; thêm hướng danh mục nền tảng mở và phối hợp 3 bên,
  lưu chứng cứ số
- Thay đường dẫn hỏng của RESIST 2 bằng RESIST 3 (công bố 29/10/2025,
  đã đọc toàn văn trên trang web)

Co-Authored-By: Claude Opus 5.5 <noreply@anthropic.com>
Claude-Session: https://claude.ai/code/session_01NzZ78rAanjcMCsGwt7jxAb
</commit_message>
<xml_diff>
--- a/tham-luan-khung-hoang-truyen-thong/de-cuong-tham-luan-bvhttdl.docx
+++ b/tham-luan-khung-hoang-truyen-thong/de-cuong-tham-luan-bvhttdl.docx
@@ -321,7 +321,7 @@
         <w:t xml:space="preserve"> </w:t>
       </w:r>
       <w:r>
-        <w:t xml:space="preserve">Cập nhật căn cứ pháp lý: Nghị định số 244/2026/NĐ-CP thay thế Nghị định số 09/2017/NĐ-CP về phát ngôn, cùng 7 văn bản bổ sung (Phần II, mục 1); số liệu mới nhất về tiếp nhận tin tức và lừa đảo trực tuyến (Mở đầu, Phần I); kinh nghiệm quốc tế (Phần II, mục 6 và Phụ lục 6), lồng ghép vào nhóm giải pháp 2, 3, 4, 6, 7.</w:t>
+        <w:t xml:space="preserve">Cập nhật căn cứ pháp lý: Nghị định số 244/2026/NĐ-CP thay thế Nghị định số 09/2017/NĐ-CP về phát ngôn, cùng 7 văn bản bổ sung (Phần II, mục 1); số liệu mới nhất về tiếp nhận tin tức và lừa đảo trực tuyến (Mở đầu, Phần I); kinh nghiệm quốc tế (Phần II, mục 6 và Phụ lục 6), trong đó có 6 kinh nghiệm liên quan Threads, lồng ghép vào nhóm giải pháp 2, 3, 4, 6, 7 và phần ứng phó trên Threads.</w:t>
       </w:r>
     </w:p>
     <w:p>
@@ -5012,6 +5012,28 @@
     </w:p>
     <w:p>
       <w:pPr>
+        <w:pStyle w:val="Compact"/>
+        <w:numPr>
+          <w:ilvl w:val="0"/>
+          <w:numId w:val="1017"/>
+        </w:numPr>
+      </w:pPr>
+      <w:r>
+        <w:rPr>
+          <w:b/>
+          <w:bCs/>
+        </w:rPr>
+        <w:t xml:space="preserve">Kinh nghiệm liên quan Threads (Úc, Malaysia, Meta).</w:t>
+      </w:r>
+      <w:r>
+        <w:t xml:space="preserve"> </w:t>
+      </w:r>
+      <w:r>
+        <w:t xml:space="preserve">Úc đưa Threads vào danh sách nền tảng phải thực hiện quy định cấm tài khoản người dưới 16 tuổi từ tháng 12/2025; Malaysia phối hợp cảnh sát và Meta truy tìm chủ tài khoản phát tán video xúc phạm tôn giáo trên Threads (3/2026); năm 2025, Meta chấm dứt chương trình kiểm chứng thông tin của bên thứ 3 tại Mỹ trên cả Facebook, Instagram và Threads, chuyển sang ghi chú cộng đồng. Đến nay chưa có quốc gia nào công bố kinh nghiệm dùng Threads làm kênh xử lý khủng hoảng kèm đánh giá kết quả.</w:t>
+      </w:r>
+    </w:p>
+    <w:p>
+      <w:pPr>
         <w:pStyle w:val="FirstParagraph"/>
       </w:pPr>
       <w:r>
@@ -6582,7 +6604,7 @@
               <w:rPr>
                 <w:sz w:val="23"/>
               </w:rPr>
-              <w:t xml:space="preserve">Kênh ưu tiên xử lý khủng hoảng trên Threads; áp dụng gắn nhãn tin giả theo Nghị định số 328/2026/NĐ-CP; số liệu xử lý riêng cho Threads trong báo cáo định kỳ</w:t>
+              <w:t xml:space="preserve">Kênh ưu tiên xử lý khủng hoảng trên Threads; áp dụng gắn nhãn tin giả theo Nghị định số 328/2026/NĐ-CP; số liệu xử lý riêng cho Threads trong báo cáo định kỳ; theo dõi thay đổi chính sách kiểm chứng thông tin của Meta (năm 2025, Meta chấm dứt kiểm chứng của bên thứ 3 tại Mỹ)</w:t>
             </w:r>
           </w:p>
         </w:tc>
@@ -6728,6 +6750,136 @@
                 <w:sz w:val="23"/>
               </w:rPr>
               <w:t xml:space="preserve">Các bộ, ngành, địa phương</w:t>
+            </w:r>
+          </w:p>
+        </w:tc>
+        <w:tc>
+          <w:tcPr/>
+          <w:p>
+            <w:pPr>
+              <w:pStyle w:val="Compact"/>
+              <w:jc w:val="left"/>
+            </w:pPr>
+            <w:r>
+              <w:rPr>
+                <w:sz w:val="23"/>
+              </w:rPr>
+              <w:t xml:space="preserve">Áp dụng ngay</w:t>
+            </w:r>
+          </w:p>
+        </w:tc>
+      </w:tr>
+      <w:tr>
+        <w:trPr>
+          <w:cantSplit w:val="true"/>
+        </w:trPr>
+        <w:tc>
+          <w:tcPr/>
+          <w:p>
+            <w:pPr>
+              <w:pStyle w:val="Compact"/>
+              <w:jc w:val="left"/>
+            </w:pPr>
+            <w:r>
+              <w:rPr>
+                <w:sz w:val="23"/>
+              </w:rPr>
+              <w:t xml:space="preserve">6. Danh mục nền tảng mở</w:t>
+            </w:r>
+          </w:p>
+        </w:tc>
+        <w:tc>
+          <w:tcPr/>
+          <w:p>
+            <w:pPr>
+              <w:pStyle w:val="Compact"/>
+              <w:jc w:val="left"/>
+            </w:pPr>
+            <w:r>
+              <w:rPr>
+                <w:sz w:val="23"/>
+              </w:rPr>
+              <w:t xml:space="preserve">Văn bản quản lý dùng danh mục nền tảng cập nhật được, tự động bao gồm nền tảng mới như Threads, thay vì chỉ nêu tên Facebook, YouTube, TikTok (tham khảo Úc)</w:t>
+            </w:r>
+          </w:p>
+        </w:tc>
+        <w:tc>
+          <w:tcPr/>
+          <w:p>
+            <w:pPr>
+              <w:pStyle w:val="Compact"/>
+              <w:jc w:val="left"/>
+            </w:pPr>
+            <w:r>
+              <w:rPr>
+                <w:sz w:val="23"/>
+              </w:rPr>
+              <w:t xml:space="preserve">Bộ VHTTDL</w:t>
+            </w:r>
+          </w:p>
+        </w:tc>
+        <w:tc>
+          <w:tcPr/>
+          <w:p>
+            <w:pPr>
+              <w:pStyle w:val="Compact"/>
+              <w:jc w:val="left"/>
+            </w:pPr>
+            <w:r>
+              <w:rPr>
+                <w:sz w:val="23"/>
+              </w:rPr>
+              <w:t xml:space="preserve">Quý I/2027</w:t>
+            </w:r>
+          </w:p>
+        </w:tc>
+      </w:tr>
+      <w:tr>
+        <w:trPr>
+          <w:cantSplit w:val="true"/>
+        </w:trPr>
+        <w:tc>
+          <w:tcPr/>
+          <w:p>
+            <w:pPr>
+              <w:pStyle w:val="Compact"/>
+              <w:jc w:val="left"/>
+            </w:pPr>
+            <w:r>
+              <w:rPr>
+                <w:sz w:val="23"/>
+              </w:rPr>
+              <w:t xml:space="preserve">7. Phối hợp 3 bên, lưu chứng cứ</w:t>
+            </w:r>
+          </w:p>
+        </w:tc>
+        <w:tc>
+          <w:tcPr/>
+          <w:p>
+            <w:pPr>
+              <w:pStyle w:val="Compact"/>
+              <w:jc w:val="left"/>
+            </w:pPr>
+            <w:r>
+              <w:rPr>
+                <w:sz w:val="23"/>
+              </w:rPr>
+              <w:t xml:space="preserve">Cơ quan quản lý, công an, nền tảng phối hợp xác định chủ tài khoản phát tán nội dung vi phạm; lưu chứng cứ số trước khi gỡ bỏ; cảnh báo công khai cả người chia sẻ lại (tham khảo Malaysia)</w:t>
+            </w:r>
+          </w:p>
+        </w:tc>
+        <w:tc>
+          <w:tcPr/>
+          <w:p>
+            <w:pPr>
+              <w:pStyle w:val="Compact"/>
+              <w:jc w:val="left"/>
+            </w:pPr>
+            <w:r>
+              <w:rPr>
+                <w:sz w:val="23"/>
+              </w:rPr>
+              <w:t xml:space="preserve">Bộ Công an, Bộ VHTTDL</w:t>
             </w:r>
           </w:p>
         </w:tc>
@@ -10350,7 +10502,7 @@
               <w:rPr>
                 <w:sz w:val="23"/>
               </w:rPr>
-              <w:t xml:space="preserve">Bộ công cụ RESIST 2 (6 bước: nhận diện, cảnh báo sớm, nắm tình hình, đánh giá tác động, truyền thông chiến lược, theo dõi hiệu quả); Online Safety Act 2023</w:t>
+              <w:t xml:space="preserve">Bộ công cụ RESIST 3 (công bố 29/10/2025, thay RESIST 2 năm 2021; 6 bước: nhận diện, cảnh báo sớm, nắm tình hình, đánh giá tác động, truyền thông chiến lược, theo dõi hiệu quả); Online Safety Act 2023</w:t>
             </w:r>
           </w:p>
         </w:tc>
@@ -10680,7 +10832,7 @@
           <w:i/>
           <w:iCs/>
         </w:rPr>
-        <w:t xml:space="preserve">Ghi chú: đã đối chiếu văn bản gốc đối với mốc 5 giờ, 24 giờ của Trung Quốc và số liệu nghiên cứu trên Science Advances; các số liệu còn lại tổng hợp qua tìm kiếm, tổ biên tập mở từng nguồn để đối chiếu trước khi sử dụng. Không có tài liệu quốc tế riêng về ứng phó trên Threads.</w:t>
+        <w:t xml:space="preserve">Ghi chú: đã đối chiếu văn bản gốc đối với mốc 5 giờ, 24 giờ của Trung Quốc và số liệu nghiên cứu trên Science Advances; các số liệu còn lại tổng hợp qua tìm kiếm, tổ biên tập mở từng nguồn để đối chiếu trước khi sử dụng. Kinh nghiệm riêng về Threads trình bày tại bảng dưới.</w:t>
       </w:r>
     </w:p>
     <w:p>
@@ -10692,9 +10844,500 @@
           <w:b/>
           <w:bCs/>
         </w:rPr>
-        <w:t xml:space="preserve">Nguồn tham khảo (ưu tiên văn bản gốc, file PDF)</w:t>
-      </w:r>
-    </w:p>
+        <w:t xml:space="preserve">Kinh nghiệm quốc tế liên quan Threads</w:t>
+      </w:r>
+    </w:p>
+    <w:tbl>
+      <w:tblPr>
+        <w:tblStyle w:val="Table"/>
+        <w:tblW w:type="pct" w:w="5000"/>
+        <w:jc w:val="start"/>
+        <w:tblBorders>
+          <w:top w:val="single" w:sz="4" w:space="0" w:color="8A9BB0"/>
+          <w:left w:val="single" w:sz="4" w:space="0" w:color="8A9BB0"/>
+          <w:bottom w:val="single" w:sz="4" w:space="0" w:color="8A9BB0"/>
+          <w:right w:val="single" w:sz="4" w:space="0" w:color="8A9BB0"/>
+          <w:insideH w:val="single" w:sz="4" w:space="0" w:color="8A9BB0"/>
+          <w:insideV w:val="single" w:sz="4" w:space="0" w:color="8A9BB0"/>
+        </w:tblBorders>
+        <w:tblLook w:firstRow="1" w:lastRow="0" w:firstColumn="0" w:lastColumn="0" w:noHBand="0" w:noVBand="0" w:val="0020"/>
+      </w:tblPr>
+      <w:tblGrid>
+        <w:gridCol w:w="1291"/>
+        <w:gridCol w:w="2840"/>
+        <w:gridCol w:w="2324"/>
+        <w:gridCol w:w="1463"/>
+      </w:tblGrid>
+      <w:tr>
+        <w:trPr>
+          <w:tblHeader w:val="true"/>
+          <w:cantSplit w:val="true"/>
+          <w:tblHeader w:val="true"/>
+        </w:trPr>
+        <w:tc>
+          <w:tcPr>
+            <w:shd w:val="clear" w:color="auto" w:fill="DCE6F0"/>
+          </w:tcPr>
+          <w:p>
+            <w:pPr>
+              <w:pStyle w:val="Compact"/>
+              <w:jc w:val="left"/>
+            </w:pPr>
+            <w:r>
+              <w:rPr>
+                <w:b/>
+                <w:sz w:val="23"/>
+              </w:rPr>
+              <w:t xml:space="preserve">Nơi, thời gian</w:t>
+            </w:r>
+          </w:p>
+        </w:tc>
+        <w:tc>
+          <w:tcPr>
+            <w:shd w:val="clear" w:color="auto" w:fill="DCE6F0"/>
+          </w:tcPr>
+          <w:p>
+            <w:pPr>
+              <w:pStyle w:val="Compact"/>
+              <w:jc w:val="left"/>
+            </w:pPr>
+            <w:r>
+              <w:rPr>
+                <w:b/>
+                <w:sz w:val="23"/>
+              </w:rPr>
+              <w:t xml:space="preserve">Kinh nghiệm</w:t>
+            </w:r>
+          </w:p>
+        </w:tc>
+        <w:tc>
+          <w:tcPr>
+            <w:shd w:val="clear" w:color="auto" w:fill="DCE6F0"/>
+          </w:tcPr>
+          <w:p>
+            <w:pPr>
+              <w:pStyle w:val="Compact"/>
+              <w:jc w:val="left"/>
+            </w:pPr>
+            <w:r>
+              <w:rPr>
+                <w:b/>
+                <w:sz w:val="23"/>
+              </w:rPr>
+              <w:t xml:space="preserve">Bài học cho Việt Nam</w:t>
+            </w:r>
+          </w:p>
+        </w:tc>
+        <w:tc>
+          <w:tcPr>
+            <w:shd w:val="clear" w:color="auto" w:fill="DCE6F0"/>
+          </w:tcPr>
+          <w:p>
+            <w:pPr>
+              <w:pStyle w:val="Compact"/>
+              <w:jc w:val="left"/>
+            </w:pPr>
+            <w:r>
+              <w:rPr>
+                <w:b/>
+                <w:sz w:val="23"/>
+              </w:rPr>
+              <w:t xml:space="preserve">Mức kiểm chứng</w:t>
+            </w:r>
+          </w:p>
+        </w:tc>
+      </w:tr>
+      <w:tr>
+        <w:trPr>
+          <w:cantSplit w:val="true"/>
+        </w:trPr>
+        <w:tc>
+          <w:tcPr/>
+          <w:p>
+            <w:pPr>
+              <w:pStyle w:val="Compact"/>
+              <w:jc w:val="left"/>
+            </w:pPr>
+            <w:r>
+              <w:rPr>
+                <w:sz w:val="23"/>
+              </w:rPr>
+              <w:t xml:space="preserve">Úc, 12/2025</w:t>
+            </w:r>
+          </w:p>
+        </w:tc>
+        <w:tc>
+          <w:tcPr/>
+          <w:p>
+            <w:pPr>
+              <w:pStyle w:val="Compact"/>
+              <w:jc w:val="left"/>
+            </w:pPr>
+            <w:r>
+              <w:rPr>
+                <w:sz w:val="23"/>
+              </w:rPr>
+              <w:t xml:space="preserve">Threads nằm trong danh sách nền tảng phải cấm tài khoản người dưới 16 tuổi, cùng Facebook, Instagram, TikTok, X, YouTube; từ 4/12/2025, Threads ngừng cho người dưới 16 tuổi ở Úc dùng tài khoản; luật có hiệu lực 10/12/2025, khoảng 5 triệu tài khoản trên các nền tảng ngừng hoạt động</w:t>
+            </w:r>
+          </w:p>
+        </w:tc>
+        <w:tc>
+          <w:tcPr/>
+          <w:p>
+            <w:pPr>
+              <w:pStyle w:val="Compact"/>
+              <w:jc w:val="left"/>
+            </w:pPr>
+            <w:r>
+              <w:rPr>
+                <w:sz w:val="23"/>
+              </w:rPr>
+              <w:t xml:space="preserve">Văn bản quản lý cần danh mục nền tảng mở, cập nhật được; Việt Nam đến năm 2026 mới đưa Threads vào cơ chế chặn, gỡ</w:t>
+            </w:r>
+          </w:p>
+        </w:tc>
+        <w:tc>
+          <w:tcPr/>
+          <w:p>
+            <w:pPr>
+              <w:pStyle w:val="Compact"/>
+              <w:jc w:val="left"/>
+            </w:pPr>
+            <w:r>
+              <w:rPr>
+                <w:sz w:val="23"/>
+              </w:rPr>
+              <w:t xml:space="preserve">Trung bình: tóm tắt tìm kiếm trích trang của cơ quan Úc; trang gốc không truy cập được</w:t>
+            </w:r>
+          </w:p>
+        </w:tc>
+      </w:tr>
+      <w:tr>
+        <w:trPr>
+          <w:cantSplit w:val="true"/>
+        </w:trPr>
+        <w:tc>
+          <w:tcPr/>
+          <w:p>
+            <w:pPr>
+              <w:pStyle w:val="Compact"/>
+              <w:jc w:val="left"/>
+            </w:pPr>
+            <w:r>
+              <w:rPr>
+                <w:sz w:val="23"/>
+              </w:rPr>
+              <w:t xml:space="preserve">Meta, 1/2025</w:t>
+            </w:r>
+          </w:p>
+        </w:tc>
+        <w:tc>
+          <w:tcPr/>
+          <w:p>
+            <w:pPr>
+              <w:pStyle w:val="Compact"/>
+              <w:jc w:val="left"/>
+            </w:pPr>
+            <w:r>
+              <w:rPr>
+                <w:sz w:val="23"/>
+              </w:rPr>
+              <w:t xml:space="preserve">Meta chấm dứt chương trình kiểm chứng thông tin của bên thứ 3 tại Mỹ, chuyển sang ghi chú cộng đồng trên Facebook, Instagram, Threads; ghi chú cộng đồng không làm giảm mức lan truyền của bài viết</w:t>
+            </w:r>
+          </w:p>
+        </w:tc>
+        <w:tc>
+          <w:tcPr/>
+          <w:p>
+            <w:pPr>
+              <w:pStyle w:val="Compact"/>
+              <w:jc w:val="left"/>
+            </w:pPr>
+            <w:r>
+              <w:rPr>
+                <w:sz w:val="23"/>
+              </w:rPr>
+              <w:t xml:space="preserve">Không thể dựa vào cơ chế kiểm chứng của nền tảng; cần cơ chế gắn nhãn tin giả quốc gia theo Nghị định số 328/2026/NĐ-CP; theo dõi việc Meta áp dụng thay đổi ngoài nước Mỹ</w:t>
+            </w:r>
+          </w:p>
+        </w:tc>
+        <w:tc>
+          <w:tcPr/>
+          <w:p>
+            <w:pPr>
+              <w:pStyle w:val="Compact"/>
+              <w:jc w:val="left"/>
+            </w:pPr>
+            <w:r>
+              <w:rPr>
+                <w:sz w:val="23"/>
+              </w:rPr>
+              <w:t xml:space="preserve">Cao: đã đọc thông báo gốc của Meta</w:t>
+            </w:r>
+          </w:p>
+        </w:tc>
+      </w:tr>
+      <w:tr>
+        <w:trPr>
+          <w:cantSplit w:val="true"/>
+        </w:trPr>
+        <w:tc>
+          <w:tcPr/>
+          <w:p>
+            <w:pPr>
+              <w:pStyle w:val="Compact"/>
+              <w:jc w:val="left"/>
+            </w:pPr>
+            <w:r>
+              <w:rPr>
+                <w:sz w:val="23"/>
+              </w:rPr>
+              <w:t xml:space="preserve">Meta, 2/2024</w:t>
+            </w:r>
+          </w:p>
+        </w:tc>
+        <w:tc>
+          <w:tcPr/>
+          <w:p>
+            <w:pPr>
+              <w:pStyle w:val="Compact"/>
+              <w:jc w:val="left"/>
+            </w:pPr>
+            <w:r>
+              <w:rPr>
+                <w:sz w:val="23"/>
+              </w:rPr>
+              <w:t xml:space="preserve">Meta ngừng chủ động đề xuất nội dung chính trị từ tài khoản người dùng không theo dõi, trên Threads và Instagram</w:t>
+            </w:r>
+          </w:p>
+        </w:tc>
+        <w:tc>
+          <w:tcPr/>
+          <w:p>
+            <w:pPr>
+              <w:pStyle w:val="Compact"/>
+              <w:jc w:val="left"/>
+            </w:pPr>
+            <w:r>
+              <w:rPr>
+                <w:sz w:val="23"/>
+              </w:rPr>
+              <w:t xml:space="preserve">Thuật toán đề xuất quyết định mức lan tỏa; đối thoại với Meta về ưu tiên hiển thị thông tin chính thống khi có khủng hoảng</w:t>
+            </w:r>
+          </w:p>
+        </w:tc>
+        <w:tc>
+          <w:tcPr/>
+          <w:p>
+            <w:pPr>
+              <w:pStyle w:val="Compact"/>
+              <w:jc w:val="left"/>
+            </w:pPr>
+            <w:r>
+              <w:rPr>
+                <w:sz w:val="23"/>
+              </w:rPr>
+              <w:t xml:space="preserve">Trung bình: nhiều báo Mỹ đưa tin thống nhất; chưa xác minh chính sách năm 2025</w:t>
+            </w:r>
+          </w:p>
+        </w:tc>
+      </w:tr>
+      <w:tr>
+        <w:trPr>
+          <w:cantSplit w:val="true"/>
+        </w:trPr>
+        <w:tc>
+          <w:tcPr/>
+          <w:p>
+            <w:pPr>
+              <w:pStyle w:val="Compact"/>
+              <w:jc w:val="left"/>
+            </w:pPr>
+            <w:r>
+              <w:rPr>
+                <w:sz w:val="23"/>
+              </w:rPr>
+              <w:t xml:space="preserve">Malaysia, 11/3/2026</w:t>
+            </w:r>
+          </w:p>
+        </w:tc>
+        <w:tc>
+          <w:tcPr/>
+          <w:p>
+            <w:pPr>
+              <w:pStyle w:val="Compact"/>
+              <w:jc w:val="left"/>
+            </w:pPr>
+            <w:r>
+              <w:rPr>
+                <w:sz w:val="23"/>
+              </w:rPr>
+              <w:t xml:space="preserve">Video xúc phạm tôn giáo lan trên Threads và Facebook; cơ quan quản lý truyền thông (MCMC) phối hợp cảnh sát và Meta xác định chủ tài khoản dù tài khoản đã xóa, lưu giữ tài liệu làm chứng cứ, cảnh báo người chia sẻ lại</w:t>
+            </w:r>
+          </w:p>
+        </w:tc>
+        <w:tc>
+          <w:tcPr/>
+          <w:p>
+            <w:pPr>
+              <w:pStyle w:val="Compact"/>
+              <w:jc w:val="left"/>
+            </w:pPr>
+            <w:r>
+              <w:rPr>
+                <w:sz w:val="23"/>
+              </w:rPr>
+              <w:t xml:space="preserve">Quy trình 3 bên: cơ quan quản lý, công an, nền tảng; lưu chứng cứ số trước khi gỡ</w:t>
+            </w:r>
+          </w:p>
+        </w:tc>
+        <w:tc>
+          <w:tcPr/>
+          <w:p>
+            <w:pPr>
+              <w:pStyle w:val="Compact"/>
+              <w:jc w:val="left"/>
+            </w:pPr>
+            <w:r>
+              <w:rPr>
+                <w:sz w:val="23"/>
+              </w:rPr>
+              <w:t xml:space="preserve">Khá: đã đọc trang theo dõi chính sách Digital Policy Alert; chưa đọc thông cáo gốc của MCMC</w:t>
+            </w:r>
+          </w:p>
+        </w:tc>
+      </w:tr>
+      <w:tr>
+        <w:trPr>
+          <w:cantSplit w:val="true"/>
+        </w:trPr>
+        <w:tc>
+          <w:tcPr/>
+          <w:p>
+            <w:pPr>
+              <w:pStyle w:val="Compact"/>
+              <w:jc w:val="left"/>
+            </w:pPr>
+            <w:r>
+              <w:rPr>
+                <w:sz w:val="23"/>
+              </w:rPr>
+              <w:t xml:space="preserve">Meta, quy trình theo luật sở tại</w:t>
+            </w:r>
+          </w:p>
+        </w:tc>
+        <w:tc>
+          <w:tcPr/>
+          <w:p>
+            <w:pPr>
+              <w:pStyle w:val="Compact"/>
+              <w:jc w:val="left"/>
+            </w:pPr>
+            <w:r>
+              <w:rPr>
+                <w:sz w:val="23"/>
+              </w:rPr>
+              <w:t xml:space="preserve">Khi chính phủ yêu cầu hạn chế nội dung trên Facebook, Instagram hoặc Threads vì vi phạm luật nước đó, Meta chỉ hạn chế hiển thị tại nước đó, xem xét pháp lý trước, có thể từ chối yêu cầu quá rộng, công bố số liệu 6 tháng 1 lần</w:t>
+            </w:r>
+          </w:p>
+        </w:tc>
+        <w:tc>
+          <w:tcPr/>
+          <w:p>
+            <w:pPr>
+              <w:pStyle w:val="Compact"/>
+              <w:jc w:val="left"/>
+            </w:pPr>
+            <w:r>
+              <w:rPr>
+                <w:sz w:val="23"/>
+              </w:rPr>
+              <w:t xml:space="preserve">Nội dung hạn chế tại Việt Nam vẫn hiển thị ở nước ngoài, và Meta sẽ công bố số yêu cầu; cần chủ động công bố căn cứ khi hạn chế hiển thị</w:t>
+            </w:r>
+          </w:p>
+        </w:tc>
+        <w:tc>
+          <w:tcPr/>
+          <w:p>
+            <w:pPr>
+              <w:pStyle w:val="Compact"/>
+              <w:jc w:val="left"/>
+            </w:pPr>
+            <w:r>
+              <w:rPr>
+                <w:sz w:val="23"/>
+              </w:rPr>
+              <w:t xml:space="preserve">Trung bình: tóm tắt tìm kiếm trích trang Meta; trang gốc cần JavaScript nên chưa đọc được</w:t>
+            </w:r>
+          </w:p>
+        </w:tc>
+      </w:tr>
+      <w:tr>
+        <w:trPr>
+          <w:cantSplit w:val="true"/>
+        </w:trPr>
+        <w:tc>
+          <w:tcPr/>
+          <w:p>
+            <w:pPr>
+              <w:pStyle w:val="Compact"/>
+              <w:jc w:val="left"/>
+            </w:pPr>
+            <w:r>
+              <w:rPr>
+                <w:sz w:val="23"/>
+              </w:rPr>
+              <w:t xml:space="preserve">Thổ Nhĩ Kỳ, 18/3/2024</w:t>
+            </w:r>
+          </w:p>
+        </w:tc>
+        <w:tc>
+          <w:tcPr/>
+          <w:p>
+            <w:pPr>
+              <w:pStyle w:val="Compact"/>
+              <w:jc w:val="left"/>
+            </w:pPr>
+            <w:r>
+              <w:rPr>
+                <w:sz w:val="23"/>
+              </w:rPr>
+              <w:t xml:space="preserve">Cơ quan cạnh tranh ra biện pháp tạm thời hạn chế chia sẻ dữ liệu giữa Instagram và Threads</w:t>
+            </w:r>
+          </w:p>
+        </w:tc>
+        <w:tc>
+          <w:tcPr/>
+          <w:p>
+            <w:pPr>
+              <w:pStyle w:val="Compact"/>
+              <w:jc w:val="left"/>
+            </w:pPr>
+            <w:r>
+              <w:rPr>
+                <w:sz w:val="23"/>
+              </w:rPr>
+              <w:t xml:space="preserve">Quản lý Threads còn có các công cụ về dữ liệu, cạnh tranh, không chỉ quản lý nội dung</w:t>
+            </w:r>
+          </w:p>
+        </w:tc>
+        <w:tc>
+          <w:tcPr/>
+          <w:p>
+            <w:pPr>
+              <w:pStyle w:val="Compact"/>
+              <w:jc w:val="left"/>
+            </w:pPr>
+            <w:r>
+              <w:rPr>
+                <w:sz w:val="23"/>
+              </w:rPr>
+              <w:t xml:space="preserve">Cao: đã đọc bản tin gốc của Reuters</w:t>
+            </w:r>
+          </w:p>
+        </w:tc>
+      </w:tr>
+    </w:tbl>
     <w:p>
       <w:pPr>
         <w:pStyle w:val="BodyText"/>
@@ -10704,347 +11347,406 @@
           <w:i/>
           <w:iCs/>
         </w:rPr>
-        <w:t xml:space="preserve">Trung Quốc</w:t>
-      </w:r>
-    </w:p>
-    <w:p>
-      <w:pPr>
-        <w:pStyle w:val="Compact"/>
-        <w:numPr>
-          <w:ilvl w:val="0"/>
-          <w:numId w:val="1033"/>
-        </w:numPr>
-        <w:jc w:val="left"/>
-      </w:pPr>
-      <w:r>
-        <w:t xml:space="preserve">Thông báo của Văn phòng Quốc vụ viện về phản hồi dư luận chính vụ, số 61 năm 2016 (bản gốc tiếng Trung). https://www.gov.cn/zhengce/content/2016-08/12/content_5099138.htm</w:t>
-      </w:r>
-    </w:p>
-    <w:p>
-      <w:pPr>
-        <w:pStyle w:val="Compact"/>
-        <w:numPr>
-          <w:ilvl w:val="0"/>
-          <w:numId w:val="1033"/>
-        </w:numPr>
-        <w:jc w:val="left"/>
-      </w:pPr>
-      <w:r>
-        <w:t xml:space="preserve">Bản dịch tiếng Anh của Thông báo số 61 năm 2016. https://www.chinalawtranslate.com/state-council-notice-on-responses-to-public-opinion-on-government-affairs/</w:t>
-      </w:r>
-    </w:p>
-    <w:p>
-      <w:pPr>
-        <w:pStyle w:val="Compact"/>
-        <w:numPr>
-          <w:ilvl w:val="0"/>
-          <w:numId w:val="1033"/>
-        </w:numPr>
-        <w:jc w:val="left"/>
-      </w:pPr>
-      <w:r>
-        <w:t xml:space="preserve">Chi tiết thực hiện công khai chính vụ, số 80 năm 2016 (mốc 5 giờ, 24 giờ; trang gốc ghi văn bản đã hết hiệu lực). https://www.gov.cn/zhengce/content/2016-11/15/content_5132852.htm</w:t>
-      </w:r>
-    </w:p>
-    <w:p>
-      <w:pPr>
-        <w:pStyle w:val="Compact"/>
-        <w:numPr>
-          <w:ilvl w:val="0"/>
-          <w:numId w:val="1033"/>
-        </w:numPr>
-        <w:jc w:val="left"/>
-      </w:pPr>
-      <w:r>
-        <w:t xml:space="preserve">Nền tảng bác bỏ tin đồn Internet liên hợp. https://www.piyao.org.cn/</w:t>
-      </w:r>
-    </w:p>
-    <w:p>
-      <w:pPr>
-        <w:pStyle w:val="FirstParagraph"/>
-      </w:pPr>
+        <w:t xml:space="preserve">Chưa tìm thấy: trường hợp chính phủ dùng Threads làm kênh xử lý khủng hoảng kèm đánh giá kết quả; nghiên cứu khoa học về tin giả trên Threads trong thảm họa, bầu cử. Tham khảo thêm: năm 2023, Threads chặn một số từ khóa tìm kiếm nhạy cảm như</w:t>
+      </w:r>
       <w:r>
         <w:rPr>
           <w:i/>
           <w:iCs/>
         </w:rPr>
-        <w:t xml:space="preserve">Singapore</w:t>
-      </w:r>
-    </w:p>
-    <w:p>
-      <w:pPr>
-        <w:pStyle w:val="Compact"/>
-        <w:numPr>
-          <w:ilvl w:val="0"/>
-          <w:numId w:val="1034"/>
-        </w:numPr>
-        <w:jc w:val="left"/>
-      </w:pPr>
-      <w:r>
-        <w:t xml:space="preserve">Văn bản Luật POFMA 2019 (Singapore Statutes Online). https://sso.agc.gov.sg/Act/POFMA2019</w:t>
-      </w:r>
-    </w:p>
-    <w:p>
-      <w:pPr>
-        <w:pStyle w:val="Compact"/>
-        <w:numPr>
-          <w:ilvl w:val="0"/>
-          <w:numId w:val="1034"/>
-        </w:numPr>
-        <w:jc w:val="left"/>
-      </w:pPr>
-      <w:r>
-        <w:t xml:space="preserve">Bảng thống kê vụ việc POFMA, cập nhật đến 1/7/2026 (PDF). https://isomer-user-content.by.gov.sg/501/80bbf192-e278-4ab9-93cc-8da479af0819/tabulation_of_pofma_cases_and_actions.pdf</w:t>
-      </w:r>
-    </w:p>
-    <w:p>
-      <w:pPr>
-        <w:pStyle w:val="Compact"/>
-        <w:numPr>
-          <w:ilvl w:val="0"/>
-          <w:numId w:val="1034"/>
-        </w:numPr>
-        <w:jc w:val="left"/>
-      </w:pPr>
-      <w:r>
-        <w:t xml:space="preserve">Thông cáo về Ủy ban An toàn trực tuyến và Đạo luật năm 2025. https://www.mlaw.gov.sg/online-safety-commission-and-online-safety-relief-and-accountability-act-2025-to-start-on-29-june-2026/</w:t>
-      </w:r>
-    </w:p>
-    <w:p>
-      <w:pPr>
-        <w:pStyle w:val="FirstParagraph"/>
-      </w:pPr>
+        <w:t xml:space="preserve"> </w:t>
+      </w:r>
       <w:r>
         <w:rPr>
           <w:i/>
           <w:iCs/>
         </w:rPr>
-        <w:t xml:space="preserve">Liên minh châu Âu</w:t>
-      </w:r>
-    </w:p>
-    <w:p>
-      <w:pPr>
-        <w:pStyle w:val="Compact"/>
-        <w:numPr>
-          <w:ilvl w:val="0"/>
-          <w:numId w:val="1035"/>
-        </w:numPr>
-        <w:jc w:val="left"/>
-      </w:pPr>
-      <w:r>
-        <w:t xml:space="preserve">Văn bản Đạo luật Dịch vụ số, Quy định (EU) 2022/2065 (EUR-Lex). https://eur-lex.europa.eu/eli/reg/2022/2065/oj</w:t>
-      </w:r>
-    </w:p>
-    <w:p>
-      <w:pPr>
-        <w:pStyle w:val="Compact"/>
-        <w:numPr>
-          <w:ilvl w:val="0"/>
-          <w:numId w:val="1035"/>
-        </w:numPr>
-        <w:jc w:val="left"/>
-      </w:pPr>
-      <w:r>
-        <w:t xml:space="preserve">Thông cáo của Ủy ban châu Âu về khoản phạt 120 triệu euro đối với X. https://digital-strategy.ec.europa.eu/en/news/commission-fines-x-eu120-million-under-digital-services-act</w:t>
-      </w:r>
-    </w:p>
-    <w:p>
-      <w:pPr>
-        <w:pStyle w:val="Compact"/>
-        <w:numPr>
-          <w:ilvl w:val="0"/>
-          <w:numId w:val="1035"/>
-        </w:numPr>
-        <w:jc w:val="left"/>
-      </w:pPr>
-      <w:r>
-        <w:t xml:space="preserve">Phân tích cơ chế ứng phó khủng hoảng của Đạo luật Dịch vụ số. https://dsa-observatory.eu/2023/02/21/the-dsas-crisis-approach-crisis-response-mechanism-and-crisis-protocols/</w:t>
-      </w:r>
-    </w:p>
-    <w:p>
-      <w:pPr>
-        <w:pStyle w:val="FirstParagraph"/>
-      </w:pPr>
+        <w:t xml:space="preserve">“</w:t>
+      </w:r>
       <w:r>
         <w:rPr>
           <w:i/>
           <w:iCs/>
         </w:rPr>
-        <w:t xml:space="preserve">Anh</w:t>
-      </w:r>
-    </w:p>
-    <w:p>
-      <w:pPr>
-        <w:pStyle w:val="Compact"/>
-        <w:numPr>
-          <w:ilvl w:val="0"/>
-          <w:numId w:val="1036"/>
-        </w:numPr>
-        <w:jc w:val="left"/>
-      </w:pPr>
-      <w:r>
-        <w:t xml:space="preserve">Bộ công cụ RESIST 2 (PDF). https://gcs.civilservice.gov.uk/wp-content/uploads/2021/11/RESIST-2-counter-disinformation-toolkit.pdf</w:t>
-      </w:r>
-    </w:p>
-    <w:p>
-      <w:pPr>
-        <w:pStyle w:val="Compact"/>
-        <w:numPr>
-          <w:ilvl w:val="0"/>
-          <w:numId w:val="1036"/>
-        </w:numPr>
-        <w:jc w:val="left"/>
-      </w:pPr>
-      <w:r>
-        <w:t xml:space="preserve">Giao thức ứng phó khủng hoảng của Ofcom, 9/6/2026 (trang văn bản và PDF). https://www.ofcom.org.uk/online-safety/illegal-and-harmful-content/statement-crisis-response-protocol ; https://www.ofcom.org.uk/siteassets/resources/documents/online-safety/protecting-children/illegal-harms/crisis-response-protocol-online-safety-additional-safety-measures.pdf</w:t>
-      </w:r>
-    </w:p>
-    <w:p>
-      <w:pPr>
-        <w:pStyle w:val="Compact"/>
-        <w:numPr>
-          <w:ilvl w:val="0"/>
-          <w:numId w:val="1036"/>
-        </w:numPr>
-        <w:jc w:val="left"/>
-      </w:pPr>
-      <w:r>
-        <w:t xml:space="preserve">Ủy ban Nội vụ Hạ viện Anh về bạo loạn năm 2024. https://committees.parliament.uk/committee/83/home-affairs-committee/news/206380/</w:t>
-      </w:r>
-    </w:p>
-    <w:p>
-      <w:pPr>
-        <w:pStyle w:val="FirstParagraph"/>
-      </w:pPr>
+        <w:t xml:space="preserve">covid</w:t>
+      </w:r>
       <w:r>
         <w:rPr>
           <w:i/>
           <w:iCs/>
         </w:rPr>
-        <w:t xml:space="preserve">Nepal</w:t>
-      </w:r>
-    </w:p>
-    <w:p>
-      <w:pPr>
-        <w:pStyle w:val="Compact"/>
-        <w:numPr>
-          <w:ilvl w:val="0"/>
-          <w:numId w:val="1037"/>
-        </w:numPr>
-        <w:jc w:val="left"/>
-      </w:pPr>
-      <w:r>
-        <w:t xml:space="preserve">Diễn biến biểu tình của giới trẻ năm 2025. https://restofworld.org/2025/nepal-gen-z-protest/ ; https://www.cbsnews.com/news/nepal-protests-social-media-ban-prime-minister-oli-resigns/</w:t>
-      </w:r>
-    </w:p>
-    <w:p>
-      <w:pPr>
-        <w:pStyle w:val="FirstParagraph"/>
-      </w:pPr>
+        <w:t xml:space="preserve">”</w:t>
+      </w:r>
       <w:r>
         <w:rPr>
           <w:i/>
           <w:iCs/>
         </w:rPr>
-        <w:t xml:space="preserve">Pháp, Thụy Điển, Phần Lan</w:t>
-      </w:r>
-    </w:p>
-    <w:p>
-      <w:pPr>
-        <w:pStyle w:val="Compact"/>
-        <w:numPr>
-          <w:ilvl w:val="0"/>
-          <w:numId w:val="1038"/>
-        </w:numPr>
-        <w:jc w:val="left"/>
-      </w:pPr>
-      <w:r>
-        <w:t xml:space="preserve">Báo cáo của VIGINUM về Thế vận hội Paris 2024 (PDF). https://www.vie-publique.fr/files/rapport/pdf/295411.pdf</w:t>
-      </w:r>
-    </w:p>
-    <w:p>
-      <w:pPr>
-        <w:pStyle w:val="Compact"/>
-        <w:numPr>
-          <w:ilvl w:val="0"/>
-          <w:numId w:val="1038"/>
-        </w:numPr>
-        <w:jc w:val="left"/>
-      </w:pPr>
-      <w:r>
-        <w:t xml:space="preserve">Tóm tắt của Bộ Ngoại giao Pháp về báo cáo VIGINUM. https://diplomatie.gouv.fr/en/french-foreign-policy/sports-diplomacy/news/article/paris-2024-olympic-and-paralympic-games-report-on-attempted-foreign-digital</w:t>
-      </w:r>
-    </w:p>
-    <w:p>
-      <w:pPr>
-        <w:pStyle w:val="Compact"/>
-        <w:numPr>
-          <w:ilvl w:val="0"/>
-          <w:numId w:val="1038"/>
-        </w:numPr>
-        <w:jc w:val="left"/>
-      </w:pPr>
-      <w:r>
-        <w:t xml:space="preserve">Cơ quan Phòng vệ tâm lý Thụy Điển. https://www.mpf.se/</w:t>
-      </w:r>
-    </w:p>
-    <w:p>
-      <w:pPr>
-        <w:pStyle w:val="Compact"/>
-        <w:numPr>
-          <w:ilvl w:val="0"/>
-          <w:numId w:val="1038"/>
-        </w:numPr>
-        <w:jc w:val="left"/>
-      </w:pPr>
-      <w:r>
-        <w:t xml:space="preserve">Chỉ số năng lực truyền thông châu Âu năm 2023 (PDF). https://osis.bg/wp-content/uploads/2023/06/MLI-report-in-English-22.06.pdf</w:t>
-      </w:r>
-    </w:p>
-    <w:p>
-      <w:pPr>
-        <w:pStyle w:val="FirstParagraph"/>
+        <w:t xml:space="preserve">, các nhà nghiên cứu cảnh báo cách làm này tạo khoảng trống thông tin (báo chí Mỹ, chưa kiểm chứng sâu).</w:t>
+      </w:r>
+    </w:p>
+    <w:p>
+      <w:pPr>
+        <w:pStyle w:val="BodyText"/>
+      </w:pPr>
+      <w:r>
+        <w:rPr>
+          <w:b/>
+          <w:bCs/>
+        </w:rPr>
+        <w:t xml:space="preserve">Nguồn tham khảo (ưu tiên văn bản gốc, file PDF)</w:t>
+      </w:r>
+    </w:p>
+    <w:p>
+      <w:pPr>
+        <w:pStyle w:val="BodyText"/>
       </w:pPr>
       <w:r>
         <w:rPr>
           <w:i/>
           <w:iCs/>
         </w:rPr>
-        <w:t xml:space="preserve">Nghiên cứu</w:t>
-      </w:r>
+        <w:t xml:space="preserve">Trung Quốc</w:t>
+      </w:r>
+    </w:p>
+    <w:p>
+      <w:pPr>
+        <w:pStyle w:val="Compact"/>
+        <w:numPr>
+          <w:ilvl w:val="0"/>
+          <w:numId w:val="1033"/>
+        </w:numPr>
+        <w:jc w:val="left"/>
+      </w:pPr>
+      <w:r>
+        <w:t xml:space="preserve">Thông báo của Văn phòng Quốc vụ viện về phản hồi dư luận chính vụ, số 61 năm 2016 (bản gốc tiếng Trung). https://www.gov.cn/zhengce/content/2016-08/12/content_5099138.htm</w:t>
+      </w:r>
+    </w:p>
+    <w:p>
+      <w:pPr>
+        <w:pStyle w:val="Compact"/>
+        <w:numPr>
+          <w:ilvl w:val="0"/>
+          <w:numId w:val="1033"/>
+        </w:numPr>
+        <w:jc w:val="left"/>
+      </w:pPr>
+      <w:r>
+        <w:t xml:space="preserve">Bản dịch tiếng Anh của Thông báo số 61 năm 2016. https://www.chinalawtranslate.com/state-council-notice-on-responses-to-public-opinion-on-government-affairs/</w:t>
+      </w:r>
+    </w:p>
+    <w:p>
+      <w:pPr>
+        <w:pStyle w:val="Compact"/>
+        <w:numPr>
+          <w:ilvl w:val="0"/>
+          <w:numId w:val="1033"/>
+        </w:numPr>
+        <w:jc w:val="left"/>
+      </w:pPr>
+      <w:r>
+        <w:t xml:space="preserve">Chi tiết thực hiện công khai chính vụ, số 80 năm 2016 (mốc 5 giờ, 24 giờ; trang gốc ghi văn bản đã hết hiệu lực). https://www.gov.cn/zhengce/content/2016-11/15/content_5132852.htm</w:t>
+      </w:r>
+    </w:p>
+    <w:p>
+      <w:pPr>
+        <w:pStyle w:val="Compact"/>
+        <w:numPr>
+          <w:ilvl w:val="0"/>
+          <w:numId w:val="1033"/>
+        </w:numPr>
+        <w:jc w:val="left"/>
+      </w:pPr>
+      <w:r>
+        <w:t xml:space="preserve">Nền tảng bác bỏ tin đồn Internet liên hợp. https://www.piyao.org.cn/</w:t>
+      </w:r>
+    </w:p>
+    <w:p>
+      <w:pPr>
+        <w:pStyle w:val="FirstParagraph"/>
+      </w:pPr>
       <w:r>
         <w:rPr>
           <w:i/>
           <w:iCs/>
         </w:rPr>
-        <w:t xml:space="preserve"> </w:t>
-      </w:r>
+        <w:t xml:space="preserve">Singapore</w:t>
+      </w:r>
+    </w:p>
+    <w:p>
+      <w:pPr>
+        <w:pStyle w:val="Compact"/>
+        <w:numPr>
+          <w:ilvl w:val="0"/>
+          <w:numId w:val="1034"/>
+        </w:numPr>
+        <w:jc w:val="left"/>
+      </w:pPr>
+      <w:r>
+        <w:t xml:space="preserve">Văn bản Luật POFMA 2019 (Singapore Statutes Online). https://sso.agc.gov.sg/Act/POFMA2019</w:t>
+      </w:r>
+    </w:p>
+    <w:p>
+      <w:pPr>
+        <w:pStyle w:val="Compact"/>
+        <w:numPr>
+          <w:ilvl w:val="0"/>
+          <w:numId w:val="1034"/>
+        </w:numPr>
+        <w:jc w:val="left"/>
+      </w:pPr>
+      <w:r>
+        <w:t xml:space="preserve">Bảng thống kê vụ việc POFMA, cập nhật đến 1/7/2026 (PDF). https://isomer-user-content.by.gov.sg/501/80bbf192-e278-4ab9-93cc-8da479af0819/tabulation_of_pofma_cases_and_actions.pdf</w:t>
+      </w:r>
+    </w:p>
+    <w:p>
+      <w:pPr>
+        <w:pStyle w:val="Compact"/>
+        <w:numPr>
+          <w:ilvl w:val="0"/>
+          <w:numId w:val="1034"/>
+        </w:numPr>
+        <w:jc w:val="left"/>
+      </w:pPr>
+      <w:r>
+        <w:t xml:space="preserve">Thông cáo về Ủy ban An toàn trực tuyến và Đạo luật năm 2025. https://www.mlaw.gov.sg/online-safety-commission-and-online-safety-relief-and-accountability-act-2025-to-start-on-29-june-2026/</w:t>
+      </w:r>
+    </w:p>
+    <w:p>
+      <w:pPr>
+        <w:pStyle w:val="FirstParagraph"/>
+      </w:pPr>
       <w:r>
         <w:rPr>
           <w:i/>
           <w:iCs/>
         </w:rPr>
-        <w:t xml:space="preserve">“</w:t>
-      </w:r>
+        <w:t xml:space="preserve">Liên minh châu Âu</w:t>
+      </w:r>
+    </w:p>
+    <w:p>
+      <w:pPr>
+        <w:pStyle w:val="Compact"/>
+        <w:numPr>
+          <w:ilvl w:val="0"/>
+          <w:numId w:val="1035"/>
+        </w:numPr>
+        <w:jc w:val="left"/>
+      </w:pPr>
+      <w:r>
+        <w:t xml:space="preserve">Văn bản Đạo luật Dịch vụ số, Quy định (EU) 2022/2065 (EUR-Lex). https://eur-lex.europa.eu/eli/reg/2022/2065/oj</w:t>
+      </w:r>
+    </w:p>
+    <w:p>
+      <w:pPr>
+        <w:pStyle w:val="Compact"/>
+        <w:numPr>
+          <w:ilvl w:val="0"/>
+          <w:numId w:val="1035"/>
+        </w:numPr>
+        <w:jc w:val="left"/>
+      </w:pPr>
+      <w:r>
+        <w:t xml:space="preserve">Thông cáo của Ủy ban châu Âu về khoản phạt 120 triệu euro đối với X. https://digital-strategy.ec.europa.eu/en/news/commission-fines-x-eu120-million-under-digital-services-act</w:t>
+      </w:r>
+    </w:p>
+    <w:p>
+      <w:pPr>
+        <w:pStyle w:val="Compact"/>
+        <w:numPr>
+          <w:ilvl w:val="0"/>
+          <w:numId w:val="1035"/>
+        </w:numPr>
+        <w:jc w:val="left"/>
+      </w:pPr>
+      <w:r>
+        <w:t xml:space="preserve">Phân tích cơ chế ứng phó khủng hoảng của Đạo luật Dịch vụ số. https://dsa-observatory.eu/2023/02/21/the-dsas-crisis-approach-crisis-response-mechanism-and-crisis-protocols/</w:t>
+      </w:r>
+    </w:p>
+    <w:p>
+      <w:pPr>
+        <w:pStyle w:val="FirstParagraph"/>
+      </w:pPr>
       <w:r>
         <w:rPr>
           <w:i/>
           <w:iCs/>
         </w:rPr>
-        <w:t xml:space="preserve">tiêm chủng thông tin</w:t>
-      </w:r>
+        <w:t xml:space="preserve">Anh</w:t>
+      </w:r>
+    </w:p>
+    <w:p>
+      <w:pPr>
+        <w:pStyle w:val="Compact"/>
+        <w:numPr>
+          <w:ilvl w:val="0"/>
+          <w:numId w:val="1036"/>
+        </w:numPr>
+        <w:jc w:val="left"/>
+      </w:pPr>
+      <w:r>
+        <w:t xml:space="preserve">Bộ công cụ RESIST 3, công bố 29/10/2025 (toàn văn trên trang web). https://www.communications.gov.uk/publications/resist-3-building-resilience-to-information-threats</w:t>
+      </w:r>
+    </w:p>
+    <w:p>
+      <w:pPr>
+        <w:pStyle w:val="Compact"/>
+        <w:numPr>
+          <w:ilvl w:val="0"/>
+          <w:numId w:val="1036"/>
+        </w:numPr>
+        <w:jc w:val="left"/>
+      </w:pPr>
+      <w:r>
+        <w:t xml:space="preserve">Giao thức ứng phó khủng hoảng của Ofcom, 9/6/2026 (trang văn bản và PDF). https://www.ofcom.org.uk/online-safety/illegal-and-harmful-content/statement-crisis-response-protocol ; https://www.ofcom.org.uk/siteassets/resources/documents/online-safety/protecting-children/illegal-harms/crisis-response-protocol-online-safety-additional-safety-measures.pdf</w:t>
+      </w:r>
+    </w:p>
+    <w:p>
+      <w:pPr>
+        <w:pStyle w:val="Compact"/>
+        <w:numPr>
+          <w:ilvl w:val="0"/>
+          <w:numId w:val="1036"/>
+        </w:numPr>
+        <w:jc w:val="left"/>
+      </w:pPr>
+      <w:r>
+        <w:t xml:space="preserve">Ủy ban Nội vụ Hạ viện Anh về bạo loạn năm 2024. https://committees.parliament.uk/committee/83/home-affairs-committee/news/206380/</w:t>
+      </w:r>
+    </w:p>
+    <w:p>
+      <w:pPr>
+        <w:pStyle w:val="FirstParagraph"/>
+      </w:pPr>
       <w:r>
         <w:rPr>
           <w:i/>
           <w:iCs/>
         </w:rPr>
-        <w:t xml:space="preserve">”</w:t>
-      </w:r>
+        <w:t xml:space="preserve">Nepal</w:t>
+      </w:r>
+    </w:p>
+    <w:p>
+      <w:pPr>
+        <w:pStyle w:val="Compact"/>
+        <w:numPr>
+          <w:ilvl w:val="0"/>
+          <w:numId w:val="1037"/>
+        </w:numPr>
+        <w:jc w:val="left"/>
+      </w:pPr>
+      <w:r>
+        <w:t xml:space="preserve">Diễn biến biểu tình của giới trẻ năm 2025. https://restofworld.org/2025/nepal-gen-z-protest/ ; https://www.cbsnews.com/news/nepal-protests-social-media-ban-prime-minister-oli-resigns/</w:t>
+      </w:r>
+    </w:p>
+    <w:p>
+      <w:pPr>
+        <w:pStyle w:val="FirstParagraph"/>
+      </w:pPr>
       <w:r>
         <w:rPr>
           <w:i/>
           <w:iCs/>
         </w:rPr>
+        <w:t xml:space="preserve">Pháp, Thụy Điển, Phần Lan</w:t>
+      </w:r>
+    </w:p>
+    <w:p>
+      <w:pPr>
+        <w:pStyle w:val="Compact"/>
+        <w:numPr>
+          <w:ilvl w:val="0"/>
+          <w:numId w:val="1038"/>
+        </w:numPr>
+        <w:jc w:val="left"/>
+      </w:pPr>
+      <w:r>
+        <w:t xml:space="preserve">Báo cáo của VIGINUM về Thế vận hội Paris 2024 (PDF). https://www.vie-publique.fr/files/rapport/pdf/295411.pdf</w:t>
+      </w:r>
+    </w:p>
+    <w:p>
+      <w:pPr>
+        <w:pStyle w:val="Compact"/>
+        <w:numPr>
+          <w:ilvl w:val="0"/>
+          <w:numId w:val="1038"/>
+        </w:numPr>
+        <w:jc w:val="left"/>
+      </w:pPr>
+      <w:r>
+        <w:t xml:space="preserve">Tóm tắt của Bộ Ngoại giao Pháp về báo cáo VIGINUM. https://diplomatie.gouv.fr/en/french-foreign-policy/sports-diplomacy/news/article/paris-2024-olympic-and-paralympic-games-report-on-attempted-foreign-digital</w:t>
+      </w:r>
+    </w:p>
+    <w:p>
+      <w:pPr>
+        <w:pStyle w:val="Compact"/>
+        <w:numPr>
+          <w:ilvl w:val="0"/>
+          <w:numId w:val="1038"/>
+        </w:numPr>
+        <w:jc w:val="left"/>
+      </w:pPr>
+      <w:r>
+        <w:t xml:space="preserve">Cơ quan Phòng vệ tâm lý Thụy Điển. https://www.mpf.se/</w:t>
+      </w:r>
+    </w:p>
+    <w:p>
+      <w:pPr>
+        <w:pStyle w:val="Compact"/>
+        <w:numPr>
+          <w:ilvl w:val="0"/>
+          <w:numId w:val="1038"/>
+        </w:numPr>
+        <w:jc w:val="left"/>
+      </w:pPr>
+      <w:r>
+        <w:t xml:space="preserve">Chỉ số năng lực truyền thông châu Âu năm 2023 (PDF). https://osis.bg/wp-content/uploads/2023/06/MLI-report-in-English-22.06.pdf</w:t>
+      </w:r>
+    </w:p>
+    <w:p>
+      <w:pPr>
+        <w:pStyle w:val="FirstParagraph"/>
+      </w:pPr>
+      <w:r>
+        <w:rPr>
+          <w:i/>
+          <w:iCs/>
+        </w:rPr>
+        <w:t xml:space="preserve">Nghiên cứu</w:t>
+      </w:r>
+      <w:r>
+        <w:rPr>
+          <w:i/>
+          <w:iCs/>
+        </w:rPr>
+        <w:t xml:space="preserve"> </w:t>
+      </w:r>
+      <w:r>
+        <w:rPr>
+          <w:i/>
+          <w:iCs/>
+        </w:rPr>
+        <w:t xml:space="preserve">“</w:t>
+      </w:r>
+      <w:r>
+        <w:rPr>
+          <w:i/>
+          <w:iCs/>
+        </w:rPr>
+        <w:t xml:space="preserve">tiêm chủng thông tin</w:t>
+      </w:r>
+      <w:r>
+        <w:rPr>
+          <w:i/>
+          <w:iCs/>
+        </w:rPr>
+        <w:t xml:space="preserve">”</w:t>
+      </w:r>
+      <w:r>
+        <w:rPr>
+          <w:i/>
+          <w:iCs/>
+        </w:rPr>
         <w:t xml:space="preserve">, WHO</w:t>
       </w:r>
     </w:p>
@@ -11090,6 +11792,96 @@
       </w:r>
       <w:r>
         <w:t xml:space="preserve">(2021). https://www.who.int/publications/i/item/9789240035287</w:t>
+      </w:r>
+    </w:p>
+    <w:p>
+      <w:pPr>
+        <w:pStyle w:val="FirstParagraph"/>
+      </w:pPr>
+      <w:r>
+        <w:rPr>
+          <w:i/>
+          <w:iCs/>
+        </w:rPr>
+        <w:t xml:space="preserve">Threads</w:t>
+      </w:r>
+    </w:p>
+    <w:p>
+      <w:pPr>
+        <w:pStyle w:val="Compact"/>
+        <w:numPr>
+          <w:ilvl w:val="0"/>
+          <w:numId w:val="1040"/>
+        </w:numPr>
+        <w:jc w:val="left"/>
+      </w:pPr>
+      <w:r>
+        <w:t xml:space="preserve">Thông báo của Meta về chấm dứt kiểm chứng của bên thứ 3 tại Mỹ, 7/1/2025. https://about.fb.com/news/2025/01/meta-more-speech-fewer-mistakes/</w:t>
+      </w:r>
+    </w:p>
+    <w:p>
+      <w:pPr>
+        <w:pStyle w:val="Compact"/>
+        <w:numPr>
+          <w:ilvl w:val="0"/>
+          <w:numId w:val="1040"/>
+        </w:numPr>
+        <w:jc w:val="left"/>
+      </w:pPr>
+      <w:r>
+        <w:t xml:space="preserve">Hướng dẫn về Threads của cơ quan An toàn điện tử Úc. https://www.esafety.gov.au/key-topics/esafety-guide/threads</w:t>
+      </w:r>
+    </w:p>
+    <w:p>
+      <w:pPr>
+        <w:pStyle w:val="Compact"/>
+        <w:numPr>
+          <w:ilvl w:val="0"/>
+          <w:numId w:val="1040"/>
+        </w:numPr>
+        <w:jc w:val="left"/>
+      </w:pPr>
+      <w:r>
+        <w:t xml:space="preserve">Malaysia điều tra nội dung xúc phạm tôn giáo trên Threads và Facebook, 11/3/2026. https://digitalpolicyalert.org/event/38576-malaysian-communications-and-multimedia-commission-initiates-investigation-into-meta-platforms-regarding-content-insulting-islam</w:t>
+      </w:r>
+    </w:p>
+    <w:p>
+      <w:pPr>
+        <w:pStyle w:val="Compact"/>
+        <w:numPr>
+          <w:ilvl w:val="0"/>
+          <w:numId w:val="1040"/>
+        </w:numPr>
+        <w:jc w:val="left"/>
+      </w:pPr>
+      <w:r>
+        <w:t xml:space="preserve">Thổ Nhĩ Kỳ hạn chế chia sẻ dữ liệu giữa Instagram và Threads (Reuters), 18/3/2024. https://www.thestar.com.my/tech/tech-news/2024/03/18/turkey-takes-measure-against-meta-over-threads-instagram-data-sharing</w:t>
+      </w:r>
+    </w:p>
+    <w:p>
+      <w:pPr>
+        <w:pStyle w:val="Compact"/>
+        <w:numPr>
+          <w:ilvl w:val="0"/>
+          <w:numId w:val="1040"/>
+        </w:numPr>
+        <w:jc w:val="left"/>
+      </w:pPr>
+      <w:r>
+        <w:t xml:space="preserve">Meta ngừng đề xuất nội dung chính trị trên Threads (Axios), 9/2/2024. https://www.axios.com/2024/02/09/meta-political-content-moderation-threads</w:t>
+      </w:r>
+    </w:p>
+    <w:p>
+      <w:pPr>
+        <w:pStyle w:val="Compact"/>
+        <w:numPr>
+          <w:ilvl w:val="0"/>
+          <w:numId w:val="1040"/>
+        </w:numPr>
+        <w:jc w:val="left"/>
+      </w:pPr>
+      <w:r>
+        <w:t xml:space="preserve">Quy trình hạn chế nội dung theo luật sở tại của Meta. https://transparency.meta.com/reports/content-restrictions</w:t>
       </w:r>
     </w:p>
     <w:bookmarkEnd w:id="56"/>
@@ -11745,6 +12537,9 @@
     <w:abstractNumId w:val="991"/>
   </w:num>
   <w:num w:numId="1039">
+    <w:abstractNumId w:val="991"/>
+  </w:num>
+  <w:num w:numId="1040">
     <w:abstractNumId w:val="991"/>
   </w:num>
 </w:numbering>

</xml_diff>

<commit_message>
Dự thảo 4: đối chiếu toàn văn 4 tài liệu gốc về Singapore, Anh
- Luật POFMA và bảng thống kê vụ việc POFMA đến 1/7/2026: bổ sung điều khoản, số liệu lệnh cải chính chung, chưa có lệnh ngừng phát tán, vô hiệu hóa
- Báo cáo HC 381: sửa số liệu vụ Southport (1.804 lượt bắt giữ đến 22/1/2025), bỏ chi tiết không có trong nguồn gốc, bổ sung diễn biến tin sai theo giờ
- Quy định của Ofcom 9/6/2026: bổ sung giao thức ứng phó khủng hoảng của nền tảng
- Thêm bài học vào nhóm giải pháp 2, 3, 6; cập nhật nguồn, mức kiểm chứng tại Phụ lục 5, 6

Co-Authored-By: Claude Opus 5.5 <noreply@anthropic.com>
Claude-Session: https://claude.ai/code/session_01NzZ78rAanjcMCsGwt7jxAb
</commit_message>
<xml_diff>
--- a/tham-luan-khung-hoang-truyen-thong/de-cuong-tham-luan-bvhttdl.docx
+++ b/tham-luan-khung-hoang-truyen-thong/de-cuong-tham-luan-bvhttdl.docx
@@ -258,7 +258,7 @@
         <w:pStyle w:val="ThongTinChung"/>
       </w:pPr>
       <w:r>
-        <w:t xml:space="preserve">Dự thảo 3, ngày 28/10/2026. Tài liệu làm việc phục vụ tổ biên tập.</w:t>
+        <w:t xml:space="preserve">Dự thảo 4, ngày 28/10/2026. Tài liệu làm việc phục vụ tổ biên tập.</w:t>
       </w:r>
     </w:p>
     <w:bookmarkStart w:id="20" w:name="tóm-tắt"/>
@@ -322,6 +322,24 @@
       </w:r>
       <w:r>
         <w:t xml:space="preserve">Cập nhật căn cứ pháp lý: Nghị định số 244/2026/NĐ-CP thay thế Nghị định số 09/2017/NĐ-CP về phát ngôn, cùng 7 văn bản bổ sung (Phần II, mục 1); số liệu mới nhất về tiếp nhận tin tức và lừa đảo trực tuyến (Mở đầu, Phần I); kinh nghiệm quốc tế (Phần II, mục 6 và Phụ lục 6), trong đó có 6 kinh nghiệm liên quan Threads, lồng ghép vào nhóm giải pháp 2, 3, 4, 6, 7 và phần ứng phó trên Threads.</w:t>
+      </w:r>
+    </w:p>
+    <w:p>
+      <w:pPr>
+        <w:pStyle w:val="BodyText"/>
+      </w:pPr>
+      <w:r>
+        <w:rPr>
+          <w:b/>
+          <w:bCs/>
+        </w:rPr>
+        <w:t xml:space="preserve">Điểm mới của dự thảo 4.</w:t>
+      </w:r>
+      <w:r>
+        <w:t xml:space="preserve"> </w:t>
+      </w:r>
+      <w:r>
+        <w:t xml:space="preserve">Đối chiếu toàn văn 4 tài liệu gốc về kinh nghiệm Singapore và Anh: Luật POFMA, bảng thống kê vụ việc POFMA đến 1/7/2026, giao thức ứng phó khủng hoảng của Ofcom (9/6/2026), báo cáo HC 381 của Ủy ban Nội vụ Hạ viện Anh (14/4/2025). Sửa số liệu vụ Southport; bỏ 1 chi tiết không có trong nguồn gốc; bổ sung 3 bài học: giao thức ứng phó khủng hoảng của nền tảng, thống nhất nội dung công bố giữa cơ quan tố tụng và người phát ngôn, giám sát nhóm kín và nền tảng nhắn tin (Phần II, mục 6; Phần III, nhóm 2, 3, 6; Phụ lục 6).</w:t>
       </w:r>
     </w:p>
     <w:p>
@@ -4820,7 +4838,7 @@
         <w:t xml:space="preserve"> </w:t>
       </w:r>
       <w:r>
-        <w:t xml:space="preserve">Luật POFMA (2019) buộc người đăng gắn thông báo cải chính vào bài gốc, buộc nền tảng hiển thị cải chính cho người dùng đã xem tin sai; mỗi lệnh kèm bài giải thích công khai. Cách làm này ít gây phản ứng ngược hơn gỡ bài, với điều kiện có tiêu chí công khai, minh bạch.</w:t>
+        <w:t xml:space="preserve">Luật POFMA (hiệu lực từ 2/10/2019) cho phép cơ quan có thẩm quyền yêu cầu người đăng gắn thông báo cải chính cạnh bài gốc mà không buộc xóa bài, kể cả khi người đăng không biết thông tin sai (Điều 11); yêu cầu nền tảng gửi cải chính tới người dùng đã truy cập tin sai (Điều 21). Lệnh chỉ ban hành khi đủ 2 điều kiện: có thông tin sai về sự kiện và việc ban hành vì lợi ích công cộng (Điều 10, 20); người nhận lệnh có quyền khiếu nại ra tòa (Điều 17, 29). Thực tiễn cho thấy Singapore ưu tiên cải chính: đến 1/7/2026, cơ quan chức năng ban hành 146 lệnh cải chính, 39 lệnh cải chính nhắm mục tiêu, 5 lệnh cải chính chung, nhưng chưa ban hành lệnh buộc ngừng phát tán hay lệnh buộc nền tảng vô hiệu hóa nội dung nào.</w:t>
       </w:r>
     </w:p>
     <w:p>
@@ -4842,7 +4860,7 @@
         <w:t xml:space="preserve"> </w:t>
       </w:r>
       <w:r>
-        <w:t xml:space="preserve">Sau vụ tấn công ở Southport (29/7/2024), tin sai về danh tính nghi phạm lan nhanh khi cơ quan chức năng chưa thể công bố thông tin do hạn chế tố tụng, dẫn tới bạo loạn; cảnh sát bắt giữ hơn 1.700 người. Ủy ban Nội vụ Hạ viện Anh kết luận quy định hạn chế công bố đã tạo khoảng trống cho tin sai.</w:t>
+        <w:t xml:space="preserve">Sau vụ tấn công làm 3 bé gái thiệt mạng ở Southport ngày 29/7/2024, cảnh sát không được công bố danh tính nghi phạm vì nghi phạm chưa đủ 18 tuổi. Lúc 16 giờ 49 cùng ngày, 1 bài đăng trên X bịa ra tên nghi phạm và gán thân phận người xin tị nạn; đến trưa 30/7, tin sai đạt 30.000 lượt nhắc từ 18.000 tài khoản trên X. Bạo loạn nổ ra từ tối 30/7, lan ra nhiều thành phố tới 7/8/2024; đến 22/1/2025, cảnh sát thực hiện 1.804 lượt bắt giữ. Ủy ban Nội vụ Hạ viện Anh (báo cáo HC 381, 4/2025) kết luận: chưa thể xác định công bố thêm thông tin có ngăn được bạo loạn hay không, nhưng việc thiếu thông tin đã tạo khoảng trống cho tin sai phát triển; luật và hướng dẫn về công bố thông tin trong tố tụng không còn phù hợp thời đại mạng xã hội; ý kiến không thống nhất giữa cơ quan công tố và cảnh sát về việc công bố tôn giáo của nghi phạm đã cản trở phản ứng của cảnh sát.</w:t>
       </w:r>
     </w:p>
     <w:p>
@@ -4858,13 +4876,13 @@
           <w:b/>
           <w:bCs/>
         </w:rPr>
-        <w:t xml:space="preserve">Nghĩa vụ hệ thống của nền tảng (Liên minh châu Âu).</w:t>
-      </w:r>
-      <w:r>
-        <w:t xml:space="preserve"> </w:t>
-      </w:r>
-      <w:r>
-        <w:t xml:space="preserve">Đạo luật Dịch vụ số buộc nền tảng rất lớn đánh giá, giảm thiểu rủi ro hệ thống, có cơ chế ứng phó khủng hoảng, mức phạt tối đa 6% doanh thu toàn cầu; tháng 12/2025, Ủy ban châu Âu phạt X 120 triệu euro.</w:t>
+        <w:t xml:space="preserve">Nghĩa vụ ứng phó khủng hoảng của nền tảng (Liên minh châu Âu, Anh).</w:t>
+      </w:r>
+      <w:r>
+        <w:t xml:space="preserve"> </w:t>
+      </w:r>
+      <w:r>
+        <w:t xml:space="preserve">Đạo luật Dịch vụ số của Liên minh châu Âu buộc nền tảng rất lớn đánh giá, giảm thiểu rủi ro hệ thống, có cơ chế ứng phó khủng hoảng, mức phạt tối đa 6% doanh thu toàn cầu; tháng 12/2025, Ủy ban châu Âu phạt X 120 triệu euro. Ngày 9/6/2026, cơ quan quản lý truyền thông Anh (Ofcom) quyết định yêu cầu nền tảng quy mô lớn có rủi ro trung bình và nền tảng mọi quy mô có rủi ro cao lập giao thức ứng phó khủng hoảng bằng văn bản, gồm: bộ chỉ số nhận diện khủng hoảng; tổ ứng phó liên chức năng có thẩm quyền quyết định; biện pháp xử lý nội dung; phân tích sau khủng hoảng, lưu hồ sơ, chậm nhất sau 90 ngày. Nền tảng lớn lập kênh liên lạc riêng với cơ quan thực thi pháp luật khi có khủng hoảng. Ofcom không ấn định thời hạn cứng, chỉ yêu cầu kích hoạt sớm nhất có thể trong thực tế, vì chưa đủ bằng chứng cho 1 chuẩn chung; quy định có hiệu lực sau khi Nghị viện thông qua.</w:t>
       </w:r>
     </w:p>
     <w:p>
@@ -5062,7 +5080,7 @@
           <w:i/>
           <w:iCs/>
         </w:rPr>
-        <w:t xml:space="preserve">Kinh nghiệm của Trung Quốc, Singapore, Anh cho thấy: cần lượng hóa thời hạn phản hồi, cải chính hiệu quả hơn chỉ gỡ bỏ, và im lặng vì thủ tục là rủi ro lớn nhất</w:t>
+        <w:t xml:space="preserve">Kinh nghiệm của Trung Quốc, Singapore, Anh cho thấy: cần lượng hóa thời hạn phản hồi, ưu tiên cải chính thay vì chỉ gỡ bỏ, và im lặng vì thủ tục sẽ để lại khoảng trống cho tin sai</w:t>
       </w:r>
       <w:r>
         <w:rPr>
@@ -5384,7 +5402,7 @@
         <w:t xml:space="preserve"> </w:t>
       </w:r>
       <w:r>
-        <w:t xml:space="preserve">đối với vụ việc đang điều tra, xác minh, để không tạo khoảng trống thông tin (bài học từ vụ Southport của Anh năm 2024).</w:t>
+        <w:t xml:space="preserve">đối với vụ việc đang điều tra, xác minh, cùng cơ chế thống nhất nhanh nội dung công bố giữa cơ quan điều tra, viện kiểm sát và người phát ngôn, để không tạo khoảng trống thông tin (bài học từ vụ Southport của Anh năm 2024: ý kiến không thống nhất giữa cơ quan công tố và cảnh sát làm chậm việc công bố).</w:t>
       </w:r>
     </w:p>
     <w:p>
@@ -5520,6 +5538,18 @@
         </w:numPr>
       </w:pPr>
       <w:r>
+        <w:t xml:space="preserve">Kết hợp năng lực giám sát tại chỗ của địa phương với hỗ trợ của trung ương đối với nhóm kín, nền tảng nhắn tin và nguồn phát tán từ nước ngoài; xác minh nhanh tin đồn về tụ tập đông người để tin giả không dẫn tới huy động thật (bài học từ Anh năm 2024: tin đồn trên Telegram về 15 điểm biểu tình, phần lớn bịa đặt, vẫn khiến khoảng 10.000 người tụ tập phản đối tại 1 quận của London).</w:t>
+      </w:r>
+    </w:p>
+    <w:p>
+      <w:pPr>
+        <w:pStyle w:val="Compact"/>
+        <w:numPr>
+          <w:ilvl w:val="0"/>
+          <w:numId w:val="1021"/>
+        </w:numPr>
+      </w:pPr>
+      <w:r>
         <w:t xml:space="preserve">Lập</w:t>
       </w:r>
       <w:r>
@@ -6033,7 +6063,7 @@
         </w:numPr>
       </w:pPr>
       <w:r>
-        <w:t xml:space="preserve">Yêu cầu nền tảng xuyên biên giới thực hiện nghiêm nghĩa vụ: xác thực tài khoản; gỡ bỏ trong thời hạn quy định; cung cấp dữ liệu phục vụ điều tra; thiết lập kênh ưu tiên và giao thức ứng phó khủng hoảng (tham khảo Đạo luật Dịch vụ số của Liên minh châu Âu); báo cáo minh bạch định kỳ.</w:t>
+        <w:t xml:space="preserve">Yêu cầu nền tảng xuyên biên giới thực hiện nghiêm nghĩa vụ: xác thực tài khoản; gỡ bỏ trong thời hạn quy định; cung cấp dữ liệu phục vụ điều tra; thiết lập kênh ưu tiên và giao thức ứng phó khủng hoảng gồm bộ chỉ số nhận diện, tổ ứng phó, kênh liên lạc riêng với cơ quan chức năng, phân tích sau khủng hoảng (tham khảo Đạo luật Dịch vụ số của Liên minh châu Âu và quy định của Ofcom, Anh, năm 2026); báo cáo minh bạch định kỳ.</w:t>
       </w:r>
     </w:p>
     <w:p>
@@ -10146,7 +10176,7 @@
               <w:rPr>
                 <w:sz w:val="23"/>
               </w:rPr>
-              <w:t xml:space="preserve">Đối chiếu số liệu, nguồn kinh nghiệm quốc tế tại Phụ lục 6 (hiện tổng hợp qua tìm kiếm, chưa đọc trực tiếp văn bản gốc)</w:t>
+              <w:t xml:space="preserve">Đối chiếu số liệu, nguồn kinh nghiệm quốc tế tại Phụ lục 6 (đã đối chiếu văn bản gốc phần Singapore, Anh, mốc giờ của Trung Quốc và nghiên cứu Science Advances; phần Liên minh châu Âu, Nepal, Pháp, Thụy Điển, Phần Lan, Threads còn tổng hợp qua tìm kiếm)</w:t>
             </w:r>
           </w:p>
         </w:tc>
@@ -10372,37 +10402,37 @@
               <w:rPr>
                 <w:sz w:val="23"/>
               </w:rPr>
-              <w:t xml:space="preserve">Luật POFMA (10/2019): lệnh cải chính đính kèm bài gốc, lệnh cải chính nhắm mục tiêu qua nền tảng, trang giải thích Factually; kênh WhatsApp Gov.sg; Ủy ban An toàn trực tuyến hoạt động từ 29/6/2026</w:t>
-            </w:r>
-          </w:p>
-        </w:tc>
-        <w:tc>
-          <w:tcPr/>
-          <w:p>
-            <w:pPr>
-              <w:pStyle w:val="Compact"/>
-              <w:jc w:val="left"/>
-            </w:pPr>
-            <w:r>
-              <w:rPr>
-                <w:sz w:val="23"/>
-              </w:rPr>
-              <w:t xml:space="preserve">Đến 1/7/2026: 92 vụ, 146 lệnh cải chính, 39 lệnh cải chính nhắm mục tiêu, 5 lệnh chặn truy cập; kênh WhatsApp Gov.sg tăng từ khoảng 7.000 lên hơn 900.000 thuê bao trong 10 tuần đầu dịch COVID-19</w:t>
-            </w:r>
-          </w:p>
-        </w:tc>
-        <w:tc>
-          <w:tcPr/>
-          <w:p>
-            <w:pPr>
-              <w:pStyle w:val="Compact"/>
-              <w:jc w:val="left"/>
-            </w:pPr>
-            <w:r>
-              <w:rPr>
-                <w:sz w:val="23"/>
-              </w:rPr>
-              <w:t xml:space="preserve">Cao: chi phí thấp, ít phản ứng ngược; cần tiêu chí công khai</w:t>
+              <w:t xml:space="preserve">Luật POFMA (hiệu lực 2/10/2019): lệnh cải chính gắn cạnh bài gốc, không buộc xóa bài (Điều 11); lệnh cải chính nhắm mục tiêu buộc nền tảng gửi cải chính tới người dùng đã truy cập tin sai (Điều 21); lệnh cải chính chung qua nền tảng, báo in, phát thanh, truyền hình (Điều 23); điều kiện ban hành: thông tin sai về sự kiện và vì lợi ích công cộng; quyền khiếu nại ra tòa; cá nhân cố ý phát tán tin sai gây hại chịu mức phạt tới 50.000 SGD hoặc 5 năm tù, tới 100.000 SGD hoặc 10 năm tù nếu dùng tài khoản giả, bot (Điều 7); trang giải thích Factually; kênh WhatsApp Gov.sg; Ủy ban An toàn trực tuyến hoạt động từ 29/6/2026</w:t>
+            </w:r>
+          </w:p>
+        </w:tc>
+        <w:tc>
+          <w:tcPr/>
+          <w:p>
+            <w:pPr>
+              <w:pStyle w:val="Compact"/>
+              <w:jc w:val="left"/>
+            </w:pPr>
+            <w:r>
+              <w:rPr>
+                <w:sz w:val="23"/>
+              </w:rPr>
+              <w:t xml:space="preserve">Đến 1/7/2026: 92 vụ; 146 lệnh cải chính, 39 lệnh cải chính nhắm mục tiêu, 5 lệnh cải chính chung; chưa có lệnh ngừng phát tán, lệnh vô hiệu hóa nội dung nào; 5 lệnh chặn truy cập, 3 lệnh vô hiệu hóa truy cập địa chỉ vi phạm; cơ quan chức năng công bố 27 địa chỉ trực tuyến vi phạm do đăng từ 3 tin sai trở lên trong 6 tháng (16 địa chỉ đã hết thời hạn); từ 2020 đến quý I/2023, 21 trong 38 vụ liên quan COVID-19 (đã đối chiếu luật và bảng thống kê gốc). Kênh WhatsApp Gov.sg tăng từ khoảng 7.000 lên hơn 900.000 thuê bao trong 10 tuần đầu dịch COVID-19 (chưa đối chiếu)</w:t>
+            </w:r>
+          </w:p>
+        </w:tc>
+        <w:tc>
+          <w:tcPr/>
+          <w:p>
+            <w:pPr>
+              <w:pStyle w:val="Compact"/>
+              <w:jc w:val="left"/>
+            </w:pPr>
+            <w:r>
+              <w:rPr>
+                <w:sz w:val="23"/>
+              </w:rPr>
+              <w:t xml:space="preserve">Cao: ưu tiên cải chính, ít dùng gỡ bỏ; điều kiện ban hành do luật định, có cơ chế khiếu nại</w:t>
             </w:r>
           </w:p>
         </w:tc>
@@ -10502,22 +10532,52 @@
               <w:rPr>
                 <w:sz w:val="23"/>
               </w:rPr>
-              <w:t xml:space="preserve">Bộ công cụ RESIST 3 (công bố 29/10/2025, thay RESIST 2 năm 2021; 6 bước: nhận diện, cảnh báo sớm, nắm tình hình, đánh giá tác động, truyền thông chiến lược, theo dõi hiệu quả); Online Safety Act 2023</w:t>
-            </w:r>
-          </w:p>
-        </w:tc>
-        <w:tc>
-          <w:tcPr/>
-          <w:p>
-            <w:pPr>
-              <w:pStyle w:val="Compact"/>
-              <w:jc w:val="left"/>
-            </w:pPr>
-            <w:r>
-              <w:rPr>
-                <w:sz w:val="23"/>
-              </w:rPr>
-              <w:t xml:space="preserve">Vụ Southport (29/7/2024): tin sai về danh tính nghi phạm xuất hiện ngay trong ngày, bạo loạn từ 30/7; cảnh sát bắt giữ hơn 1.700 người (đến 12/2024); có bị cáo nhận án tù chỉ 1 ngày sau bài đăng kích động; Ủy ban Nội vụ Hạ viện (4/2025) kết luận hạn chế công bố đã tạo khoảng trống thông tin</w:t>
+              <w:t xml:space="preserve">Bộ công cụ RESIST 3 (công bố 29/10/2025, thay RESIST 2 năm 2021; 6 bước: nhận diện, cảnh báo sớm, nắm tình hình, đánh giá tác động, truyền thông chiến lược, theo dõi hiệu quả); Online Safety Act 2023; quy định của Ofcom về giao thức ứng phó khủng hoảng (9/6/2026): khủng hoảng là</w:t>
+            </w:r>
+            <w:r>
+              <w:rPr>
+                <w:sz w:val="23"/>
+              </w:rPr>
+              <w:t xml:space="preserve"> </w:t>
+            </w:r>
+            <w:r>
+              <w:rPr>
+                <w:sz w:val="23"/>
+              </w:rPr>
+              <w:t xml:space="preserve">“</w:t>
+            </w:r>
+            <w:r>
+              <w:rPr>
+                <w:sz w:val="23"/>
+              </w:rPr>
+              <w:t xml:space="preserve">tình huống bất thường đe dọa nghiêm trọng an toàn công cộng tại Anh</w:t>
+            </w:r>
+            <w:r>
+              <w:rPr>
+                <w:sz w:val="23"/>
+              </w:rPr>
+              <w:t xml:space="preserve">”</w:t>
+            </w:r>
+            <w:r>
+              <w:rPr>
+                <w:sz w:val="23"/>
+              </w:rPr>
+              <w:t xml:space="preserve">; nền tảng quy mô lớn có rủi ro trung bình và nền tảng mọi quy mô có rủi ro cao lập giao thức bằng văn bản (chỉ số nhận diện từ cơ quan thực thi pháp luật, báo chí, tổ chức chuyên môn, số khiếu nại tăng đột biến; tổ ứng phó; biện pháp xử lý), phân tích sau khủng hoảng chậm nhất sau 90 ngày; nền tảng lớn lập kênh liên lạc riêng với cơ quan thực thi pháp luật; có hiệu lực sau khi Nghị viện thông qua</w:t>
+            </w:r>
+          </w:p>
+        </w:tc>
+        <w:tc>
+          <w:tcPr/>
+          <w:p>
+            <w:pPr>
+              <w:pStyle w:val="Compact"/>
+              <w:jc w:val="left"/>
+            </w:pPr>
+            <w:r>
+              <w:rPr>
+                <w:sz w:val="23"/>
+              </w:rPr>
+              <w:t xml:space="preserve">Vụ Southport (29/7/2024): lúc 16 giờ 49 cùng ngày, bài đăng trên X bịa tên nghi phạm; đến trưa 30/7 có 30.000 lượt nhắc từ 18.000 tài khoản; cảnh sát bác tin sai lúc 12 giờ 12 ngày 30/7 nhưng vẫn chưa được công bố danh tính thật; bạo loạn từ 30/7 đến 7/8/2024, 246 sự kiện, trong đó 88 sự kiện nghiêm trọng; đến 22/1/2025: 1.804 lượt bắt giữ, 1.072 lượt khởi tố; ít nhất 302 cảnh sát bị thương; cơ quan công tố tăng cường hơn 100 công tố viên để khởi tố trong 24 giờ, 3 người nhận án tù trong 8 ngày. Ofcom ước tính chi phí soạn giao thức của nền tảng lớn từ 4.600 đến 10.900 bảng Anh (đã đối chiếu báo cáo HC 381 và văn bản Ofcom)</w:t>
             </w:r>
           </w:p>
         </w:tc>
@@ -10557,6 +10617,12 @@
                 <w:sz w:val="23"/>
               </w:rPr>
               <w:t xml:space="preserve">”</w:t>
+            </w:r>
+            <w:r>
+              <w:rPr>
+                <w:sz w:val="23"/>
+              </w:rPr>
+              <w:t xml:space="preserve">; Ofcom không ấn định thời hạn cứng, cho thấy mốc 3, 6, 24 giờ của đề cương cần kèm đánh giá sau áp dụng</w:t>
             </w:r>
           </w:p>
         </w:tc>
@@ -10832,7 +10898,7 @@
           <w:i/>
           <w:iCs/>
         </w:rPr>
-        <w:t xml:space="preserve">Ghi chú: đã đối chiếu văn bản gốc đối với mốc 5 giờ, 24 giờ của Trung Quốc và số liệu nghiên cứu trên Science Advances; các số liệu còn lại tổng hợp qua tìm kiếm, tổ biên tập mở từng nguồn để đối chiếu trước khi sử dụng. Kinh nghiệm riêng về Threads trình bày tại bảng dưới.</w:t>
+        <w:t xml:space="preserve">Ghi chú: đã đối chiếu văn bản gốc đối với mốc 5 giờ, 24 giờ của Trung Quốc; số liệu nghiên cứu trên Science Advances; Luật POFMA và bảng thống kê vụ việc POFMA của Singapore; báo cáo HC 381 và quy định của Ofcom (Anh). Bản PDF của 4 tài liệu Singapore, Anh lưu tại thư mục tai-lieu cùng đề cương. Các số liệu còn lại tổng hợp qua tìm kiếm, tổ biên tập mở từng nguồn để đối chiếu trước khi sử dụng. Kinh nghiệm riêng về Threads trình bày tại bảng dưới.</w:t>
       </w:r>
     </w:p>
     <w:p>
@@ -11483,7 +11549,7 @@
         <w:jc w:val="left"/>
       </w:pPr>
       <w:r>
-        <w:t xml:space="preserve">Văn bản Luật POFMA 2019 (Singapore Statutes Online). https://sso.agc.gov.sg/Act/POFMA2019</w:t>
+        <w:t xml:space="preserve">Văn bản Luật POFMA 2019 (Singapore Statutes Online; đã đọc toàn văn bản PDF hợp nhất năm 2020, cập nhật sửa đổi đến 1/12/2021; tổ biên tập kiểm tra sửa đổi sau thời điểm này). https://sso.agc.gov.sg/Act/POFMA2019</w:t>
       </w:r>
     </w:p>
     <w:p>
@@ -11496,7 +11562,7 @@
         <w:jc w:val="left"/>
       </w:pPr>
       <w:r>
-        <w:t xml:space="preserve">Bảng thống kê vụ việc POFMA, cập nhật đến 1/7/2026 (PDF). https://isomer-user-content.by.gov.sg/501/80bbf192-e278-4ab9-93cc-8da479af0819/tabulation_of_pofma_cases_and_actions.pdf</w:t>
+        <w:t xml:space="preserve">Bảng thống kê vụ việc POFMA, cập nhật đến 1/7/2026 (PDF, đã đọc toàn văn). https://isomer-user-content.by.gov.sg/501/80bbf192-e278-4ab9-93cc-8da479af0819/tabulation_of_pofma_cases_and_actions.pdf</w:t>
       </w:r>
     </w:p>
     <w:p>
@@ -11598,7 +11664,7 @@
         <w:jc w:val="left"/>
       </w:pPr>
       <w:r>
-        <w:t xml:space="preserve">Giao thức ứng phó khủng hoảng của Ofcom, 9/6/2026 (trang văn bản và PDF). https://www.ofcom.org.uk/online-safety/illegal-and-harmful-content/statement-crisis-response-protocol ; https://www.ofcom.org.uk/siteassets/resources/documents/online-safety/protecting-children/illegal-harms/crisis-response-protocol-online-safety-additional-safety-measures.pdf</w:t>
+        <w:t xml:space="preserve">Quy định của Ofcom về giao thức ứng phó khủng hoảng, 9/6/2026 (trang văn bản và PDF; đã đọc toàn văn bản PDF). https://www.ofcom.org.uk/online-safety/illegal-and-harmful-content/statement-crisis-response-protocol ; https://www.ofcom.org.uk/siteassets/resources/documents/online-safety/protecting-children/illegal-harms/crisis-response-protocol-online-safety-additional-safety-measures.pdf</w:t>
       </w:r>
     </w:p>
     <w:p>
@@ -11611,7 +11677,22 @@
         <w:jc w:val="left"/>
       </w:pPr>
       <w:r>
-        <w:t xml:space="preserve">Ủy ban Nội vụ Hạ viện Anh về bạo loạn năm 2024. https://committees.parliament.uk/committee/83/home-affairs-committee/news/206380/</w:t>
+        <w:t xml:space="preserve">Ủy ban Nội vụ Hạ viện Anh, báo cáo HC 381</w:t>
+      </w:r>
+      <w:r>
+        <w:t xml:space="preserve"> </w:t>
+      </w:r>
+      <w:r>
+        <w:t xml:space="preserve">“</w:t>
+      </w:r>
+      <w:r>
+        <w:t xml:space="preserve">Police response to the 2024 summer disorder</w:t>
+      </w:r>
+      <w:r>
+        <w:t xml:space="preserve">”</w:t>
+      </w:r>
+      <w:r>
+        <w:t xml:space="preserve">, công bố 14/4/2025 (tin công bố và PDF; đã đọc toàn văn bản PDF). https://committees.parliament.uk/committee/83/home-affairs-committee/news/206380/ ; https://committees.parliament.uk/publications/47476/documents/246718/default/</w:t>
       </w:r>
     </w:p>
     <w:p>

</xml_diff>

<commit_message>
Dự thảo 5: đối chiếu Đạo luật Dịch vụ số, trang eSafety, bài Mekong Eye và Dân Việt
- Đạo luật Dịch vụ số: bổ sung nội dung Điều 33, 34, 36, 48, 74 từ văn bản gốc
- eSafety: xác nhận mốc 4/12/2025, 10/12/2025 của Threads tại Úc, nâng mức kiểm chứng
- Dân Việt: sửa số liệu lừa đảo trực tuyến năm 2025 (4.200 vụ việc, khoảng 8.000 tỷ đồng); thêm chiến dịch “Tin AI?”
- Mekong Eye: cập nhật vụ Làng Vân, Safari Ba Vì (chưa có nguồn trong nước xác nhận việc phê duyệt ngày 9/10), phản ứng của người dùng khi nền tảng gỡ bài, số liệu Meta
- Luật An ninh mạng năm 2025: thời hạn không quá 6 giờ với tình huống khẩn cấp liên quan an ninh quốc gia

Co-Authored-By: Claude Opus 5.5 <noreply@anthropic.com>
Claude-Session: https://claude.ai/code/session_01NzZ78rAanjcMCsGwt7jxAb
</commit_message>
<xml_diff>
--- a/tham-luan-khung-hoang-truyen-thong/de-cuong-tham-luan-bvhttdl.docx
+++ b/tham-luan-khung-hoang-truyen-thong/de-cuong-tham-luan-bvhttdl.docx
@@ -258,7 +258,7 @@
         <w:pStyle w:val="ThongTinChung"/>
       </w:pPr>
       <w:r>
-        <w:t xml:space="preserve">Dự thảo 4, ngày 28/10/2026. Tài liệu làm việc phục vụ tổ biên tập.</w:t>
+        <w:t xml:space="preserve">Dự thảo 5, ngày 28/10/2026. Tài liệu làm việc phục vụ tổ biên tập.</w:t>
       </w:r>
     </w:p>
     <w:bookmarkStart w:id="20" w:name="tóm-tắt"/>
@@ -340,6 +340,24 @@
       </w:r>
       <w:r>
         <w:t xml:space="preserve">Đối chiếu toàn văn 4 tài liệu gốc về kinh nghiệm Singapore và Anh: Luật POFMA, bảng thống kê vụ việc POFMA đến 1/7/2026, giao thức ứng phó khủng hoảng của Ofcom (9/6/2026), báo cáo HC 381 của Ủy ban Nội vụ Hạ viện Anh (14/4/2025). Sửa số liệu vụ Southport; bỏ 1 chi tiết không có trong nguồn gốc; bổ sung 3 bài học: giao thức ứng phó khủng hoảng của nền tảng, thống nhất nội dung công bố giữa cơ quan tố tụng và người phát ngôn, giám sát nhóm kín và nền tảng nhắn tin (Phần II, mục 6; Phần III, nhóm 2, 3, 6; Phụ lục 6).</w:t>
+      </w:r>
+    </w:p>
+    <w:p>
+      <w:pPr>
+        <w:pStyle w:val="BodyText"/>
+      </w:pPr>
+      <w:r>
+        <w:rPr>
+          <w:b/>
+          <w:bCs/>
+        </w:rPr>
+        <w:t xml:space="preserve">Điểm mới của dự thảo 5.</w:t>
+      </w:r>
+      <w:r>
+        <w:t xml:space="preserve"> </w:t>
+      </w:r>
+      <w:r>
+        <w:t xml:space="preserve">Đối chiếu toàn văn Đạo luật Dịch vụ số của Liên minh châu Âu (Điều 33, 34, 36, 48, 74), trang hướng dẫn về Threads của cơ quan An toàn điện tử Úc, bài của Mekong Eye (26/10/2026) và Dân Việt (17/10/2026). Sửa số liệu lừa đảo trực tuyến năm 2025; bổ sung thời hạn 6 giờ theo Luật An ninh mạng năm 2025; cập nhật diễn biến vụ Làng Vân, Safari Ba Vì và phản ứng của người dùng Threads khi nền tảng gỡ bài (Phần I, Phần II, Phụ lục 5, 6).</w:t>
       </w:r>
     </w:p>
     <w:p>
@@ -1607,7 +1625,7 @@
         <w:t xml:space="preserve"> </w:t>
       </w:r>
       <w:r>
-        <w:t xml:space="preserve">AI tạo sinh giúp làm giả hình ảnh, giọng nói lãnh đạo, mạo danh cơ quan báo chí, cơ quan nhà nước với chi phí rất thấp. Năm 2025, Bộ Công an phát hiện hơn 4.200 vụ lừa đảo trực tuyến, thiệt hại hơn 8.000 tỷ đồng; 9 tháng đầu năm 2026 ghi nhận thêm 1.800 vụ việc; nhiều vụ dùng video deepfake mạo danh cán bộ công an, kiểm sát viên.</w:t>
+        <w:t xml:space="preserve">AI tạo sinh giúp làm giả hình ảnh, giọng nói lãnh đạo, mạo danh cơ quan báo chí, cơ quan nhà nước với chi phí rất thấp. Theo thống kê của Bộ Công an, năm 2025 toàn quốc xảy ra 4.200 vụ việc lừa đảo trực tuyến, thiệt hại khoảng 8.000 tỷ đồng; 9 tháng đầu năm 2026 ghi nhận thêm 1.800 vụ việc; nhiều vụ dùng video deepfake mạo danh cán bộ công an, kiểm sát viên.</w:t>
       </w:r>
     </w:p>
     <w:p>
@@ -3203,7 +3221,7 @@
         <w:t xml:space="preserve">”</w:t>
       </w:r>
       <w:r>
-        <w:t xml:space="preserve">.</w:t>
+        <w:t xml:space="preserve">. Theo Mekong Eye (26/10/2026), làn sóng phản đối dự án ven đèo Hải Vân hình thành tự phát, không có tổ chức nào đứng ra điều phối; người dùng tự tra cứu báo cáo đánh giá tác động môi trường của dự án. Vì vậy, cần tách bạch rõ người dân bày tỏ quan điểm chính đáng với đối tượng lợi dụng.</w:t>
       </w:r>
     </w:p>
     <w:p>
@@ -3225,7 +3243,7 @@
         <w:t xml:space="preserve"> </w:t>
       </w:r>
       <w:r>
-        <w:t xml:space="preserve">Người dùng Threads thường chia sẻ lại thông báo nền tảng hạn chế hiển thị bài viết; nếu thiếu thông tin giải thích đi kèm, biện pháp kỹ thuật dễ làm vụ việc lan rộng hơn và giảm niềm tin.</w:t>
+        <w:t xml:space="preserve">Người dùng Threads thường chia sẻ lại thông báo nền tảng hạn chế hiển thị bài viết; nếu thiếu thông tin giải thích đi kèm, biện pháp kỹ thuật dễ làm vụ việc lan rộng hơn và giảm niềm tin. Mekong Eye (26/10/2026) ghi nhận: người dùng phản ánh nền tảng gỡ bài phản đối dự án ven đèo Hải Vân với lý do vi phạm bản quyền dù người đăng tự tạo nội dung, có bài biến mất vài phút sau khi đăng; việc gỡ bài làm tăng bức xúc, người dùng chia sẻ cách giữ bài lâu hơn, phát động thử thách đăng bài liên tục 1.000 ngày; nền tảng khôi phục một số bài sau khi người dùng khiếu nại.</w:t>
       </w:r>
     </w:p>
     <w:p>
@@ -3335,7 +3353,7 @@
         </w:numPr>
       </w:pPr>
       <w:r>
-        <w:t xml:space="preserve">Luật An ninh mạng số 116/2025/QH15 (hiệu lực từ 1/7/2026): nghiêm cấm bịa đặt, lan truyền thông tin sai sự thật; doanh nghiệp viễn thông, Internet, mạng xã hội xử lý thông tin vi phạm tối đa 24 giờ kể từ khi nhận yêu cầu hợp pháp, thời hạn ngắn hơn trong trường hợp khẩn cấp.</w:t>
+        <w:t xml:space="preserve">Luật An ninh mạng số 116/2025/QH15 (hiệu lực từ 1/7/2026): nghiêm cấm bịa đặt, lan truyền thông tin sai sự thật; doanh nghiệp viễn thông, Internet, mạng xã hội xử lý thông tin vi phạm tối đa 24 giờ kể từ khi nhận yêu cầu hợp pháp, không quá 6 giờ đối với tình huống khẩn cấp liên quan an ninh quốc gia.</w:t>
       </w:r>
     </w:p>
     <w:p>
@@ -3690,6 +3708,51 @@
       </w:r>
       <w:r>
         <w:t xml:space="preserve">.</w:t>
+      </w:r>
+    </w:p>
+    <w:p>
+      <w:pPr>
+        <w:pStyle w:val="Compact"/>
+        <w:numPr>
+          <w:ilvl w:val="0"/>
+          <w:numId w:val="1012"/>
+        </w:numPr>
+      </w:pPr>
+      <w:r>
+        <w:t xml:space="preserve">Bộ Công an phối hợp Đài Truyền hình Việt Nam triển khai chiến dịch truyền thông</w:t>
+      </w:r>
+      <w:r>
+        <w:t xml:space="preserve"> </w:t>
+      </w:r>
+      <w:r>
+        <w:t xml:space="preserve">“</w:t>
+      </w:r>
+      <w:r>
+        <w:t xml:space="preserve">Tin AI?</w:t>
+      </w:r>
+      <w:r>
+        <w:t xml:space="preserve">”</w:t>
+      </w:r>
+      <w:r>
+        <w:t xml:space="preserve"> </w:t>
+      </w:r>
+      <w:r>
+        <w:t xml:space="preserve">và bản tin</w:t>
+      </w:r>
+      <w:r>
+        <w:t xml:space="preserve"> </w:t>
+      </w:r>
+      <w:r>
+        <w:t xml:space="preserve">“</w:t>
+      </w:r>
+      <w:r>
+        <w:t xml:space="preserve">Thật giả - Kiểm chứng</w:t>
+      </w:r>
+      <w:r>
+        <w:t xml:space="preserve">”</w:t>
+      </w:r>
+      <w:r>
+        <w:t xml:space="preserve">, nâng cao kỹ năng kiểm chứng thông tin, phòng chống tin giả; theo Bộ Công an, tội phạm lừa đảo chiếm đoạt tài sản trên không gian mạng giảm khoảng 30% so với năm 2024 (Dân Việt, 17/10/2026).</w:t>
       </w:r>
     </w:p>
     <w:p>
@@ -3960,7 +4023,7 @@
               <w:rPr>
                 <w:sz w:val="23"/>
               </w:rPr>
-              <w:t xml:space="preserve">Bài đăng trên Threads so sánh hình ảnh trước và sau san lấp mặt bằng dự án (khởi công tháng 6/2025, quy mô khoảng 512 ha, vốn gần 44.000 tỷ đồng) tạo làn sóng lo ngại về cảnh quan, sinh thái, giá trị lịch sử, văn hóa; một số cơ quan truyền thông nước ngoài khai thác, đưa tin dồn dập</w:t>
+              <w:t xml:space="preserve">Bài đăng trên Threads so sánh hình ảnh trước và sau san lấp mặt bằng dự án (khởi công tháng 6/2025, quy mô khoảng 512 ha, vốn gần 44.000 tỷ đồng) tạo làn sóng lo ngại về cảnh quan, sinh thái, giá trị lịch sử, văn hóa; một số cơ quan truyền thông nước ngoài khai thác, đưa tin dồn dập. Theo Mekong Eye, HĐND thành phố Đà Nẵng đã chấp thuận chuyển đổi gần 30 ha rừng sản xuất cho dự án; người dùng chia sẻ lại hình ảnh hàng nghìn lần, tự tra cứu báo cáo đánh giá tác động môi trường nộp năm 2024; một số người kêu gọi cân nhắc ủng hộ các sản phẩm khác của tập đoàn chủ đầu tư</w:t>
             </w:r>
           </w:p>
         </w:tc>
@@ -4126,7 +4189,7 @@
               <w:rPr>
                 <w:sz w:val="23"/>
               </w:rPr>
-              <w:t xml:space="preserve">xuất hiện</w:t>
+              <w:t xml:space="preserve">xuất hiện. Theo Mekong Eye (26/10/2026), ngày 9/10/2026, UBND thành phố Hà Nội phê duyệt dự án, vốn đầu tư dự kiến hơn 6.500 tỷ đồng, với điều kiện hoàn thành bồi thường, hỗ trợ, tái định cư, giải phóng mặt bằng trong 60 ngày (chưa tìm thấy nguồn trong nước xác nhận)</w:t>
             </w:r>
           </w:p>
         </w:tc>
@@ -4882,7 +4945,7 @@
         <w:t xml:space="preserve"> </w:t>
       </w:r>
       <w:r>
-        <w:t xml:space="preserve">Đạo luật Dịch vụ số của Liên minh châu Âu buộc nền tảng rất lớn đánh giá, giảm thiểu rủi ro hệ thống, có cơ chế ứng phó khủng hoảng, mức phạt tối đa 6% doanh thu toàn cầu; tháng 12/2025, Ủy ban châu Âu phạt X 120 triệu euro. Ngày 9/6/2026, cơ quan quản lý truyền thông Anh (Ofcom) quyết định yêu cầu nền tảng quy mô lớn có rủi ro trung bình và nền tảng mọi quy mô có rủi ro cao lập giao thức ứng phó khủng hoảng bằng văn bản, gồm: bộ chỉ số nhận diện khủng hoảng; tổ ứng phó liên chức năng có thẩm quyền quyết định; biện pháp xử lý nội dung; phân tích sau khủng hoảng, lưu hồ sơ, chậm nhất sau 90 ngày. Nền tảng lớn lập kênh liên lạc riêng với cơ quan thực thi pháp luật khi có khủng hoảng. Ofcom không ấn định thời hạn cứng, chỉ yêu cầu kích hoạt sớm nhất có thể trong thực tế, vì chưa đủ bằng chứng cho 1 chuẩn chung; quy định có hiệu lực sau khi Nghị viện thông qua.</w:t>
+        <w:t xml:space="preserve">Đạo luật Dịch vụ số của Liên minh châu Âu buộc nền tảng rất lớn đánh giá, giảm thiểu rủi ro hệ thống hằng năm; khi có khủng hoảng, Ủy ban châu Âu có quyền ra quyết định công khai buộc nền tảng áp dụng biện pháp trong thời hạn không quá 3 tháng (Điều 36); giao thức khủng hoảng gồm hiển thị nổi bật thông tin của cơ quan nhà nước và đầu mối liên lạc khủng hoảng (Điều 48); mức phạt tối đa 6% tổng doanh thu toàn cầu (Điều 74); tháng 12/2025, Ủy ban châu Âu phạt X 120 triệu euro. Ngày 9/6/2026, cơ quan quản lý truyền thông Anh (Ofcom) quyết định yêu cầu nền tảng quy mô lớn có rủi ro trung bình và nền tảng mọi quy mô có rủi ro cao lập giao thức ứng phó khủng hoảng bằng văn bản, gồm: bộ chỉ số nhận diện khủng hoảng; tổ ứng phó liên chức năng có thẩm quyền quyết định; biện pháp xử lý nội dung; phân tích sau khủng hoảng, lưu hồ sơ, chậm nhất sau 90 ngày. Nền tảng lớn lập kênh liên lạc riêng với cơ quan thực thi pháp luật khi có khủng hoảng. Ofcom không ấn định thời hạn cứng, chỉ yêu cầu kích hoạt sớm nhất có thể trong thực tế, vì chưa đủ bằng chứng cho 1 chuẩn chung; quy định có hiệu lực sau khi Nghị viện thông qua.</w:t>
       </w:r>
     </w:p>
     <w:p>
@@ -5438,7 +5501,7 @@
         </w:numPr>
       </w:pPr>
       <w:r>
-        <w:t xml:space="preserve">Hoàn thiện văn bản hướng dẫn Luật Báo chí 2025, Luật Trí tuệ nhân tạo (gắn nhãn nội dung AI); sửa đổi, bổ sung Nghị định số 147/2024/NĐ-CP theo hướng: nghĩa vụ nền tảng xử lý nhanh trong tình huống khẩn cấp; ưu tiên hiển thị thông tin chính thống khi xảy ra khủng hoảng; báo cáo minh bạch định kỳ.</w:t>
+        <w:t xml:space="preserve">Hoàn thiện văn bản hướng dẫn Luật Báo chí 2025, Luật Trí tuệ nhân tạo (gắn nhãn nội dung AI); sửa đổi, bổ sung Nghị định số 147/2024/NĐ-CP theo hướng: nghĩa vụ nền tảng xử lý nhanh trong tình huống khẩn cấp; ưu tiên hiển thị thông tin chính thống khi xảy ra khủng hoảng (tham khảo Điều 48 Đạo luật Dịch vụ số của Liên minh châu Âu); báo cáo minh bạch định kỳ.</w:t>
       </w:r>
     </w:p>
     <w:p>
@@ -9025,6 +9088,19 @@
         <w:jc w:val="left"/>
       </w:pPr>
       <w:r>
+        <w:t xml:space="preserve">Thời hạn xử lý thông tin vi phạm theo Luật An ninh mạng năm 2025: tối đa 24 giờ, không quá 6 giờ với tình huống khẩn cấp liên quan an ninh quốc gia (tài liệu tham luận tại hội nghị cung cấp thông tin cho báo chí ngày 21/4/2026 tại Bộ VHTTDL, đăng trên cổng thông tin xã Tân Phong, tỉnh Lai Châu; đã đọc toàn văn). https://tanphong.laichau.gov.vn/upload/103836/20260614/9__Tai_lieu_tuyen_truyen_Luat_An_ninh_mang_82cb2.docx</w:t>
+      </w:r>
+    </w:p>
+    <w:p>
+      <w:pPr>
+        <w:pStyle w:val="Compact"/>
+        <w:numPr>
+          <w:ilvl w:val="0"/>
+          <w:numId w:val="1029"/>
+        </w:numPr>
+        <w:jc w:val="left"/>
+      </w:pPr>
+      <w:r>
         <w:t xml:space="preserve">Luật Trí tuệ nhân tạo số 134/2025/QH15, hiệu lực từ 1/3/2026. https://luatminhkhue.vn/yeu-cau-bat-buoc-doi-voi-noi-dung-tao-boi-ai-tu-1-3-2026.aspx</w:t>
       </w:r>
     </w:p>
@@ -9362,7 +9438,7 @@
         <w:jc w:val="left"/>
       </w:pPr>
       <w:r>
-        <w:t xml:space="preserve">1.800 vụ việc lừa đảo trực tuyến trong 9 tháng năm 2026 (Dân Việt). https://danviet.vn/1800-vu-viec-lua-dao-truc-tuyen-trong-9-thang-nam-2026-dai-ta-cong-an-neu-cac-giai-phap-chan-dong-tien-bat-hop-phap-d1467783.html</w:t>
+        <w:t xml:space="preserve">1.800 vụ việc lừa đảo trực tuyến trong 9 tháng năm 2026 (Dân Việt, 17/10/2026; đã đọc toàn văn). https://danviet.vn/1800-vu-viec-lua-dao-truc-tuyen-trong-9-thang-nam-2026-dai-ta-cong-an-neu-cac-giai-phap-chan-dong-tien-bat-hop-phap-d1467783.html</w:t>
       </w:r>
     </w:p>
     <w:p>
@@ -9574,7 +9650,7 @@
         <w:jc w:val="left"/>
       </w:pPr>
       <w:r>
-        <w:t xml:space="preserve">Gen Z Việt Nam và Threads (Mekong Eye, 26/10/2026). https://www.mekongeye.com/2026/10/26/vietnam-genz-threads</w:t>
+        <w:t xml:space="preserve">Gen Z Việt Nam và Threads (Mekong Eye, 26/10/2026; đã đọc toàn văn). https://www.mekongeye.com/2026/10/26/vietnam-genz-threads</w:t>
       </w:r>
     </w:p>
     <w:p>
@@ -9721,7 +9797,7 @@
               <w:rPr>
                 <w:sz w:val="23"/>
               </w:rPr>
-              <w:t xml:space="preserve">Đối chiếu toàn văn các luật, nghị định tại Phần II, mục 1 và Phụ lục 4 (dự thảo này mới tổng hợp từ báo chí và trang pháp luật thứ cấp, chưa đọc toàn văn), nhất là Điều 7 Nghị định số 244/2026/NĐ-CP, thời hạn gỡ bỏ khẩn cấp theo Luật An ninh mạng năm 2025, phạm vi Nghị định số 219/2026/NĐ-CP và Nghị định số 343/2026/NĐ-CP</w:t>
+              <w:t xml:space="preserve">Đối chiếu toàn văn các luật, nghị định tại Phần II, mục 1 và Phụ lục 4 (dự thảo này mới tổng hợp từ báo chí và trang pháp luật thứ cấp, chưa đọc toàn văn), nhất là Điều 7 Nghị định số 244/2026/NĐ-CP, thời hạn gỡ bỏ khẩn cấp theo Luật An ninh mạng năm 2025 (nhiều nguồn thống nhất ghi không quá 6 giờ; chưa đọc điều luật gốc), phạm vi Nghị định số 219/2026/NĐ-CP và Nghị định số 343/2026/NĐ-CP</w:t>
             </w:r>
           </w:p>
         </w:tc>
@@ -10036,7 +10112,7 @@
               <w:rPr>
                 <w:sz w:val="23"/>
               </w:rPr>
-              <w:t xml:space="preserve">Số người dùng Threads tại Việt Nam; số yêu cầu chặn, gỡ và tỷ lệ đáp ứng riêng của Threads năm 2026</w:t>
+              <w:t xml:space="preserve">Số người dùng Threads tại Việt Nam; số yêu cầu chặn, gỡ và tỷ lệ đáp ứng riêng của Threads năm 2026; số liệu Meta công bố về nội dung hạn chế tại Việt Nam (Mekong Eye dẫn báo cáo của Meta: hơn 9.700 nội dung trong 6 tháng đầu năm 2026, gấp hơn 3 lần cùng kỳ năm trước)</w:t>
             </w:r>
           </w:p>
         </w:tc>
@@ -10071,7 +10147,7 @@
               <w:rPr>
                 <w:sz w:val="23"/>
               </w:rPr>
-              <w:t xml:space="preserve">Diễn biến trên Threads của vụ Làng Vân (từ giữa tháng 7/2026) và vụ Safari Ba Vì (tháng 10/2026), trong đó có phản ánh của người dùng về việc bài viết không hiển thị tại Việt Nam ngày 17 và 18/10/2026 (thông tin hiện chỉ có từ người dùng và nguồn nước ngoài)</w:t>
+              <w:t xml:space="preserve">Diễn biến trên Threads của vụ Làng Vân (từ giữa tháng 7/2026) và vụ Safari Ba Vì (tháng 10/2026), trong đó có phản ánh của người dùng về việc bài viết không hiển thị tại Việt Nam ngày 17 và 18/10/2026, phản ánh về việc nền tảng gỡ bài với lý do vi phạm bản quyền (thông tin hiện chỉ có từ người dùng và nguồn nước ngoài, trong đó có Mekong Eye ngày 26/10/2026)</w:t>
             </w:r>
           </w:p>
         </w:tc>
@@ -10106,7 +10182,7 @@
               <w:rPr>
                 <w:sz w:val="23"/>
               </w:rPr>
-              <w:t xml:space="preserve">Thông tin chính thức, phản hồi của chính quyền về dự án Làng Vân và đề xuất dự án Safari Ba Vì</w:t>
+              <w:t xml:space="preserve">Thông tin chính thức, phản hồi của chính quyền về dự án Làng Vân và đề xuất dự án Safari Ba Vì; xác minh thông tin UBND thành phố Hà Nội phê duyệt dự án Safari Ba Vì ngày 9/10/2026 (hiện chỉ có nguồn Mekong Eye)</w:t>
             </w:r>
           </w:p>
         </w:tc>
@@ -10176,7 +10252,7 @@
               <w:rPr>
                 <w:sz w:val="23"/>
               </w:rPr>
-              <w:t xml:space="preserve">Đối chiếu số liệu, nguồn kinh nghiệm quốc tế tại Phụ lục 6 (đã đối chiếu văn bản gốc phần Singapore, Anh, mốc giờ của Trung Quốc và nghiên cứu Science Advances; phần Liên minh châu Âu, Nepal, Pháp, Thụy Điển, Phần Lan, Threads còn tổng hợp qua tìm kiếm)</w:t>
+              <w:t xml:space="preserve">Đối chiếu số liệu, nguồn kinh nghiệm quốc tế tại Phụ lục 6 (đã đối chiếu văn bản gốc phần Singapore, Anh, Liên minh châu Âu, mốc giờ của Trung Quốc, nghiên cứu Science Advances và trang hướng dẫn về Threads của Úc; phần Nepal, Pháp, Thụy Điển, Phần Lan, phần lớn kinh nghiệm Threads còn tổng hợp qua tìm kiếm)</w:t>
             </w:r>
           </w:p>
         </w:tc>
@@ -10467,37 +10543,37 @@
               <w:rPr>
                 <w:sz w:val="23"/>
               </w:rPr>
-              <w:t xml:space="preserve">Đạo luật Dịch vụ số: nghĩa vụ đánh giá rủi ro hệ thống của nền tảng rất lớn, cơ chế ứng phó khủng hoảng (Điều 36), phạt tối đa 6% doanh thu toàn cầu; Lá chắn Dân chủ châu Âu (11/2025)</w:t>
-            </w:r>
-          </w:p>
-        </w:tc>
-        <w:tc>
-          <w:tcPr/>
-          <w:p>
-            <w:pPr>
-              <w:pStyle w:val="Compact"/>
-              <w:jc w:val="left"/>
-            </w:pPr>
-            <w:r>
-              <w:rPr>
-                <w:sz w:val="23"/>
-              </w:rPr>
-              <w:t xml:space="preserve">Phạt X 120 triệu euro (5/12/2025), quyết định xử phạt đầu tiên theo Đạo luật; chưa ghi nhận lần kích hoạt Điều 36</w:t>
-            </w:r>
-          </w:p>
-        </w:tc>
-        <w:tc>
-          <w:tcPr/>
-          <w:p>
-            <w:pPr>
-              <w:pStyle w:val="Compact"/>
-              <w:jc w:val="left"/>
-            </w:pPr>
-            <w:r>
-              <w:rPr>
-                <w:sz w:val="23"/>
-              </w:rPr>
-              <w:t xml:space="preserve">Trung bình: hướng đúng nhưng khó tái lập sức mặc cả của thị trường 27 nước</w:t>
+              <w:t xml:space="preserve">Đạo luật Dịch vụ số (áp dụng đầy đủ từ 17/2/2024): nền tảng rất lớn, từ 45 triệu người dùng hoạt động hằng tháng trong Liên minh (Điều 33), đánh giá rủi ro hệ thống ít nhất mỗi năm 1 lần, gồm rủi ro với thảo luận công dân, bầu cử, an ninh công cộng (Điều 34); cơ chế ứng phó khủng hoảng: khi tình huống bất thường đe dọa nghiêm trọng an ninh công cộng hoặc sức khỏe cộng đồng, Ủy ban châu Âu ra quyết định công khai buộc nền tảng đánh giá, áp dụng biện pháp, báo cáo; biện pháp kéo dài không quá 3 tháng, gia hạn tối đa 3 tháng; nền tảng tự chọn biện pháp cụ thể (Điều 36); giao thức khủng hoảng tự nguyện: hiển thị nổi bật thông tin của cơ quan nhà nước, chỉ định đầu mối liên lạc khủng hoảng, tăng nguồn lực kiểm duyệt (Điều 48); phạt tối đa 6% tổng doanh thu toàn cầu năm trước (Điều 74); Lá chắn Dân chủ châu Âu (11/2025)</w:t>
+            </w:r>
+          </w:p>
+        </w:tc>
+        <w:tc>
+          <w:tcPr/>
+          <w:p>
+            <w:pPr>
+              <w:pStyle w:val="Compact"/>
+              <w:jc w:val="left"/>
+            </w:pPr>
+            <w:r>
+              <w:rPr>
+                <w:sz w:val="23"/>
+              </w:rPr>
+              <w:t xml:space="preserve">Phạt X 120 triệu euro (5/12/2025), quyết định xử phạt đầu tiên theo Đạo luật; chưa ghi nhận lần kích hoạt Điều 36 (đã đối chiếu văn bản gốc các Điều 33, 34, 36, 48, 74; khoản phạt X và việc chưa kích hoạt Điều 36 chưa đối chiếu)</w:t>
+            </w:r>
+          </w:p>
+        </w:tc>
+        <w:tc>
+          <w:tcPr/>
+          <w:p>
+            <w:pPr>
+              <w:pStyle w:val="Compact"/>
+              <w:jc w:val="left"/>
+            </w:pPr>
+            <w:r>
+              <w:rPr>
+                <w:sz w:val="23"/>
+              </w:rPr>
+              <w:t xml:space="preserve">Trung bình: hướng đúng nhưng khó tái lập sức mặc cả của thị trường 27 nước; Điều 48 là căn cứ tham khảo cho yêu cầu nền tảng ưu tiên hiển thị thông tin chính thống khi có khủng hoảng</w:t>
             </w:r>
           </w:p>
         </w:tc>
@@ -10898,7 +10974,7 @@
           <w:i/>
           <w:iCs/>
         </w:rPr>
-        <w:t xml:space="preserve">Ghi chú: đã đối chiếu văn bản gốc đối với mốc 5 giờ, 24 giờ của Trung Quốc; số liệu nghiên cứu trên Science Advances; Luật POFMA và bảng thống kê vụ việc POFMA của Singapore; báo cáo HC 381 và quy định của Ofcom (Anh). Bản PDF của 4 tài liệu Singapore, Anh lưu tại thư mục tai-lieu cùng đề cương. Các số liệu còn lại tổng hợp qua tìm kiếm, tổ biên tập mở từng nguồn để đối chiếu trước khi sử dụng. Kinh nghiệm riêng về Threads trình bày tại bảng dưới.</w:t>
+        <w:t xml:space="preserve">Ghi chú: đã đối chiếu văn bản gốc đối với mốc 5 giờ, 24 giờ của Trung Quốc; số liệu nghiên cứu trên Science Advances; Luật POFMA và bảng thống kê vụ việc POFMA của Singapore; báo cáo HC 381 và quy định của Ofcom (Anh); Đạo luật Dịch vụ số của Liên minh châu Âu; trang hướng dẫn về Threads của cơ quan An toàn điện tử Úc. Bản PDF các tài liệu này lưu tại thư mục tai-lieu cùng đề cương. Các số liệu còn lại tổng hợp qua tìm kiếm, tổ biên tập mở từng nguồn để đối chiếu trước khi sử dụng. Kinh nghiệm riêng về Threads trình bày tại bảng dưới.</w:t>
       </w:r>
     </w:p>
     <w:p>
@@ -11043,7 +11119,7 @@
               <w:rPr>
                 <w:sz w:val="23"/>
               </w:rPr>
-              <w:t xml:space="preserve">Threads nằm trong danh sách nền tảng phải cấm tài khoản người dưới 16 tuổi, cùng Facebook, Instagram, TikTok, X, YouTube; từ 4/12/2025, Threads ngừng cho người dưới 16 tuổi ở Úc dùng tài khoản; luật có hiệu lực 10/12/2025, khoảng 5 triệu tài khoản trên các nền tảng ngừng hoạt động</w:t>
+              <w:t xml:space="preserve">Threads nằm trong danh sách nền tảng phải cấm tài khoản người dưới 16 tuổi, cùng Facebook, Instagram, TikTok, X, YouTube; từ 4/12/2025, Threads ngừng cho người dưới 16 tuổi ở Úc dùng tài khoản; luật có hiệu lực 10/12/2025, khoảng 5 triệu tài khoản trên các nền tảng ngừng hoạt động; người từ 16 tuổi trở lên mất quyền truy cập do nhầm lẫn có thể xác minh tuổi qua đối tác Yoti bằng video tự quay hoặc giấy tờ tùy thân</w:t>
             </w:r>
           </w:p>
         </w:tc>
@@ -11073,7 +11149,7 @@
               <w:rPr>
                 <w:sz w:val="23"/>
               </w:rPr>
-              <w:t xml:space="preserve">Trung bình: tóm tắt tìm kiếm trích trang của cơ quan Úc; trang gốc không truy cập được</w:t>
+              <w:t xml:space="preserve">Khá: đã đọc trang hướng dẫn về Threads của cơ quan An toàn điện tử Úc (cập nhật 20/8/2026), xác nhận Threads áp dụng độ tuổi tối thiểu 16, mốc 4/12/2025 và 10/12/2025; danh sách nền tảng khác và con số 5 triệu tài khoản chưa đối chiếu</w:t>
             </w:r>
           </w:p>
         </w:tc>
@@ -11318,22 +11394,22 @@
               <w:rPr>
                 <w:sz w:val="23"/>
               </w:rPr>
-              <w:t xml:space="preserve">Nội dung hạn chế tại Việt Nam vẫn hiển thị ở nước ngoài, và Meta sẽ công bố số yêu cầu; cần chủ động công bố căn cứ khi hạn chế hiển thị</w:t>
-            </w:r>
-          </w:p>
-        </w:tc>
-        <w:tc>
-          <w:tcPr/>
-          <w:p>
-            <w:pPr>
-              <w:pStyle w:val="Compact"/>
-              <w:jc w:val="left"/>
-            </w:pPr>
-            <w:r>
-              <w:rPr>
-                <w:sz w:val="23"/>
-              </w:rPr>
-              <w:t xml:space="preserve">Trung bình: tóm tắt tìm kiếm trích trang Meta; trang gốc cần JavaScript nên chưa đọc được</w:t>
+              <w:t xml:space="preserve">Nội dung hạn chế tại Việt Nam vẫn hiển thị ở nước ngoài, và Meta công bố số yêu cầu: theo Mekong Eye (26/10/2026) dẫn báo cáo của Meta, 6 tháng đầu năm 2026, Meta hạn chế hơn 9.700 nội dung tại Việt Nam theo yêu cầu của Bộ VHTTDL và Bộ Công an, gấp hơn 3 lần cùng kỳ năm trước; báo chí nước ngoài dùng số liệu này để phản ánh. Cần chủ động công bố căn cứ khi hạn chế hiển thị</w:t>
+            </w:r>
+          </w:p>
+        </w:tc>
+        <w:tc>
+          <w:tcPr/>
+          <w:p>
+            <w:pPr>
+              <w:pStyle w:val="Compact"/>
+              <w:jc w:val="left"/>
+            </w:pPr>
+            <w:r>
+              <w:rPr>
+                <w:sz w:val="23"/>
+              </w:rPr>
+              <w:t xml:space="preserve">Trung bình: tóm tắt tìm kiếm trích trang Meta; trang gốc cần JavaScript nên chưa đọc được; số liệu về Việt Nam dẫn qua Mekong Eye, chưa đối chiếu báo cáo gốc của Meta</w:t>
             </w:r>
           </w:p>
         </w:tc>
@@ -11600,7 +11676,7 @@
         <w:jc w:val="left"/>
       </w:pPr>
       <w:r>
-        <w:t xml:space="preserve">Văn bản Đạo luật Dịch vụ số, Quy định (EU) 2022/2065 (EUR-Lex). https://eur-lex.europa.eu/eli/reg/2022/2065/oj</w:t>
+        <w:t xml:space="preserve">Văn bản Đạo luật Dịch vụ số, Quy định (EU) 2022/2065 (EUR-Lex; đã đọc toàn văn bản PDF trên Công báo Liên minh châu Âu số L 277 ngày 27/10/2022). https://eur-lex.europa.eu/eli/reg/2022/2065/oj ; https://eur-lex.europa.eu/legal-content/EN/TXT/PDF/?uri=CELEX:32022R2065</w:t>
       </w:r>
     </w:p>
     <w:p>
@@ -11910,7 +11986,7 @@
         <w:jc w:val="left"/>
       </w:pPr>
       <w:r>
-        <w:t xml:space="preserve">Hướng dẫn về Threads của cơ quan An toàn điện tử Úc. https://www.esafety.gov.au/key-topics/esafety-guide/threads</w:t>
+        <w:t xml:space="preserve">Hướng dẫn về Threads của cơ quan An toàn điện tử Úc (cập nhật 20/8/2026; đã đọc toàn văn). https://www.esafety.gov.au/key-topics/esafety-guide/threads</w:t>
       </w:r>
     </w:p>
     <w:p>

</xml_diff>

<commit_message>
Đối chiếu bản gốc Luật An ninh mạng 2025 trên Công báo
- Điều 25: thời hạn 24 giờ, 6 giờ tính từ yêu cầu của lực lượng chuyên trách bảo vệ an ninh mạng thuộc Bộ Công an; bổ sung thời hạn cung cấp thông tin người dùng 24 giờ, 3 giờ
- Ghi rõ Luật thay thế Luật An ninh mạng 2018 và Luật An toàn thông tin mạng 2015
- Thay đường dẫn thuvienphapluat bằng bản gốc trên Công báo; cập nhật Phụ lục 5

Co-Authored-By: Claude Opus 5.5 <noreply@anthropic.com>
Claude-Session: https://claude.ai/code/session_01NzZ78rAanjcMCsGwt7jxAb
</commit_message>
<xml_diff>
--- a/tham-luan-khung-hoang-truyen-thong/de-cuong-tham-luan-bvhttdl.docx
+++ b/tham-luan-khung-hoang-truyen-thong/de-cuong-tham-luan-bvhttdl.docx
@@ -357,7 +357,7 @@
         <w:t xml:space="preserve"> </w:t>
       </w:r>
       <w:r>
-        <w:t xml:space="preserve">Đối chiếu toàn văn Đạo luật Dịch vụ số của Liên minh châu Âu (Điều 33, 34, 36, 48, 74), trang hướng dẫn về Threads của cơ quan An toàn điện tử Úc, bài của Mekong Eye (26/10/2026) và Dân Việt (17/10/2026). Sửa số liệu lừa đảo trực tuyến năm 2025; bổ sung thời hạn 6 giờ theo Luật An ninh mạng năm 2025; cập nhật diễn biến vụ Làng Vân, Safari Ba Vì và phản ứng của người dùng Threads khi nền tảng gỡ bài (Phần I, Phần II, Phụ lục 5, 6).</w:t>
+        <w:t xml:space="preserve">Đối chiếu toàn văn Đạo luật Dịch vụ số của Liên minh châu Âu (Điều 33, 34, 36, 48, 74), trang hướng dẫn về Threads của cơ quan An toàn điện tử Úc, bài của Mekong Eye (26/10/2026) và Dân Việt (17/10/2026). Sửa số liệu lừa đảo trực tuyến năm 2025; bổ sung thời hạn 6 giờ theo Điều 25 Luật An ninh mạng năm 2025 (đã đối chiếu bản gốc trên Công báo); cập nhật diễn biến vụ Làng Vân, Safari Ba Vì và phản ứng của người dùng Threads khi nền tảng gỡ bài (Phần I, Phần II, Phụ lục 5, 6).</w:t>
       </w:r>
     </w:p>
     <w:p>
@@ -3353,7 +3353,7 @@
         </w:numPr>
       </w:pPr>
       <w:r>
-        <w:t xml:space="preserve">Luật An ninh mạng số 116/2025/QH15 (hiệu lực từ 1/7/2026): nghiêm cấm bịa đặt, lan truyền thông tin sai sự thật; doanh nghiệp viễn thông, Internet, mạng xã hội xử lý thông tin vi phạm tối đa 24 giờ kể từ khi nhận yêu cầu hợp pháp, không quá 6 giờ đối với tình huống khẩn cấp liên quan an ninh quốc gia.</w:t>
+        <w:t xml:space="preserve">Luật An ninh mạng số 116/2025/QH15 (hiệu lực từ 1/7/2026, thay thế Luật An ninh mạng năm 2018 và Luật An toàn thông tin mạng năm 2015): nghiêm cấm bịa đặt, lan truyền thông tin sai sự thật; doanh nghiệp trong nước và nước ngoài cung cấp dịch vụ viễn thông, Internet, dịch vụ gia tăng trên không gian mạng phải ngăn chặn, xóa bỏ thông tin vi phạm chậm nhất 24 giờ kể từ khi có yêu cầu của lực lượng chuyên trách bảo vệ an ninh mạng thuộc Bộ Công an, chậm nhất 6 giờ trong trường hợp khẩn cấp đe dọa xâm hại an ninh quốc gia; cung cấp thông tin người dùng chậm nhất 24 giờ, 3 giờ trong trường hợp khẩn cấp (Điều 25).</w:t>
       </w:r>
     </w:p>
     <w:p>
@@ -9075,7 +9075,7 @@
         <w:jc w:val="left"/>
       </w:pPr>
       <w:r>
-        <w:t xml:space="preserve">Luật An ninh mạng số 116/2025/QH15, hiệu lực từ 1/7/2026. https://thuvienphapluat.vn/van-ban/Cong-nghe-thong-tin/Luat-An-ninh-mang-2025-so-116-2025-QH15-666020.aspx</w:t>
+        <w:t xml:space="preserve">Luật An ninh mạng số 116/2025/QH15, hiệu lực từ 1/7/2026 (bản gốc đăng Công báo số 35 ngày 21/1/2026; đã đọc toàn văn). https://congbao.chinhphu.vn/van-ban/luat-so-116-2025-qh15-468678.htm</w:t>
       </w:r>
     </w:p>
     <w:p>
@@ -9797,7 +9797,7 @@
               <w:rPr>
                 <w:sz w:val="23"/>
               </w:rPr>
-              <w:t xml:space="preserve">Đối chiếu toàn văn các luật, nghị định tại Phần II, mục 1 và Phụ lục 4 (dự thảo này mới tổng hợp từ báo chí và trang pháp luật thứ cấp, chưa đọc toàn văn), nhất là Điều 7 Nghị định số 244/2026/NĐ-CP, thời hạn gỡ bỏ khẩn cấp theo Luật An ninh mạng năm 2025 (nhiều nguồn thống nhất ghi không quá 6 giờ; chưa đọc điều luật gốc), phạm vi Nghị định số 219/2026/NĐ-CP và Nghị định số 343/2026/NĐ-CP</w:t>
+              <w:t xml:space="preserve">Đối chiếu toàn văn các luật, nghị định tại Phần II, mục 1 và Phụ lục 4 (dự thảo này mới tổng hợp từ báo chí và trang pháp luật thứ cấp, chưa đọc toàn văn), nhất là Điều 7 Nghị định số 244/2026/NĐ-CP, thời hạn 24 giờ, 6 giờ tại Điều 25 Luật An ninh mạng năm 2025 (đã đọc văn bản gốc) chỉ áp dụng với yêu cầu của lực lượng chuyên trách bảo vệ an ninh mạng thuộc Bộ Công an, cần làm rõ thời hạn áp dụng với yêu cầu của Bộ VHTTDL theo Nghị định số 147/2024/NĐ-CP, phạm vi Nghị định số 219/2026/NĐ-CP và Nghị định số 343/2026/NĐ-CP</w:t>
             </w:r>
           </w:p>
         </w:tc>

</xml_diff>

<commit_message>
Dự thảo 6: đối chiếu 15 văn bản pháp luật gốc trên Công báo và 29 nguồn tin
- Nghị định 174/2026: mức phạt 50 triệu đồng là mức với tổ chức, cá nhân tối đa 25 triệu đồng; nền tảng không gỡ bỏ chỉ chịu phạt 30 đến 50 triệu đồng
- Nghị định 244/2026: mốc 24 giờ tính từ khi cơ quan tiếp nhận vụ việc; chế độ báo cáo hằng năm làm số liệu nền
- Nghị định 328, 343/2026: sửa tên, phạm vi; Bộ Công an giúp Chính phủ quản lý nhà nước về phòng, chống tin giả
- Nghị định 147/2024, 327/2026, Luật An ninh mạng: thời hạn khẩn cấp 6 giờ chưa áp dụng với yêu cầu của Bộ VHTTDL
- Quyết định 1125/QĐ-TTg: căn cứ diễn tập truyền thông khủng hoảng, đầu mối phối hợp
- Sửa thời gian xử lý 3 đến 12 giờ (của TikTok), vụ Kera, bỏ chi tiết deepfake mạo danh không có trong nguồn
- Thay nguồn thứ cấp bằng bản gốc trên Công báo; cập nhật mức kiểm chứng tại Phụ lục 4, 5, 6

Co-Authored-By: Claude Opus 5.5 <noreply@anthropic.com>
Claude-Session: https://claude.ai/code/session_01NzZ78rAanjcMCsGwt7jxAb
</commit_message>
<xml_diff>
--- a/tham-luan-khung-hoang-truyen-thong/de-cuong-tham-luan-bvhttdl.docx
+++ b/tham-luan-khung-hoang-truyen-thong/de-cuong-tham-luan-bvhttdl.docx
@@ -258,7 +258,7 @@
         <w:pStyle w:val="ThongTinChung"/>
       </w:pPr>
       <w:r>
-        <w:t xml:space="preserve">Dự thảo 5, ngày 28/10/2026. Tài liệu làm việc phục vụ tổ biên tập.</w:t>
+        <w:t xml:space="preserve">Dự thảo 6, ngày 28/10/2026. Tài liệu làm việc phục vụ tổ biên tập.</w:t>
       </w:r>
     </w:p>
     <w:bookmarkStart w:id="20" w:name="tóm-tắt"/>
@@ -358,6 +358,24 @@
       </w:r>
       <w:r>
         <w:t xml:space="preserve">Đối chiếu toàn văn Đạo luật Dịch vụ số của Liên minh châu Âu (Điều 33, 34, 36, 48, 74), trang hướng dẫn về Threads của cơ quan An toàn điện tử Úc, bài của Mekong Eye (26/10/2026) và Dân Việt (17/10/2026). Sửa số liệu lừa đảo trực tuyến năm 2025; bổ sung thời hạn 6 giờ theo Điều 25 Luật An ninh mạng năm 2025 (đã đối chiếu bản gốc trên Công báo); cập nhật diễn biến vụ Làng Vân, Safari Ba Vì và phản ứng của người dùng Threads khi nền tảng gỡ bài (Phần I, Phần II, Phụ lục 5, 6).</w:t>
+      </w:r>
+    </w:p>
+    <w:p>
+      <w:pPr>
+        <w:pStyle w:val="BodyText"/>
+      </w:pPr>
+      <w:r>
+        <w:rPr>
+          <w:b/>
+          <w:bCs/>
+        </w:rPr>
+        <w:t xml:space="preserve">Điểm mới của dự thảo 6.</w:t>
+      </w:r>
+      <w:r>
+        <w:t xml:space="preserve"> </w:t>
+      </w:r>
+      <w:r>
+        <w:t xml:space="preserve">Đối chiếu toàn văn 15 văn bản pháp luật gốc trên Công báo (Luật Báo chí, Luật Trí tuệ nhân tạo, Luật Bảo vệ dữ liệu cá nhân, Luật Quảng cáo sửa đổi; Nghị định số 147/2024/NĐ-CP, 356/2025/NĐ-CP, 174, 219, 244, 298, 327, 328, 343/2026/NĐ-CP; Quyết định số 329/QĐ-TTg, 1125/QĐ-TTg) và 29 nguồn tin, báo cáo. Sửa 9 điểm sai hoặc chưa chính xác, quan trọng nhất: mức phạt 50 triệu đồng của Nghị định số 174/2026/NĐ-CP là mức với tổ chức, cá nhân tối đa 25 triệu đồng; mốc 24 giờ của Nghị định số 244/2026/NĐ-CP tính từ khi cơ quan tiếp nhận vụ việc; tên, phạm vi Nghị định số 328/2026/NĐ-CP và 343/2026/NĐ-CP; thời gian xử lý 3 đến 12 giờ là của TikTok; diễn biến vụ Kera; chi tiết deepfake mạo danh không có trong nguồn. Bổ sung căn cứ: Nghị định số 244/2026/NĐ-CP, 328/2026/NĐ-CP và Quyết định số 1125/QĐ-TTg đều nêu nhiệm vụ hạn chế, xử lý khủng hoảng truyền thông; khoảng trống về thời hạn khẩn cấp và mức phạt đối với nền tảng (Phần II, mục 1, 3; Phần III, nhóm 2, 3, 6; Kết luận; Phụ lục 1, 4, 5, 6).</w:t>
       </w:r>
     </w:p>
     <w:p>
@@ -1625,7 +1643,7 @@
         <w:t xml:space="preserve"> </w:t>
       </w:r>
       <w:r>
-        <w:t xml:space="preserve">AI tạo sinh giúp làm giả hình ảnh, giọng nói lãnh đạo, mạo danh cơ quan báo chí, cơ quan nhà nước với chi phí rất thấp. Theo thống kê của Bộ Công an, năm 2025 toàn quốc xảy ra 4.200 vụ việc lừa đảo trực tuyến, thiệt hại khoảng 8.000 tỷ đồng; 9 tháng đầu năm 2026 ghi nhận thêm 1.800 vụ việc; nhiều vụ dùng video deepfake mạo danh cán bộ công an, kiểm sát viên.</w:t>
+        <w:t xml:space="preserve">AI tạo sinh giúp làm giả hình ảnh, giọng nói lãnh đạo, mạo danh cơ quan báo chí, cơ quan nhà nước với chi phí rất thấp. Theo thống kê của Bộ Công an, năm 2025 toàn quốc xảy ra 4.200 vụ việc lừa đảo trực tuyến, thiệt hại khoảng 8.000 tỷ đồng; 9 tháng đầu năm 2026 ghi nhận thêm 1.800 vụ việc; Bộ Công an cảnh báo tình trạng dùng AI giả mạo hình ảnh, giọng nói để lừa đảo và đề ra giải pháp kiểm soát thuật toán, dán nhãn nội dung AI (họp báo Chính phủ ngày 3/6/2026).</w:t>
       </w:r>
     </w:p>
     <w:p>
@@ -2427,7 +2445,7 @@
         <w:t xml:space="preserve"> </w:t>
       </w:r>
       <w:r>
-        <w:t xml:space="preserve">Kêu gọi tụ tập, gây rối, khiếu kiện đông người, tẩy chay; quyên góp, gây quỹ trái phép. Từ năm 2025, các trang của tổ chức khủng bố Việt Tân lợi dụng các cuộc biểu tình của giới trẻ ở Nepal, Indonesia để kêu gọi</w:t>
+        <w:t xml:space="preserve">Kêu gọi tụ tập, gây rối, khiếu kiện đông người, tẩy chay; quyên góp, gây quỹ trái phép. Tháng 9/2025, trang web của tổ chức khủng bố Việt Tân lợi dụng biểu tình của giới trẻ ở Nepal, Indonesia, tung luận điệu</w:t>
       </w:r>
       <w:r>
         <w:t xml:space="preserve"> </w:t>
@@ -2436,16 +2454,13 @@
         <w:t xml:space="preserve">“</w:t>
       </w:r>
       <w:r>
-        <w:t xml:space="preserve">cách mạng Gen Z</w:t>
+        <w:t xml:space="preserve">từ Nepal, cần một cuộc cách mạng GenZ cho Việt Nam</w:t>
       </w:r>
       <w:r>
         <w:t xml:space="preserve">”</w:t>
       </w:r>
       <w:r>
-        <w:t xml:space="preserve"> </w:t>
-      </w:r>
-      <w:r>
-        <w:t xml:space="preserve">tại Việt Nam; một số tài khoản trên Threads kêu gọi</w:t>
+        <w:t xml:space="preserve">; năm 2026, một số tài khoản lợi dụng vụ việc gây bức xúc dư luận để kêu gọi Gen Z</w:t>
       </w:r>
       <w:r>
         <w:t xml:space="preserve"> </w:t>
@@ -2460,7 +2475,7 @@
         <w:t xml:space="preserve">”</w:t>
       </w:r>
       <w:r>
-        <w:t xml:space="preserve">.</w:t>
+        <w:t xml:space="preserve">, so sánh với Gen Z ở Nepal.</w:t>
       </w:r>
     </w:p>
     <w:p>
@@ -3067,7 +3082,7 @@
         </w:numPr>
       </w:pPr>
       <w:r>
-        <w:t xml:space="preserve">Threads (thuộc Meta) đạt khoảng 500 triệu người dùng hoạt động hằng tháng trên toàn cầu (Meta công bố tháng 6/2026). Tại Việt Nam, Meta chưa công bố số liệu chính thức; một số ước tính thị trường cho thấy khoảng 4 triệu người dùng, tập trung ở Gen Z, sinh viên, người trẻ đô thị.</w:t>
+        <w:t xml:space="preserve">Threads (thuộc Meta) đạt khoảng 500 triệu người dùng hoạt động hằng tháng trên toàn cầu (Meta công bố tháng 6/2026). Tại Việt Nam, Meta chưa công bố số liệu chính thức; các ước tính thị trường dao động từ khoảng 3,8 đến 4,65 triệu người dùng, Báo Công an nhân dân nêu con số gần 5 triệu, tập trung ở Gen Z, sinh viên, người trẻ đô thị.</w:t>
       </w:r>
     </w:p>
     <w:p>
@@ -3365,7 +3380,7 @@
         </w:numPr>
       </w:pPr>
       <w:r>
-        <w:t xml:space="preserve">Luật Trí tuệ nhân tạo số 134/2025/QH15 (hiệu lực từ 1/3/2026) yêu cầu gắn dấu hiệu nhận biết đối với nội dung do AI tạo ra.</w:t>
+        <w:t xml:space="preserve">Luật Trí tuệ nhân tạo số 134/2025/QH15 (hiệu lực từ 1/3/2026) yêu cầu đánh dấu âm thanh, hình ảnh, video do AI tạo ra ở định dạng máy đọc; gắn nhãn dễ nhận biết đối với nội dung mô phỏng người thật, tái hiện sự kiện thật (Điều 11); cấm tạo ra, phổ biến nội dung giả mạo có khả năng gây nguy hại nghiêm trọng đến an ninh quốc gia, trật tự, an toàn xã hội (Điều 7).</w:t>
       </w:r>
     </w:p>
     <w:p>
@@ -3377,7 +3392,7 @@
         </w:numPr>
       </w:pPr>
       <w:r>
-        <w:t xml:space="preserve">Luật Bảo vệ dữ liệu cá nhân số 91/2025/QH15 (hiệu lực từ 1/1/2026) và Nghị định số 356/2025/NĐ-CP: căn cứ xử lý hành vi phát tán trái phép dữ liệu cá nhân của nạn nhân, người liên quan trong các vụ việc gây chú ý.</w:t>
+        <w:t xml:space="preserve">Luật Bảo vệ dữ liệu cá nhân số 91/2025/QH15 (hiệu lực từ 1/1/2026) và Nghị định số 356/2025/NĐ-CP: nghiêm cấm cố ý làm lộ dữ liệu cá nhân (Điều 7), mức phạt tiền tối đa 3 tỷ đồng với tổ chức, 1,5 tỷ đồng với cá nhân (Điều 8); là căn cứ xử lý hành vi phát tán trái phép dữ liệu cá nhân của nạn nhân, người liên quan trong các vụ việc gây chú ý.</w:t>
       </w:r>
     </w:p>
     <w:p>
@@ -3401,7 +3416,25 @@
         </w:numPr>
       </w:pPr>
       <w:r>
-        <w:t xml:space="preserve">Nghị định số 244/2026/NĐ-CP ngày 26/6/2026 (hiệu lực từ 1/7/2026) về phát ngôn và cung cấp thông tin cho báo chí, thay thế Nghị định số 09/2017/NĐ-CP: với vụ việc đột xuất, bất thường hoặc khi dư luận có nhiều ý kiến trái chiều, người phát ngôn cung cấp thông tin ban đầu chậm nhất 24 giờ (Điều 7); vụ việc liên quan từ 2 bộ, ngành, địa phương trở lên có 1 đầu mối chủ trì thống nhất nội dung phát ngôn; cơ quan công khai thông tin người phát ngôn trên cổng thông tin điện tử trong 24 giờ; các cơ quan ban hành quy chế phát ngôn nội bộ trong 45 ngày.</w:t>
+        <w:t xml:space="preserve">Nghị định số 244/2026/NĐ-CP ngày 26/6/2026 (hiệu lực từ 1/7/2026) về phát ngôn và cung cấp thông tin cho báo chí, thay thế Nghị định số 09/2017/NĐ-CP. Với sự cố mang tính quốc gia, Thủ tướng Chính phủ hoặc người phát ngôn của Chính phủ phát ngôn ngay sau khi sự cố xảy ra; với sự kiện có tác động lớn hoặc khi dư luận có nhiều ý kiến không thống nhất, người phát ngôn cung cấp thông tin ban đầu chậm nhất 24 giờ kể từ khi cơ quan tiếp nhận vụ việc hoặc xác định vụ việc có nguy cơ tác động đến dư luận, nhằm</w:t>
+      </w:r>
+      <w:r>
+        <w:t xml:space="preserve"> </w:t>
+      </w:r>
+      <w:r>
+        <w:t xml:space="preserve">“</w:t>
+      </w:r>
+      <w:r>
+        <w:t xml:space="preserve">hạn chế xảy ra khủng hoảng truyền thông</w:t>
+      </w:r>
+      <w:r>
+        <w:t xml:space="preserve">”</w:t>
+      </w:r>
+      <w:r>
+        <w:t xml:space="preserve"> </w:t>
+      </w:r>
+      <w:r>
+        <w:t xml:space="preserve">(Điều 7); sự cố liên quan từ 2 bộ, ngành, tỉnh trở lên có 1 đầu mối chủ trì thống nhất nội dung phát ngôn; trang, kênh, tài khoản mạng xã hội chính thức của cơ quan là 1 hình thức phát ngôn (Điều 5); người đứng đầu chịu trách nhiệm khi để chậm phát ngôn, né tránh hoặc cung cấp thông tin không thống nhất (Điều 8); các bộ, UBND cấp tỉnh báo cáo hằng năm về Bộ VHTTDL, trong đó có chỉ tiêu số vụ việc phát ngôn đúng hạn (Điều 10); cơ quan chưa có quy chế phát ngôn nội bộ ban hành trong 45 ngày (Điều 12).</w:t>
       </w:r>
     </w:p>
     <w:p>
@@ -3413,7 +3446,7 @@
         </w:numPr>
       </w:pPr>
       <w:r>
-        <w:t xml:space="preserve">Nghị định số 147/2024/NĐ-CP yêu cầu xác thực tài khoản mạng xã hội và gỡ bỏ thông tin vi phạm chậm nhất 24 giờ kể từ khi có yêu cầu.</w:t>
+        <w:t xml:space="preserve">Nghị định số 147/2024/NĐ-CP yêu cầu nền tảng nước ngoài xác thực tài khoản bằng số điện thoại di động tại Việt Nam; ngăn chặn, gỡ bỏ nội dung vi phạm chậm nhất 24 giờ kể từ khi có yêu cầu của cơ quan quản lý thông tin trên mạng (nay là Bộ VHTTDL), Bộ Công an; khóa tạm thời từ 7 đến 30 ngày tài khoản vi phạm từ 5 lần trong 30 ngày (Điều 23). Nghị định chưa có thời hạn rút ngắn cho tình huống khẩn cấp.</w:t>
       </w:r>
     </w:p>
     <w:p>
@@ -3425,7 +3458,7 @@
         </w:numPr>
       </w:pPr>
       <w:r>
-        <w:t xml:space="preserve">Nghị định số 174/2026/NĐ-CP (hiệu lực từ 1/7/2026) nâng mức phạt hành vi cung cấp, chia sẻ thông tin giả mạo, sai sự thật trên mạng xã hội lên đến 50 triệu đồng, kèm biện pháp buộc gỡ bỏ, khóa tài khoản.</w:t>
+        <w:t xml:space="preserve">Nghị định số 174/2026/NĐ-CP ngày 15/5/2026 (hiệu lực từ 1/7/2026) quy định phạt từ 20 đến 30 triệu đồng hành vi cung cấp, chia sẻ thông tin giả mạo, sai sự thật trên mạng xã hội, từ 30 đến 50 triệu đồng nếu thông tin sai sự thật gây hoang mang trong Nhân dân, kèm buộc gỡ bỏ, khóa tài khoản (Điều 95). Đây là mức phạt với tổ chức; cá nhân chịu 1/2 mức này, tức tối đa 25 triệu đồng (Điều 4). Nền tảng xuyên biên giới không ngăn chặn, gỡ bỏ thông tin theo yêu cầu chỉ chịu phạt từ 30 đến 50 triệu đồng (Điều 97).</w:t>
       </w:r>
     </w:p>
     <w:p>
@@ -3437,7 +3470,7 @@
         </w:numPr>
       </w:pPr>
       <w:r>
-        <w:t xml:space="preserve">Nghị định số 219/2026/NĐ-CP (hiệu lực từ 8/8/2026) quy định xử phạt trong lĩnh vực khí tượng thủy văn, mức phạt cao nhất 40 triệu đồng đối với nhóm hành vi truyền tin sai lệch về dự báo, cảnh báo.</w:t>
+        <w:t xml:space="preserve">Nghị định số 219/2026/NĐ-CP (hiệu lực từ 8/8/2026) quy định xử phạt trong lĩnh vực khí tượng thủy văn: phạt từ 30 đến 40 triệu đồng đối với cá nhân, gấp 2 lần đối với tổ chức, khi truyền, phát sai lệch bản tin hoặc đưa tin sai lệch về dự báo, cảnh báo, kèm buộc cải chính (Điều 5, Điều 8).</w:t>
       </w:r>
     </w:p>
     <w:p>
@@ -3449,7 +3482,7 @@
         </w:numPr>
       </w:pPr>
       <w:r>
-        <w:t xml:space="preserve">Nghị định số 327/2026/NĐ-CP ngày 19/8/2026 quy định chi tiết Điều 14 Luật An ninh mạng, bổ sung biện pháp yêu cầu xóa bỏ thông tin, ngăn chặn truy cập hệ thống thông tin ở nước ngoài vi phạm.</w:t>
+        <w:t xml:space="preserve">Nghị định số 327/2026/NĐ-CP ngày 19/8/2026 (hiệu lực ngay từ ngày ký) quy định chi tiết Điều 14 Luật An ninh mạng: người đăng tải gỡ thông tin vi phạm trong 24 giờ, 6 giờ với tình huống khẩn cấp (Điều 10); quá thời hạn mà doanh nghiệp không gỡ, lực lượng chuyên trách được truy cập xóa bỏ; ngăn chặn truy cập từ Việt Nam đối với hệ thống thông tin ở nước ngoài không tuân thủ yêu cầu gỡ bỏ, kể cả nền tảng xuyên biên giới phát tán thông tin kích động bạo loạn (Điều 7); nhà cung cấp dịch vụ bố trí đầu mối thường trực 24/24 giờ trong tình huống khẩn cấp (Điều 14).</w:t>
       </w:r>
     </w:p>
     <w:p>
@@ -3461,7 +3494,43 @@
         </w:numPr>
       </w:pPr>
       <w:r>
-        <w:t xml:space="preserve">Nghị định số 328/2026/NĐ-CP ngày 19/8/2026 (hiệu lực từ 5/10/2026) quy định quy trình phát hiện, kiểm chứng, xác minh, gắn nhãn, cảnh báo, ngăn chặn, gỡ bỏ và xử lý tin giả, tin sai sự thật; xác định trách nhiệm của các bộ, ngành, UBND các cấp.</w:t>
+        <w:t xml:space="preserve">Nghị định số 328/2026/NĐ-CP ngày 19/8/2026 (hiệu lực từ 5/10/2026) quy định phòng, chống tin giả, tin sai sự thật; Bộ Công an giúp Chính phủ quản lý nhà nước (Điều 17). Quy trình 6 bước: phát hiện; kiểm chứng, xác minh; gắn nhãn</w:t>
+      </w:r>
+      <w:r>
+        <w:t xml:space="preserve"> </w:t>
+      </w:r>
+      <w:r>
+        <w:t xml:space="preserve">“</w:t>
+      </w:r>
+      <w:r>
+        <w:t xml:space="preserve">TIN GIẢ, TIN SAI SỰ THẬT</w:t>
+      </w:r>
+      <w:r>
+        <w:t xml:space="preserve">”</w:t>
+      </w:r>
+      <w:r>
+        <w:t xml:space="preserve"> </w:t>
+      </w:r>
+      <w:r>
+        <w:t xml:space="preserve">trong 24 giờ sau khi kết luận; công bố, cảnh báo ngay hoặc trong 12 giờ làm việc; ngăn chặn, gỡ bỏ; xử lý (Điều 8, 10, 11). Nghị định xếp tin giả</w:t>
+      </w:r>
+      <w:r>
+        <w:t xml:space="preserve"> </w:t>
+      </w:r>
+      <w:r>
+        <w:t xml:space="preserve">“</w:t>
+      </w:r>
+      <w:r>
+        <w:t xml:space="preserve">có khả năng gây khủng hoảng truyền thông, kích động bạo loạn</w:t>
+      </w:r>
+      <w:r>
+        <w:t xml:space="preserve">”</w:t>
+      </w:r>
+      <w:r>
+        <w:t xml:space="preserve"> </w:t>
+      </w:r>
+      <w:r>
+        <w:t xml:space="preserve">vào nhóm đặc biệt nghiêm trọng (Điều 4); giao Bộ Công an phối hợp Bộ VHTTDL công bố, cảnh báo rộng rãi trên phương tiện truyền thông đại chúng đối với tin giả có nguy cơ gây khủng hoảng truyền thông (Điều 17); Bộ VHTTDL kiểm chứng, gắn nhãn, công bố tin giả trong lĩnh vực quản lý (Điều 18); nền tảng thiết lập đầu mối phối hợp 24/7 (Điều 22).</w:t>
       </w:r>
     </w:p>
     <w:p>
@@ -3473,7 +3542,7 @@
         </w:numPr>
       </w:pPr>
       <w:r>
-        <w:t xml:space="preserve">Nghị định số 343/2026/NĐ-CP ngày 3/9/2026 quy định việc tiếp nhận, xử lý xung đột thông tin trên không gian mạng thuộc phạm vi Bộ Quốc phòng; Bộ VHTTDL tham gia ngăn chặn, khắc phục xung đột thông tin trên báo chí, phát thanh, truyền hình, thông tin điện tử.</w:t>
+        <w:t xml:space="preserve">Nghị định số 343/2026/NĐ-CP ngày 3/9/2026 quy định chi tiết một số điều của Luật An ninh mạng thuộc phạm vi quản lý của Bộ Quốc phòng, thay thế Nghị định số 142/2016/NĐ-CP về ngăn chặn xung đột thông tin trên mạng: Bộ Quốc phòng chủ trì xử lý xung đột thông tin liên quan quốc phòng, chủ quyền; Bộ Công an chủ trì vụ việc liên quan an ninh quốc gia, trật tự, an toàn xã hội; Bộ VHTTDL phối hợp chặn lọc, khắc phục, loại trừ thông tin xung đột trên báo chí, phát thanh, truyền hình, môi trường thông tin điện tử (Điều 37).</w:t>
       </w:r>
     </w:p>
     <w:p>
@@ -3485,7 +3554,7 @@
         </w:numPr>
       </w:pPr>
       <w:r>
-        <w:t xml:space="preserve">Nghị định số 298/2026/NĐ-CP kiện toàn tổ chức Bộ VHTTDL; theo Quyết định số 2559/QĐ-BVHTTDL, Cục Thông tin điện tử và Chuyển đổi số tiếp nhận nhiệm vụ của Cục Phát thanh, truyền hình và thông tin điện tử (trước đây).</w:t>
+        <w:t xml:space="preserve">Nghị định số 298/2026/NĐ-CP (hiệu lực từ 28/7/2026) quy định Bộ VHTTDL có 22 đơn vị, giao Bộ theo dõi, tổng hợp, báo cáo Thủ tướng Chính phủ việc cung cấp thông tin giải thích, làm rõ thông tin sai lệch về Việt Nam; theo Quyết định số 2559/QĐ-BVHTTDL ngày 30/9/2026, Cục Thông tin điện tử và Chuyển đổi số tiếp nhận chức năng của Cục Phát thanh, truyền hình và thông tin điện tử, chủ trì giám sát, tiếp nhận phản ánh, công bố và xử lý tin giả, tin sai sự thật trên mạng.</w:t>
       </w:r>
     </w:p>
     <w:p>
@@ -3512,7 +3581,7 @@
         <w:t xml:space="preserve">”</w:t>
       </w:r>
       <w:r>
-        <w:t xml:space="preserve">.</w:t>
+        <w:t xml:space="preserve">: mục tiêu đến năm 2030, 100% bộ, ngành, địa phương có đầu mối và cơ chế phối hợp truyền thông, nâng cao năng lực xử lý tin giả và khủng hoảng truyền thông; Bộ Công an chủ trì Đề án, phối hợp tổ chức diễn tập truyền thông khủng hoảng, xây dựng cơ chế chia sẻ cảnh báo sớm giữa lực lượng chức năng và cơ quan truyền thông; Bộ VHTTDL chủ trì chỉ đạo báo chí, nền tảng số, thông tin cơ sở, phát triển kho dữ liệu truyền thông số dùng chung.</w:t>
       </w:r>
     </w:p>
     <w:p>
@@ -3524,7 +3593,7 @@
         </w:numPr>
       </w:pPr>
       <w:r>
-        <w:t xml:space="preserve">Quyết định số 423/QĐ-BVHTTDL ngày 5/3/2026 ban hành Bộ Quy tắc ứng xử văn hóa trên môi trường số, thay thế Bộ Quy tắc ứng xử trên mạng xã hội năm 2021.</w:t>
+        <w:t xml:space="preserve">Quyết định số 423/QĐ-BVHTTDL ngày 5/3/2026 ban hành Bộ Quy tắc ứng xử văn hóa trên môi trường số, áp dụng cho 5 nhóm đối tượng, trong đó có tổ chức, doanh nghiệp cung cấp mạng xã hội, nền tảng số trong và ngoài nước.</w:t>
       </w:r>
     </w:p>
     <w:p>
@@ -3560,7 +3629,7 @@
         </w:numPr>
       </w:pPr>
       <w:r>
-        <w:t xml:space="preserve">Thời gian nền tảng xử lý yêu cầu rút xuống còn 3 đến 12 giờ, thay vì khoảng 24 giờ như trước.</w:t>
+        <w:t xml:space="preserve">Thời gian TikTok xử lý yêu cầu rút xuống còn 3 đến 12 giờ, thay vì khoảng 24 giờ như trước.</w:t>
       </w:r>
     </w:p>
     <w:p>
@@ -3584,7 +3653,7 @@
         </w:numPr>
       </w:pPr>
       <w:r>
-        <w:t xml:space="preserve">6 tháng đầu năm 2026: TikTok chặn, gỡ khoảng 115.000 video; YouTube gần 13.000 video; các nền tảng của Meta (Facebook, Instagram, Messenger, Threads) chặn, gỡ 63 tài khoản, trang, nhóm và 2.147 nội dung vi phạm.</w:t>
+        <w:t xml:space="preserve">6 tháng đầu năm 2026: TikTok chặn, gỡ 440 tài khoản, 10 tệp âm thanh liên quan khoảng 115.000 video và 275 nội dung; YouTube chặn, gỡ 18 kênh với gần 13.000 video; cơ quan quản lý yêu cầu các nền tảng của Meta (Facebook, Instagram, Messenger, Threads) chặn, gỡ 63 tài khoản, trang, nhóm và 2.147 nội dung vi phạm, trong đó lần đầu có 17 nội dung trên Threads; Trung tâm Xử lý tin giả, thông tin xấu độc Việt Nam tiếp nhận 1.287 phản ánh.</w:t>
       </w:r>
     </w:p>
     <w:p>
@@ -3776,7 +3845,7 @@
         </w:numPr>
       </w:pPr>
       <w:r>
-        <w:t xml:space="preserve">Vụ lật tàu Vịnh Xanh 58 (19/7/2025): tỉnh Quảng Ninh tổ chức họp báo khẩn ngay chiều 20/7/2025, công bố thông tin cứu nạn, cam kết hỗ trợ nạn nhân; báo chí cập nhật liên tục, hạn chế không gian cho tin đồn.</w:t>
+        <w:t xml:space="preserve">Vụ lật tàu Vịnh Xanh 58 (19/7/2025, 35 người tử vong, 4 người mất tích): Phó Chủ tịch UBND tỉnh Quảng Ninh chủ trì họp báo ngay chiều 20/7/2025, chưa đầy 1 ngày sau vụ việc, công bố thông tin cứu nạn; báo chí cập nhật liên tục, hạn chế không gian cho tin đồn.</w:t>
       </w:r>
     </w:p>
     <w:p>
@@ -3788,7 +3857,7 @@
         </w:numPr>
       </w:pPr>
       <w:r>
-        <w:t xml:space="preserve">Vụ quảng cáo sai sự thật kẹo rau củ Kera (2025): Bộ Y tế, Bộ VHTTDL, Bộ Công an phối hợp xử lý hành chính và hình sự; doanh nghiệp, người có ảnh hưởng công khai xin lỗi, hoàn tiền. Vụ việc để lại bài học về trách nhiệm của người có ảnh hưởng.</w:t>
+        <w:t xml:space="preserve">Vụ quảng cáo sai sự thật kẹo rau củ Kera (2025): Cơ quan Cảnh sát điều tra Bộ Công an kết luận điều tra ngày 7/9/2025, đề nghị truy tố 5 bị can về tội lừa dối khách hàng, trong đó có 3 người có ảnh hưởng; công ty hoàn trả hơn 1,3 tỷ đồng cho 3.798 khách hàng. Vụ việc để lại bài học về trách nhiệm của người có ảnh hưởng.</w:t>
       </w:r>
     </w:p>
     <w:p>
@@ -4088,7 +4157,31 @@
               <w:rPr>
                 <w:sz w:val="23"/>
               </w:rPr>
-              <w:t xml:space="preserve">Video cắt ghép, tin sai về vỡ đê, sạt lở, ngập lụt xuất hiện trong nhiều đợt mưa lũ, gây hoang mang và cản trở công tác cứu hộ</w:t>
+              <w:t xml:space="preserve">Video cắt ghép, tin sai về vỡ đê, sạt lở, ngập lụt xuất hiện trong nhiều đợt mưa lũ, gây hoang mang và cản trở công tác cứu hộ; ngày 16/9/2026, cơ quan chức năng Hà Tĩnh phạt 15 triệu đồng người đăng video cắt ghép</w:t>
+            </w:r>
+            <w:r>
+              <w:rPr>
+                <w:sz w:val="23"/>
+              </w:rPr>
+              <w:t xml:space="preserve"> </w:t>
+            </w:r>
+            <w:r>
+              <w:rPr>
+                <w:sz w:val="23"/>
+              </w:rPr>
+              <w:t xml:space="preserve">“</w:t>
+            </w:r>
+            <w:r>
+              <w:rPr>
+                <w:sz w:val="23"/>
+              </w:rPr>
+              <w:t xml:space="preserve">vỡ đê</w:t>
+            </w:r>
+            <w:r>
+              <w:rPr>
+                <w:sz w:val="23"/>
+              </w:rPr>
+              <w:t xml:space="preserve">”</w:t>
             </w:r>
           </w:p>
         </w:tc>
@@ -4302,7 +4395,37 @@
               <w:rPr>
                 <w:sz w:val="23"/>
               </w:rPr>
-              <w:t xml:space="preserve">Các trang của tổ chức khủng bố Việt Tân lợi dụng biểu tình của giới trẻ ở Nepal, Indonesia để kêu gọi giới trẻ Việt Nam xuống đường; một số tài khoản trên Threads kêu gọi</w:t>
+              <w:t xml:space="preserve">Tháng 9/2025, trang web của tổ chức khủng bố Việt Tân lợi dụng biểu tình của giới trẻ ở Nepal, Indonesia, kêu gọi</w:t>
+            </w:r>
+            <w:r>
+              <w:rPr>
+                <w:sz w:val="23"/>
+              </w:rPr>
+              <w:t xml:space="preserve"> </w:t>
+            </w:r>
+            <w:r>
+              <w:rPr>
+                <w:sz w:val="23"/>
+              </w:rPr>
+              <w:t xml:space="preserve">“</w:t>
+            </w:r>
+            <w:r>
+              <w:rPr>
+                <w:sz w:val="23"/>
+              </w:rPr>
+              <w:t xml:space="preserve">cách mạng GenZ cho Việt Nam</w:t>
+            </w:r>
+            <w:r>
+              <w:rPr>
+                <w:sz w:val="23"/>
+              </w:rPr>
+              <w:t xml:space="preserve">”</w:t>
+            </w:r>
+            <w:r>
+              <w:rPr>
+                <w:sz w:val="23"/>
+              </w:rPr>
+              <w:t xml:space="preserve">; năm 2026, một số tài khoản, trong đó có tài khoản trên Threads, lợi dụng vụ việc gây bức xúc để kêu gọi Gen Z</w:t>
             </w:r>
             <w:r>
               <w:rPr>
@@ -4481,7 +4604,7 @@
         <w:t xml:space="preserve"> </w:t>
       </w:r>
       <w:r>
-        <w:t xml:space="preserve">Vẫn còn nội dung vi phạm chưa gỡ hoặc tái xuất hiện dưới tài khoản mới; livestream, nhóm kín, ứng dụng nhắn tin khó giám sát; thuật toán tiếp tục khuếch đại nội dung gây sốc.</w:t>
+        <w:t xml:space="preserve">Vẫn còn nội dung vi phạm chưa gỡ hoặc tái xuất hiện dưới tài khoản mới; livestream, nhóm kín, ứng dụng nhắn tin khó giám sát; thuật toán tiếp tục khuếch đại nội dung gây sốc; đối tượng vi phạm dùng AI, dịch chuyển sang Threads, X, Reddit. Chế tài với nền tảng còn nhẹ: nền tảng không gỡ bỏ theo yêu cầu chỉ chịu phạt từ 30 đến 50 triệu đồng; thời hạn rút ngắn còn 6 giờ trong tình huống khẩn cấp mới áp dụng với yêu cầu của lực lượng chuyên trách thuộc Bộ Công an, chưa áp dụng với yêu cầu của Bộ VHTTDL.</w:t>
       </w:r>
     </w:p>
     <w:p>
@@ -4503,7 +4626,7 @@
         <w:t xml:space="preserve"> </w:t>
       </w:r>
       <w:r>
-        <w:t xml:space="preserve">Người phát ngôn phần lớn kiêm nhiệm, ít có cơ hội đào tạo kỹ năng truyền thông khủng hoảng; cấp xã sau sắp xếp thiếu nhân lực chuyên trách.</w:t>
+        <w:t xml:space="preserve">Người phát ngôn phần lớn kiêm nhiệm, ít có cơ hội đào tạo kỹ năng truyền thông khủng hoảng; cấp xã sau sắp xếp thiếu nhân lực chuyên trách; nhân lực giám sát, xử lý thông tin trên không gian mạng ở một số địa phương còn mỏng.</w:t>
       </w:r>
     </w:p>
     <w:p>
@@ -5435,7 +5558,7 @@
         </w:numPr>
       </w:pPr>
       <w:r>
-        <w:t xml:space="preserve">Bảo đảm thống nhất với quy trình xử lý tin giả theo Nghị định số 328/2026/NĐ-CP và các biện pháp theo Nghị định số 327/2026/NĐ-CP.</w:t>
+        <w:t xml:space="preserve">Bảo đảm thống nhất với quy trình xử lý tin giả theo Nghị định số 328/2026/NĐ-CP (Bộ Công an giúp Chính phủ quản lý nhà nước; Bộ VHTTDL phối hợp công bố, cảnh báo trên truyền thông đại chúng đối với tin giả có nguy cơ gây khủng hoảng truyền thông) và các biện pháp theo Nghị định số 327/2026/NĐ-CP.</w:t>
       </w:r>
     </w:p>
     <w:p>
@@ -5477,7 +5600,25 @@
         </w:numPr>
       </w:pPr>
       <w:r>
-        <w:t xml:space="preserve">Triển khai nghiêm Nghị định số 244/2026/NĐ-CP về phát ngôn và cung cấp thông tin cho báo chí: kiểm tra việc ban hành quy chế phát ngôn nội bộ (thời hạn 45 ngày kể từ ngày 1/7/2026); hướng dẫn phát ngôn trên tài khoản chính thức của cơ quan nhà nước trên nền tảng số; trong Quy chế phối hợp, đặt mục tiêu thông tin ban đầu sớm hơn mốc tối đa 24 giờ tại Điều 7 đối với khủng hoảng cấp độ 2 và 3.</w:t>
+        <w:t xml:space="preserve">Triển khai nghiêm Nghị định số 244/2026/NĐ-CP về phát ngôn và cung cấp thông tin cho báo chí: kiểm tra việc ban hành quy chế phát ngôn nội bộ (thời hạn 45 ngày kể từ ngày 1/7/2026); hướng dẫn phát ngôn trên tài khoản chính thức của cơ quan nhà nước trên nền tảng số; trong Quy chế phối hợp, đặt mục tiêu thông tin ban đầu sớm hơn mốc tối đa 24 giờ tại khoản 3, 4 Điều 7 đối với khủng hoảng cấp độ 2 và 3; dùng chỉ tiêu</w:t>
+      </w:r>
+      <w:r>
+        <w:t xml:space="preserve"> </w:t>
+      </w:r>
+      <w:r>
+        <w:t xml:space="preserve">“</w:t>
+      </w:r>
+      <w:r>
+        <w:t xml:space="preserve">số vụ việc phát ngôn đúng hạn</w:t>
+      </w:r>
+      <w:r>
+        <w:t xml:space="preserve">”</w:t>
+      </w:r>
+      <w:r>
+        <w:t xml:space="preserve"> </w:t>
+      </w:r>
+      <w:r>
+        <w:t xml:space="preserve">trong báo cáo hằng năm theo Điều 10 làm số liệu nền.</w:t>
       </w:r>
     </w:p>
     <w:p>
@@ -5501,7 +5642,7 @@
         </w:numPr>
       </w:pPr>
       <w:r>
-        <w:t xml:space="preserve">Hoàn thiện văn bản hướng dẫn Luật Báo chí 2025, Luật Trí tuệ nhân tạo (gắn nhãn nội dung AI); sửa đổi, bổ sung Nghị định số 147/2024/NĐ-CP theo hướng: nghĩa vụ nền tảng xử lý nhanh trong tình huống khẩn cấp; ưu tiên hiển thị thông tin chính thống khi xảy ra khủng hoảng (tham khảo Điều 48 Đạo luật Dịch vụ số của Liên minh châu Âu); báo cáo minh bạch định kỳ.</w:t>
+        <w:t xml:space="preserve">Hoàn thiện văn bản hướng dẫn Luật Báo chí 2025, Luật Trí tuệ nhân tạo (gắn nhãn nội dung AI); sửa đổi, bổ sung Nghị định số 147/2024/NĐ-CP theo hướng: rút ngắn thời hạn nền tảng xử lý yêu cầu của Bộ VHTTDL trong tình huống khẩn cấp (hiện chỉ có mốc 24 giờ, trong khi yêu cầu của lực lượng chuyên trách thuộc Bộ Công an được rút xuống 6 giờ); đề xuất nâng mức phạt đối với nền tảng xuyên biên giới không thực hiện yêu cầu ngăn chặn, gỡ bỏ (hiện từ 30 đến 50 triệu đồng theo Điều 97 Nghị định số 174/2026/NĐ-CP); ưu tiên hiển thị thông tin chính thống khi xảy ra khủng hoảng (tham khảo Điều 48 Đạo luật Dịch vụ số của Liên minh châu Âu); báo cáo minh bạch định kỳ.</w:t>
       </w:r>
     </w:p>
     <w:p>
@@ -5655,7 +5796,7 @@
         </w:numPr>
       </w:pPr>
       <w:r>
-        <w:t xml:space="preserve">Xác lập số liệu nền (thời gian phát hiện, thời gian phản hồi, tỷ lệ gỡ bỏ, thời gian kết thúc khủng hoảng) để đo lường hiệu quả hằng quý.</w:t>
+        <w:t xml:space="preserve">Xác lập số liệu nền (thời gian phát hiện, thời gian phản hồi, tỷ lệ gỡ bỏ, thời gian kết thúc khủng hoảng) để đo lường hiệu quả hằng quý, kết hợp chỉ tiêu báo cáo theo Điều 10 Nghị định số 244/2026/NĐ-CP.</w:t>
       </w:r>
     </w:p>
     <w:p>
@@ -5852,7 +5993,7 @@
         <w:t xml:space="preserve"> </w:t>
       </w:r>
       <w:r>
-        <w:t xml:space="preserve">thông tin ban đầu trong 3 giờ đối với cấp độ 3, trong 6 giờ đối với cấp độ 2, trong 24 giờ đối với cấp độ 1; họp báo hoặc thông cáo đầy đủ trong 24 giờ đối với cấp độ 2 và 3. Mốc 24 giờ là thời hạn tối đa theo Điều 7 Nghị định số 244/2026/NĐ-CP; mốc 3 giờ, 6 giờ là mục tiêu đề xuất, phù hợp tốc độ lan truyền trên mạng xã hội.</w:t>
+        <w:t xml:space="preserve">thông tin ban đầu trong 3 giờ đối với cấp độ 3, trong 6 giờ đối với cấp độ 2, trong 24 giờ đối với cấp độ 1; họp báo hoặc thông cáo đầy đủ trong 24 giờ đối với cấp độ 2 và 3. Mốc 24 giờ là thời hạn tối đa theo khoản 3, 4 Điều 7 Nghị định số 244/2026/NĐ-CP, tính từ khi cơ quan tiếp nhận vụ việc hoặc xác định vụ việc có nguy cơ tác động đến dư luận; mốc 3 giờ, 6 giờ là mục tiêu đề xuất, phù hợp tốc độ lan truyền trên mạng xã hội.</w:t>
       </w:r>
     </w:p>
     <w:p>
@@ -6138,7 +6279,7 @@
         </w:numPr>
       </w:pPr>
       <w:r>
-        <w:t xml:space="preserve">Không áp dụng biện pháp chặn nền tảng diện rộng; biện pháp kỹ thuật nhắm đúng nội dung, đúng tài khoản vi phạm (bài học từ Nepal năm 2025).</w:t>
+        <w:t xml:space="preserve">Không áp dụng biện pháp chặn nền tảng diện rộng; biện pháp kỹ thuật nhắm đúng nội dung, đúng tài khoản vi phạm (bài học từ Nepal năm 2025). Nghị định số 327/2026/NĐ-CP cho phép ngăn chặn truy cập cả nền tảng xuyên biên giới phát tán thông tin kích động bạo loạn; biện pháp này chỉ nên dùng khi các biện pháp nhắm đúng nội dung không còn hiệu quả.</w:t>
       </w:r>
     </w:p>
     <w:p>
@@ -7540,7 +7681,7 @@
         </w:numPr>
       </w:pPr>
       <w:r>
-        <w:t xml:space="preserve">Thành lập Tổ phản ứng nhanh của Bộ; duy trì đầu mối liên lạc 24/7 với các nền tảng xuyên biên giới.</w:t>
+        <w:t xml:space="preserve">Thành lập Tổ phản ứng nhanh của Bộ; duy trì đầu mối liên lạc 24/7 với các nền tảng xuyên biên giới (nền tảng có nghĩa vụ lập đầu mối phối hợp 24/7 theo Điều 22 Nghị định số 328/2026/NĐ-CP).</w:t>
       </w:r>
     </w:p>
     <w:p>
@@ -7552,7 +7693,7 @@
         </w:numPr>
       </w:pPr>
       <w:r>
-        <w:t xml:space="preserve">Tập huấn người phát ngôn của các bộ, ngành, 34 tỉnh, thành phố; chủ trì tổ chức diễn tập cấp quốc gia lần đầu trong năm 2027.</w:t>
+        <w:t xml:space="preserve">Tập huấn người phát ngôn của các bộ, ngành, 34 tỉnh, thành phố; phối hợp Bộ Công an tổ chức diễn tập truyền thông khủng hoảng cấp quốc gia lần đầu trong năm 2027, gắn với Đề án theo Quyết định số 1125/QĐ-TTg.</w:t>
       </w:r>
     </w:p>
     <w:p>
@@ -7987,7 +8128,7 @@
           <w:i/>
           <w:iCs/>
         </w:rPr>
-        <w:t xml:space="preserve">Ghi chú: mốc 24 giờ là thời hạn tối đa theo Điều 7 Nghị định số 244/2026/NĐ-CP; mốc 6 giờ, 3 giờ là mục tiêu đề xuất đưa vào Quy chế phối hợp.</w:t>
+        <w:t xml:space="preserve">Ghi chú: mốc 24 giờ là thời hạn tối đa theo khoản 3, 4 Điều 7 Nghị định số 244/2026/NĐ-CP, tính từ khi cơ quan tiếp nhận vụ việc hoặc xác định vụ việc có nguy cơ tác động đến dư luận; với sự cố mang tính quốc gia, Thủ tướng Chính phủ hoặc người phát ngôn của Chính phủ phát ngôn ngay sau khi sự cố xảy ra (khoản 1); mốc 6 giờ, 3 giờ là mục tiêu đề xuất đưa vào Quy chế phối hợp.</w:t>
       </w:r>
     </w:p>
     <w:bookmarkEnd w:id="51"/>
@@ -9037,7 +9178,7 @@
         <w:jc w:val="left"/>
       </w:pPr>
       <w:r>
-        <w:t xml:space="preserve">Nghị quyết số 80-NQ/TW ngày 7/1/2026 của Bộ Chính trị về phát triển văn hóa Việt Nam. https://www.quanlynhanuoc.vn/2026/01/13/nghi-quyet-so-80-nq-tw-ve-phat-trien-van-hoa-viet-nam/</w:t>
+        <w:t xml:space="preserve">Nghị quyết số 80-NQ/TW ngày 7/1/2026 của Bộ Chính trị về phát triển văn hóa Việt Nam (đã đọc bài giới thiệu, trích nội dung của Tạp chí Quản lý nhà nước). https://www.quanlynhanuoc.vn/2026/01/13/nghi-quyet-so-80-nq-tw-ve-phat-trien-van-hoa-viet-nam/</w:t>
       </w:r>
     </w:p>
     <w:p>
@@ -9062,7 +9203,7 @@
         <w:jc w:val="left"/>
       </w:pPr>
       <w:r>
-        <w:t xml:space="preserve">Luật Báo chí số 126/2025/QH15, hiệu lực từ 1/7/2026. https://vneconomy.vn/quoc-hoi-thong-qua-luat-bao-chi-sua-doi-voi-nhieu-diem-moi.htm</w:t>
+        <w:t xml:space="preserve">Luật Báo chí số 126/2025/QH15, hiệu lực từ 1/7/2026 (bản gốc trên Công báo; đã đọc toàn văn). https://congbao.chinhphu.vn/van-ban/luat-so-126-2025-qh15-468687.htm</w:t>
       </w:r>
     </w:p>
     <w:p>
@@ -9101,7 +9242,7 @@
         <w:jc w:val="left"/>
       </w:pPr>
       <w:r>
-        <w:t xml:space="preserve">Luật Trí tuệ nhân tạo số 134/2025/QH15, hiệu lực từ 1/3/2026. https://luatminhkhue.vn/yeu-cau-bat-buoc-doi-voi-noi-dung-tao-boi-ai-tu-1-3-2026.aspx</w:t>
+        <w:t xml:space="preserve">Luật Trí tuệ nhân tạo số 134/2025/QH15, hiệu lực từ 1/3/2026 (bản gốc trên Công báo; đã đọc toàn văn). https://congbao.chinhphu.vn/van-ban/luat-so-134-2025-qh15-468694.htm</w:t>
       </w:r>
     </w:p>
     <w:p>
@@ -9114,7 +9255,7 @@
         <w:jc w:val="left"/>
       </w:pPr>
       <w:r>
-        <w:t xml:space="preserve">Luật số 75/2025/QH15 sửa đổi, bổ sung một số điều của Luật Quảng cáo, hiệu lực từ 1/1/2026. https://thuvienphapluat.vn/van-ban/Thuong-mai/Luat-Quang-cao-sua-doi-2025-so-75-2025-QH15-555035.aspx</w:t>
+        <w:t xml:space="preserve">Luật số 75/2025/QH15 sửa đổi, bổ sung một số điều của Luật Quảng cáo, hiệu lực từ 1/1/2026 (bản gốc trên Công báo; đã đọc toàn văn). https://congbao.chinhphu.vn/van-ban/luat-so-75-2025-qh15-45566.htm</w:t>
       </w:r>
     </w:p>
     <w:p>
@@ -9127,7 +9268,7 @@
         <w:jc w:val="left"/>
       </w:pPr>
       <w:r>
-        <w:t xml:space="preserve">Luật Bảo vệ dữ liệu cá nhân số 91/2025/QH15, hiệu lực từ 1/1/2026. https://hatinh.gov.vn/vi/bai-viet/luat-bao-ve-du-lieu-ca-nhan-chinh-thuc-co-hieu-luc-thi-hanh-tu-ngay-112026</w:t>
+        <w:t xml:space="preserve">Luật Bảo vệ dữ liệu cá nhân số 91/2025/QH15, hiệu lực từ 1/1/2026 (bản gốc trên Công báo; đã đọc toàn văn); Nghị định số 356/2025/NĐ-CP ngày 31/12/2025. https://congbao.chinhphu.vn/van-ban/luat-so-91-2025-qh15-45578.htm ; https://congbao.chinhphu.vn/van-ban/nghi-dinh-so-356-2025-nd-cp-468371.htm</w:t>
       </w:r>
     </w:p>
     <w:p>
@@ -9140,32 +9281,6 @@
       </w:pPr>
       <w:r>
         <w:t xml:space="preserve">Luật Tiếp cận thông tin số 104/2016/QH13 và Luật Thực hiện dân chủ ở cơ sở số 10/2022/QH15 (tổ biên tập đối chiếu tại Cơ sở dữ liệu quốc gia về pháp luật).</w:t>
-      </w:r>
-    </w:p>
-    <w:p>
-      <w:pPr>
-        <w:pStyle w:val="Compact"/>
-        <w:numPr>
-          <w:ilvl w:val="0"/>
-          <w:numId w:val="1029"/>
-        </w:numPr>
-        <w:jc w:val="left"/>
-      </w:pPr>
-      <w:r>
-        <w:t xml:space="preserve">Điều 31 Luật Báo chí năm 2025 về cung cấp thông tin cho báo chí. https://pbgdpl.cantho.gov.vn/quy-dinh-ve-cung-cap-thong-tin-cho-bao-chi-theo-luat-bao-chi-nam-2025</w:t>
-      </w:r>
-    </w:p>
-    <w:p>
-      <w:pPr>
-        <w:pStyle w:val="Compact"/>
-        <w:numPr>
-          <w:ilvl w:val="0"/>
-          <w:numId w:val="1029"/>
-        </w:numPr>
-        <w:jc w:val="left"/>
-      </w:pPr>
-      <w:r>
-        <w:t xml:space="preserve">Thời hạn xử lý thông tin vi phạm theo Luật An ninh mạng năm 2025. https://luatvietnam.vn/tin-van-ban-moi/mang-xa-hoi-buoc-go-noi-dung-vi-pham-trong-3-6-gio-doi-voi-truong-hop-khan-cap-186-106179-article.html</w:t>
       </w:r>
     </w:p>
     <w:p>
@@ -9190,7 +9305,7 @@
         <w:jc w:val="left"/>
       </w:pPr>
       <w:r>
-        <w:t xml:space="preserve">Nghị định số 244/2026/NĐ-CP ngày 26/6/2026 quy định chi tiết việc phát ngôn và cung cấp thông tin cho báo chí của các cơ quan hành chính nhà nước, hiệu lực từ 1/7/2026, thay thế Nghị định số 09/2017/NĐ-CP. https://luatvietnam.vn/hanh-chinh/nghi-dinh-244-2026-nd-cp-quy-dinh-phat-ngon-va-cung-cap-thong-tin-cho-bao-chi-438961-d1.html</w:t>
+        <w:t xml:space="preserve">Nghị định số 244/2026/NĐ-CP ngày 26/6/2026 quy định chi tiết việc phát ngôn và cung cấp thông tin cho báo chí của các cơ quan hành chính nhà nước, hiệu lực từ 1/7/2026, thay thế Nghị định số 09/2017/NĐ-CP (bản gốc trên Công báo số 377 ngày 9/7/2026; đã đọc toàn văn). https://congbao.chinhphu.vn/van-ban/nghi-dinh-so-244-2026-nd-cp-469890.htm</w:t>
       </w:r>
     </w:p>
     <w:p>
@@ -9203,7 +9318,7 @@
         <w:jc w:val="left"/>
       </w:pPr>
       <w:r>
-        <w:t xml:space="preserve">Nghị định số 147/2024/NĐ-CP về quản lý, cung cấp, sử dụng dịch vụ Internet và thông tin trên mạng. https://vneconomy.vn/facebook-google-phai-go-bo-noi-dung-vi-pham-trong-vong-24-gio.htm</w:t>
+        <w:t xml:space="preserve">Nghị định số 147/2024/NĐ-CP ngày 9/11/2024 về quản lý, cung cấp, sử dụng dịch vụ Internet và thông tin trên mạng (bản gốc trên Công báo; đã đọc Điều 23 và các quy định về thời hạn). https://congbao.chinhphu.vn/van-ban/nghi-dinh-so-147-2024-nd-cp-43155.htm</w:t>
       </w:r>
     </w:p>
     <w:p>
@@ -9216,7 +9331,7 @@
         <w:jc w:val="left"/>
       </w:pPr>
       <w:r>
-        <w:t xml:space="preserve">Nghị định số 174/2026/NĐ-CP về xử phạt vi phạm hành chính trong lĩnh vực bưu chính, viễn thông, giao dịch điện tử và công nghệ thông tin, hiệu lực từ 1/7/2026. https://baovanhoa.vn/phap-luat/tu-17-cung-cap-chia-se-thong-tin-gia-mao-sai-su-that-tren-mang-xa-hoi-bi-phat-den-50-trieu-dong-230197.html</w:t>
+        <w:t xml:space="preserve">Nghị định số 174/2026/NĐ-CP ngày 15/5/2026 về xử phạt vi phạm hành chính trong lĩnh vực bưu chính, viễn thông, tần số vô tuyến điện, giao dịch điện tử và công nghệ thông tin, hiệu lực từ 1/7/2026 (bản gốc trên Công báo; đã đọc Điều 4 và Chương VI). https://congbao.chinhphu.vn/van-ban/nghi-dinh-so-174-2026-nd-cp-469616.htm</w:t>
       </w:r>
     </w:p>
     <w:p>
@@ -9229,7 +9344,7 @@
         <w:jc w:val="left"/>
       </w:pPr>
       <w:r>
-        <w:t xml:space="preserve">Nghị định số 219/2026/NĐ-CP ngày 21/6/2026 quy định xử phạt trong lĩnh vực khí tượng thủy văn, hiệu lực từ 8/8/2026. https://vov.vn/xa-hoi/dua-tin-sai-lech-ve-du-bao-khi-tuong-thuy-van-co-the-bi-phat-den-40-trieu-dong-post1310071.vov</w:t>
+        <w:t xml:space="preserve">Nghị định số 219/2026/NĐ-CP ngày 21/6/2026 quy định xử phạt trong lĩnh vực khí tượng thủy văn, hiệu lực từ 8/8/2026 (bản gốc trên Công báo; đã đọc Điều 4, 5, 8, 28). https://congbao.chinhphu.vn/van-ban/nghi-dinh-so-219-2026-nd-cp-469854.htm</w:t>
       </w:r>
     </w:p>
     <w:p>
@@ -9242,7 +9357,7 @@
         <w:jc w:val="left"/>
       </w:pPr>
       <w:r>
-        <w:t xml:space="preserve">Nghị định số 343/2026/NĐ-CP ngày 3/9/2026 quy định việc tiếp nhận và xử lý xung đột thông tin trên không gian mạng. https://www.vietnamplus.vn/quy-dinh-viec-tiep-nhan-va-xu-ly-xung-dot-thong-tin-tren-khong-gian-mang-post1134300.vnp</w:t>
+        <w:t xml:space="preserve">Nghị định số 343/2026/NĐ-CP ngày 3/9/2026 quy định chi tiết một số điều của Luật An ninh mạng thuộc phạm vi quản lý của Bộ Quốc phòng (bản gốc trên Công báo; đã đọc các điều về xung đột thông tin). https://congbao.chinhphu.vn/van-ban/nghi-dinh-so-343-2026-nd-cp-470391.htm</w:t>
       </w:r>
     </w:p>
     <w:p>
@@ -9255,7 +9370,7 @@
         <w:jc w:val="left"/>
       </w:pPr>
       <w:r>
-        <w:t xml:space="preserve">Nghị định số 298/2026/NĐ-CP ngày 27/7/2026 quy định chức năng, nhiệm vụ, quyền hạn và cơ cấu tổ chức của Bộ VHTTDL. https://luatvietnam.vn/tin-van-ban-moi/tu-28-7-2026-bo-van-hoa-the-thao-va-du-lich-co-22-don-vi-truc-thuoc-186-110909-article.html</w:t>
+        <w:t xml:space="preserve">Nghị định số 298/2026/NĐ-CP ngày 27/7/2026 quy định chức năng, nhiệm vụ, quyền hạn và cơ cấu tổ chức của Bộ VHTTDL (bản gốc trên Công báo; đã đọc toàn văn). https://congbao.chinhphu.vn/van-ban/nghi-dinh-so-298-2026-nd-cp-470179.htm</w:t>
       </w:r>
     </w:p>
     <w:p>
@@ -9268,7 +9383,7 @@
         <w:jc w:val="left"/>
       </w:pPr>
       <w:r>
-        <w:t xml:space="preserve">Nghị định số 327/2026/NĐ-CP ngày 19/8/2026 quy định chi tiết Điều 14 Luật An ninh mạng. https://www.vietnamplus.vn/xu-ly-hanh-vi-su-dung-cong-nghe-thong-tin-xam-pham-an-ninh-quoc-gia-tren-khong-gian-mang-post1131676.vnp</w:t>
+        <w:t xml:space="preserve">Nghị định số 327/2026/NĐ-CP ngày 19/8/2026 quy định chi tiết Điều 14 Luật An ninh mạng (bản gốc trên Công báo; đã đọc toàn văn). https://congbao.chinhphu.vn/van-ban/nghi-dinh-so-327-2026-nd-cp-470332.htm</w:t>
       </w:r>
     </w:p>
     <w:p>
@@ -9281,7 +9396,7 @@
         <w:jc w:val="left"/>
       </w:pPr>
       <w:r>
-        <w:t xml:space="preserve">Nghị định số 328/2026/NĐ-CP ngày 19/8/2026 quy định quy trình phát hiện, kiểm chứng và xử lý tin giả, tin sai sự thật, hiệu lực từ 5/10/2026. https://baovanhoa.vn/bao-chi/tu-510-quy-trinh-xu-ly-tin-gia-tin-sai-su-that-theo-quy-dinh-moi-258189.html</w:t>
+        <w:t xml:space="preserve">Nghị định số 328/2026/NĐ-CP ngày 19/8/2026 quy định phòng, chống tin giả, tin sai sự thật, hiệu lực từ 5/10/2026 (bản gốc trên Công báo; đã đọc toàn văn). https://congbao.chinhphu.vn/van-ban/nghi-dinh-so-328-2026-nd-cp-470333.htm</w:t>
       </w:r>
     </w:p>
     <w:p>
@@ -9294,7 +9409,7 @@
         <w:jc w:val="left"/>
       </w:pPr>
       <w:r>
-        <w:t xml:space="preserve">Quyết định số 329/QĐ-TTg ngày 24/2/2026 ban hành Kế hoạch triển khai thi hành Luật Báo chí. https://tapchicongthuong.vn/ke-hoach-trien-khai-thi-hanh-luat-bao-chi-460311.htm</w:t>
+        <w:t xml:space="preserve">Quyết định số 329/QĐ-TTg ngày 24/2/2026 ban hành Kế hoạch triển khai thi hành Luật Báo chí (bản gốc trên Công báo; đã đọc toàn văn). https://congbao.chinhphu.vn/van-ban/quyet-dinh-so-329-qd-ttg-468999.htm</w:t>
       </w:r>
     </w:p>
     <w:p>
@@ -9322,7 +9437,10 @@
         <w:t xml:space="preserve">”</w:t>
       </w:r>
       <w:r>
-        <w:t xml:space="preserve">. https://luatvietnam.vn/an-ninh-trat-tu/quyet-dinh-1125-qd-ttg-2026-phe-duyet-de-an-tuyen-truyen-phong-ngua-ung-pho-de-doa-an-ninh-phi-truyen-thong-438517-d1.html</w:t>
+        <w:t xml:space="preserve"> </w:t>
+      </w:r>
+      <w:r>
+        <w:t xml:space="preserve">(bản gốc trên Công báo; đã đọc toàn văn). https://congbao.chinhphu.vn/van-ban/quyet-dinh-so-1125-qd-ttg-469843.htm</w:t>
       </w:r>
     </w:p>
     <w:p>
@@ -9335,7 +9453,7 @@
         <w:jc w:val="left"/>
       </w:pPr>
       <w:r>
-        <w:t xml:space="preserve">Quyết định số 423/QĐ-BVHTTDL ngày 5/3/2026 ban hành Bộ Quy tắc ứng xử văn hóa trên môi trường số. https://nhandan.vn/ocop/ban-hanh-bo-quy-tac-ung-xu-van-hoa-tren-moi-truong-so-post948106.html</w:t>
+        <w:t xml:space="preserve">Quyết định số 423/QĐ-BVHTTDL ngày 5/3/2026 ban hành Bộ Quy tắc ứng xử văn hóa trên môi trường số (không đăng Công báo; đã đọc bài đưa tin của Báo Nhân Dân). https://nhandan.vn/ocop/ban-hanh-bo-quy-tac-ung-xu-van-hoa-tren-moi-truong-so-post948106.html</w:t>
       </w:r>
     </w:p>
     <w:p>
@@ -9348,7 +9466,7 @@
         <w:jc w:val="left"/>
       </w:pPr>
       <w:r>
-        <w:t xml:space="preserve">Quyết định số 2559/QĐ-BVHTTDL quy định chức năng, nhiệm vụ, quyền hạn và cơ cấu tổ chức của Cục Thông tin điện tử và Chuyển đổi số. https://luatvietnam.vn/co-cau-to-chuc/quyet-dinh-2559-qd-bvhttdl-2026-quy-dinh-chuc-nang-nhiem-vu-quyen-han-va-co-cau-to-chuc-cua-cuc-thong-tin-dien-tu-va-chuyen-doi-so-449380-d1.html</w:t>
+        <w:t xml:space="preserve">Quyết định số 2559/QĐ-BVHTTDL ngày 30/9/2026 quy định chức năng, nhiệm vụ, quyền hạn và cơ cấu tổ chức của Cục Thông tin điện tử và Chuyển đổi số (không đăng Công báo; đã đọc toàn văn trên LuatVietnam). https://luatvietnam.vn/co-cau-to-chuc/quyet-dinh-2559-qd-bvhttdl-2026-quy-dinh-chuc-nang-nhiem-vu-quyen-han-va-co-cau-to-chuc-cua-cuc-thong-tin-dien-tu-va-chuyen-doi-so-449380-d1.html</w:t>
       </w:r>
     </w:p>
     <w:p>
@@ -9373,7 +9491,7 @@
         <w:jc w:val="left"/>
       </w:pPr>
       <w:r>
-        <w:t xml:space="preserve">DataReportal, Digital 2026: Vietnam. https://datareportal.com/reports/digital-2026-vietnam</w:t>
+        <w:t xml:space="preserve">DataReportal, Digital 2026: Vietnam (đã đọc toàn văn). https://datareportal.com/reports/digital-2026-vietnam</w:t>
       </w:r>
     </w:p>
     <w:p>
@@ -9386,7 +9504,7 @@
         <w:jc w:val="left"/>
       </w:pPr>
       <w:r>
-        <w:t xml:space="preserve">Tỷ lệ chặn, gỡ trên 94% trên nền tảng xuyên biên giới, 6 tháng đầu năm 2026. https://www.sggp.org.vn/go-bo-hon-94-noi-dung-xau-doc-tren-nen-tang-xuyen-bien-gioi-post858921.html</w:t>
+        <w:t xml:space="preserve">Tỷ lệ chặn, gỡ trên 94% trên nền tảng xuyên biên giới, 6 tháng đầu năm 2026 (Sài Gòn Giải Phóng; đã đọc toàn văn). https://www.sggp.org.vn/go-bo-hon-94-noi-dung-xau-doc-tren-nen-tang-xuyen-bien-gioi-post858921.html</w:t>
       </w:r>
     </w:p>
     <w:p>
@@ -9399,7 +9517,7 @@
         <w:jc w:val="left"/>
       </w:pPr>
       <w:r>
-        <w:t xml:space="preserve">Cơ quan chức năng chặn, gỡ hơn 117.000 nội dung trên mạng xã hội sau 6 tháng đầu năm 2026. https://znews.vn/hon-117000-noi-dung-tren-mang-xa-hoi-bi-chan-go-sau-6-thang-post1663043.html</w:t>
+        <w:t xml:space="preserve">Cơ quan chức năng chặn, gỡ hơn 117.000 nội dung trên mạng xã hội sau 6 tháng đầu năm 2026 (Znews; đã đọc toàn văn). https://znews.vn/hon-117000-noi-dung-tren-mang-xa-hoi-bi-chan-go-sau-6-thang-post1663043.html</w:t>
       </w:r>
     </w:p>
     <w:p>
@@ -9412,7 +9530,7 @@
         <w:jc w:val="left"/>
       </w:pPr>
       <w:r>
-        <w:t xml:space="preserve">Tỷ lệ chặn, gỡ trên 92% giai đoạn 2021-2025. https://www.sggp.org.vn/go-bo-tren-92-thong-tin-xau-doc-tren-facebook-youtube-tiktok-post830682.html</w:t>
+        <w:t xml:space="preserve">Tỷ lệ chặn, gỡ trên 92% giai đoạn 2021-2025 (Sài Gòn Giải Phóng; đã đọc toàn văn). https://www.sggp.org.vn/go-bo-tren-92-thong-tin-xau-doc-tren-facebook-youtube-tiktok-post830682.html</w:t>
       </w:r>
     </w:p>
     <w:p>
@@ -9425,7 +9543,7 @@
         <w:jc w:val="left"/>
       </w:pPr>
       <w:r>
-        <w:t xml:space="preserve">Hơn 12.200 thông tin xấu độc trên mạng bị gỡ bỏ trong quý III/2025 (Báo Điện tử Chính phủ). https://baochinhphu.vn/hon-12200-thong-tin-xau-doc-tren-mang-bi-go-bo-102251010182038234.htm</w:t>
+        <w:t xml:space="preserve">Hơn 12.200 thông tin xấu độc trên mạng bị gỡ bỏ trong quý III/2025 (Báo Điện tử Chính phủ; trang chặn truy cập tự động, chưa đọc được). https://baochinhphu.vn/hon-12200-thong-tin-xau-doc-tren-mang-bi-go-bo-102251010182038234.htm</w:t>
       </w:r>
     </w:p>
     <w:p>
@@ -9451,7 +9569,7 @@
         <w:jc w:val="left"/>
       </w:pPr>
       <w:r>
-        <w:t xml:space="preserve">Bộ Công an cảnh báo tình trạng dùng AI, deepfake để lừa đảo trên không gian mạng (Tuổi Trẻ, 3/6/2026). https://tuoitre.vn/bo-cong-an-canh-bao-tinh-trang-dung-ai-deepfake-de-lua-dao-tren-khong-gian-mang-2026060317353666.htm</w:t>
+        <w:t xml:space="preserve">Bộ Công an cảnh báo tình trạng dùng AI, deepfake để lừa đảo trên không gian mạng (Tuổi Trẻ, 3/6/2026; đã đọc toàn văn). https://tuoitre.vn/bo-cong-an-canh-bao-tinh-trang-dung-ai-deepfake-de-lua-dao-tren-khong-gian-mang-2026060317353666.htm</w:t>
       </w:r>
     </w:p>
     <w:p>
@@ -9464,7 +9582,7 @@
         <w:jc w:val="left"/>
       </w:pPr>
       <w:r>
-        <w:t xml:space="preserve">Reuters Institute, Digital News Report 2026 (tóm tắt). https://www.benton.org/headlines/reuters-institute-digital-news-report-2026</w:t>
+        <w:t xml:space="preserve">Reuters Institute, Digital News Report 2026, phần Tóm tắt (bản gốc; đã đọc toàn văn). https://reutersinstitute.politics.ox.ac.uk/digital-news-report/2026/dnr-executive-summary</w:t>
       </w:r>
     </w:p>
     <w:p>
@@ -9477,7 +9595,7 @@
         <w:jc w:val="left"/>
       </w:pPr>
       <w:r>
-        <w:t xml:space="preserve">Họp báo vụ lật tàu Vịnh Xanh 58 trên vịnh Hạ Long. https://tuoitre.vn/hop-bao-vu-lat-tau-o-ha-long-lam-35-nguoi-chet-co-gang-tim-nguoi-mat-tich-truoc-toi-nay-20250720132901673.htm</w:t>
+        <w:t xml:space="preserve">Họp báo vụ lật tàu Vịnh Xanh 58 trên vịnh Hạ Long (Tuổi Trẻ, 20/7/2025; đã đọc toàn văn). https://tuoitre.vn/hop-bao-vu-lat-tau-o-ha-long-lam-35-nguoi-chet-co-gang-tim-nguoi-mat-tich-truoc-toi-nay-20250720132901673.htm</w:t>
       </w:r>
     </w:p>
     <w:p>
@@ -9490,7 +9608,7 @@
         <w:jc w:val="left"/>
       </w:pPr>
       <w:r>
-        <w:t xml:space="preserve">Vụ kẹo rau củ Kera. https://vneconomy.vn/vu-keo-kera-cac-kol-phong-dai-cong-dung-san-pham-de-lua-doi-khach-hang.htm</w:t>
+        <w:t xml:space="preserve">Vụ kẹo rau củ Kera: kết luận điều tra ngày 7/9/2025 (VnEconomy; đã đọc toàn văn). https://vneconomy.vn/vu-keo-kera-cac-kol-phong-dai-cong-dung-san-pham-de-lua-doi-khach-hang.htm</w:t>
       </w:r>
     </w:p>
     <w:p>
@@ -9521,7 +9639,7 @@
         <w:t xml:space="preserve"> </w:t>
       </w:r>
       <w:r>
-        <w:t xml:space="preserve">đạt doanh thu kỷ lục. https://baolaocai.vn/doanh-thu-gan-552-ty-dong-mua-do-chinh-thuc-tro-thanh-phim-an-khach-nhat-moi-thoi-dai-rap-chieu-viet-nam-post881538.html</w:t>
+        <w:t xml:space="preserve">đạt doanh thu kỷ lục (Báo Lào Cai; đã đọc toàn văn). https://baolaocai.vn/doanh-thu-gan-552-ty-dong-mua-do-chinh-thuc-tro-thanh-phim-an-khach-nhat-moi-thoi-dai-rap-chieu-viet-nam-post881538.html</w:t>
       </w:r>
     </w:p>
     <w:p>
@@ -9546,7 +9664,7 @@
         <w:jc w:val="left"/>
       </w:pPr>
       <w:r>
-        <w:t xml:space="preserve">Lần đầu tiên chặn, gỡ nội dung vi phạm trên mạng xã hội Threads (Tuổi Trẻ, 25/6/2026). https://tuoitre.vn/lan-dau-tien-chan-go-noi-dung-vi-pham-tren-mang-xa-hoi-threads-100260625131951823.htm</w:t>
+        <w:t xml:space="preserve">Lần đầu tiên chặn, gỡ nội dung vi phạm trên mạng xã hội Threads (Tuổi Trẻ, 25/6/2026; đã đọc toàn văn). https://tuoitre.vn/lan-dau-tien-chan-go-noi-dung-vi-pham-tren-mang-xa-hoi-threads-100260625131951823.htm</w:t>
       </w:r>
     </w:p>
     <w:p>
@@ -9559,7 +9677,7 @@
         <w:jc w:val="left"/>
       </w:pPr>
       <w:r>
-        <w:t xml:space="preserve">Threads đạt mốc 500 triệu người dùng hằng tháng (VietnamPlus). https://www.vietnamplus.vn/mang-xa-hoi-threads-dat-moc-500-trieu-nguoi-dung-hang-thang-sau-gan-3-nam-post1117039.vnp</w:t>
+        <w:t xml:space="preserve">Threads đạt mốc 500 triệu người dùng hằng tháng (VietnamPlus, 6/2026; đã đọc toàn văn). https://www.vietnamplus.vn/mang-xa-hoi-threads-dat-moc-500-trieu-nguoi-dung-hang-thang-sau-gan-3-nam-post1117039.vnp</w:t>
       </w:r>
     </w:p>
     <w:p>
@@ -9572,7 +9690,7 @@
         <w:jc w:val="left"/>
       </w:pPr>
       <w:r>
-        <w:t xml:space="preserve">Ước tính số người dùng Threads tại Việt Nam (nguồn thị trường, chưa chính thức). https://raccoon.vn/chi-tiet-tin-tuc/thong-ke-so-nguoi-viet-nam-su-dung-mang-xa-hoi-threads-hien-nay-352</w:t>
+        <w:t xml:space="preserve">Ước tính số người dùng Threads tại Việt Nam (nguồn thị trường, chưa chính thức; đã đọc toàn văn). https://raccoon.vn/chi-tiet-tin-tuc/thong-ke-so-nguoi-viet-nam-su-dung-mang-xa-hoi-threads-hien-nay-352</w:t>
       </w:r>
     </w:p>
     <w:p>
@@ -9598,7 +9716,7 @@
         <w:jc w:val="left"/>
       </w:pPr>
       <w:r>
-        <w:t xml:space="preserve">Khởi công dự án Làng Vân dưới chân đèo Hải Vân (Tuổi Trẻ, 22/6/2025). https://tuoitre.vn/vingroup-khoi-cong-du-an-44-000-ti-dong-duoi-chan-deo-hai-van-da-nang-20250622114340955.htm</w:t>
+        <w:t xml:space="preserve">Khởi công dự án Làng Vân dưới chân đèo Hải Vân (Tuổi Trẻ, 22/6/2025; đã đọc toàn văn). https://tuoitre.vn/vingroup-khoi-cong-du-an-44-000-ti-dong-duoi-chan-deo-hai-van-da-nang-20250622114340955.htm</w:t>
       </w:r>
     </w:p>
     <w:p>
@@ -9611,7 +9729,7 @@
         <w:jc w:val="left"/>
       </w:pPr>
       <w:r>
-        <w:t xml:space="preserve">Sở Tài chính Hà Nội: dự án Safari Ba Vì mới là đề xuất của nhà đầu tư (Tuổi Trẻ, 5/10/2026). https://tuoitre.vn/so-tai-chinh-ha-noi-du-an-safari-ba-vi-moi-la-de-xuat-cua-nha-dau-tu-chua-phai-chu-truong-cua-ha-noi-100261005165353826.htm</w:t>
+        <w:t xml:space="preserve">Sở Tài chính Hà Nội: dự án Safari Ba Vì mới là đề xuất của nhà đầu tư (Tuổi Trẻ, 5/10/2026; đã đọc toàn văn). https://tuoitre.vn/so-tai-chinh-ha-noi-du-an-safari-ba-vi-moi-la-de-xuat-cua-nha-dau-tu-chua-phai-chu-truong-cua-ha-noi-100261005165353826.htm</w:t>
       </w:r>
     </w:p>
     <w:p>
@@ -9624,7 +9742,7 @@
         <w:jc w:val="left"/>
       </w:pPr>
       <w:r>
-        <w:t xml:space="preserve">Dự án Safari Ba Vì giảm diện tích từ 580 ha xuống khoảng 300 ha (Dân trí, 5/10/2026). https://dantri.com.vn/thoi-su/du-an-safari-ba-vi-giam-gan-mot-nua-dien-tich-tu-580ha-xuong-khoang-300ha-20261005181057335.htm</w:t>
+        <w:t xml:space="preserve">Dự án Safari Ba Vì giảm diện tích từ 580 ha xuống khoảng 300 ha (Dân trí, 5/10/2026; đã đọc toàn văn). https://dantri.com.vn/thoi-su/du-an-safari-ba-vi-giam-gan-mot-nua-dien-tich-tu-580ha-xuong-khoang-300ha-20261005181057335.htm</w:t>
       </w:r>
     </w:p>
     <w:p>
@@ -9681,7 +9799,7 @@
         <w:t xml:space="preserve"> </w:t>
       </w:r>
       <w:r>
-        <w:t xml:space="preserve">(Báo Lào Cai). https://baolaocai.vn/canh-giac-am-muu-loi-dung-bieu-tinh-bao-loan-o-indonesia-nepal-de-kich-dong-cach-mang-mau-post882057.html</w:t>
+        <w:t xml:space="preserve">(Báo Lào Cai, 14/9/2025; đã đọc toàn văn). https://baolaocai.vn/canh-giac-am-muu-loi-dung-bieu-tinh-bao-loan-o-indonesia-nepal-de-kich-dong-cach-mang-mau-post882057.html</w:t>
       </w:r>
     </w:p>
     <w:p>
@@ -9694,7 +9812,7 @@
         <w:jc w:val="left"/>
       </w:pPr>
       <w:r>
-        <w:t xml:space="preserve">Để Gen Z không bị cuốn vào dòng xoáy thông tin gây bất ổn xã hội (Báo Công an nhân dân). https://cand.vn/de-gen-z-khong-bi-cuon-vao-dong-xoay-thong-tin-gay-bat-on-xa-hoi-post820186.html</w:t>
+        <w:t xml:space="preserve">Để Gen Z không bị cuốn vào dòng xoáy thông tin gây bất ổn xã hội (Báo Công an nhân dân, 23/8/2026; đã đọc toàn văn). https://cand.vn/de-gen-z-khong-bi-cuon-vao-dong-xoay-thong-tin-gay-bat-on-xa-hoi-post820186.html</w:t>
       </w:r>
     </w:p>
     <w:p>
@@ -9707,7 +9825,7 @@
         <w:jc w:val="left"/>
       </w:pPr>
       <w:r>
-        <w:t xml:space="preserve">Tin giả trong mùa mưa lũ đặc biệt nguy hiểm (Sức khỏe và Đời sống, 17/9/2026). https://suckhoedoisong.vn/tin-gia-trong-mua-mua-lu-dac-biet-nguy-hiem-co-the-gay-chet-nguoi-169260917101216227.htm</w:t>
+        <w:t xml:space="preserve">Tin giả trong mùa mưa lũ đặc biệt nguy hiểm (Sức khỏe và Đời sống, 17/9/2026; đã đọc toàn văn). https://suckhoedoisong.vn/tin-gia-trong-mua-mua-lu-dac-biet-nguy-hiem-co-the-gay-chet-nguoi-169260917101216227.htm</w:t>
       </w:r>
     </w:p>
     <w:bookmarkEnd w:id="54"/>
@@ -9797,7 +9915,7 @@
               <w:rPr>
                 <w:sz w:val="23"/>
               </w:rPr>
-              <w:t xml:space="preserve">Đối chiếu toàn văn các luật, nghị định tại Phần II, mục 1 và Phụ lục 4 (dự thảo này mới tổng hợp từ báo chí và trang pháp luật thứ cấp, chưa đọc toàn văn), nhất là Điều 7 Nghị định số 244/2026/NĐ-CP, thời hạn 24 giờ, 6 giờ tại Điều 25 Luật An ninh mạng năm 2025 (đã đọc văn bản gốc) chỉ áp dụng với yêu cầu của lực lượng chuyên trách bảo vệ an ninh mạng thuộc Bộ Công an, cần làm rõ thời hạn áp dụng với yêu cầu của Bộ VHTTDL theo Nghị định số 147/2024/NĐ-CP, phạm vi Nghị định số 219/2026/NĐ-CP và Nghị định số 343/2026/NĐ-CP</w:t>
+              <w:t xml:space="preserve">Đã đối chiếu toàn văn 16 luật, nghị định, quyết định trên Công báo (dự thảo 5, 6). Còn lại: Quyết định số 423/QĐ-BVHTTDL, 2559/QĐ-BVHTTDL (không đăng Công báo, đối chiếu qua báo chí, LuatVietnam), Nghị quyết số 35-NQ/TW. Cần làm rõ: thời hạn 24 giờ, 6 giờ tại Điều 25 Luật An ninh mạng năm 2025 chỉ áp dụng với yêu cầu của lực lượng chuyên trách thuộc Bộ Công an; yêu cầu của Bộ VHTTDL theo Nghị định số 147/2024/NĐ-CP chỉ có mốc 24 giờ, chưa có mốc rút ngắn cho tình huống khẩn cấp</w:t>
             </w:r>
           </w:p>
         </w:tc>
@@ -9832,7 +9950,7 @@
               <w:rPr>
                 <w:sz w:val="23"/>
               </w:rPr>
-              <w:t xml:space="preserve">Số liệu chính thức chặn, gỡ thông tin vi phạm quý III và 9 tháng năm 2026 (chưa công bố công khai); số liệu nền về thời gian phát hiện, phản hồi</w:t>
+              <w:t xml:space="preserve">Số liệu chính thức chặn, gỡ thông tin vi phạm quý III và 9 tháng năm 2026 (chưa công bố công khai); số liệu quý III/2025 (12.200 thông tin; Facebook 10.713 bài viết) chưa đối chiếu được do trang Báo Điện tử Chính phủ chặn truy cập tự động; số liệu nền về thời gian phát hiện, phản hồi</w:t>
             </w:r>
           </w:p>
         </w:tc>
@@ -10042,7 +10160,7 @@
               <w:rPr>
                 <w:sz w:val="23"/>
               </w:rPr>
-              <w:t xml:space="preserve">Mô hình tổ chức, cơ quan chủ quản hiện hành của Trung tâm Xử lý tin giả Việt Nam sau sắp xếp</w:t>
+              <w:t xml:space="preserve">Mô hình tổ chức, cơ quan chủ quản hiện hành của Trung tâm Xử lý tin giả, thông tin xấu độc Việt Nam sau sắp xếp (Quyết định số 2559/QĐ-BVHTTDL không liệt kê Trung tâm trong cơ cấu Cục Thông tin điện tử và Chuyển đổi số)</w:t>
             </w:r>
           </w:p>
         </w:tc>
@@ -10077,7 +10195,7 @@
               <w:rPr>
                 <w:sz w:val="23"/>
               </w:rPr>
-              <w:t xml:space="preserve">Thẩm quyền, cơ quan chủ trì từng bước trong quy trình xử lý tin giả theo Nghị định số 328/2026/NĐ-CP, làm cơ sở phân vai trong Quy chế phối hợp</w:t>
+              <w:t xml:space="preserve">Phân vai cụ thể giữa Bộ VHTTDL và Bộ Công an trong từng bước của quy trình theo Nghị định số 328/2026/NĐ-CP (Điều 17, 18), nhất là khâu công bố, cảnh báo tin giả có nguy cơ gây khủng hoảng truyền thông, làm cơ sở phân vai trong Quy chế phối hợp</w:t>
             </w:r>
           </w:p>
         </w:tc>
@@ -10252,7 +10370,7 @@
               <w:rPr>
                 <w:sz w:val="23"/>
               </w:rPr>
-              <w:t xml:space="preserve">Đối chiếu số liệu, nguồn kinh nghiệm quốc tế tại Phụ lục 6 (đã đối chiếu văn bản gốc phần Singapore, Anh, Liên minh châu Âu, mốc giờ của Trung Quốc, nghiên cứu Science Advances và trang hướng dẫn về Threads của Úc; phần Nepal, Pháp, Thụy Điển, Phần Lan, phần lớn kinh nghiệm Threads còn tổng hợp qua tìm kiếm)</w:t>
+              <w:t xml:space="preserve">Đối chiếu số liệu, nguồn kinh nghiệm quốc tế tại Phụ lục 6 (đã đối chiếu văn bản gốc phần Singapore, Anh, Liên minh châu Âu, Trung Quốc, Nepal, Phần Lan, WHO, nghiên cứu Science Advances và trang hướng dẫn về Threads của Úc; còn lại báo cáo VIGINUM của Pháp, năm thành lập cơ quan Thụy Điển, số liệu nền tảng bác bỏ tin đồn của Trung Quốc và phần lớn kinh nghiệm Threads)</w:t>
             </w:r>
           </w:p>
         </w:tc>
@@ -10413,7 +10531,7 @@
               <w:rPr>
                 <w:sz w:val="23"/>
               </w:rPr>
-              <w:t xml:space="preserve">Văn bản của Văn phòng Quốc vụ viện tháng 8/2016: họp báo chậm nhất 24 giờ với sự kiện đột xuất nghiêm trọng, phản hồi dư luận khác trong 48 giờ; văn bản tháng 11/2016 (nay đã hết hiệu lực): công bố thông tin chính thức chậm nhất 5 giờ, họp báo trong 24 giờ (đã đối chiếu văn bản gốc); nền tảng bác bỏ tin đồn Internet liên hợp (từ 8/2018), tích hợp hơn 40 nền tảng địa phương</w:t>
+              <w:t xml:space="preserve">Văn bản của Văn phòng Quốc vụ viện tháng 8/2016: họp báo chậm nhất 24 giờ với sự kiện đột xuất đặc biệt nghiêm trọng, nghiêm trọng, phản hồi dư luận khác trong 48 giờ (đã đối chiếu bản gốc); văn bản tháng 11/2016 (nay đã hết hiệu lực): công bố thông tin chính thức chậm nhất 5 giờ, họp báo trong 24 giờ (đã đối chiếu văn bản gốc); nền tảng bác bỏ tin đồn Internet liên hợp (từ 8/2018), tích hợp hơn 40 nền tảng địa phương</w:t>
             </w:r>
           </w:p>
         </w:tc>
@@ -10813,7 +10931,7 @@
               <w:rPr>
                 <w:sz w:val="23"/>
               </w:rPr>
-              <w:t xml:space="preserve">VIGINUM phát hiện 43 chiến dịch nhắm vào Thế vận hội Paris 2024; Phần Lan đứng đầu Chỉ số năng lực truyền thông châu Âu năm 2023 (74/100 điểm, lần thứ 6 liên tiếp)</w:t>
+              <w:t xml:space="preserve">VIGINUM phát hiện 43 chiến dịch nhắm vào Thế vận hội Paris 2024; Phần Lan đứng đầu Chỉ số năng lực truyền thông châu Âu năm 2023 với 74/100 điểm (đã đối chiếu báo cáo gốc; VIGINUM, năm thành lập cơ quan Thụy Điển chưa đối chiếu được)</w:t>
             </w:r>
           </w:p>
         </w:tc>
@@ -10974,7 +11092,7 @@
           <w:i/>
           <w:iCs/>
         </w:rPr>
-        <w:t xml:space="preserve">Ghi chú: đã đối chiếu văn bản gốc đối với mốc 5 giờ, 24 giờ của Trung Quốc; số liệu nghiên cứu trên Science Advances; Luật POFMA và bảng thống kê vụ việc POFMA của Singapore; báo cáo HC 381 và quy định của Ofcom (Anh); Đạo luật Dịch vụ số của Liên minh châu Âu; trang hướng dẫn về Threads của cơ quan An toàn điện tử Úc. Bản PDF các tài liệu này lưu tại thư mục tai-lieu cùng đề cương. Các số liệu còn lại tổng hợp qua tìm kiếm, tổ biên tập mở từng nguồn để đối chiếu trước khi sử dụng. Kinh nghiệm riêng về Threads trình bày tại bảng dưới.</w:t>
+        <w:t xml:space="preserve">Ghi chú: đã đối chiếu văn bản gốc đối với mốc 5 giờ, 24 giờ của Trung Quốc; số liệu nghiên cứu trên Science Advances; Luật POFMA và bảng thống kê vụ việc POFMA của Singapore; báo cáo HC 381 và quy định của Ofcom (Anh); Đạo luật Dịch vụ số của Liên minh châu Âu; trang hướng dẫn về Threads của cơ quan An toàn điện tử Úc; Thông báo số 61 năm 2016 của Trung Quốc; thông cáo của Singapore về Ủy ban An toàn trực tuyến; RESIST 3; diễn biến ở Nepal; khung năng lực của WHO; Chỉ số năng lực truyền thông châu Âu năm 2023. Chưa đối chiếu được: số liệu của nền tảng bác bỏ tin đồn Trung Quốc (trang chạy JavaScript), báo cáo VIGINUM (trang đang bảo trì). Bản PDF các tài liệu này lưu tại thư mục tai-lieu cùng đề cương. Các số liệu còn lại tổng hợp qua tìm kiếm, tổ biên tập mở từng nguồn để đối chiếu trước khi sử dụng. Kinh nghiệm riêng về Threads trình bày tại bảng dưới.</w:t>
       </w:r>
     </w:p>
     <w:p>
@@ -11561,7 +11679,7 @@
         <w:jc w:val="left"/>
       </w:pPr>
       <w:r>
-        <w:t xml:space="preserve">Thông báo của Văn phòng Quốc vụ viện về phản hồi dư luận chính vụ, số 61 năm 2016 (bản gốc tiếng Trung). https://www.gov.cn/zhengce/content/2016-08/12/content_5099138.htm</w:t>
+        <w:t xml:space="preserve">Thông báo của Văn phòng Quốc vụ viện về phản hồi dư luận chính vụ, số 61 năm 2016 (bản gốc tiếng Trung; đã đọc mục mốc thời gian). https://www.gov.cn/zhengce/content/2016-08/12/content_5099138.htm</w:t>
       </w:r>
     </w:p>
     <w:p>
@@ -11651,7 +11769,7 @@
         <w:jc w:val="left"/>
       </w:pPr>
       <w:r>
-        <w:t xml:space="preserve">Thông cáo về Ủy ban An toàn trực tuyến và Đạo luật năm 2025. https://www.mlaw.gov.sg/online-safety-commission-and-online-safety-relief-and-accountability-act-2025-to-start-on-29-june-2026/</w:t>
+        <w:t xml:space="preserve">Thông cáo về Ủy ban An toàn trực tuyến và Đạo luật năm 2025 (đã đọc toàn văn). https://www.mlaw.gov.sg/online-safety-commission-and-online-safety-relief-and-accountability-act-2025-to-start-on-29-june-2026/</w:t>
       </w:r>
     </w:p>
     <w:p>
@@ -11727,7 +11845,7 @@
         <w:jc w:val="left"/>
       </w:pPr>
       <w:r>
-        <w:t xml:space="preserve">Bộ công cụ RESIST 3, công bố 29/10/2025 (toàn văn trên trang web). https://www.communications.gov.uk/publications/resist-3-building-resilience-to-information-threats</w:t>
+        <w:t xml:space="preserve">Bộ công cụ RESIST 3, công bố 29/10/2025 (toàn văn trên trang web; đã đối chiếu ngày công bố, 6 bước). https://www.communications.gov.uk/publications/resist-3-building-resilience-to-information-threats</w:t>
       </w:r>
     </w:p>
     <w:p>
@@ -11793,7 +11911,7 @@
         <w:jc w:val="left"/>
       </w:pPr>
       <w:r>
-        <w:t xml:space="preserve">Diễn biến biểu tình của giới trẻ năm 2025. https://restofworld.org/2025/nepal-gen-z-protest/ ; https://www.cbsnews.com/news/nepal-protests-social-media-ban-prime-minister-oli-resigns/</w:t>
+        <w:t xml:space="preserve">Diễn biến biểu tình của giới trẻ năm 2025 (đã đọc toàn văn 2 bài). https://restofworld.org/2025/nepal-gen-z-protest/ ; https://www.cbsnews.com/news/nepal-protests-social-media-ban-prime-minister-oli-resigns/</w:t>
       </w:r>
     </w:p>
     <w:p>
@@ -11818,7 +11936,7 @@
         <w:jc w:val="left"/>
       </w:pPr>
       <w:r>
-        <w:t xml:space="preserve">Báo cáo của VIGINUM về Thế vận hội Paris 2024 (PDF). https://www.vie-publique.fr/files/rapport/pdf/295411.pdf</w:t>
+        <w:t xml:space="preserve">Báo cáo của VIGINUM về Thế vận hội Paris 2024 (PDF; trang đang bảo trì, chưa đọc được). https://www.vie-publique.fr/files/rapport/pdf/295411.pdf</w:t>
       </w:r>
     </w:p>
     <w:p>
@@ -11857,7 +11975,7 @@
         <w:jc w:val="left"/>
       </w:pPr>
       <w:r>
-        <w:t xml:space="preserve">Chỉ số năng lực truyền thông châu Âu năm 2023 (PDF). https://osis.bg/wp-content/uploads/2023/06/MLI-report-in-English-22.06.pdf</w:t>
+        <w:t xml:space="preserve">Chỉ số năng lực truyền thông châu Âu năm 2023 (PDF; đã đọc phần xếp hạng). https://osis.bg/wp-content/uploads/2023/06/MLI-report-in-English-22.06.pdf</w:t>
       </w:r>
     </w:p>
     <w:p>
@@ -11945,10 +12063,7 @@
         <w:t xml:space="preserve">”</w:t>
       </w:r>
       <w:r>
-        <w:t xml:space="preserve"> </w:t>
-      </w:r>
-      <w:r>
-        <w:t xml:space="preserve">(2021). https://www.who.int/publications/i/item/9789240035287</w:t>
+        <w:t xml:space="preserve">, công bố 15/9/2021 (đã đọc trang giới thiệu). https://www.who.int/publications/i/item/9789240035287</w:t>
       </w:r>
     </w:p>
     <w:p>

</xml_diff>

<commit_message>
Dự thảo 7: đối chiếu thông cáo phạt X và số liệu hạn chế nội dung của Meta
- Ủy ban châu Âu phạt X 120 triệu euro vì vi phạm nghĩa vụ minh bạch (dấu tích xanh, kho quảng cáo, dữ liệu cho nhà nghiên cứu), không phải vì nội dung
- Số liệu gốc của Meta: 9.749 nội dung hạn chế tại Việt Nam 6 tháng đầu năm 2026, gấp 3,2 lần cùng kỳ năm 2025
- Phụ lục 5: đề nghị giải thích chênh lệch với con số 2.147 nội dung do Cục công bố

Co-Authored-By: Claude Opus 5.5 <noreply@anthropic.com>
Claude-Session: https://claude.ai/code/session_01NzZ78rAanjcMCsGwt7jxAb
</commit_message>
<xml_diff>
--- a/tham-luan-khung-hoang-truyen-thong/de-cuong-tham-luan-bvhttdl.docx
+++ b/tham-luan-khung-hoang-truyen-thong/de-cuong-tham-luan-bvhttdl.docx
@@ -258,7 +258,7 @@
         <w:pStyle w:val="ThongTinChung"/>
       </w:pPr>
       <w:r>
-        <w:t xml:space="preserve">Dự thảo 6, ngày 28/10/2026. Tài liệu làm việc phục vụ tổ biên tập.</w:t>
+        <w:t xml:space="preserve">Dự thảo 7, ngày 28/10/2026. Tài liệu làm việc phục vụ tổ biên tập.</w:t>
       </w:r>
     </w:p>
     <w:bookmarkStart w:id="20" w:name="tóm-tắt"/>
@@ -376,6 +376,24 @@
       </w:r>
       <w:r>
         <w:t xml:space="preserve">Đối chiếu toàn văn 15 văn bản pháp luật gốc trên Công báo (Luật Báo chí, Luật Trí tuệ nhân tạo, Luật Bảo vệ dữ liệu cá nhân, Luật Quảng cáo sửa đổi; Nghị định số 147/2024/NĐ-CP, 356/2025/NĐ-CP, 174, 219, 244, 298, 327, 328, 343/2026/NĐ-CP; Quyết định số 329/QĐ-TTg, 1125/QĐ-TTg) và 29 nguồn tin, báo cáo. Sửa 9 điểm sai hoặc chưa chính xác, quan trọng nhất: mức phạt 50 triệu đồng của Nghị định số 174/2026/NĐ-CP là mức với tổ chức, cá nhân tối đa 25 triệu đồng; mốc 24 giờ của Nghị định số 244/2026/NĐ-CP tính từ khi cơ quan tiếp nhận vụ việc; tên, phạm vi Nghị định số 328/2026/NĐ-CP và 343/2026/NĐ-CP; thời gian xử lý 3 đến 12 giờ là của TikTok; diễn biến vụ Kera; chi tiết deepfake mạo danh không có trong nguồn. Bổ sung căn cứ: Nghị định số 244/2026/NĐ-CP, 328/2026/NĐ-CP và Quyết định số 1125/QĐ-TTg đều nêu nhiệm vụ hạn chế, xử lý khủng hoảng truyền thông; khoảng trống về thời hạn khẩn cấp và mức phạt đối với nền tảng (Phần II, mục 1, 3; Phần III, nhóm 2, 3, 6; Kết luận; Phụ lục 1, 4, 5, 6).</w:t>
+      </w:r>
+    </w:p>
+    <w:p>
+      <w:pPr>
+        <w:pStyle w:val="BodyText"/>
+      </w:pPr>
+      <w:r>
+        <w:rPr>
+          <w:b/>
+          <w:bCs/>
+        </w:rPr>
+        <w:t xml:space="preserve">Điểm mới của dự thảo 7.</w:t>
+      </w:r>
+      <w:r>
+        <w:t xml:space="preserve"> </w:t>
+      </w:r>
+      <w:r>
+        <w:t xml:space="preserve">Đối chiếu thông cáo gốc của Ủy ban châu Âu về khoản phạt X và bộ số liệu hạn chế nội dung theo quốc gia của Meta. Ghi rõ Ủy ban châu Âu phạt X vì vi phạm nghĩa vụ minh bạch, không phải vì nội dung; xác nhận Meta hạn chế 9.749 nội dung tại Việt Nam trong 6 tháng đầu năm 2026, gấp 3,2 lần cùng kỳ; đề nghị Cục Thông tin điện tử và Chuyển đổi số giải thích chênh lệch với số liệu của Cục (Phần II, mục 6; Phụ lục 5, 6).</w:t>
       </w:r>
     </w:p>
     <w:p>
@@ -5068,7 +5086,7 @@
         <w:t xml:space="preserve"> </w:t>
       </w:r>
       <w:r>
-        <w:t xml:space="preserve">Đạo luật Dịch vụ số của Liên minh châu Âu buộc nền tảng rất lớn đánh giá, giảm thiểu rủi ro hệ thống hằng năm; khi có khủng hoảng, Ủy ban châu Âu có quyền ra quyết định công khai buộc nền tảng áp dụng biện pháp trong thời hạn không quá 3 tháng (Điều 36); giao thức khủng hoảng gồm hiển thị nổi bật thông tin của cơ quan nhà nước và đầu mối liên lạc khủng hoảng (Điều 48); mức phạt tối đa 6% tổng doanh thu toàn cầu (Điều 74); tháng 12/2025, Ủy ban châu Âu phạt X 120 triệu euro. Ngày 9/6/2026, cơ quan quản lý truyền thông Anh (Ofcom) quyết định yêu cầu nền tảng quy mô lớn có rủi ro trung bình và nền tảng mọi quy mô có rủi ro cao lập giao thức ứng phó khủng hoảng bằng văn bản, gồm: bộ chỉ số nhận diện khủng hoảng; tổ ứng phó liên chức năng có thẩm quyền quyết định; biện pháp xử lý nội dung; phân tích sau khủng hoảng, lưu hồ sơ, chậm nhất sau 90 ngày. Nền tảng lớn lập kênh liên lạc riêng với cơ quan thực thi pháp luật khi có khủng hoảng. Ofcom không ấn định thời hạn cứng, chỉ yêu cầu kích hoạt sớm nhất có thể trong thực tế, vì chưa đủ bằng chứng cho 1 chuẩn chung; quy định có hiệu lực sau khi Nghị viện thông qua.</w:t>
+        <w:t xml:space="preserve">Đạo luật Dịch vụ số của Liên minh châu Âu buộc nền tảng rất lớn đánh giá, giảm thiểu rủi ro hệ thống hằng năm; khi có khủng hoảng, Ủy ban châu Âu có quyền ra quyết định công khai buộc nền tảng áp dụng biện pháp trong thời hạn không quá 3 tháng (Điều 36); giao thức khủng hoảng gồm hiển thị nổi bật thông tin của cơ quan nhà nước và đầu mối liên lạc khủng hoảng (Điều 48); mức phạt tối đa 6% tổng doanh thu toàn cầu (Điều 74); tháng 12/2025, Ủy ban châu Âu phạt X 120 triệu euro vì vi phạm nghĩa vụ minh bạch: dấu tích xanh gây hiểu lầm về việc xác minh tài khoản, kho quảng cáo thiếu minh bạch, cản trở nhà nghiên cứu tiếp cận dữ liệu; phần điều tra về nội dung bất hợp pháp và thao túng thông tin vẫn tiếp tục. Ngày 9/6/2026, cơ quan quản lý truyền thông Anh (Ofcom) quyết định yêu cầu nền tảng quy mô lớn có rủi ro trung bình và nền tảng mọi quy mô có rủi ro cao lập giao thức ứng phó khủng hoảng bằng văn bản, gồm: bộ chỉ số nhận diện khủng hoảng; tổ ứng phó liên chức năng có thẩm quyền quyết định; biện pháp xử lý nội dung; phân tích sau khủng hoảng, lưu hồ sơ, chậm nhất sau 90 ngày. Nền tảng lớn lập kênh liên lạc riêng với cơ quan thực thi pháp luật khi có khủng hoảng. Ofcom không ấn định thời hạn cứng, chỉ yêu cầu kích hoạt sớm nhất có thể trong thực tế, vì chưa đủ bằng chứng cho 1 chuẩn chung; quy định có hiệu lực sau khi Nghị viện thông qua.</w:t>
       </w:r>
     </w:p>
     <w:p>
@@ -10230,7 +10248,7 @@
               <w:rPr>
                 <w:sz w:val="23"/>
               </w:rPr>
-              <w:t xml:space="preserve">Số người dùng Threads tại Việt Nam; số yêu cầu chặn, gỡ và tỷ lệ đáp ứng riêng của Threads năm 2026; số liệu Meta công bố về nội dung hạn chế tại Việt Nam (Mekong Eye dẫn báo cáo của Meta: hơn 9.700 nội dung trong 6 tháng đầu năm 2026, gấp hơn 3 lần cùng kỳ năm trước)</w:t>
+              <w:t xml:space="preserve">Số người dùng Threads tại Việt Nam; số yêu cầu chặn, gỡ và tỷ lệ đáp ứng riêng của Threads năm 2026; giải thích chênh lệch giữa số liệu Meta công bố (9.749 nội dung hạn chế tại Việt Nam trong 6 tháng đầu năm 2026, đã đối chiếu số liệu gốc) và con số 2.147 nội dung Cục Phát thanh, truyền hình và thông tin điện tử công bố</w:t>
             </w:r>
           </w:p>
         </w:tc>
@@ -10676,7 +10694,7 @@
               <w:rPr>
                 <w:sz w:val="23"/>
               </w:rPr>
-              <w:t xml:space="preserve">Phạt X 120 triệu euro (5/12/2025), quyết định xử phạt đầu tiên theo Đạo luật; chưa ghi nhận lần kích hoạt Điều 36 (đã đối chiếu văn bản gốc các Điều 33, 34, 36, 48, 74; khoản phạt X và việc chưa kích hoạt Điều 36 chưa đối chiếu)</w:t>
+              <w:t xml:space="preserve">Phạt X 120 triệu euro (5/12/2025), quyết định đầu tiên về vi phạm Đạo luật, áp dụng với vi phạm nghĩa vụ minh bạch (dấu tích xanh trả phí không kèm xác minh thực chất, kho quảng cáo, quyền tiếp cận dữ liệu của nhà nghiên cứu), không phải với nội dung; cuộc điều tra mở từ 18/12/2023 về nội dung bất hợp pháp, thao túng thông tin trên X vẫn tiếp tục; chưa ghi nhận lần kích hoạt Điều 36 (đã đối chiếu văn bản gốc Đạo luật và thông cáo gốc của Ủy ban châu Âu; việc chưa kích hoạt Điều 36 chưa đối chiếu)</w:t>
             </w:r>
           </w:p>
         </w:tc>
@@ -11512,22 +11530,22 @@
               <w:rPr>
                 <w:sz w:val="23"/>
               </w:rPr>
-              <w:t xml:space="preserve">Nội dung hạn chế tại Việt Nam vẫn hiển thị ở nước ngoài, và Meta công bố số yêu cầu: theo Mekong Eye (26/10/2026) dẫn báo cáo của Meta, 6 tháng đầu năm 2026, Meta hạn chế hơn 9.700 nội dung tại Việt Nam theo yêu cầu của Bộ VHTTDL và Bộ Công an, gấp hơn 3 lần cùng kỳ năm trước; báo chí nước ngoài dùng số liệu này để phản ánh. Cần chủ động công bố căn cứ khi hạn chế hiển thị</w:t>
-            </w:r>
-          </w:p>
-        </w:tc>
-        <w:tc>
-          <w:tcPr/>
-          <w:p>
-            <w:pPr>
-              <w:pStyle w:val="Compact"/>
-              <w:jc w:val="left"/>
-            </w:pPr>
-            <w:r>
-              <w:rPr>
-                <w:sz w:val="23"/>
-              </w:rPr>
-              <w:t xml:space="preserve">Trung bình: tóm tắt tìm kiếm trích trang Meta; trang gốc cần JavaScript nên chưa đọc được; số liệu về Việt Nam dẫn qua Mekong Eye, chưa đối chiếu báo cáo gốc của Meta</w:t>
+              <w:t xml:space="preserve">Nội dung hạn chế tại Việt Nam vẫn hiển thị ở nước ngoài, và Meta công bố số liệu: 6 tháng đầu năm 2026, Meta hạn chế 9.749 nội dung tại Việt Nam vì vi phạm luật sở tại, trong đó 9.632 bài đăng Facebook; gấp 3,2 lần cùng kỳ năm 2025 (3.029 nội dung), tăng từ 5.381 nội dung của 6 tháng cuối năm 2025; báo chí nước ngoài (Mekong Eye) dùng số liệu này để phản ánh. Số liệu của Meta lớn hơn nhiều con số 2.147 nội dung cơ quan quản lý công bố đến đầu tháng 6/2026; cần chủ động công bố căn cứ khi hạn chế hiển thị và sẵn sàng giải thích chênh lệch</w:t>
+            </w:r>
+          </w:p>
+        </w:tc>
+        <w:tc>
+          <w:tcPr/>
+          <w:p>
+            <w:pPr>
+              <w:pStyle w:val="Compact"/>
+              <w:jc w:val="left"/>
+            </w:pPr>
+            <w:r>
+              <w:rPr>
+                <w:sz w:val="23"/>
+              </w:rPr>
+              <w:t xml:space="preserve">Khá: đã đối chiếu bộ số liệu gốc của Meta theo quốc gia (từ năm 2013 đến 6 tháng đầu năm 2026); bộ số liệu không ghi cơ quan yêu cầu, không có cột riêng cho Threads; trang mô tả quy trình cần JavaScript nên chưa đọc được</w:t>
             </w:r>
           </w:p>
         </w:tc>
@@ -11807,7 +11825,7 @@
         <w:jc w:val="left"/>
       </w:pPr>
       <w:r>
-        <w:t xml:space="preserve">Thông cáo của Ủy ban châu Âu về khoản phạt 120 triệu euro đối với X. https://digital-strategy.ec.europa.eu/en/news/commission-fines-x-eu120-million-under-digital-services-act</w:t>
+        <w:t xml:space="preserve">Thông cáo của Ủy ban châu Âu về khoản phạt 120 triệu euro đối với X, ngày 5/12/2025 (đã đọc toàn văn bản PDF người dùng tải về). https://digital-strategy.ec.europa.eu/en/news/commission-fines-x-eu120-million-under-digital-services-act</w:t>
       </w:r>
     </w:p>
     <w:p>
@@ -12153,7 +12171,7 @@
         <w:jc w:val="left"/>
       </w:pPr>
       <w:r>
-        <w:t xml:space="preserve">Quy trình hạn chế nội dung theo luật sở tại của Meta. https://transparency.meta.com/reports/content-restrictions</w:t>
+        <w:t xml:space="preserve">Quy trình hạn chế nội dung theo luật sở tại của Meta; bộ số liệu theo quốc gia (CSV, người dùng tải về; đã đối chiếu số liệu Việt Nam). https://transparency.meta.com/reports/content-restrictions</w:t>
       </w:r>
     </w:p>
     <w:bookmarkEnd w:id="56"/>

</xml_diff>

<commit_message>
Dự thảo 8: sửa nhãn nguồn, bổ sung DSA, POFMA, HC 381
- Sửa nhãn "đã đọc toàn văn" ở Phụ lục 4, 5 và Tóm tắt: chỉ giữ cho tài liệu đã đọc hết; các tài liệu khác ghi rõ điều, mục, số liệu đã đối chiếu.
- Đọc thêm bản gốc Đạo luật Dịch vụ số (Điều 9, 16, 22, 23, 25, 39, 40), Luật POFMA (Điều 8, 32, 37, 38, 40, 48, 50, 54), 21 kết luận, kiến nghị của báo cáo HC 381.
- Bổ sung Phần II mục 6 điểm 9; nhóm 2, 6 Phần III; Phụ lục 6.
- Ghi nhận 4 trang người dùng đã đọc: Phụ nữ Việt Nam, VOV, Axios, Báo Điện tử Chính phủ.

Co-Authored-By: Claude Opus 5.5 <noreply@anthropic.com>
Claude-Session: https://claude.ai/code/session_01NzZ78rAanjcMCsGwt7jxAb
</commit_message>
<xml_diff>
--- a/tham-luan-khung-hoang-truyen-thong/de-cuong-tham-luan-bvhttdl.docx
+++ b/tham-luan-khung-hoang-truyen-thong/de-cuong-tham-luan-bvhttdl.docx
@@ -258,7 +258,7 @@
         <w:pStyle w:val="ThongTinChung"/>
       </w:pPr>
       <w:r>
-        <w:t xml:space="preserve">Dự thảo 7, ngày 28/10/2026. Tài liệu làm việc phục vụ tổ biên tập.</w:t>
+        <w:t xml:space="preserve">Dự thảo 8, ngày 28/10/2026. Tài liệu làm việc phục vụ tổ biên tập.</w:t>
       </w:r>
     </w:p>
     <w:bookmarkStart w:id="20" w:name="tóm-tắt"/>
@@ -339,7 +339,7 @@
         <w:t xml:space="preserve"> </w:t>
       </w:r>
       <w:r>
-        <w:t xml:space="preserve">Đối chiếu toàn văn 4 tài liệu gốc về kinh nghiệm Singapore và Anh: Luật POFMA, bảng thống kê vụ việc POFMA đến 1/7/2026, giao thức ứng phó khủng hoảng của Ofcom (9/6/2026), báo cáo HC 381 của Ủy ban Nội vụ Hạ viện Anh (14/4/2025). Sửa số liệu vụ Southport; bỏ 1 chi tiết không có trong nguồn gốc; bổ sung 3 bài học: giao thức ứng phó khủng hoảng của nền tảng, thống nhất nội dung công bố giữa cơ quan tố tụng và người phát ngôn, giám sát nhóm kín và nền tảng nhắn tin (Phần II, mục 6; Phần III, nhóm 2, 3, 6; Phụ lục 6).</w:t>
+        <w:t xml:space="preserve">Đối chiếu bản gốc 4 tài liệu về kinh nghiệm Singapore và Anh: Luật POFMA, bảng thống kê vụ việc POFMA đến 1/7/2026, giao thức ứng phó khủng hoảng của Ofcom (9/6/2026), báo cáo HC 381 của Ủy ban Nội vụ Hạ viện Anh (14/4/2025). Sửa số liệu vụ Southport; bỏ 1 chi tiết không có trong nguồn gốc; bổ sung 3 bài học: giao thức ứng phó khủng hoảng của nền tảng, thống nhất nội dung công bố giữa cơ quan tố tụng và người phát ngôn, giám sát nhóm kín và nền tảng nhắn tin (Phần II, mục 6; Phần III, nhóm 2, 3, 6; Phụ lục 6).</w:t>
       </w:r>
     </w:p>
     <w:p>
@@ -357,7 +357,7 @@
         <w:t xml:space="preserve"> </w:t>
       </w:r>
       <w:r>
-        <w:t xml:space="preserve">Đối chiếu toàn văn Đạo luật Dịch vụ số của Liên minh châu Âu (Điều 33, 34, 36, 48, 74), trang hướng dẫn về Threads của cơ quan An toàn điện tử Úc, bài của Mekong Eye (26/10/2026) và Dân Việt (17/10/2026). Sửa số liệu lừa đảo trực tuyến năm 2025; bổ sung thời hạn 6 giờ theo Điều 25 Luật An ninh mạng năm 2025 (đã đối chiếu bản gốc trên Công báo); cập nhật diễn biến vụ Làng Vân, Safari Ba Vì và phản ứng của người dùng Threads khi nền tảng gỡ bài (Phần I, Phần II, Phụ lục 5, 6).</w:t>
+        <w:t xml:space="preserve">Đối chiếu bản gốc Đạo luật Dịch vụ số của Liên minh châu Âu (Điều 33, 34, 36, 48, 74), đọc toàn văn trang hướng dẫn về Threads của cơ quan An toàn điện tử Úc, bài của Mekong Eye (26/10/2026) và Dân Việt (17/10/2026). Sửa số liệu lừa đảo trực tuyến năm 2025; bổ sung thời hạn 6 giờ theo Điều 25 Luật An ninh mạng năm 2025 (đã đối chiếu bản gốc trên Công báo); cập nhật diễn biến vụ Làng Vân, Safari Ba Vì và phản ứng của người dùng Threads khi nền tảng gỡ bài (Phần I, Phần II, Phụ lục 5, 6).</w:t>
       </w:r>
     </w:p>
     <w:p>
@@ -375,7 +375,7 @@
         <w:t xml:space="preserve"> </w:t>
       </w:r>
       <w:r>
-        <w:t xml:space="preserve">Đối chiếu toàn văn 15 văn bản pháp luật gốc trên Công báo (Luật Báo chí, Luật Trí tuệ nhân tạo, Luật Bảo vệ dữ liệu cá nhân, Luật Quảng cáo sửa đổi; Nghị định số 147/2024/NĐ-CP, 356/2025/NĐ-CP, 174, 219, 244, 298, 327, 328, 343/2026/NĐ-CP; Quyết định số 329/QĐ-TTg, 1125/QĐ-TTg) và 29 nguồn tin, báo cáo. Sửa 9 điểm sai hoặc chưa chính xác, quan trọng nhất: mức phạt 50 triệu đồng của Nghị định số 174/2026/NĐ-CP là mức với tổ chức, cá nhân tối đa 25 triệu đồng; mốc 24 giờ của Nghị định số 244/2026/NĐ-CP tính từ khi cơ quan tiếp nhận vụ việc; tên, phạm vi Nghị định số 328/2026/NĐ-CP và 343/2026/NĐ-CP; thời gian xử lý 3 đến 12 giờ là của TikTok; diễn biến vụ Kera; chi tiết deepfake mạo danh không có trong nguồn. Bổ sung căn cứ: Nghị định số 244/2026/NĐ-CP, 328/2026/NĐ-CP và Quyết định số 1125/QĐ-TTg đều nêu nhiệm vụ hạn chế, xử lý khủng hoảng truyền thông; khoảng trống về thời hạn khẩn cấp và mức phạt đối với nền tảng (Phần II, mục 1, 3; Phần III, nhóm 2, 3, 6; Kết luận; Phụ lục 1, 4, 5, 6).</w:t>
+        <w:t xml:space="preserve">Đối chiếu bản gốc 15 văn bản pháp luật trên Công báo (Luật Báo chí, Luật Trí tuệ nhân tạo, Luật Bảo vệ dữ liệu cá nhân, Luật Quảng cáo sửa đổi; Nghị định số 147/2024/NĐ-CP, 356/2025/NĐ-CP, 174, 219, 244, 298, 327, 328, 343/2026/NĐ-CP; Quyết định số 329/QĐ-TTg, 1125/QĐ-TTg) và 29 nguồn tin, báo cáo. Sửa 9 điểm sai hoặc chưa chính xác, quan trọng nhất: mức phạt 50 triệu đồng của Nghị định số 174/2026/NĐ-CP là mức với tổ chức, cá nhân tối đa 25 triệu đồng; mốc 24 giờ của Nghị định số 244/2026/NĐ-CP tính từ khi cơ quan tiếp nhận vụ việc; tên, phạm vi Nghị định số 328/2026/NĐ-CP và 343/2026/NĐ-CP; thời gian xử lý 3 đến 12 giờ là của TikTok; diễn biến vụ Kera; chi tiết deepfake mạo danh không có trong nguồn. Bổ sung căn cứ: Nghị định số 244/2026/NĐ-CP, 328/2026/NĐ-CP và Quyết định số 1125/QĐ-TTg đều nêu nhiệm vụ hạn chế, xử lý khủng hoảng truyền thông; khoảng trống về thời hạn khẩn cấp và mức phạt đối với nền tảng (Phần II, mục 1, 3; Phần III, nhóm 2, 3, 6; Kết luận; Phụ lục 1, 4, 5, 6).</w:t>
       </w:r>
     </w:p>
     <w:p>
@@ -394,6 +394,42 @@
       </w:r>
       <w:r>
         <w:t xml:space="preserve">Đối chiếu thông cáo gốc của Ủy ban châu Âu về khoản phạt X và bộ số liệu hạn chế nội dung theo quốc gia của Meta. Ghi rõ Ủy ban châu Âu phạt X vì vi phạm nghĩa vụ minh bạch, không phải vì nội dung; xác nhận Meta hạn chế 9.749 nội dung tại Việt Nam trong 6 tháng đầu năm 2026, gấp 3,2 lần cùng kỳ; đề nghị Cục Thông tin điện tử và Chuyển đổi số giải thích chênh lệch với số liệu của Cục (Phần II, mục 6; Phụ lục 5, 6).</w:t>
+      </w:r>
+    </w:p>
+    <w:p>
+      <w:pPr>
+        <w:pStyle w:val="BodyText"/>
+      </w:pPr>
+      <w:r>
+        <w:rPr>
+          <w:b/>
+          <w:bCs/>
+        </w:rPr>
+        <w:t xml:space="preserve">Điểm mới của dự thảo 8.</w:t>
+      </w:r>
+      <w:r>
+        <w:t xml:space="preserve"> </w:t>
+      </w:r>
+      <w:r>
+        <w:t xml:space="preserve">Đọc thêm bản gốc Đạo luật Dịch vụ số của Liên minh châu Âu (Điều 9, 16, 22, 23, 25, 39, 40), Luật POFMA của Singapore (Điều 8, 32, 37, 38, 40, 48, 50, 54) và 21 kết luận, kiến nghị của báo cáo HC 381. Bổ sung 4 điểm tham khảo: lệnh xử lý nội dung của cơ quan nhà nước nêu rõ căn cứ pháp lý, lý do, đường dẫn cụ thể; nền tảng ưu tiên xử lý thông báo của đầu mối báo cáo tin cậy; biện pháp hạn chế tài khoản giả, tài khoản do bot điều khiển; mức phạt nền tảng không khắc phục vi phạm tới 1 triệu SGD, cộng tới 100.000 SGD mỗi ngày tiếp tục vi phạm. Ghi điều khoản căn cứ của khoản phạt X. Sửa nhãn nguồn: chỉ ghi</w:t>
+      </w:r>
+      <w:r>
+        <w:t xml:space="preserve"> </w:t>
+      </w:r>
+      <w:r>
+        <w:t xml:space="preserve">“</w:t>
+      </w:r>
+      <w:r>
+        <w:t xml:space="preserve">đã đọc toàn văn</w:t>
+      </w:r>
+      <w:r>
+        <w:t xml:space="preserve">”</w:t>
+      </w:r>
+      <w:r>
+        <w:t xml:space="preserve"> </w:t>
+      </w:r>
+      <w:r>
+        <w:t xml:space="preserve">với tài liệu đã đọc hết; các tài liệu khác ghi rõ điều, mục, số liệu đã đối chiếu. Ghi nhận 4 trang người dùng đã đọc, không có nội dung cần bổ sung (Phần II, mục 6; Phần III, nhóm 2, 6; Phụ lục 4, 5, 6).</w:t>
       </w:r>
     </w:p>
     <w:p>
@@ -5086,7 +5122,7 @@
         <w:t xml:space="preserve"> </w:t>
       </w:r>
       <w:r>
-        <w:t xml:space="preserve">Đạo luật Dịch vụ số của Liên minh châu Âu buộc nền tảng rất lớn đánh giá, giảm thiểu rủi ro hệ thống hằng năm; khi có khủng hoảng, Ủy ban châu Âu có quyền ra quyết định công khai buộc nền tảng áp dụng biện pháp trong thời hạn không quá 3 tháng (Điều 36); giao thức khủng hoảng gồm hiển thị nổi bật thông tin của cơ quan nhà nước và đầu mối liên lạc khủng hoảng (Điều 48); mức phạt tối đa 6% tổng doanh thu toàn cầu (Điều 74); tháng 12/2025, Ủy ban châu Âu phạt X 120 triệu euro vì vi phạm nghĩa vụ minh bạch: dấu tích xanh gây hiểu lầm về việc xác minh tài khoản, kho quảng cáo thiếu minh bạch, cản trở nhà nghiên cứu tiếp cận dữ liệu; phần điều tra về nội dung bất hợp pháp và thao túng thông tin vẫn tiếp tục. Ngày 9/6/2026, cơ quan quản lý truyền thông Anh (Ofcom) quyết định yêu cầu nền tảng quy mô lớn có rủi ro trung bình và nền tảng mọi quy mô có rủi ro cao lập giao thức ứng phó khủng hoảng bằng văn bản, gồm: bộ chỉ số nhận diện khủng hoảng; tổ ứng phó liên chức năng có thẩm quyền quyết định; biện pháp xử lý nội dung; phân tích sau khủng hoảng, lưu hồ sơ, chậm nhất sau 90 ngày. Nền tảng lớn lập kênh liên lạc riêng với cơ quan thực thi pháp luật khi có khủng hoảng. Ofcom không ấn định thời hạn cứng, chỉ yêu cầu kích hoạt sớm nhất có thể trong thực tế, vì chưa đủ bằng chứng cho 1 chuẩn chung; quy định có hiệu lực sau khi Nghị viện thông qua.</w:t>
+        <w:t xml:space="preserve">Đạo luật Dịch vụ số của Liên minh châu Âu buộc nền tảng rất lớn đánh giá, giảm thiểu rủi ro hệ thống hằng năm; khi có khủng hoảng, Ủy ban châu Âu có quyền ra quyết định công khai buộc nền tảng áp dụng biện pháp trong thời hạn không quá 3 tháng (Điều 36); giao thức khủng hoảng gồm hiển thị nổi bật thông tin của cơ quan nhà nước và đầu mối liên lạc khủng hoảng (Điều 48); mức phạt tối đa 6% tổng doanh thu toàn cầu (Điều 74); tháng 12/2025, Ủy ban châu Âu phạt X 120 triệu euro vì vi phạm nghĩa vụ minh bạch: dấu tích xanh gây hiểu lầm về việc xác minh tài khoản (khoản 1 Điều 25), kho quảng cáo thiếu minh bạch (Điều 39), cản trở nhà nghiên cứu tiếp cận dữ liệu công khai (khoản 12 Điều 40); phần điều tra về nội dung bất hợp pháp và thao túng thông tin vẫn tiếp tục. Ngày 9/6/2026, cơ quan quản lý truyền thông Anh (Ofcom) quyết định yêu cầu nền tảng quy mô lớn có rủi ro trung bình và nền tảng mọi quy mô có rủi ro cao lập giao thức ứng phó khủng hoảng bằng văn bản, gồm: bộ chỉ số nhận diện khủng hoảng; tổ ứng phó liên chức năng có thẩm quyền quyết định; biện pháp xử lý nội dung; phân tích sau khủng hoảng, lưu hồ sơ, chậm nhất sau 90 ngày. Nền tảng lớn lập kênh liên lạc riêng với cơ quan thực thi pháp luật khi có khủng hoảng. Ofcom không ấn định thời hạn cứng, chỉ yêu cầu kích hoạt sớm nhất có thể trong thực tế, vì chưa đủ bằng chứng cho 1 chuẩn chung; quy định có hiệu lực sau khi Nghị viện thông qua.</w:t>
       </w:r>
     </w:p>
     <w:p>
@@ -5252,6 +5288,58 @@
       </w:r>
       <w:r>
         <w:t xml:space="preserve">Úc đưa Threads vào danh sách nền tảng phải thực hiện quy định cấm tài khoản người dưới 16 tuổi từ tháng 12/2025; Malaysia phối hợp cảnh sát và Meta truy tìm chủ tài khoản phát tán video xúc phạm tôn giáo trên Threads (3/2026); năm 2025, Meta chấm dứt chương trình kiểm chứng thông tin của bên thứ 3 tại Mỹ trên cả Facebook, Instagram và Threads, chuyển sang ghi chú cộng đồng. Đến nay chưa có quốc gia nào công bố kinh nghiệm dùng Threads làm kênh xử lý khủng hoảng kèm đánh giá kết quả.</w:t>
+      </w:r>
+    </w:p>
+    <w:p>
+      <w:pPr>
+        <w:pStyle w:val="Compact"/>
+        <w:numPr>
+          <w:ilvl w:val="0"/>
+          <w:numId w:val="1017"/>
+        </w:numPr>
+      </w:pPr>
+      <w:r>
+        <w:rPr>
+          <w:b/>
+          <w:bCs/>
+        </w:rPr>
+        <w:t xml:space="preserve">Chuẩn hóa yêu cầu xử lý, ưu tiên đầu mối tin cậy, xử lý tài khoản giả (Liên minh châu Âu, Singapore).</w:t>
+      </w:r>
+      <w:r>
+        <w:t xml:space="preserve"> </w:t>
+      </w:r>
+      <w:r>
+        <w:t xml:space="preserve">Đạo luật Dịch vụ số buộc lệnh xử lý nội dung bất hợp pháp của cơ quan tư pháp, hành chính nêu rõ căn cứ pháp lý, lý do, đường dẫn cụ thể, cơ chế khiếu nại và giới hạn phạm vi lãnh thổ ở mức thật sự cần thiết; nền tảng báo kết quả thực hiện</w:t>
+      </w:r>
+      <w:r>
+        <w:t xml:space="preserve"> </w:t>
+      </w:r>
+      <w:r>
+        <w:t xml:space="preserve">“</w:t>
+      </w:r>
+      <w:r>
+        <w:t xml:space="preserve">không chậm trễ quá mức</w:t>
+      </w:r>
+      <w:r>
+        <w:t xml:space="preserve">”</w:t>
+      </w:r>
+      <w:r>
+        <w:t xml:space="preserve">, Đạo luật không ấn định số giờ (Điều 9). Nền tảng ưu tiên xử lý thông báo của</w:t>
+      </w:r>
+      <w:r>
+        <w:t xml:space="preserve"> </w:t>
+      </w:r>
+      <w:r>
+        <w:t xml:space="preserve">“</w:t>
+      </w:r>
+      <w:r>
+        <w:t xml:space="preserve">bên báo cáo tin cậy</w:t>
+      </w:r>
+      <w:r>
+        <w:t xml:space="preserve">”</w:t>
+      </w:r>
+      <w:r>
+        <w:t xml:space="preserve">, tức tổ chức có chuyên môn, độc lập với nền tảng, do cơ quan điều phối dịch vụ số quốc gia công nhận; bên báo cáo tin cậy công khai báo cáo hằng năm về các thông báo đã gửi (Điều 22). Nền tảng tạm ngừng dịch vụ với tài khoản thường xuyên đăng nội dung rõ ràng bất hợp pháp, sau khi cảnh báo trước (Điều 23). Luật POFMA cho phép Bộ trưởng yêu cầu nền tảng hạn chế tài khoản giả hoặc tài khoản do bot điều khiển dùng để phát tán tin sai, thực hiện hành vi phối hợp thiếu xác thực, tối đa 3 tháng hoặc không thời hạn (Điều 40); cấm đưa quảng cáo, hỗ trợ tài chính cho trang trực tuyến mà Bộ trưởng đã công bố vi phạm (Điều 32, 37, 38); phạt nền tảng không khắc phục vi phạm quy tắc thực hành tới 1 triệu SGD, cộng tới 100.000 SGD mỗi ngày tiếp tục vi phạm (Điều 50).</w:t>
       </w:r>
     </w:p>
     <w:p>
@@ -5606,7 +5694,7 @@
         <w:t xml:space="preserve"> </w:t>
       </w:r>
       <w:r>
-        <w:t xml:space="preserve">đối với vụ việc đang điều tra, xác minh, cùng cơ chế thống nhất nhanh nội dung công bố giữa cơ quan điều tra, viện kiểm sát và người phát ngôn, để không tạo khoảng trống thông tin (bài học từ vụ Southport của Anh năm 2024: ý kiến không thống nhất giữa cơ quan công tố và cảnh sát làm chậm việc công bố).</w:t>
+        <w:t xml:space="preserve">đối với vụ việc đang điều tra, xác minh, cùng cơ chế thống nhất nhanh nội dung công bố giữa cơ quan điều tra, viện kiểm sát và người phát ngôn, để không tạo khoảng trống thông tin (bài học từ vụ Southport của Anh năm 2024: ý kiến không thống nhất giữa cơ quan công tố và cảnh sát làm chậm việc công bố). Rà soát hướng dẫn này định kỳ và khi môi trường truyền thông thay đổi lớn (Ủy ban Nội vụ Hạ viện Anh kiến nghị cơ quan công tố cập nhật hướng dẫn cho báo chí ít nhất 5 năm 1 lần, thống nhất cách hiểu với cảnh sát và báo chí).</w:t>
       </w:r>
     </w:p>
     <w:p>
@@ -5660,7 +5748,7 @@
         </w:numPr>
       </w:pPr>
       <w:r>
-        <w:t xml:space="preserve">Hoàn thiện văn bản hướng dẫn Luật Báo chí 2025, Luật Trí tuệ nhân tạo (gắn nhãn nội dung AI); sửa đổi, bổ sung Nghị định số 147/2024/NĐ-CP theo hướng: rút ngắn thời hạn nền tảng xử lý yêu cầu của Bộ VHTTDL trong tình huống khẩn cấp (hiện chỉ có mốc 24 giờ, trong khi yêu cầu của lực lượng chuyên trách thuộc Bộ Công an được rút xuống 6 giờ); đề xuất nâng mức phạt đối với nền tảng xuyên biên giới không thực hiện yêu cầu ngăn chặn, gỡ bỏ (hiện từ 30 đến 50 triệu đồng theo Điều 97 Nghị định số 174/2026/NĐ-CP); ưu tiên hiển thị thông tin chính thống khi xảy ra khủng hoảng (tham khảo Điều 48 Đạo luật Dịch vụ số của Liên minh châu Âu); báo cáo minh bạch định kỳ.</w:t>
+        <w:t xml:space="preserve">Hoàn thiện văn bản hướng dẫn Luật Báo chí 2025, Luật Trí tuệ nhân tạo (gắn nhãn nội dung AI); sửa đổi, bổ sung Nghị định số 147/2024/NĐ-CP theo hướng: rút ngắn thời hạn nền tảng xử lý yêu cầu của Bộ VHTTDL trong tình huống khẩn cấp (hiện chỉ có mốc 24 giờ, trong khi yêu cầu của lực lượng chuyên trách thuộc Bộ Công an được rút xuống 6 giờ), kèm mẫu yêu cầu chuẩn nêu rõ căn cứ pháp lý, lý do, đường dẫn cụ thể để nền tảng xử lý nhanh, khó từ chối (tham khảo Điều 9 Đạo luật Dịch vụ số của Liên minh châu Âu); đề xuất nâng mức phạt đối với nền tảng xuyên biên giới không thực hiện yêu cầu ngăn chặn, gỡ bỏ (hiện từ 30 đến 50 triệu đồng theo Điều 97 Nghị định số 174/2026/NĐ-CP; Singapore phạt nền tảng không khắc phục vi phạm tới 1 triệu SGD, cộng tới 100.000 SGD mỗi ngày tiếp tục vi phạm); ưu tiên hiển thị thông tin chính thống khi xảy ra khủng hoảng (tham khảo Điều 48 Đạo luật Dịch vụ số của Liên minh châu Âu, Điều 48 Luật POFMA của Singapore); báo cáo minh bạch định kỳ.</w:t>
       </w:r>
     </w:p>
     <w:p>
@@ -6285,7 +6373,7 @@
         </w:numPr>
       </w:pPr>
       <w:r>
-        <w:t xml:space="preserve">Yêu cầu nền tảng xuyên biên giới thực hiện nghiêm nghĩa vụ: xác thực tài khoản; gỡ bỏ trong thời hạn quy định; cung cấp dữ liệu phục vụ điều tra; thiết lập kênh ưu tiên và giao thức ứng phó khủng hoảng gồm bộ chỉ số nhận diện, tổ ứng phó, kênh liên lạc riêng với cơ quan chức năng, phân tích sau khủng hoảng (tham khảo Đạo luật Dịch vụ số của Liên minh châu Âu và quy định của Ofcom, Anh, năm 2026); báo cáo minh bạch định kỳ.</w:t>
+        <w:t xml:space="preserve">Yêu cầu nền tảng xuyên biên giới thực hiện nghiêm nghĩa vụ: xác thực tài khoản; gỡ bỏ trong thời hạn quy định; cung cấp dữ liệu phục vụ điều tra; thiết lập kênh ưu tiên cho các đầu mối báo cáo tin cậy do cơ quan quản lý công nhận (tham khảo Điều 22 Đạo luật Dịch vụ số) và giao thức ứng phó khủng hoảng gồm bộ chỉ số nhận diện, tổ ứng phó, kênh liên lạc riêng với cơ quan chức năng, phân tích sau khủng hoảng (tham khảo Đạo luật Dịch vụ số của Liên minh châu Âu và quy định của Ofcom, Anh, năm 2026); báo cáo minh bạch định kỳ.</w:t>
       </w:r>
     </w:p>
     <w:p>
@@ -6310,6 +6398,18 @@
       </w:pPr>
       <w:r>
         <w:t xml:space="preserve">Áp dụng biện pháp ngăn chặn truy cập theo Nghị định số 327/2026/NĐ-CP đối với hệ thống thông tin ở nước ngoài không tuân thủ pháp luật Việt Nam.</w:t>
+      </w:r>
+    </w:p>
+    <w:p>
+      <w:pPr>
+        <w:pStyle w:val="Compact"/>
+        <w:numPr>
+          <w:ilvl w:val="0"/>
+          <w:numId w:val="1024"/>
+        </w:numPr>
+      </w:pPr>
+      <w:r>
+        <w:t xml:space="preserve">Yêu cầu nền tảng hạn chế tài khoản giả, tài khoản do bot điều khiển, mạng lưới tài khoản phối hợp phát tán tin sai; tạm ngừng tài khoản vi phạm nhiều lần sau cảnh báo; cắt nguồn quảng cáo của trang, kênh vi phạm nhiều lần (tham khảo Điều 32, 37, 38, 40 Luật POFMA của Singapore; Điều 23 Đạo luật Dịch vụ số của Liên minh châu Âu).</w:t>
       </w:r>
     </w:p>
     <w:p>
@@ -9167,6 +9267,102 @@
       </w:pPr>
       <w:r>
         <w:rPr>
+          <w:i/>
+          <w:iCs/>
+        </w:rPr>
+        <w:t xml:space="preserve">Ghi chú nhãn nguồn:</w:t>
+      </w:r>
+      <w:r>
+        <w:rPr>
+          <w:i/>
+          <w:iCs/>
+        </w:rPr>
+        <w:t xml:space="preserve"> </w:t>
+      </w:r>
+      <w:r>
+        <w:rPr>
+          <w:i/>
+          <w:iCs/>
+        </w:rPr>
+        <w:t xml:space="preserve">“</w:t>
+      </w:r>
+      <w:r>
+        <w:rPr>
+          <w:i/>
+          <w:iCs/>
+        </w:rPr>
+        <w:t xml:space="preserve">đã đọc toàn văn</w:t>
+      </w:r>
+      <w:r>
+        <w:rPr>
+          <w:i/>
+          <w:iCs/>
+        </w:rPr>
+        <w:t xml:space="preserve">”</w:t>
+      </w:r>
+      <w:r>
+        <w:rPr>
+          <w:i/>
+          <w:iCs/>
+        </w:rPr>
+        <w:t xml:space="preserve"> </w:t>
+      </w:r>
+      <w:r>
+        <w:rPr>
+          <w:i/>
+          <w:iCs/>
+        </w:rPr>
+        <w:t xml:space="preserve">nghĩa là đã đọc hết văn bản;</w:t>
+      </w:r>
+      <w:r>
+        <w:rPr>
+          <w:i/>
+          <w:iCs/>
+        </w:rPr>
+        <w:t xml:space="preserve"> </w:t>
+      </w:r>
+      <w:r>
+        <w:rPr>
+          <w:i/>
+          <w:iCs/>
+        </w:rPr>
+        <w:t xml:space="preserve">“</w:t>
+      </w:r>
+      <w:r>
+        <w:rPr>
+          <w:i/>
+          <w:iCs/>
+        </w:rPr>
+        <w:t xml:space="preserve">đã đối chiếu</w:t>
+      </w:r>
+      <w:r>
+        <w:rPr>
+          <w:i/>
+          <w:iCs/>
+        </w:rPr>
+        <w:t xml:space="preserve">”</w:t>
+      </w:r>
+      <w:r>
+        <w:rPr>
+          <w:i/>
+          <w:iCs/>
+        </w:rPr>
+        <w:t xml:space="preserve"> </w:t>
+      </w:r>
+      <w:r>
+        <w:rPr>
+          <w:i/>
+          <w:iCs/>
+        </w:rPr>
+        <w:t xml:space="preserve">nghĩa là đã đọc bản gốc ở các điều, mục, số liệu nêu kèm; với nguồn không ghi nhãn, tổ biên tập mở bản gốc để kiểm tra trước khi dẫn.</w:t>
+      </w:r>
+    </w:p>
+    <w:p>
+      <w:pPr>
+        <w:pStyle w:val="BodyText"/>
+      </w:pPr>
+      <w:r>
+        <w:rPr>
           <w:b/>
           <w:bCs/>
         </w:rPr>
@@ -9221,7 +9417,7 @@
         <w:jc w:val="left"/>
       </w:pPr>
       <w:r>
-        <w:t xml:space="preserve">Luật Báo chí số 126/2025/QH15, hiệu lực từ 1/7/2026 (bản gốc trên Công báo; đã đọc toàn văn). https://congbao.chinhphu.vn/van-ban/luat-so-126-2025-qh15-468687.htm</w:t>
+        <w:t xml:space="preserve">Luật Báo chí số 126/2025/QH15, hiệu lực từ 1/7/2026 (bản gốc trên Công báo; đã đối chiếu Điều 31, 34, 39 và điều khoản hiệu lực). https://congbao.chinhphu.vn/van-ban/luat-so-126-2025-qh15-468687.htm</w:t>
       </w:r>
     </w:p>
     <w:p>
@@ -9234,7 +9430,7 @@
         <w:jc w:val="left"/>
       </w:pPr>
       <w:r>
-        <w:t xml:space="preserve">Luật An ninh mạng số 116/2025/QH15, hiệu lực từ 1/7/2026 (bản gốc đăng Công báo số 35 ngày 21/1/2026; đã đọc toàn văn). https://congbao.chinhphu.vn/van-ban/luat-so-116-2025-qh15-468678.htm</w:t>
+        <w:t xml:space="preserve">Luật An ninh mạng số 116/2025/QH15, hiệu lực từ 1/7/2026 (bản gốc đăng Công báo số 35 ngày 21/1/2026; đã đối chiếu Điều 25 về thời hạn xử lý và các quy định về thông tin sai sự thật). https://congbao.chinhphu.vn/van-ban/luat-so-116-2025-qh15-468678.htm</w:t>
       </w:r>
     </w:p>
     <w:p>
@@ -9260,7 +9456,7 @@
         <w:jc w:val="left"/>
       </w:pPr>
       <w:r>
-        <w:t xml:space="preserve">Luật Trí tuệ nhân tạo số 134/2025/QH15, hiệu lực từ 1/3/2026 (bản gốc trên Công báo; đã đọc toàn văn). https://congbao.chinhphu.vn/van-ban/luat-so-134-2025-qh15-468694.htm</w:t>
+        <w:t xml:space="preserve">Luật Trí tuệ nhân tạo số 134/2025/QH15, hiệu lực từ 1/3/2026 (bản gốc trên Công báo; đã đối chiếu Điều 7, 11). https://congbao.chinhphu.vn/van-ban/luat-so-134-2025-qh15-468694.htm</w:t>
       </w:r>
     </w:p>
     <w:p>
@@ -9273,7 +9469,7 @@
         <w:jc w:val="left"/>
       </w:pPr>
       <w:r>
-        <w:t xml:space="preserve">Luật số 75/2025/QH15 sửa đổi, bổ sung một số điều của Luật Quảng cáo, hiệu lực từ 1/1/2026 (bản gốc trên Công báo; đã đọc toàn văn). https://congbao.chinhphu.vn/van-ban/luat-so-75-2025-qh15-45566.htm</w:t>
+        <w:t xml:space="preserve">Luật số 75/2025/QH15 sửa đổi, bổ sung một số điều của Luật Quảng cáo, hiệu lực từ 1/1/2026 (bản gốc trên Công báo; đã đối chiếu Điều 15a, 23 và điều khoản hiệu lực). https://congbao.chinhphu.vn/van-ban/luat-so-75-2025-qh15-45566.htm</w:t>
       </w:r>
     </w:p>
     <w:p>
@@ -9286,7 +9482,7 @@
         <w:jc w:val="left"/>
       </w:pPr>
       <w:r>
-        <w:t xml:space="preserve">Luật Bảo vệ dữ liệu cá nhân số 91/2025/QH15, hiệu lực từ 1/1/2026 (bản gốc trên Công báo; đã đọc toàn văn); Nghị định số 356/2025/NĐ-CP ngày 31/12/2025. https://congbao.chinhphu.vn/van-ban/luat-so-91-2025-qh15-45578.htm ; https://congbao.chinhphu.vn/van-ban/nghi-dinh-so-356-2025-nd-cp-468371.htm</w:t>
+        <w:t xml:space="preserve">Luật Bảo vệ dữ liệu cá nhân số 91/2025/QH15, hiệu lực từ 1/1/2026 (bản gốc trên Công báo; đã đối chiếu Điều 7, 8, 16, 29); Nghị định số 356/2025/NĐ-CP ngày 31/12/2025. https://congbao.chinhphu.vn/van-ban/luat-so-91-2025-qh15-45578.htm ; https://congbao.chinhphu.vn/van-ban/nghi-dinh-so-356-2025-nd-cp-468371.htm</w:t>
       </w:r>
     </w:p>
     <w:p>
@@ -9388,7 +9584,7 @@
         <w:jc w:val="left"/>
       </w:pPr>
       <w:r>
-        <w:t xml:space="preserve">Nghị định số 298/2026/NĐ-CP ngày 27/7/2026 quy định chức năng, nhiệm vụ, quyền hạn và cơ cấu tổ chức của Bộ VHTTDL (bản gốc trên Công báo; đã đọc toàn văn). https://congbao.chinhphu.vn/van-ban/nghi-dinh-so-298-2026-nd-cp-470179.htm</w:t>
+        <w:t xml:space="preserve">Nghị định số 298/2026/NĐ-CP ngày 27/7/2026 quy định chức năng, nhiệm vụ, quyền hạn và cơ cấu tổ chức của Bộ VHTTDL (bản gốc trên Công báo; đã đối chiếu các điều về chức năng, nhiệm vụ, cơ cấu tổ chức và hiệu lực). https://congbao.chinhphu.vn/van-ban/nghi-dinh-so-298-2026-nd-cp-470179.htm</w:t>
       </w:r>
     </w:p>
     <w:p>
@@ -9401,7 +9597,7 @@
         <w:jc w:val="left"/>
       </w:pPr>
       <w:r>
-        <w:t xml:space="preserve">Nghị định số 327/2026/NĐ-CP ngày 19/8/2026 quy định chi tiết Điều 14 Luật An ninh mạng (bản gốc trên Công báo; đã đọc toàn văn). https://congbao.chinhphu.vn/van-ban/nghi-dinh-so-327-2026-nd-cp-470332.htm</w:t>
+        <w:t xml:space="preserve">Nghị định số 327/2026/NĐ-CP ngày 19/8/2026 quy định chi tiết Điều 14 Luật An ninh mạng (bản gốc trên Công báo; đã đối chiếu phạm vi, Điều 7, 10, 14 và điều khoản hiệu lực). https://congbao.chinhphu.vn/van-ban/nghi-dinh-so-327-2026-nd-cp-470332.htm</w:t>
       </w:r>
     </w:p>
     <w:p>
@@ -9458,7 +9654,7 @@
         <w:t xml:space="preserve"> </w:t>
       </w:r>
       <w:r>
-        <w:t xml:space="preserve">(bản gốc trên Công báo; đã đọc toàn văn). https://congbao.chinhphu.vn/van-ban/quyet-dinh-so-1125-qd-ttg-469843.htm</w:t>
+        <w:t xml:space="preserve">(bản gốc trên Công báo; đã đối chiếu mục tiêu, nhiệm vụ, phân công và hiệu lực). https://congbao.chinhphu.vn/van-ban/quyet-dinh-so-1125-qd-ttg-469843.htm</w:t>
       </w:r>
     </w:p>
     <w:p>
@@ -9484,7 +9680,7 @@
         <w:jc w:val="left"/>
       </w:pPr>
       <w:r>
-        <w:t xml:space="preserve">Quyết định số 2559/QĐ-BVHTTDL ngày 30/9/2026 quy định chức năng, nhiệm vụ, quyền hạn và cơ cấu tổ chức của Cục Thông tin điện tử và Chuyển đổi số (không đăng Công báo; đã đọc toàn văn trên LuatVietnam). https://luatvietnam.vn/co-cau-to-chuc/quyet-dinh-2559-qd-bvhttdl-2026-quy-dinh-chuc-nang-nhiem-vu-quyen-han-va-co-cau-to-chuc-cua-cuc-thong-tin-dien-tu-va-chuyen-doi-so-449380-d1.html</w:t>
+        <w:t xml:space="preserve">Quyết định số 2559/QĐ-BVHTTDL ngày 30/9/2026 quy định chức năng, nhiệm vụ, quyền hạn và cơ cấu tổ chức của Cục Thông tin điện tử và Chuyển đổi số (không đăng Công báo; đã đối chiếu bản trên LuatVietnam ở các điều về chức năng, nhiệm vụ, cơ cấu tổ chức và hiệu lực). https://luatvietnam.vn/co-cau-to-chuc/quyet-dinh-2559-qd-bvhttdl-2026-quy-dinh-chuc-nang-nhiem-vu-quyen-han-va-co-cau-to-chuc-cua-cuc-thong-tin-dien-tu-va-chuyen-doi-so-449380-d1.html</w:t>
       </w:r>
     </w:p>
     <w:p>
@@ -9509,7 +9705,7 @@
         <w:jc w:val="left"/>
       </w:pPr>
       <w:r>
-        <w:t xml:space="preserve">DataReportal, Digital 2026: Vietnam (đã đọc toàn văn). https://datareportal.com/reports/digital-2026-vietnam</w:t>
+        <w:t xml:space="preserve">DataReportal, Digital 2026: Vietnam (đã đối chiếu số liệu được dẫn). https://datareportal.com/reports/digital-2026-vietnam</w:t>
       </w:r>
     </w:p>
     <w:p>
@@ -9561,7 +9757,7 @@
         <w:jc w:val="left"/>
       </w:pPr>
       <w:r>
-        <w:t xml:space="preserve">Hơn 12.200 thông tin xấu độc trên mạng bị gỡ bỏ trong quý III/2025 (Báo Điện tử Chính phủ; trang chặn truy cập tự động, chưa đọc được). https://baochinhphu.vn/hon-12200-thong-tin-xau-doc-tren-mang-bi-go-bo-102251010182038234.htm</w:t>
+        <w:t xml:space="preserve">Hơn 12.200 thông tin xấu độc trên mạng bị gỡ bỏ trong quý III/2025 (Báo Điện tử Chính phủ; người dùng đã đọc bản gốc ngày 28/10/2026, không có nội dung cần bổ sung). https://baochinhphu.vn/hon-12200-thong-tin-xau-doc-tren-mang-bi-go-bo-102251010182038234.htm</w:t>
       </w:r>
     </w:p>
     <w:p>
@@ -9600,7 +9796,7 @@
         <w:jc w:val="left"/>
       </w:pPr>
       <w:r>
-        <w:t xml:space="preserve">Reuters Institute, Digital News Report 2026, phần Tóm tắt (bản gốc; đã đọc toàn văn). https://reutersinstitute.politics.ox.ac.uk/digital-news-report/2026/dnr-executive-summary</w:t>
+        <w:t xml:space="preserve">Reuters Institute, Digital News Report 2026, phần Tóm tắt (bản gốc; đã đối chiếu số liệu được dẫn). https://reutersinstitute.politics.ox.ac.uk/digital-news-report/2026/dnr-executive-summary</w:t>
       </w:r>
     </w:p>
     <w:p>
@@ -9721,7 +9917,7 @@
         <w:jc w:val="left"/>
       </w:pPr>
       <w:r>
-        <w:t xml:space="preserve">Facebook, Messenger, Instagram, Threads đồng loạt gián đoạn tại Việt Nam (Phụ nữ Việt Nam, 12/6/2026). https://phunuvietnam.vn/facebook-messenger-instagram-threads-dong-loat-sap-tai-viet-nam-238260612210826749.htm</w:t>
+        <w:t xml:space="preserve">Facebook, Messenger, Instagram, Threads đồng loạt gián đoạn tại Việt Nam (Phụ nữ Việt Nam, 12/6/2026; người dùng đã đọc bản gốc, không có nội dung cần bổ sung). https://phunuvietnam.vn/facebook-messenger-instagram-threads-dong-loat-sap-tai-viet-nam-238260612210826749.htm</w:t>
       </w:r>
     </w:p>
     <w:p>
@@ -9773,7 +9969,7 @@
         <w:jc w:val="left"/>
       </w:pPr>
       <w:r>
-        <w:t xml:space="preserve">Bài báo nêu Hà Nội thống nhất chủ trương đầu tư Công viên Safari Ba Vì, khởi công dịp 10/10 (VOV). https://vov.vn/xa-hoi/ha-noi-thong-nhat-chu-truong-dau-tu-cong-vien-safari-ba-vi-khoi-cong-dip-1010-post1338883.vov</w:t>
+        <w:t xml:space="preserve">Bài báo nêu Hà Nội thống nhất chủ trương đầu tư Công viên Safari Ba Vì, khởi công dịp 10/10 (VOV; người dùng đã đọc bản gốc, không có nội dung cần bổ sung). https://vov.vn/xa-hoi/ha-noi-thong-nhat-chu-truong-dau-tu-cong-vien-safari-ba-vi-khoi-cong-dip-1010-post1338883.vov</w:t>
       </w:r>
     </w:p>
     <w:p>
@@ -9933,7 +10129,7 @@
               <w:rPr>
                 <w:sz w:val="23"/>
               </w:rPr>
-              <w:t xml:space="preserve">Đã đối chiếu toàn văn 16 luật, nghị định, quyết định trên Công báo (dự thảo 5, 6). Còn lại: Quyết định số 423/QĐ-BVHTTDL, 2559/QĐ-BVHTTDL (không đăng Công báo, đối chiếu qua báo chí, LuatVietnam), Nghị quyết số 35-NQ/TW. Cần làm rõ: thời hạn 24 giờ, 6 giờ tại Điều 25 Luật An ninh mạng năm 2025 chỉ áp dụng với yêu cầu của lực lượng chuyên trách thuộc Bộ Công an; yêu cầu của Bộ VHTTDL theo Nghị định số 147/2024/NĐ-CP chỉ có mốc 24 giờ, chưa có mốc rút ngắn cho tình huống khẩn cấp</w:t>
+              <w:t xml:space="preserve">Đã đối chiếu bản gốc 16 luật, nghị định, quyết định trên Công báo (dự thảo 5, 6): đọc toàn văn Nghị định số 244/2026/NĐ-CP, 328/2026/NĐ-CP, Quyết định số 329/QĐ-TTg; các văn bản còn lại đối chiếu các điều được dẫn. Còn lại: Quyết định số 423/QĐ-BVHTTDL, 2559/QĐ-BVHTTDL (không đăng Công báo, đối chiếu qua báo chí, LuatVietnam), Nghị quyết số 35-NQ/TW. Cần làm rõ: thời hạn 24 giờ, 6 giờ tại Điều 25 Luật An ninh mạng năm 2025 chỉ áp dụng với yêu cầu của lực lượng chuyên trách thuộc Bộ Công an; yêu cầu của Bộ VHTTDL theo Nghị định số 147/2024/NĐ-CP chỉ có mốc 24 giờ, chưa có mốc rút ngắn cho tình huống khẩn cấp</w:t>
             </w:r>
           </w:p>
         </w:tc>
@@ -9968,7 +10164,7 @@
               <w:rPr>
                 <w:sz w:val="23"/>
               </w:rPr>
-              <w:t xml:space="preserve">Số liệu chính thức chặn, gỡ thông tin vi phạm quý III và 9 tháng năm 2026 (chưa công bố công khai); số liệu quý III/2025 (12.200 thông tin; Facebook 10.713 bài viết) chưa đối chiếu được do trang Báo Điện tử Chính phủ chặn truy cập tự động; số liệu nền về thời gian phát hiện, phản hồi</w:t>
+              <w:t xml:space="preserve">Số liệu chính thức chặn, gỡ thông tin vi phạm quý III và 9 tháng năm 2026 (chưa công bố công khai); số liệu quý III/2025 (12.200 thông tin; Facebook 10.713 bài viết): người dùng đã đọc bản gốc trên Báo Điện tử Chính phủ, không ghi nhận điểm cần điều chỉnh; số liệu nền về thời gian phát hiện, phản hồi</w:t>
             </w:r>
           </w:p>
         </w:tc>
@@ -10614,7 +10810,7 @@
               <w:rPr>
                 <w:sz w:val="23"/>
               </w:rPr>
-              <w:t xml:space="preserve">Luật POFMA (hiệu lực 2/10/2019): lệnh cải chính gắn cạnh bài gốc, không buộc xóa bài (Điều 11); lệnh cải chính nhắm mục tiêu buộc nền tảng gửi cải chính tới người dùng đã truy cập tin sai (Điều 21); lệnh cải chính chung qua nền tảng, báo in, phát thanh, truyền hình (Điều 23); điều kiện ban hành: thông tin sai về sự kiện và vì lợi ích công cộng; quyền khiếu nại ra tòa; cá nhân cố ý phát tán tin sai gây hại chịu mức phạt tới 50.000 SGD hoặc 5 năm tù, tới 100.000 SGD hoặc 10 năm tù nếu dùng tài khoản giả, bot (Điều 7); trang giải thích Factually; kênh WhatsApp Gov.sg; Ủy ban An toàn trực tuyến hoạt động từ 29/6/2026</w:t>
+              <w:t xml:space="preserve">Luật POFMA (hiệu lực 2/10/2019): lệnh cải chính gắn cạnh bài gốc, không buộc xóa bài (Điều 11); lệnh cải chính nhắm mục tiêu buộc nền tảng gửi cải chính tới người dùng đã truy cập tin sai (Điều 21); lệnh cải chính chung qua nền tảng, báo in, phát thanh, truyền hình (Điều 23); điều kiện ban hành: thông tin sai về sự kiện và vì lợi ích công cộng; quyền khiếu nại ra tòa; cá nhân cố ý phát tán tin sai gây hại chịu mức phạt tới 50.000 SGD hoặc 5 năm tù, tới 100.000 SGD hoặc 10 năm tù nếu dùng tài khoản giả, bot (Điều 7); tạo, sửa bot để phát tán tin sai: cá nhân tới 30.000 SGD hoặc 3 năm tù, tổ chức tới 500.000 SGD, trường hợp nghiêm trọng như gây hại an ninh, trật tự công cộng tới 60.000 SGD hoặc 6 năm tù, tổ chức tới 1 triệu SGD (Điều 8); công bố trang trực tuyến vi phạm, cấm đưa quảng cáo, hỗ trợ tài chính cho trang (Điều 32, 37, 38); lệnh hạn chế tài khoản giả, tài khoản do bot điều khiển, tối đa 3 tháng hoặc không thời hạn (Điều 40); quy tắc thực hành buộc nền tảng phát hiện hành vi phối hợp thiếu xác thực, đưa nguồn tin đáng tin cậy lên vị trí nổi bật, báo cáo nghi vấn, chỉ định kênh nhận lệnh (Điều 48); nền tảng không khắc phục vi phạm quy tắc: phạt tới 1 triệu SGD, cộng tới 100.000 SGD mỗi ngày tiếp tục vi phạm (Điều 50); buộc chỉ định đại diện tại Singapore nhận lệnh, không thực hiện có thể bị chặn truy cập (Điều 54); trang giải thích Factually; kênh WhatsApp Gov.sg; Ủy ban An toàn trực tuyến hoạt động từ 29/6/2026</w:t>
             </w:r>
           </w:p>
         </w:tc>
@@ -10644,7 +10840,7 @@
               <w:rPr>
                 <w:sz w:val="23"/>
               </w:rPr>
-              <w:t xml:space="preserve">Cao: ưu tiên cải chính, ít dùng gỡ bỏ; điều kiện ban hành do luật định, có cơ chế khiếu nại</w:t>
+              <w:t xml:space="preserve">Cao: ưu tiên cải chính, ít dùng gỡ bỏ; điều kiện ban hành do luật định, có cơ chế khiếu nại; mức phạt nền tảng cao hơn nhiều mức 30 đến 50 triệu đồng của Việt Nam</w:t>
             </w:r>
           </w:p>
         </w:tc>
@@ -10679,37 +10875,67 @@
               <w:rPr>
                 <w:sz w:val="23"/>
               </w:rPr>
-              <w:t xml:space="preserve">Đạo luật Dịch vụ số (áp dụng đầy đủ từ 17/2/2024): nền tảng rất lớn, từ 45 triệu người dùng hoạt động hằng tháng trong Liên minh (Điều 33), đánh giá rủi ro hệ thống ít nhất mỗi năm 1 lần, gồm rủi ro với thảo luận công dân, bầu cử, an ninh công cộng (Điều 34); cơ chế ứng phó khủng hoảng: khi tình huống bất thường đe dọa nghiêm trọng an ninh công cộng hoặc sức khỏe cộng đồng, Ủy ban châu Âu ra quyết định công khai buộc nền tảng đánh giá, áp dụng biện pháp, báo cáo; biện pháp kéo dài không quá 3 tháng, gia hạn tối đa 3 tháng; nền tảng tự chọn biện pháp cụ thể (Điều 36); giao thức khủng hoảng tự nguyện: hiển thị nổi bật thông tin của cơ quan nhà nước, chỉ định đầu mối liên lạc khủng hoảng, tăng nguồn lực kiểm duyệt (Điều 48); phạt tối đa 6% tổng doanh thu toàn cầu năm trước (Điều 74); Lá chắn Dân chủ châu Âu (11/2025)</w:t>
-            </w:r>
-          </w:p>
-        </w:tc>
-        <w:tc>
-          <w:tcPr/>
-          <w:p>
-            <w:pPr>
-              <w:pStyle w:val="Compact"/>
-              <w:jc w:val="left"/>
-            </w:pPr>
-            <w:r>
-              <w:rPr>
-                <w:sz w:val="23"/>
-              </w:rPr>
-              <w:t xml:space="preserve">Phạt X 120 triệu euro (5/12/2025), quyết định đầu tiên về vi phạm Đạo luật, áp dụng với vi phạm nghĩa vụ minh bạch (dấu tích xanh trả phí không kèm xác minh thực chất, kho quảng cáo, quyền tiếp cận dữ liệu của nhà nghiên cứu), không phải với nội dung; cuộc điều tra mở từ 18/12/2023 về nội dung bất hợp pháp, thao túng thông tin trên X vẫn tiếp tục; chưa ghi nhận lần kích hoạt Điều 36 (đã đối chiếu văn bản gốc Đạo luật và thông cáo gốc của Ủy ban châu Âu; việc chưa kích hoạt Điều 36 chưa đối chiếu)</w:t>
-            </w:r>
-          </w:p>
-        </w:tc>
-        <w:tc>
-          <w:tcPr/>
-          <w:p>
-            <w:pPr>
-              <w:pStyle w:val="Compact"/>
-              <w:jc w:val="left"/>
-            </w:pPr>
-            <w:r>
-              <w:rPr>
-                <w:sz w:val="23"/>
-              </w:rPr>
-              <w:t xml:space="preserve">Trung bình: hướng đúng nhưng khó tái lập sức mặc cả của thị trường 27 nước; Điều 48 là căn cứ tham khảo cho yêu cầu nền tảng ưu tiên hiển thị thông tin chính thống khi có khủng hoảng</w:t>
+              <w:t xml:space="preserve">Đạo luật Dịch vụ số (áp dụng đầy đủ từ 17/2/2024): nền tảng rất lớn, từ 45 triệu người dùng hoạt động hằng tháng trong Liên minh (Điều 33), đánh giá rủi ro hệ thống ít nhất mỗi năm 1 lần, gồm rủi ro với thảo luận công dân, bầu cử, an ninh công cộng (Điều 34); cơ chế ứng phó khủng hoảng: khi tình huống bất thường đe dọa nghiêm trọng an ninh công cộng hoặc sức khỏe cộng đồng, Ủy ban châu Âu ra quyết định công khai buộc nền tảng đánh giá, áp dụng biện pháp, báo cáo; biện pháp kéo dài không quá 3 tháng, gia hạn tối đa 3 tháng; nền tảng tự chọn biện pháp cụ thể (Điều 36); giao thức khủng hoảng tự nguyện: hiển thị nổi bật thông tin của cơ quan nhà nước, chỉ định đầu mối liên lạc khủng hoảng, tăng nguồn lực kiểm duyệt (Điều 48); lệnh xử lý nội dung của cơ quan tư pháp, hành chính nêu căn cứ, lý do, đường dẫn cụ thể, cơ chế khiếu nại; nền tảng báo kết quả</w:t>
+            </w:r>
+            <w:r>
+              <w:rPr>
+                <w:sz w:val="23"/>
+              </w:rPr>
+              <w:t xml:space="preserve"> </w:t>
+            </w:r>
+            <w:r>
+              <w:rPr>
+                <w:sz w:val="23"/>
+              </w:rPr>
+              <w:t xml:space="preserve">“</w:t>
+            </w:r>
+            <w:r>
+              <w:rPr>
+                <w:sz w:val="23"/>
+              </w:rPr>
+              <w:t xml:space="preserve">không chậm trễ quá mức</w:t>
+            </w:r>
+            <w:r>
+              <w:rPr>
+                <w:sz w:val="23"/>
+              </w:rPr>
+              <w:t xml:space="preserve">”</w:t>
+            </w:r>
+            <w:r>
+              <w:rPr>
+                <w:sz w:val="23"/>
+              </w:rPr>
+              <w:t xml:space="preserve">, không ấn định số giờ (Điều 9); nền tảng ưu tiên xử lý thông báo của bên báo cáo tin cậy (Điều 22); tạm ngừng dịch vụ với tài khoản thường xuyên đăng nội dung rõ ràng bất hợp pháp (Điều 23); phạt tối đa 6% tổng doanh thu toàn cầu năm trước (Điều 74); Lá chắn Dân chủ châu Âu (11/2025)</w:t>
+            </w:r>
+          </w:p>
+        </w:tc>
+        <w:tc>
+          <w:tcPr/>
+          <w:p>
+            <w:pPr>
+              <w:pStyle w:val="Compact"/>
+              <w:jc w:val="left"/>
+            </w:pPr>
+            <w:r>
+              <w:rPr>
+                <w:sz w:val="23"/>
+              </w:rPr>
+              <w:t xml:space="preserve">Phạt X 120 triệu euro (5/12/2025), quyết định đầu tiên về vi phạm Đạo luật, áp dụng với vi phạm nghĩa vụ minh bạch (dấu tích xanh trả phí không kèm xác minh thực chất, khoản 1 Điều 25; kho quảng cáo, Điều 39; quyền tiếp cận dữ liệu công khai của nhà nghiên cứu, khoản 12 Điều 40), không phải với nội dung; cuộc điều tra mở từ 18/12/2023 về nội dung bất hợp pháp, thao túng thông tin trên X vẫn tiếp tục; chưa ghi nhận lần kích hoạt Điều 36 (đã đối chiếu văn bản gốc Đạo luật và thông cáo gốc của Ủy ban châu Âu; việc chưa kích hoạt Điều 36 chưa đối chiếu)</w:t>
+            </w:r>
+          </w:p>
+        </w:tc>
+        <w:tc>
+          <w:tcPr/>
+          <w:p>
+            <w:pPr>
+              <w:pStyle w:val="Compact"/>
+              <w:jc w:val="left"/>
+            </w:pPr>
+            <w:r>
+              <w:rPr>
+                <w:sz w:val="23"/>
+              </w:rPr>
+              <w:t xml:space="preserve">Trung bình: hướng đúng nhưng khó tái lập sức mặc cả của thị trường 27 nước; Điều 48 là căn cứ tham khảo cho yêu cầu nền tảng ưu tiên hiển thị thông tin chính thống khi có khủng hoảng; Điều 9 cho thấy chất lượng yêu cầu (căn cứ, lý do, đường dẫn) quan trọng ngang thời hạn xử lý</w:t>
             </w:r>
           </w:p>
         </w:tc>
@@ -10789,7 +11015,7 @@
               <w:rPr>
                 <w:sz w:val="23"/>
               </w:rPr>
-              <w:t xml:space="preserve">Vụ Southport (29/7/2024): lúc 16 giờ 49 cùng ngày, bài đăng trên X bịa tên nghi phạm; đến trưa 30/7 có 30.000 lượt nhắc từ 18.000 tài khoản; cảnh sát bác tin sai lúc 12 giờ 12 ngày 30/7 nhưng vẫn chưa được công bố danh tính thật; bạo loạn từ 30/7 đến 7/8/2024, 246 sự kiện, trong đó 88 sự kiện nghiêm trọng; đến 22/1/2025: 1.804 lượt bắt giữ, 1.072 lượt khởi tố; ít nhất 302 cảnh sát bị thương; cơ quan công tố tăng cường hơn 100 công tố viên để khởi tố trong 24 giờ, 3 người nhận án tù trong 8 ngày. Ofcom ước tính chi phí soạn giao thức của nền tảng lớn từ 4.600 đến 10.900 bảng Anh (đã đối chiếu báo cáo HC 381 và văn bản Ofcom)</w:t>
+              <w:t xml:space="preserve">Vụ Southport (29/7/2024): lúc 16 giờ 49 cùng ngày, bài đăng trên X bịa tên nghi phạm; đến trưa 30/7 có 30.000 lượt nhắc từ 18.000 tài khoản; cảnh sát bác tin sai lúc 12 giờ 12 ngày 30/7 nhưng vẫn chưa được công bố danh tính thật; bạo loạn từ 30/7 đến 7/8/2024, 246 sự kiện, trong đó 88 sự kiện nghiêm trọng; đến 22/1/2025: 1.804 lượt bắt giữ, 1.072 lượt khởi tố; ít nhất 302 cảnh sát bị thương; cơ quan công tố tăng cường hơn 100 công tố viên để khởi tố trong 24 giờ, 3 người nhận án tù trong 8 ngày; Ủy ban Nội vụ đánh giá việc xét xử nhanh góp phần ngăn bạo loạn tiếp diễn, kiến nghị cơ quan công tố cập nhật hướng dẫn cho báo chí ít nhất 5 năm 1 lần và tăng năng lực giám sát mạng xã hội cấp quốc gia. Ofcom ước tính chi phí soạn giao thức của nền tảng lớn từ 4.600 đến 10.900 bảng Anh (đã đối chiếu báo cáo HC 381 và văn bản Ofcom)</w:t>
             </w:r>
           </w:p>
         </w:tc>
@@ -11415,7 +11641,7 @@
               <w:rPr>
                 <w:sz w:val="23"/>
               </w:rPr>
-              <w:t xml:space="preserve">Trung bình: nhiều báo Mỹ đưa tin thống nhất; chưa xác minh chính sách năm 2025</w:t>
+              <w:t xml:space="preserve">Trung bình: nhiều báo Mỹ đưa tin thống nhất; người dùng đã đọc bài gốc của Axios; chưa xác minh chính sách năm 2025</w:t>
             </w:r>
           </w:p>
         </w:tc>
@@ -11761,7 +11987,7 @@
         <w:jc w:val="left"/>
       </w:pPr>
       <w:r>
-        <w:t xml:space="preserve">Văn bản Luật POFMA 2019 (Singapore Statutes Online; đã đọc toàn văn bản PDF hợp nhất năm 2020, cập nhật sửa đổi đến 1/12/2021; tổ biên tập kiểm tra sửa đổi sau thời điểm này). https://sso.agc.gov.sg/Act/POFMA2019</w:t>
+        <w:t xml:space="preserve">Văn bản Luật POFMA 2019 (Singapore Statutes Online; bản PDF hợp nhất năm 2020, cập nhật sửa đổi đến 1/12/2021; đã đối chiếu mục lục và Điều 4, 7, 8, 10, 11, 17, 20, 21, 23, 29, 32, 37, 38, 40, 48, 50, 54; tổ biên tập kiểm tra sửa đổi sau thời điểm này). https://sso.agc.gov.sg/Act/POFMA2019</w:t>
       </w:r>
     </w:p>
     <w:p>
@@ -11812,7 +12038,7 @@
         <w:jc w:val="left"/>
       </w:pPr>
       <w:r>
-        <w:t xml:space="preserve">Văn bản Đạo luật Dịch vụ số, Quy định (EU) 2022/2065 (EUR-Lex; đã đọc toàn văn bản PDF trên Công báo Liên minh châu Âu số L 277 ngày 27/10/2022). https://eur-lex.europa.eu/eli/reg/2022/2065/oj ; https://eur-lex.europa.eu/legal-content/EN/TXT/PDF/?uri=CELEX:32022R2065</w:t>
+        <w:t xml:space="preserve">Văn bản Đạo luật Dịch vụ số, Quy định (EU) 2022/2065 (EUR-Lex; bản PDF trên Công báo Liên minh châu Âu số L 277 ngày 27/10/2022; đã đối chiếu Điều 9, 16, 22, 23, 25, 33 đến 36, 39, 40, 48, 52, 74). https://eur-lex.europa.eu/eli/reg/2022/2065/oj ; https://eur-lex.europa.eu/legal-content/EN/TXT/PDF/?uri=CELEX:32022R2065</w:t>
       </w:r>
     </w:p>
     <w:p>
@@ -11876,7 +12102,7 @@
         <w:jc w:val="left"/>
       </w:pPr>
       <w:r>
-        <w:t xml:space="preserve">Quy định của Ofcom về giao thức ứng phó khủng hoảng, 9/6/2026 (trang văn bản và PDF; đã đọc toàn văn bản PDF). https://www.ofcom.org.uk/online-safety/illegal-and-harmful-content/statement-crisis-response-protocol ; https://www.ofcom.org.uk/siteassets/resources/documents/online-safety/protecting-children/illegal-harms/crisis-response-protocol-online-safety-additional-safety-measures.pdf</w:t>
+        <w:t xml:space="preserve">Quy định của Ofcom về giao thức ứng phó khủng hoảng, 9/6/2026 (trang văn bản và PDF; đã đối chiếu phần tóm tắt, chương 3 về giao thức ứng phó khủng hoảng và ước tính chi phí). https://www.ofcom.org.uk/online-safety/illegal-and-harmful-content/statement-crisis-response-protocol ; https://www.ofcom.org.uk/siteassets/resources/documents/online-safety/protecting-children/illegal-harms/crisis-response-protocol-online-safety-additional-safety-measures.pdf</w:t>
       </w:r>
     </w:p>
     <w:p>
@@ -11904,7 +12130,7 @@
         <w:t xml:space="preserve">”</w:t>
       </w:r>
       <w:r>
-        <w:t xml:space="preserve">, công bố 14/4/2025 (tin công bố và PDF; đã đọc toàn văn bản PDF). https://committees.parliament.uk/committee/83/home-affairs-committee/news/206380/ ; https://committees.parliament.uk/publications/47476/documents/246718/default/</w:t>
+        <w:t xml:space="preserve">, công bố 14/4/2025 (tin công bố và PDF; đã đối chiếu phần tóm tắt, chương 1 về diễn biến và thông tin sai trên mạng xã hội, mục giám sát mạng xã hội, mục xét xử nhanh và toàn bộ 21 kết luận, kiến nghị). https://committees.parliament.uk/committee/83/home-affairs-committee/news/206380/ ; https://committees.parliament.uk/publications/47476/documents/246718/default/</w:t>
       </w:r>
     </w:p>
     <w:p>
@@ -12158,7 +12384,7 @@
         <w:jc w:val="left"/>
       </w:pPr>
       <w:r>
-        <w:t xml:space="preserve">Meta ngừng đề xuất nội dung chính trị trên Threads (Axios), 9/2/2024. https://www.axios.com/2024/02/09/meta-political-content-moderation-threads</w:t>
+        <w:t xml:space="preserve">Meta ngừng đề xuất nội dung chính trị trên Threads (Axios), 9/2/2024 (người dùng đã đọc bản gốc, không có nội dung cần bổ sung). https://www.axios.com/2024/02/09/meta-political-content-moderation-threads</w:t>
       </w:r>
     </w:p>
     <w:p>

</xml_diff>

<commit_message>
Đọc toàn văn báo cáo VIGINUM: sửa "43 chiến dịch", cập nhật đề cương dự thảo 11, tham luận dự thảo 4
- Báo cáo VIGINUM (9/2024) ghi 43 hành vi thao túng thông tin, trong đó chỉ
  2 chiến dịch có kế hoạch; các dự thảo trước ghi sai là 43 chiến dịch.
- Bổ sung nhận định của báo cáo vào đề cương (Phần II mục 6, Phần III nhóm 3,
  Phụ lục 5, 6) và vào tham luận (nhóm 3, nhóm 4, kho dữ kiện, bảng đối chiếu).
- Số liệu nền tảng bác bỏ tin đồn của Trung Quốc vẫn chưa đối chiếu được.

Co-Authored-By: Claude Sonnet 5.5 <noreply@anthropic.com>
Claude-Session: https://claude.ai/code/session_01NzZ78rAanjcMCsGwt7jxAb
</commit_message>
<xml_diff>
--- a/tham-luan-khung-hoang-truyen-thong/de-cuong-tham-luan-bvhttdl.docx
+++ b/tham-luan-khung-hoang-truyen-thong/de-cuong-tham-luan-bvhttdl.docx
@@ -258,7 +258,7 @@
         <w:pStyle w:val="ThongTinChung"/>
       </w:pPr>
       <w:r>
-        <w:t xml:space="preserve">Dự thảo 10, ngày 28/10/2026. Tài liệu làm việc phục vụ tổ biên tập.</w:t>
+        <w:t xml:space="preserve">Dự thảo 11, ngày 29/10/2026. Tài liệu làm việc phục vụ tổ biên tập.</w:t>
       </w:r>
     </w:p>
     <w:bookmarkStart w:id="20" w:name="tóm-tắt"/>
@@ -607,6 +607,57 @@
       </w:r>
       <w:r>
         <w:t xml:space="preserve">thành rà soát, sửa đổi, bổ sung văn bản hướng dẫn nghĩa vụ của nền tảng, vì chưa xác nhận được tình trạng hiệu lực và văn bản sửa đổi của Nghị định này (Phụ lục 5).</w:t>
+      </w:r>
+    </w:p>
+    <w:p>
+      <w:pPr>
+        <w:pStyle w:val="BodyText"/>
+      </w:pPr>
+      <w:r>
+        <w:rPr>
+          <w:b/>
+          <w:bCs/>
+        </w:rPr>
+        <w:t xml:space="preserve">Điểm mới của dự thảo 11.</w:t>
+      </w:r>
+      <w:r>
+        <w:t xml:space="preserve"> </w:t>
+      </w:r>
+      <w:r>
+        <w:t xml:space="preserve">Đọc toàn văn báo cáo công khai của VIGINUM (Pháp) về mối đe dọa thông tin nhắm vào Thế vận hội Paris 2024 (11 trang, tháng 9/2024; file PDF bổ sung vào thư mục tai-lieu). Sửa 1 lỗi: báo cáo ghi 43</w:t>
+      </w:r>
+      <w:r>
+        <w:t xml:space="preserve"> </w:t>
+      </w:r>
+      <w:r>
+        <w:t xml:space="preserve">“</w:t>
+      </w:r>
+      <w:r>
+        <w:t xml:space="preserve">hành vi thao túng thông tin</w:t>
+      </w:r>
+      <w:r>
+        <w:t xml:space="preserve">”</w:t>
+      </w:r>
+      <w:r>
+        <w:t xml:space="preserve"> </w:t>
+      </w:r>
+      <w:r>
+        <w:t xml:space="preserve">(manœuvres informationnelles), trong đó chỉ 2 là chiến dịch có kế hoạch, phối hợp; các dự thảo trước ghi sai là</w:t>
+      </w:r>
+      <w:r>
+        <w:t xml:space="preserve"> </w:t>
+      </w:r>
+      <w:r>
+        <w:t xml:space="preserve">“</w:t>
+      </w:r>
+      <w:r>
+        <w:t xml:space="preserve">43 chiến dịch</w:t>
+      </w:r>
+      <w:r>
+        <w:t xml:space="preserve">”</w:t>
+      </w:r>
+      <w:r>
+        <w:t xml:space="preserve">. Bổ sung nhận định của báo cáo: phần lớn hành vi không xâm nhập được tranh luận công cộng, một phần nhờ báo chí, xã hội dân sự vào cuộc mạnh; nhân vật công chúng có lượng người theo dõi lớn chia sẻ lại là yếu tố làm tăng tầm nhìn thấy nhiều nhất; bác bỏ công khai đôi khi làm tin sai tới nhiều người hơn, nên cơ quan này cân nhắc rủi ro tác động trước khi công bố (Phần II, mục 6; Phần III, nhóm 3). Số liệu nền tảng bác bỏ tin đồn của Trung Quốc vẫn chưa đối chiếu được.</w:t>
       </w:r>
     </w:p>
     <w:p>
@@ -5361,7 +5412,22 @@
         <w:t xml:space="preserve"> </w:t>
       </w:r>
       <w:r>
-        <w:t xml:space="preserve">Pháp lập cơ quan VIGINUM (2021), công bố báo cáo về 43 chiến dịch thao túng thông tin nhắm vào Thế vận hội Paris 2024; Thụy Điển lập Cơ quan Phòng vệ tâm lý (2022). Báo cáo bằng chứng công khai làm tăng tính chính danh của biện pháp xử lý.</w:t>
+        <w:t xml:space="preserve">Pháp lập cơ quan VIGINUM (13/7/2021, trực thuộc Tổng Thư ký Quốc phòng và An ninh quốc gia), công bố báo cáo công khai tháng 9/2024: trong giai đoạn theo dõi từ tháng 4/2023 đến 8/9/2024, VIGINUM phát hiện 43 hành vi thao túng thông tin nhắm vào Thế vận hội Paris 2024, phần lớn mang tính cơ hội, chỉ có 2 chiến dịch có kế hoạch, phối hợp (trong đó 1 chiến dịch mùa hè 2023 tên</w:t>
+      </w:r>
+      <w:r>
+        <w:t xml:space="preserve"> </w:t>
+      </w:r>
+      <w:r>
+        <w:t xml:space="preserve">“</w:t>
+      </w:r>
+      <w:r>
+        <w:t xml:space="preserve">OLIMPIYA</w:t>
+      </w:r>
+      <w:r>
+        <w:t xml:space="preserve">”</w:t>
+      </w:r>
+      <w:r>
+        <w:t xml:space="preserve">, liên quan các tác nhân thân Azerbaijan). Báo cáo nhận định: phần lớn hành vi khó đạt mức nhìn thấy đủ lớn trong tranh luận công cộng bằng tiếng Pháp, có thể một phần nhờ báo chí, xã hội dân sự và cơ quan công quyền vào cuộc mạnh; nhân vật công chúng Pháp có lượng người theo dõi lớn chia sẻ lại nội dung sai là yếu tố làm tăng tầm nhìn thấy nhiều nhất; một số trường hợp bác bỏ công khai có thể đã đưa tin sai tới nhiều người hơn mức vốn có, nên việc công bố 1 chiến dịch cần dựa trên phân tích rủi ro tác động. VIGINUM phân tích theo phương thức hoạt động, không theo nội dung. Thụy Điển lập Cơ quan Phòng vệ tâm lý (2022; chưa đối chiếu). Báo cáo bằng chứng công khai làm tăng tính chính danh của biện pháp xử lý (nhận định của tổ soạn thảo).</w:t>
       </w:r>
     </w:p>
     <w:p>
@@ -6109,7 +6175,7 @@
         </w:numPr>
       </w:pPr>
       <w:r>
-        <w:t xml:space="preserve">Định kỳ công bố báo cáo bằng chứng về các chiến dịch thao túng thông tin có tổ chức từ nước ngoài, tăng tính chính danh của biện pháp xử lý (tham khảo cơ quan VIGINUM của Pháp).</w:t>
+        <w:t xml:space="preserve">Định kỳ công bố báo cáo bằng chứng về các chiến dịch thao túng thông tin có tổ chức từ nước ngoài, tăng tính chính danh của biện pháp xử lý (tham khảo cơ quan VIGINUM của Pháp, cơ quan này cân nhắc rủi ro tác động trước khi công bố vì bác bỏ công khai có thể khuếch đại nội dung sai).</w:t>
       </w:r>
     </w:p>
     <w:p>
@@ -10873,7 +10939,7 @@
               <w:rPr>
                 <w:sz w:val="23"/>
               </w:rPr>
-              <w:t xml:space="preserve">Đối chiếu số liệu, nguồn kinh nghiệm quốc tế tại Phụ lục 6 (đã đối chiếu văn bản gốc phần Singapore, Anh, Liên minh châu Âu, Trung Quốc, Nepal, Phần Lan, WHO, nghiên cứu Science Advances và trang hướng dẫn về Threads của Úc; còn lại báo cáo VIGINUM của Pháp, năm thành lập cơ quan Thụy Điển, số liệu nền tảng bác bỏ tin đồn của Trung Quốc và phần lớn kinh nghiệm Threads)</w:t>
+              <w:t xml:space="preserve">Đối chiếu số liệu, nguồn kinh nghiệm quốc tế tại Phụ lục 6 (đã đối chiếu văn bản gốc phần Singapore, Anh, Pháp (báo cáo VIGINUM), Liên minh châu Âu, Trung Quốc, Nepal, Phần Lan, WHO, nghiên cứu Science Advances và trang hướng dẫn về Threads của Úc; còn lại năm thành lập cơ quan Thụy Điển, số liệu nền tảng bác bỏ tin đồn của Trung Quốc và phần lớn kinh nghiệm Threads)</w:t>
             </w:r>
           </w:p>
         </w:tc>
@@ -11464,7 +11530,7 @@
               <w:rPr>
                 <w:sz w:val="23"/>
               </w:rPr>
-              <w:t xml:space="preserve">VIGINUM phát hiện 43 chiến dịch nhắm vào Thế vận hội Paris 2024; Phần Lan đứng đầu Chỉ số năng lực truyền thông châu Âu năm 2023 với 74/100 điểm (đã đối chiếu báo cáo gốc; VIGINUM, năm thành lập cơ quan Thụy Điển chưa đối chiếu được)</w:t>
+              <w:t xml:space="preserve">VIGINUM (báo cáo 9/2024) phát hiện 43 hành vi thao túng thông tin nhắm vào Thế vận hội Paris 2024, trong đó 2 chiến dịch có kế hoạch, phối hợp; phần lớn khó đạt mức nhìn thấy lớn trong tranh luận công cộng; Phần Lan đứng đầu Chỉ số năng lực truyền thông châu Âu năm 2023 với 74/100 điểm (đã đối chiếu báo cáo gốc của VIGINUM và Chỉ số năng lực truyền thông; năm thành lập cơ quan Thụy Điển chưa đối chiếu được)</w:t>
             </w:r>
           </w:p>
         </w:tc>
@@ -11625,7 +11691,7 @@
           <w:i/>
           <w:iCs/>
         </w:rPr>
-        <w:t xml:space="preserve">Ghi chú: đã đối chiếu văn bản gốc đối với mốc 5 giờ, 24 giờ của Trung Quốc; số liệu nghiên cứu trên Science Advances; Luật POFMA và bảng thống kê vụ việc POFMA của Singapore; báo cáo HC 381 và quy định của Ofcom (Anh); Đạo luật Dịch vụ số của Liên minh châu Âu; trang hướng dẫn về Threads của cơ quan An toàn điện tử Úc; Thông báo số 61 năm 2016 của Trung Quốc; thông cáo của Singapore về Ủy ban An toàn trực tuyến; RESIST 3; diễn biến ở Nepal; khung năng lực của WHO; Chỉ số năng lực truyền thông châu Âu năm 2023. Chưa đối chiếu được: số liệu của nền tảng bác bỏ tin đồn Trung Quốc (trang chạy JavaScript), báo cáo VIGINUM (trang đang bảo trì). Bản PDF các tài liệu này lưu tại thư mục tai-lieu cùng đề cương. Các số liệu còn lại tổng hợp qua tìm kiếm, tổ biên tập mở từng nguồn để đối chiếu trước khi sử dụng. Kinh nghiệm riêng về Threads trình bày tại bảng dưới.</w:t>
+        <w:t xml:space="preserve">Ghi chú: đã đối chiếu văn bản gốc đối với mốc 5 giờ, 24 giờ của Trung Quốc; số liệu nghiên cứu trên Science Advances; Luật POFMA và bảng thống kê vụ việc POFMA của Singapore; báo cáo HC 381 và quy định của Ofcom (Anh); Đạo luật Dịch vụ số của Liên minh châu Âu; trang hướng dẫn về Threads của cơ quan An toàn điện tử Úc; Thông báo số 61 năm 2016 của Trung Quốc; báo cáo VIGINUM về Thế vận hội Paris 2024 (đã đọc toàn văn); thông cáo của Singapore về Ủy ban An toàn trực tuyến; RESIST 3; diễn biến ở Nepal; khung năng lực của WHO; Chỉ số năng lực truyền thông châu Âu năm 2023. Chưa đối chiếu được: số liệu của nền tảng bác bỏ tin đồn Trung Quốc (trang chạy JavaScript; người dùng báo đã mở được trang, chờ số liệu). Bản PDF các tài liệu này lưu tại thư mục tai-lieu cùng đề cương. Các số liệu còn lại tổng hợp qua tìm kiếm, tổ biên tập mở từng nguồn để đối chiếu trước khi sử dụng. Kinh nghiệm riêng về Threads trình bày tại bảng dưới.</w:t>
       </w:r>
     </w:p>
     <w:p>
@@ -12469,7 +12535,22 @@
         <w:jc w:val="left"/>
       </w:pPr>
       <w:r>
-        <w:t xml:space="preserve">Báo cáo của VIGINUM về Thế vận hội Paris 2024 (PDF; trang đang bảo trì, chưa đọc được). https://www.vie-publique.fr/files/rapport/pdf/295411.pdf</w:t>
+        <w:t xml:space="preserve">Báo cáo của VIGINUM về Thế vận hội Paris 2024,</w:t>
+      </w:r>
+      <w:r>
+        <w:t xml:space="preserve"> </w:t>
+      </w:r>
+      <w:r>
+        <w:t xml:space="preserve">“</w:t>
+      </w:r>
+      <w:r>
+        <w:t xml:space="preserve">Synthèse de la menace informationnelle ayant visé les Jeux Olympiques et Paralympiques de Paris 2024</w:t>
+      </w:r>
+      <w:r>
+        <w:t xml:space="preserve">”</w:t>
+      </w:r>
+      <w:r>
+        <w:t xml:space="preserve">, tháng 9/2024 (PDF 11 trang, tiếng Pháp; đã đọc toàn văn file PDF người dùng cung cấp, tai-lieu/VIGINUM.pdf). https://www.vie-publique.fr/files/rapport/pdf/295411.pdf</w:t>
       </w:r>
     </w:p>
     <w:p>

</xml_diff>